<commit_message>
Plan A: keep 3.2/3.3 split, de-dup syndrome content—rename 3.3.1, remove duplicate DiagX[8], add 3.2.2<->3.3.1 cross-refs; refresh track-changes
</commit_message>
<xml_diff>
--- a/大语言模型在中医药领域评测研究0617_修订模式.docx
+++ b/大语言模型在中医药领域评测研究0617_修订模式.docx
@@ -6499,6 +6499,15 @@
           <w:rFonts w:hint="eastAsia" w:ascii="宋体" w:hAnsi="宋体" w:eastAsia="宋体" w:cs="宋体"/>
         </w:rPr>
       </w:pPr>
+      <w:ins w:id="322" w:author="Kiro润色" w:date="2026-06-17T00:00:00Z">
+        <w:r>
+          <w:rPr>
+            <w:rFonts w:hint="eastAsia" w:ascii="宋体" w:hAnsi="宋体" w:eastAsia="宋体" w:cs="宋体"/>
+            <w:color w:val="FF0000"/>
+          </w:rPr>
+          <w:t xml:space="preserve">本节聚焦模型自身的临床推理（含辨证）能力，集成系统层面的辨证应用见3.3。</w:t>
+        </w:r>
+      </w:ins>
       <w:r>
         <w:rPr>
           <w:rFonts w:hint="eastAsia" w:ascii="宋体" w:hAnsi="宋体" w:eastAsia="宋体" w:cs="宋体"/>
@@ -6506,7 +6515,7 @@
         </w:rPr>
         <w:t xml:space="preserve">在需要综合</w:t>
       </w:r>
-      <w:ins w:id="322" w:author="Kiro润色" w:date="2026-06-17T00:00:00Z">
+      <w:ins w:id="323" w:author="Kiro润色" w:date="2026-06-17T00:00:00Z">
         <w:r>
           <w:rPr>
             <w:rFonts w:hint="eastAsia" w:ascii="宋体" w:hAnsi="宋体" w:eastAsia="宋体" w:cs="宋体"/>
@@ -6522,7 +6531,7 @@
         </w:rPr>
         <w:t xml:space="preserve">知识</w:t>
       </w:r>
-      <w:del w:id="323" w:author="Kiro润色" w:date="2026-06-17T00:00:00Z">
+      <w:del w:id="324" w:author="Kiro润色" w:date="2026-06-17T00:00:00Z">
         <w:r>
           <w:rPr>
             <w:rFonts w:hint="eastAsia" w:ascii="宋体" w:hAnsi="宋体" w:eastAsia="宋体" w:cs="宋体"/>
@@ -6531,7 +6540,7 @@
           <w:delText xml:space="preserve">进行</w:delText>
         </w:r>
       </w:del>
-      <w:ins w:id="324" w:author="Kiro润色" w:date="2026-06-17T00:00:00Z">
+      <w:ins w:id="325" w:author="Kiro润色" w:date="2026-06-17T00:00:00Z">
         <w:r>
           <w:rPr>
             <w:rFonts w:hint="eastAsia" w:ascii="宋体" w:hAnsi="宋体" w:eastAsia="宋体" w:cs="宋体"/>
@@ -6547,7 +6556,7 @@
         </w:rPr>
         <w:t xml:space="preserve">临床推理</w:t>
       </w:r>
-      <w:del w:id="325" w:author="Kiro润色" w:date="2026-06-17T00:00:00Z">
+      <w:del w:id="326" w:author="Kiro润色" w:date="2026-06-17T00:00:00Z">
         <w:r>
           <w:rPr>
             <w:rFonts w:hint="eastAsia" w:ascii="宋体" w:hAnsi="宋体" w:eastAsia="宋体" w:cs="宋体"/>
@@ -6563,7 +6572,7 @@
         </w:rPr>
         <w:t xml:space="preserve">任务上，各类模型</w:t>
       </w:r>
-      <w:del w:id="326" w:author="Kiro润色" w:date="2026-06-17T00:00:00Z">
+      <w:del w:id="327" w:author="Kiro润色" w:date="2026-06-17T00:00:00Z">
         <w:r>
           <w:rPr>
             <w:rFonts w:hint="eastAsia" w:ascii="宋体" w:hAnsi="宋体" w:eastAsia="宋体" w:cs="宋体"/>
@@ -6572,7 +6581,7 @@
           <w:delText xml:space="preserve">均面临</w:delText>
         </w:r>
       </w:del>
-      <w:ins w:id="327" w:author="Kiro润色" w:date="2026-06-17T00:00:00Z">
+      <w:ins w:id="328" w:author="Kiro润色" w:date="2026-06-17T00:00:00Z">
         <w:r>
           <w:rPr>
             <w:rFonts w:hint="eastAsia" w:ascii="宋体" w:hAnsi="宋体" w:eastAsia="宋体" w:cs="宋体"/>
@@ -6588,7 +6597,7 @@
         </w:rPr>
         <w:t xml:space="preserve">显</w:t>
       </w:r>
-      <w:del w:id="328" w:author="Kiro润色" w:date="2026-06-17T00:00:00Z">
+      <w:del w:id="329" w:author="Kiro润色" w:date="2026-06-17T00:00:00Z">
         <w:r>
           <w:rPr>
             <w:rFonts w:hint="eastAsia" w:ascii="宋体" w:hAnsi="宋体" w:eastAsia="宋体" w:cs="宋体"/>
@@ -6597,7 +6606,7 @@
           <w:delText xml:space="preserve">著挑战。</w:delText>
         </w:r>
       </w:del>
-      <w:ins w:id="329" w:author="Kiro润色" w:date="2026-06-17T00:00:00Z">
+      <w:ins w:id="330" w:author="Kiro润色" w:date="2026-06-17T00:00:00Z">
         <w:r>
           <w:rPr>
             <w:rFonts w:hint="eastAsia" w:ascii="宋体" w:hAnsi="宋体" w:eastAsia="宋体" w:cs="宋体"/>
@@ -6613,7 +6622,7 @@
         </w:rPr>
         <w:t xml:space="preserve">症状诊断通常被视为难度最高的推理类别[3]。</w:t>
       </w:r>
-      <w:del w:id="330" w:author="Kiro润色" w:date="2026-06-17T00:00:00Z">
+      <w:del w:id="331" w:author="Kiro润色" w:date="2026-06-17T00:00:00Z">
         <w:r>
           <w:rPr>
             <w:rFonts w:hint="eastAsia" w:ascii="宋体" w:hAnsi="宋体" w:eastAsia="宋体" w:cs="宋体"/>
@@ -6629,7 +6638,7 @@
         </w:rPr>
         <w:t xml:space="preserve">未经优化的通用</w:t>
       </w:r>
-      <w:del w:id="331" w:author="Kiro润色" w:date="2026-06-17T00:00:00Z">
+      <w:del w:id="332" w:author="Kiro润色" w:date="2026-06-17T00:00:00Z">
         <w:r>
           <w:rPr>
             <w:rFonts w:hint="eastAsia" w:ascii="宋体" w:hAnsi="宋体" w:eastAsia="宋体" w:cs="宋体"/>
@@ -6638,7 +6647,7 @@
           <w:delText xml:space="preserve">LLM和</w:delText>
         </w:r>
       </w:del>
-      <w:ins w:id="332" w:author="Kiro润色" w:date="2026-06-17T00:00:00Z">
+      <w:ins w:id="333" w:author="Kiro润色" w:date="2026-06-17T00:00:00Z">
         <w:r>
           <w:rPr>
             <w:rFonts w:hint="eastAsia" w:ascii="宋体" w:hAnsi="宋体" w:eastAsia="宋体" w:cs="宋体"/>
@@ -6654,7 +6663,7 @@
         </w:rPr>
         <w:t xml:space="preserve">中医专用</w:t>
       </w:r>
-      <w:del w:id="333" w:author="Kiro润色" w:date="2026-06-17T00:00:00Z">
+      <w:del w:id="334" w:author="Kiro润色" w:date="2026-06-17T00:00:00Z">
         <w:r>
           <w:rPr>
             <w:rFonts w:hint="eastAsia" w:ascii="宋体" w:hAnsi="宋体" w:eastAsia="宋体" w:cs="宋体"/>
@@ -6663,7 +6672,7 @@
           <w:delText xml:space="preserve">LLM</w:delText>
         </w:r>
       </w:del>
-      <w:ins w:id="334" w:author="Kiro润色" w:date="2026-06-17T00:00:00Z">
+      <w:ins w:id="335" w:author="Kiro润色" w:date="2026-06-17T00:00:00Z">
         <w:r>
           <w:rPr>
             <w:rFonts w:hint="eastAsia" w:ascii="宋体" w:hAnsi="宋体" w:eastAsia="宋体" w:cs="宋体"/>
@@ -6679,7 +6688,7 @@
         </w:rPr>
         <w:t xml:space="preserve">在病机推断</w:t>
       </w:r>
-      <w:del w:id="335" w:author="Kiro润色" w:date="2026-06-17T00:00:00Z">
+      <w:del w:id="336" w:author="Kiro润色" w:date="2026-06-17T00:00:00Z">
         <w:r>
           <w:rPr>
             <w:rFonts w:hint="eastAsia" w:ascii="宋体" w:hAnsi="宋体" w:eastAsia="宋体" w:cs="宋体"/>
@@ -6688,7 +6697,7 @@
           <w:delText xml:space="preserve">与</w:delText>
         </w:r>
       </w:del>
-      <w:ins w:id="336" w:author="Kiro润色" w:date="2026-06-17T00:00:00Z">
+      <w:ins w:id="337" w:author="Kiro润色" w:date="2026-06-17T00:00:00Z">
         <w:r>
           <w:rPr>
             <w:rFonts w:hint="eastAsia" w:ascii="宋体" w:hAnsi="宋体" w:eastAsia="宋体" w:cs="宋体"/>
@@ -6704,7 +6713,7 @@
         </w:rPr>
         <w:t xml:space="preserve">证候推断上</w:t>
       </w:r>
-      <w:del w:id="337" w:author="Kiro润色" w:date="2026-06-17T00:00:00Z">
+      <w:del w:id="338" w:author="Kiro润色" w:date="2026-06-17T00:00:00Z">
         <w:r>
           <w:rPr>
             <w:rFonts w:hint="eastAsia" w:ascii="宋体" w:hAnsi="宋体" w:eastAsia="宋体" w:cs="宋体"/>
@@ -6720,7 +6729,7 @@
         </w:rPr>
         <w:t xml:space="preserve">准确率</w:t>
       </w:r>
-      <w:del w:id="338" w:author="Kiro润色" w:date="2026-06-17T00:00:00Z">
+      <w:del w:id="339" w:author="Kiro润色" w:date="2026-06-17T00:00:00Z">
         <w:r>
           <w:rPr>
             <w:rFonts w:hint="eastAsia" w:ascii="宋体" w:hAnsi="宋体" w:eastAsia="宋体" w:cs="宋体"/>
@@ -6729,7 +6738,7 @@
           <w:delText xml:space="preserve">均</w:delText>
         </w:r>
       </w:del>
-      <w:ins w:id="339" w:author="Kiro润色" w:date="2026-06-17T00:00:00Z">
+      <w:ins w:id="340" w:author="Kiro润色" w:date="2026-06-17T00:00:00Z">
         <w:r>
           <w:rPr>
             <w:rFonts w:hint="eastAsia" w:ascii="宋体" w:hAnsi="宋体" w:eastAsia="宋体" w:cs="宋体"/>
@@ -6745,7 +6754,7 @@
         </w:rPr>
         <w:t xml:space="preserve">较为有限，而</w:t>
       </w:r>
-      <w:del w:id="340" w:author="Kiro润色" w:date="2026-06-17T00:00:00Z">
+      <w:del w:id="341" w:author="Kiro润色" w:date="2026-06-17T00:00:00Z">
         <w:r>
           <w:rPr>
             <w:rFonts w:hint="eastAsia" w:ascii="宋体" w:hAnsi="宋体" w:eastAsia="宋体" w:cs="宋体"/>
@@ -6754,7 +6763,7 @@
           <w:delText xml:space="preserve">采用其提出的“</w:delText>
         </w:r>
       </w:del>
-      <w:ins w:id="341" w:author="Kiro润色" w:date="2026-06-17T00:00:00Z">
+      <w:ins w:id="342" w:author="Kiro润色" w:date="2026-06-17T00:00:00Z">
         <w:r>
           <w:rPr>
             <w:rFonts w:hint="eastAsia" w:ascii="宋体" w:hAnsi="宋体" w:eastAsia="宋体" w:cs="宋体"/>
@@ -6770,7 +6779,7 @@
         </w:rPr>
         <w:t xml:space="preserve">开卷考试式指令微调</w:t>
       </w:r>
-      <w:del w:id="342" w:author="Kiro润色" w:date="2026-06-17T00:00:00Z">
+      <w:del w:id="343" w:author="Kiro润色" w:date="2026-06-17T00:00:00Z">
         <w:r>
           <w:rPr>
             <w:rFonts w:hint="eastAsia" w:ascii="宋体" w:hAnsi="宋体" w:eastAsia="宋体" w:cs="宋体"/>
@@ -6786,7 +6795,7 @@
         </w:rPr>
         <w:t xml:space="preserve">后</w:t>
       </w:r>
-      <w:del w:id="343" w:author="Kiro润色" w:date="2026-06-17T00:00:00Z">
+      <w:del w:id="344" w:author="Kiro润色" w:date="2026-06-17T00:00:00Z">
         <w:r>
           <w:rPr>
             <w:rFonts w:hint="eastAsia" w:ascii="宋体" w:hAnsi="宋体" w:eastAsia="宋体" w:cs="宋体"/>
@@ -6802,7 +6811,7 @@
         </w:rPr>
         <w:t xml:space="preserve">性能</w:t>
       </w:r>
-      <w:ins w:id="344" w:author="Kiro润色" w:date="2026-06-17T00:00:00Z">
+      <w:ins w:id="345" w:author="Kiro润色" w:date="2026-06-17T00:00:00Z">
         <w:r>
           <w:rPr>
             <w:rFonts w:hint="eastAsia" w:ascii="宋体" w:hAnsi="宋体" w:eastAsia="宋体" w:cs="宋体"/>
@@ -6818,7 +6827,7 @@
         </w:rPr>
         <w:t xml:space="preserve">获</w:t>
       </w:r>
-      <w:del w:id="345" w:author="Kiro润色" w:date="2026-06-17T00:00:00Z">
+      <w:del w:id="346" w:author="Kiro润色" w:date="2026-06-17T00:00:00Z">
         <w:r>
           <w:rPr>
             <w:rFonts w:hint="eastAsia" w:ascii="宋体" w:hAnsi="宋体" w:eastAsia="宋体" w:cs="宋体"/>
@@ -6827,7 +6836,7 @@
           <w:delText xml:space="preserve">得</w:delText>
         </w:r>
       </w:del>
-      <w:ins w:id="346" w:author="Kiro润色" w:date="2026-06-17T00:00:00Z">
+      <w:ins w:id="347" w:author="Kiro润色" w:date="2026-06-17T00:00:00Z">
         <w:r>
           <w:rPr>
             <w:rFonts w:hint="eastAsia" w:ascii="宋体" w:hAnsi="宋体" w:eastAsia="宋体" w:cs="宋体"/>
@@ -6843,7 +6852,7 @@
         </w:rPr>
         <w:t xml:space="preserve">显</w:t>
       </w:r>
-      <w:del w:id="347" w:author="Kiro润色" w:date="2026-06-17T00:00:00Z">
+      <w:del w:id="348" w:author="Kiro润色" w:date="2026-06-17T00:00:00Z">
         <w:r>
           <w:rPr>
             <w:rFonts w:hint="eastAsia" w:ascii="宋体" w:hAnsi="宋体" w:eastAsia="宋体" w:cs="宋体"/>
@@ -6859,7 +6868,7 @@
         </w:rPr>
         <w:t xml:space="preserve">提升</w:t>
       </w:r>
-      <w:ins w:id="348" w:author="Kiro润色" w:date="2026-06-17T00:00:00Z">
+      <w:ins w:id="349" w:author="Kiro润色" w:date="2026-06-17T00:00:00Z">
         <w:r>
           <w:rPr>
             <w:rFonts w:hint="eastAsia" w:ascii="宋体" w:hAnsi="宋体" w:eastAsia="宋体" w:cs="宋体"/>
@@ -6875,7 +6884,7 @@
         </w:rPr>
         <w:t xml:space="preserve">。</w:t>
       </w:r>
-      <w:del w:id="349" w:author="Kiro润色" w:date="2026-06-17T00:00:00Z">
+      <w:del w:id="350" w:author="Kiro润色" w:date="2026-06-17T00:00:00Z">
         <w:r>
           <w:rPr>
             <w:rFonts w:hint="eastAsia" w:ascii="宋体" w:hAnsi="宋体" w:eastAsia="宋体" w:cs="宋体"/>
@@ -6884,7 +6893,7 @@
           <w:delText xml:space="preserve">上述结果表</w:delText>
         </w:r>
       </w:del>
-      <w:ins w:id="350" w:author="Kiro润色" w:date="2026-06-17T00:00:00Z">
+      <w:ins w:id="351" w:author="Kiro润色" w:date="2026-06-17T00:00:00Z">
         <w:r>
           <w:rPr>
             <w:rFonts w:hint="eastAsia" w:ascii="宋体" w:hAnsi="宋体" w:eastAsia="宋体" w:cs="宋体"/>
@@ -6900,7 +6909,7 @@
         </w:rPr>
         <w:t xml:space="preserve">明</w:t>
       </w:r>
-      <w:del w:id="351" w:author="Kiro润色" w:date="2026-06-17T00:00:00Z">
+      <w:del w:id="352" w:author="Kiro润色" w:date="2026-06-17T00:00:00Z">
         <w:r>
           <w:rPr>
             <w:rFonts w:hint="eastAsia" w:ascii="宋体" w:hAnsi="宋体" w:eastAsia="宋体" w:cs="宋体"/>
@@ -6916,7 +6925,7 @@
         </w:rPr>
         <w:t xml:space="preserve">单纯</w:t>
       </w:r>
-      <w:del w:id="352" w:author="Kiro润色" w:date="2026-06-17T00:00:00Z">
+      <w:del w:id="353" w:author="Kiro润色" w:date="2026-06-17T00:00:00Z">
         <w:r>
           <w:rPr>
             <w:rFonts w:hint="eastAsia" w:ascii="宋体" w:hAnsi="宋体" w:eastAsia="宋体" w:cs="宋体"/>
@@ -6925,7 +6934,7 @@
           <w:delText xml:space="preserve">的</w:delText>
         </w:r>
       </w:del>
-      <w:ins w:id="353" w:author="Kiro润色" w:date="2026-06-17T00:00:00Z">
+      <w:ins w:id="354" w:author="Kiro润色" w:date="2026-06-17T00:00:00Z">
         <w:r>
           <w:rPr>
             <w:rFonts w:hint="eastAsia" w:ascii="宋体" w:hAnsi="宋体" w:eastAsia="宋体" w:cs="宋体"/>
@@ -6941,7 +6950,7 @@
         </w:rPr>
         <w:t xml:space="preserve">知识</w:t>
       </w:r>
-      <w:del w:id="354" w:author="Kiro润色" w:date="2026-06-17T00:00:00Z">
+      <w:del w:id="355" w:author="Kiro润色" w:date="2026-06-17T00:00:00Z">
         <w:r>
           <w:rPr>
             <w:rFonts w:hint="eastAsia" w:ascii="宋体" w:hAnsi="宋体" w:eastAsia="宋体" w:cs="宋体"/>
@@ -6957,7 +6966,7 @@
         </w:rPr>
         <w:t xml:space="preserve">不足以</w:t>
       </w:r>
-      <w:del w:id="355" w:author="Kiro润色" w:date="2026-06-17T00:00:00Z">
+      <w:del w:id="356" w:author="Kiro润色" w:date="2026-06-17T00:00:00Z">
         <w:r>
           <w:rPr>
             <w:rFonts w:hint="eastAsia" w:ascii="宋体" w:hAnsi="宋体" w:eastAsia="宋体" w:cs="宋体"/>
@@ -6966,7 +6975,7 @@
           <w:delText xml:space="preserve">使</w:delText>
         </w:r>
       </w:del>
-      <w:ins w:id="356" w:author="Kiro润色" w:date="2026-06-17T00:00:00Z">
+      <w:ins w:id="357" w:author="Kiro润色" w:date="2026-06-17T00:00:00Z">
         <w:r>
           <w:rPr>
             <w:rFonts w:hint="eastAsia" w:ascii="宋体" w:hAnsi="宋体" w:eastAsia="宋体" w:cs="宋体"/>
@@ -6982,7 +6991,7 @@
         </w:rPr>
         <w:t xml:space="preserve">模型掌握</w:t>
       </w:r>
-      <w:del w:id="357" w:author="Kiro润色" w:date="2026-06-17T00:00:00Z">
+      <w:del w:id="358" w:author="Kiro润色" w:date="2026-06-17T00:00:00Z">
         <w:r>
           <w:rPr>
             <w:rFonts w:hint="eastAsia" w:ascii="宋体" w:hAnsi="宋体" w:eastAsia="宋体" w:cs="宋体"/>
@@ -6998,7 +7007,7 @@
         </w:rPr>
         <w:t xml:space="preserve">辨证思维，</w:t>
       </w:r>
-      <w:del w:id="358" w:author="Kiro润色" w:date="2026-06-17T00:00:00Z">
+      <w:del w:id="359" w:author="Kiro润色" w:date="2026-06-17T00:00:00Z">
         <w:r>
           <w:rPr>
             <w:rFonts w:hint="eastAsia" w:ascii="宋体" w:hAnsi="宋体" w:eastAsia="宋体" w:cs="宋体"/>
@@ -7007,7 +7016,7 @@
           <w:delText xml:space="preserve">需借助</w:delText>
         </w:r>
       </w:del>
-      <w:ins w:id="359" w:author="Kiro润色" w:date="2026-06-17T00:00:00Z">
+      <w:ins w:id="360" w:author="Kiro润色" w:date="2026-06-17T00:00:00Z">
         <w:r>
           <w:rPr>
             <w:rFonts w:hint="eastAsia" w:ascii="宋体" w:hAnsi="宋体" w:eastAsia="宋体" w:cs="宋体"/>
@@ -7023,7 +7032,7 @@
         </w:rPr>
         <w:t xml:space="preserve">特定策略引导模型遵循中医逻辑</w:t>
       </w:r>
-      <w:del w:id="360" w:author="Kiro润色" w:date="2026-06-17T00:00:00Z">
+      <w:del w:id="361" w:author="Kiro润色" w:date="2026-06-17T00:00:00Z">
         <w:r>
           <w:rPr>
             <w:rFonts w:hint="eastAsia" w:ascii="宋体" w:hAnsi="宋体" w:eastAsia="宋体" w:cs="宋体"/>
@@ -7032,7 +7041,7 @@
           <w:delText xml:space="preserve">进行</w:delText>
         </w:r>
       </w:del>
-      <w:ins w:id="361" w:author="Kiro润色" w:date="2026-06-17T00:00:00Z">
+      <w:ins w:id="362" w:author="Kiro润色" w:date="2026-06-17T00:00:00Z">
         <w:r>
           <w:rPr>
             <w:rFonts w:hint="eastAsia" w:ascii="宋体" w:hAnsi="宋体" w:eastAsia="宋体" w:cs="宋体"/>
@@ -7073,7 +7082,7 @@
           <w:rFonts w:hint="eastAsia" w:ascii="宋体" w:hAnsi="宋体" w:eastAsia="宋体" w:cs="宋体"/>
         </w:rPr>
       </w:pPr>
-      <w:del w:id="362" w:author="Kiro润色" w:date="2026-06-17T00:00:00Z">
+      <w:del w:id="363" w:author="Kiro润色" w:date="2026-06-17T00:00:00Z">
         <w:r>
           <w:rPr>
             <w:rFonts w:hint="eastAsia" w:eastAsia="宋体" w:cs="宋体"/>
@@ -7083,7 +7092,7 @@
           <w:delText xml:space="preserve">部分模型</w:delText>
         </w:r>
       </w:del>
-      <w:ins w:id="363" w:author="Kiro润色" w:date="2026-06-17T00:00:00Z">
+      <w:ins w:id="364" w:author="Kiro润色" w:date="2026-06-17T00:00:00Z">
         <w:r>
           <w:rPr>
             <w:rFonts w:hint="eastAsia" w:eastAsia="宋体" w:cs="宋体"/>
@@ -7101,7 +7110,7 @@
         </w:rPr>
         <w:t xml:space="preserve">在标准考试中表现良好</w:t>
       </w:r>
-      <w:ins w:id="364" w:author="Kiro润色" w:date="2026-06-17T00:00:00Z">
+      <w:ins w:id="365" w:author="Kiro润色" w:date="2026-06-17T00:00:00Z">
         <w:r>
           <w:rPr>
             <w:rFonts w:hint="eastAsia" w:eastAsia="宋体" w:cs="宋体"/>
@@ -7119,7 +7128,7 @@
         </w:rPr>
         <w:t xml:space="preserve">，在错误信息检测任务上准确率</w:t>
       </w:r>
-      <w:ins w:id="365" w:author="Kiro润色" w:date="2026-06-17T00:00:00Z">
+      <w:ins w:id="366" w:author="Kiro润色" w:date="2026-06-17T00:00:00Z">
         <w:r>
           <w:rPr>
             <w:rFonts w:hint="eastAsia" w:eastAsia="宋体" w:cs="宋体"/>
@@ -7137,7 +7146,7 @@
         </w:rPr>
         <w:t xml:space="preserve">降至20%</w:t>
       </w:r>
-      <w:del w:id="366" w:author="Kiro润色" w:date="2026-06-17T00:00:00Z">
+      <w:del w:id="367" w:author="Kiro润色" w:date="2026-06-17T00:00:00Z">
         <w:r>
           <w:rPr>
             <w:rFonts w:hint="eastAsia" w:eastAsia="宋体" w:cs="宋体"/>
@@ -7147,7 +7156,7 @@
           <w:delText xml:space="preserve">-</w:delText>
         </w:r>
       </w:del>
-      <w:ins w:id="367" w:author="Kiro润色" w:date="2026-06-17T00:00:00Z">
+      <w:ins w:id="368" w:author="Kiro润色" w:date="2026-06-17T00:00:00Z">
         <w:r>
           <w:rPr>
             <w:rFonts w:hint="eastAsia" w:eastAsia="宋体" w:cs="宋体"/>
@@ -7165,7 +7174,7 @@
         </w:rPr>
         <w:t xml:space="preserve">39%</w:t>
       </w:r>
-      <w:del w:id="368" w:author="Kiro润色" w:date="2026-06-17T00:00:00Z">
+      <w:del w:id="369" w:author="Kiro润色" w:date="2026-06-17T00:00:00Z">
         <w:r>
           <w:rPr>
             <w:rFonts w:hint="eastAsia" w:eastAsia="宋体" w:cs="宋体"/>
@@ -7183,7 +7192,7 @@
         </w:rPr>
         <w:t xml:space="preserve">，</w:t>
       </w:r>
-      <w:ins w:id="369" w:author="Kiro润色" w:date="2026-06-17T00:00:00Z">
+      <w:ins w:id="370" w:author="Kiro润色" w:date="2026-06-17T00:00:00Z">
         <w:r>
           <w:rPr>
             <w:rFonts w:hint="eastAsia" w:eastAsia="宋体" w:cs="宋体"/>
@@ -7201,7 +7210,7 @@
         </w:rPr>
         <w:t xml:space="preserve">答题</w:t>
       </w:r>
-      <w:ins w:id="370" w:author="Kiro润色" w:date="2026-06-17T00:00:00Z">
+      <w:ins w:id="371" w:author="Kiro润色" w:date="2026-06-17T00:00:00Z">
         <w:r>
           <w:rPr>
             <w:rFonts w:hint="eastAsia" w:eastAsia="宋体" w:cs="宋体"/>
@@ -7219,7 +7228,7 @@
         </w:rPr>
         <w:t xml:space="preserve">能</w:t>
       </w:r>
-      <w:del w:id="371" w:author="Kiro润色" w:date="2026-06-17T00:00:00Z">
+      <w:del w:id="372" w:author="Kiro润色" w:date="2026-06-17T00:00:00Z">
         <w:r>
           <w:rPr>
             <w:rFonts w:hint="eastAsia" w:eastAsia="宋体" w:cs="宋体"/>
@@ -7229,7 +7238,7 @@
           <w:delText xml:space="preserve">力与真</w:delText>
         </w:r>
       </w:del>
-      <w:ins w:id="372" w:author="Kiro润色" w:date="2026-06-17T00:00:00Z">
+      <w:ins w:id="373" w:author="Kiro润色" w:date="2026-06-17T00:00:00Z">
         <w:r>
           <w:rPr>
             <w:rFonts w:hint="eastAsia" w:eastAsia="宋体" w:cs="宋体"/>
@@ -7247,7 +7256,7 @@
         </w:rPr>
         <w:t xml:space="preserve">伪</w:t>
       </w:r>
-      <w:del w:id="373" w:author="Kiro润色" w:date="2026-06-17T00:00:00Z">
+      <w:del w:id="374" w:author="Kiro润色" w:date="2026-06-17T00:00:00Z">
         <w:r>
           <w:rPr>
             <w:rFonts w:hint="eastAsia" w:eastAsia="宋体" w:cs="宋体"/>
@@ -7257,7 +7266,7 @@
           <w:delText xml:space="preserve">辨识能力之间存在显著落差</w:delText>
         </w:r>
       </w:del>
-      <w:ins w:id="374" w:author="Kiro润色" w:date="2026-06-17T00:00:00Z">
+      <w:ins w:id="375" w:author="Kiro润色" w:date="2026-06-17T00:00:00Z">
         <w:r>
           <w:rPr>
             <w:rFonts w:hint="eastAsia" w:eastAsia="宋体" w:cs="宋体"/>
@@ -7275,7 +7284,7 @@
         </w:rPr>
         <w:t xml:space="preserve">[11]。处方审核基准直接</w:t>
       </w:r>
-      <w:del w:id="375" w:author="Kiro润色" w:date="2026-06-17T00:00:00Z">
+      <w:del w:id="376" w:author="Kiro润色" w:date="2026-06-17T00:00:00Z">
         <w:r>
           <w:rPr>
             <w:rFonts w:hint="eastAsia" w:eastAsia="宋体" w:cs="宋体"/>
@@ -7293,7 +7302,7 @@
         </w:rPr>
         <w:t xml:space="preserve">对</w:t>
       </w:r>
-      <w:ins w:id="376" w:author="Kiro润色" w:date="2026-06-17T00:00:00Z">
+      <w:ins w:id="377" w:author="Kiro润色" w:date="2026-06-17T00:00:00Z">
         <w:r>
           <w:rPr>
             <w:rFonts w:hint="eastAsia" w:eastAsia="宋体" w:cs="宋体"/>
@@ -7311,7 +7320,7 @@
         </w:rPr>
         <w:t xml:space="preserve">用药安全这一核心临床风险[12]</w:t>
       </w:r>
-      <w:del w:id="377" w:author="Kiro润色" w:date="2026-06-17T00:00:00Z">
+      <w:del w:id="378" w:author="Kiro润色" w:date="2026-06-17T00:00:00Z">
         <w:r>
           <w:rPr>
             <w:rFonts w:hint="eastAsia" w:eastAsia="宋体" w:cs="宋体"/>
@@ -7321,7 +7330,7 @@
           <w:delText xml:space="preserve">。Zhao等[22]</w:delText>
         </w:r>
       </w:del>
-      <w:ins w:id="378" w:author="Kiro润色" w:date="2026-06-17T00:00:00Z">
+      <w:ins w:id="379" w:author="Kiro润色" w:date="2026-06-17T00:00:00Z">
         <w:r>
           <w:rPr>
             <w:rFonts w:hint="eastAsia" w:eastAsia="宋体" w:cs="宋体"/>
@@ -7339,7 +7348,7 @@
         </w:rPr>
         <w:t xml:space="preserve">从临床实践指南符合度</w:t>
       </w:r>
-      <w:del w:id="379" w:author="Kiro润色" w:date="2026-06-17T00:00:00Z">
+      <w:del w:id="380" w:author="Kiro润色" w:date="2026-06-17T00:00:00Z">
         <w:r>
           <w:rPr>
             <w:rFonts w:hint="eastAsia" w:eastAsia="宋体" w:cs="宋体"/>
@@ -7357,7 +7366,7 @@
         </w:rPr>
         <w:t xml:space="preserve">评估</w:t>
       </w:r>
-      <w:del w:id="380" w:author="Kiro润色" w:date="2026-06-17T00:00:00Z">
+      <w:del w:id="381" w:author="Kiro润色" w:date="2026-06-17T00:00:00Z">
         <w:r>
           <w:rPr>
             <w:rFonts w:hint="eastAsia" w:eastAsia="宋体" w:cs="宋体"/>
@@ -7375,7 +7384,7 @@
         </w:rPr>
         <w:t xml:space="preserve">八个模型</w:t>
       </w:r>
-      <w:del w:id="381" w:author="Kiro润色" w:date="2026-06-17T00:00:00Z">
+      <w:del w:id="382" w:author="Kiro润色" w:date="2026-06-17T00:00:00Z">
         <w:r>
           <w:rPr>
             <w:rFonts w:hint="eastAsia" w:eastAsia="宋体" w:cs="宋体"/>
@@ -7385,7 +7394,7 @@
           <w:delText xml:space="preserve">，</w:delText>
         </w:r>
       </w:del>
-      <w:ins w:id="382" w:author="Kiro润色" w:date="2026-06-17T00:00:00Z">
+      <w:ins w:id="383" w:author="Kiro润色" w:date="2026-06-17T00:00:00Z">
         <w:r>
           <w:rPr>
             <w:rFonts w:hint="eastAsia" w:eastAsia="宋体" w:cs="宋体"/>
@@ -7403,7 +7412,7 @@
         </w:rPr>
         <w:t xml:space="preserve">发现</w:t>
       </w:r>
-      <w:del w:id="383" w:author="Kiro润色" w:date="2026-06-17T00:00:00Z">
+      <w:del w:id="384" w:author="Kiro润色" w:date="2026-06-17T00:00:00Z">
         <w:r>
           <w:rPr>
             <w:rFonts w:hint="eastAsia" w:eastAsia="宋体" w:cs="宋体"/>
@@ -7413,7 +7422,7 @@
           <w:delText xml:space="preserve">其</w:delText>
         </w:r>
       </w:del>
-      <w:ins w:id="384" w:author="Kiro润色" w:date="2026-06-17T00:00:00Z">
+      <w:ins w:id="385" w:author="Kiro润色" w:date="2026-06-17T00:00:00Z">
         <w:r>
           <w:rPr>
             <w:rFonts w:hint="eastAsia" w:eastAsia="宋体" w:cs="宋体"/>
@@ -7431,7 +7440,7 @@
         </w:rPr>
         <w:t xml:space="preserve">在用药安全提示与指南一致性</w:t>
       </w:r>
-      <w:del w:id="385" w:author="Kiro润色" w:date="2026-06-17T00:00:00Z">
+      <w:del w:id="386" w:author="Kiro润色" w:date="2026-06-17T00:00:00Z">
         <w:r>
           <w:rPr>
             <w:rFonts w:hint="eastAsia" w:eastAsia="宋体" w:cs="宋体"/>
@@ -7441,7 +7450,7 @@
           <w:delText xml:space="preserve">方面表现</w:delText>
         </w:r>
       </w:del>
-      <w:ins w:id="386" w:author="Kiro润色" w:date="2026-06-17T00:00:00Z">
+      <w:ins w:id="387" w:author="Kiro润色" w:date="2026-06-17T00:00:00Z">
         <w:r>
           <w:rPr>
             <w:rFonts w:hint="eastAsia" w:eastAsia="宋体" w:cs="宋体"/>
@@ -7459,7 +7468,7 @@
         </w:rPr>
         <w:t xml:space="preserve">参差不齐</w:t>
       </w:r>
-      <w:del w:id="387" w:author="Kiro润色" w:date="2026-06-17T00:00:00Z">
+      <w:del w:id="388" w:author="Kiro润色" w:date="2026-06-17T00:00:00Z">
         <w:r>
           <w:rPr>
             <w:rFonts w:hint="eastAsia" w:eastAsia="宋体" w:cs="宋体"/>
@@ -7469,7 +7478,7 @@
           <w:delText xml:space="preserve">。其他评估也表明</w:delText>
         </w:r>
       </w:del>
-      <w:ins w:id="388" w:author="Kiro润色" w:date="2026-06-17T00:00:00Z">
+      <w:ins w:id="389" w:author="Kiro润色" w:date="2026-06-17T00:00:00Z">
         <w:r>
           <w:rPr>
             <w:rFonts w:hint="eastAsia" w:eastAsia="宋体" w:cs="宋体"/>
@@ -7487,7 +7496,7 @@
         </w:rPr>
         <w:t xml:space="preserve">，即</w:t>
       </w:r>
-      <w:del w:id="389" w:author="Kiro润色" w:date="2026-06-17T00:00:00Z">
+      <w:del w:id="390" w:author="Kiro润色" w:date="2026-06-17T00:00:00Z">
         <w:r>
           <w:rPr>
             <w:rFonts w:hint="eastAsia" w:eastAsia="宋体" w:cs="宋体"/>
@@ -7497,7 +7506,7 @@
           <w:delText xml:space="preserve">使模型</w:delText>
         </w:r>
       </w:del>
-      <w:ins w:id="390" w:author="Kiro润色" w:date="2026-06-17T00:00:00Z">
+      <w:ins w:id="391" w:author="Kiro润色" w:date="2026-06-17T00:00:00Z">
         <w:r>
           <w:rPr>
             <w:rFonts w:hint="eastAsia" w:eastAsia="宋体" w:cs="宋体"/>
@@ -7515,7 +7524,7 @@
         </w:rPr>
         <w:t xml:space="preserve">通过</w:t>
       </w:r>
-      <w:del w:id="391" w:author="Kiro润色" w:date="2026-06-17T00:00:00Z">
+      <w:del w:id="392" w:author="Kiro润色" w:date="2026-06-17T00:00:00Z">
         <w:r>
           <w:rPr>
             <w:rFonts w:hint="eastAsia" w:eastAsia="宋体" w:cs="宋体"/>
@@ -7533,7 +7542,7 @@
         </w:rPr>
         <w:t xml:space="preserve">中医考试，其生成内容的内部逻辑</w:t>
       </w:r>
-      <w:del w:id="392" w:author="Kiro润色" w:date="2026-06-17T00:00:00Z">
+      <w:del w:id="393" w:author="Kiro润色" w:date="2026-06-17T00:00:00Z">
         <w:r>
           <w:rPr>
             <w:rFonts w:hint="eastAsia" w:eastAsia="宋体" w:cs="宋体"/>
@@ -7551,7 +7560,7 @@
         </w:rPr>
         <w:t xml:space="preserve">、与外部知识的一致性及安全性仍需严格审查[23]。</w:t>
       </w:r>
-      <w:ins w:id="393" w:author="Kiro润色" w:date="2026-06-17T00:00:00Z">
+      <w:ins w:id="394" w:author="Kiro润色" w:date="2026-06-17T00:00:00Z">
         <w:r>
           <w:rPr>
             <w:rFonts w:hint="eastAsia" w:eastAsia="宋体" w:cs="宋体"/>
@@ -7569,7 +7578,7 @@
         </w:rPr>
         <w:t xml:space="preserve">未来</w:t>
       </w:r>
-      <w:del w:id="394" w:author="Kiro润色" w:date="2026-06-17T00:00:00Z">
+      <w:del w:id="395" w:author="Kiro润色" w:date="2026-06-17T00:00:00Z">
         <w:r>
           <w:rPr>
             <w:rFonts w:hint="eastAsia" w:eastAsia="宋体" w:cs="宋体"/>
@@ -7587,7 +7596,7 @@
         </w:rPr>
         <w:t xml:space="preserve">评测应</w:t>
       </w:r>
-      <w:del w:id="395" w:author="Kiro润色" w:date="2026-06-17T00:00:00Z">
+      <w:del w:id="396" w:author="Kiro润色" w:date="2026-06-17T00:00:00Z">
         <w:r>
           <w:rPr>
             <w:rFonts w:hint="eastAsia" w:eastAsia="宋体" w:cs="宋体"/>
@@ -7597,7 +7606,7 @@
           <w:delText xml:space="preserve">当将</w:delText>
         </w:r>
       </w:del>
-      <w:ins w:id="396" w:author="Kiro润色" w:date="2026-06-17T00:00:00Z">
+      <w:ins w:id="397" w:author="Kiro润色" w:date="2026-06-17T00:00:00Z">
         <w:r>
           <w:rPr>
             <w:rFonts w:hint="eastAsia" w:eastAsia="宋体" w:cs="宋体"/>
@@ -7615,7 +7624,7 @@
         </w:rPr>
         <w:t xml:space="preserve">安全性置于与准确性同等、甚至更</w:t>
       </w:r>
-      <w:del w:id="397" w:author="Kiro润色" w:date="2026-06-17T00:00:00Z">
+      <w:del w:id="398" w:author="Kiro润色" w:date="2026-06-17T00:00:00Z">
         <w:r>
           <w:rPr>
             <w:rFonts w:hint="eastAsia" w:eastAsia="宋体" w:cs="宋体"/>
@@ -7633,7 +7642,7 @@
         </w:rPr>
         <w:t xml:space="preserve">优先的</w:t>
       </w:r>
-      <w:del w:id="398" w:author="Kiro润色" w:date="2026-06-17T00:00:00Z">
+      <w:del w:id="399" w:author="Kiro润色" w:date="2026-06-17T00:00:00Z">
         <w:r>
           <w:rPr>
             <w:rFonts w:hint="eastAsia" w:eastAsia="宋体" w:cs="宋体"/>
@@ -7651,7 +7660,7 @@
         </w:rPr>
         <w:t xml:space="preserve">位</w:t>
       </w:r>
-      <w:del w:id="399" w:author="Kiro润色" w:date="2026-06-17T00:00:00Z">
+      <w:del w:id="400" w:author="Kiro润色" w:date="2026-06-17T00:00:00Z">
         <w:r>
           <w:rPr>
             <w:rFonts w:hint="eastAsia" w:eastAsia="宋体" w:cs="宋体"/>
@@ -7661,7 +7670,7 @@
           <w:delText xml:space="preserve">[11]</w:delText>
         </w:r>
       </w:del>
-      <w:ins w:id="400" w:author="Kiro润色" w:date="2026-06-17T00:00:00Z">
+      <w:ins w:id="401" w:author="Kiro润色" w:date="2026-06-17T00:00:00Z">
         <w:r>
           <w:rPr>
             <w:rFonts w:hint="eastAsia" w:eastAsia="宋体" w:cs="宋体"/>
@@ -7711,7 +7720,7 @@
         </w:rPr>
         <w:t xml:space="preserve">语言</w:t>
       </w:r>
-      <w:del w:id="401" w:author="Kiro润色" w:date="2026-06-17T00:00:00Z">
+      <w:del w:id="402" w:author="Kiro润色" w:date="2026-06-17T00:00:00Z">
         <w:r>
           <w:rPr>
             <w:rFonts w:hint="eastAsia" w:ascii="宋体" w:hAnsi="宋体" w:eastAsia="宋体" w:cs="宋体"/>
@@ -7720,7 +7729,7 @@
           <w:delText xml:space="preserve">和</w:delText>
         </w:r>
       </w:del>
-      <w:ins w:id="402" w:author="Kiro润色" w:date="2026-06-17T00:00:00Z">
+      <w:ins w:id="403" w:author="Kiro润色" w:date="2026-06-17T00:00:00Z">
         <w:r>
           <w:rPr>
             <w:rFonts w:hint="eastAsia" w:ascii="宋体" w:hAnsi="宋体" w:eastAsia="宋体" w:cs="宋体"/>
@@ -7736,7 +7745,7 @@
         </w:rPr>
         <w:t xml:space="preserve">文化背景</w:t>
       </w:r>
-      <w:ins w:id="403" w:author="Kiro润色" w:date="2026-06-17T00:00:00Z">
+      <w:ins w:id="404" w:author="Kiro润色" w:date="2026-06-17T00:00:00Z">
         <w:r>
           <w:rPr>
             <w:rFonts w:hint="eastAsia" w:ascii="宋体" w:hAnsi="宋体" w:eastAsia="宋体" w:cs="宋体"/>
@@ -7752,7 +7761,7 @@
         </w:rPr>
         <w:t xml:space="preserve">显</w:t>
       </w:r>
-      <w:del w:id="404" w:author="Kiro润色" w:date="2026-06-17T00:00:00Z">
+      <w:del w:id="405" w:author="Kiro润色" w:date="2026-06-17T00:00:00Z">
         <w:r>
           <w:rPr>
             <w:rFonts w:hint="eastAsia" w:ascii="宋体" w:hAnsi="宋体" w:eastAsia="宋体" w:cs="宋体"/>
@@ -7768,7 +7777,7 @@
         </w:rPr>
         <w:t xml:space="preserve">影响模型表现。</w:t>
       </w:r>
-      <w:del w:id="405" w:author="Kiro润色" w:date="2026-06-17T00:00:00Z">
+      <w:del w:id="406" w:author="Kiro润色" w:date="2026-06-17T00:00:00Z">
         <w:r>
           <w:rPr>
             <w:rFonts w:hint="eastAsia" w:ascii="宋体" w:hAnsi="宋体" w:eastAsia="宋体" w:cs="宋体"/>
@@ -7784,7 +7793,7 @@
         </w:rPr>
         <w:t xml:space="preserve">GPT-4在韩</w:t>
       </w:r>
-      <w:del w:id="406" w:author="Kiro润色" w:date="2026-06-17T00:00:00Z">
+      <w:del w:id="407" w:author="Kiro润色" w:date="2026-06-17T00:00:00Z">
         <w:r>
           <w:rPr>
             <w:rFonts w:hint="eastAsia" w:ascii="宋体" w:hAnsi="宋体" w:eastAsia="宋体" w:cs="宋体"/>
@@ -7800,7 +7809,7 @@
         </w:rPr>
         <w:t xml:space="preserve">医</w:t>
       </w:r>
-      <w:del w:id="407" w:author="Kiro润色" w:date="2026-06-17T00:00:00Z">
+      <w:del w:id="408" w:author="Kiro润色" w:date="2026-06-17T00:00:00Z">
         <w:r>
           <w:rPr>
             <w:rFonts w:hint="eastAsia" w:ascii="宋体" w:hAnsi="宋体" w:eastAsia="宋体" w:cs="宋体"/>
@@ -7816,7 +7825,7 @@
         </w:rPr>
         <w:t xml:space="preserve">考试中</w:t>
       </w:r>
-      <w:del w:id="408" w:author="Kiro润色" w:date="2026-06-17T00:00:00Z">
+      <w:del w:id="409" w:author="Kiro润色" w:date="2026-06-17T00:00:00Z">
         <w:r>
           <w:rPr>
             <w:rFonts w:hint="eastAsia" w:ascii="宋体" w:hAnsi="宋体" w:eastAsia="宋体" w:cs="宋体"/>
@@ -7832,7 +7841,7 @@
         </w:rPr>
         <w:t xml:space="preserve">处理文化特定性医学知识时的</w:t>
       </w:r>
-      <w:del w:id="409" w:author="Kiro润色" w:date="2026-06-17T00:00:00Z">
+      <w:del w:id="410" w:author="Kiro润色" w:date="2026-06-17T00:00:00Z">
         <w:r>
           <w:rPr>
             <w:rFonts w:hint="eastAsia" w:ascii="宋体" w:hAnsi="宋体" w:eastAsia="宋体" w:cs="宋体"/>
@@ -7841,7 +7850,7 @@
           <w:delText xml:space="preserve">困难</w:delText>
         </w:r>
       </w:del>
-      <w:ins w:id="410" w:author="Kiro润色" w:date="2026-06-17T00:00:00Z">
+      <w:ins w:id="411" w:author="Kiro润色" w:date="2026-06-17T00:00:00Z">
         <w:r>
           <w:rPr>
             <w:rFonts w:hint="eastAsia" w:ascii="宋体" w:hAnsi="宋体" w:eastAsia="宋体" w:cs="宋体"/>
@@ -7857,7 +7866,7 @@
         </w:rPr>
         <w:t xml:space="preserve">[4]</w:t>
       </w:r>
-      <w:del w:id="411" w:author="Kiro润色" w:date="2026-06-17T00:00:00Z">
+      <w:del w:id="412" w:author="Kiro润色" w:date="2026-06-17T00:00:00Z">
         <w:r>
           <w:rPr>
             <w:rFonts w:hint="eastAsia" w:ascii="宋体" w:hAnsi="宋体" w:eastAsia="宋体" w:cs="宋体"/>
@@ -7866,7 +7875,7 @@
           <w:delText xml:space="preserve">；Ghanad等[24]比较GPT与</w:delText>
         </w:r>
       </w:del>
-      <w:ins w:id="412" w:author="Kiro润色" w:date="2026-06-17T00:00:00Z">
+      <w:ins w:id="413" w:author="Kiro润色" w:date="2026-06-17T00:00:00Z">
         <w:r>
           <w:rPr>
             <w:rFonts w:hint="eastAsia" w:ascii="宋体" w:hAnsi="宋体" w:eastAsia="宋体" w:cs="宋体"/>
@@ -7882,7 +7891,7 @@
         </w:rPr>
         <w:t xml:space="preserve">ERNIE</w:t>
       </w:r>
-      <w:ins w:id="413" w:author="Kiro润色" w:date="2026-06-17T00:00:00Z">
+      <w:ins w:id="414" w:author="Kiro润色" w:date="2026-06-17T00:00:00Z">
         <w:r>
           <w:rPr>
             <w:rFonts w:hint="eastAsia" w:ascii="宋体" w:hAnsi="宋体" w:eastAsia="宋体" w:cs="宋体"/>
@@ -7898,7 +7907,7 @@
         </w:rPr>
         <w:t xml:space="preserve">在中国中医执业医师考试上</w:t>
       </w:r>
-      <w:del w:id="414" w:author="Kiro润色" w:date="2026-06-17T00:00:00Z">
+      <w:del w:id="415" w:author="Kiro润色" w:date="2026-06-17T00:00:00Z">
         <w:r>
           <w:rPr>
             <w:rFonts w:hint="eastAsia" w:ascii="宋体" w:hAnsi="宋体" w:eastAsia="宋体" w:cs="宋体"/>
@@ -7914,7 +7923,7 @@
         </w:rPr>
         <w:t xml:space="preserve">以81.7%领先</w:t>
       </w:r>
-      <w:del w:id="415" w:author="Kiro润色" w:date="2026-06-17T00:00:00Z">
+      <w:del w:id="416" w:author="Kiro润色" w:date="2026-06-17T00:00:00Z">
         <w:r>
           <w:rPr>
             <w:rFonts w:hint="eastAsia" w:ascii="宋体" w:hAnsi="宋体" w:eastAsia="宋体" w:cs="宋体"/>
@@ -7930,7 +7939,7 @@
         </w:rPr>
         <w:t xml:space="preserve">GPT-4 turbo的50.7%</w:t>
       </w:r>
-      <w:del w:id="416" w:author="Kiro润色" w:date="2026-06-17T00:00:00Z">
+      <w:del w:id="417" w:author="Kiro润色" w:date="2026-06-17T00:00:00Z">
         <w:r>
           <w:rPr>
             <w:rFonts w:hint="eastAsia" w:ascii="宋体" w:hAnsi="宋体" w:eastAsia="宋体" w:cs="宋体"/>
@@ -7939,7 +7948,7 @@
           <w:delText xml:space="preserve">，</w:delText>
         </w:r>
       </w:del>
-      <w:ins w:id="417" w:author="Kiro润色" w:date="2026-06-17T00:00:00Z">
+      <w:ins w:id="418" w:author="Kiro润色" w:date="2026-06-17T00:00:00Z">
         <w:r>
           <w:rPr>
             <w:rFonts w:hint="eastAsia" w:ascii="宋体" w:hAnsi="宋体" w:eastAsia="宋体" w:cs="宋体"/>
@@ -7955,7 +7964,7 @@
         </w:rPr>
         <w:t xml:space="preserve">而在西医内科题上各模型差距很小</w:t>
       </w:r>
-      <w:del w:id="418" w:author="Kiro润色" w:date="2026-06-17T00:00:00Z">
+      <w:del w:id="419" w:author="Kiro润色" w:date="2026-06-17T00:00:00Z">
         <w:r>
           <w:rPr>
             <w:rFonts w:hint="eastAsia" w:ascii="宋体" w:hAnsi="宋体" w:eastAsia="宋体" w:cs="宋体"/>
@@ -7971,7 +7980,7 @@
         </w:rPr>
         <w:t xml:space="preserve">[2</w:t>
       </w:r>
-      <w:del w:id="419" w:author="Kiro润色" w:date="2026-06-17T00:00:00Z">
+      <w:del w:id="420" w:author="Kiro润色" w:date="2026-06-17T00:00:00Z">
         <w:r>
           <w:rPr>
             <w:rFonts w:hint="eastAsia" w:ascii="宋体" w:hAnsi="宋体" w:eastAsia="宋体" w:cs="宋体"/>
@@ -7980,7 +7989,7 @@
           <w:delText xml:space="preserve">5</w:delText>
         </w:r>
       </w:del>
-      <w:ins w:id="420" w:author="Kiro润色" w:date="2026-06-17T00:00:00Z">
+      <w:ins w:id="421" w:author="Kiro润色" w:date="2026-06-17T00:00:00Z">
         <w:r>
           <w:rPr>
             <w:rFonts w:hint="eastAsia" w:ascii="宋体" w:hAnsi="宋体" w:eastAsia="宋体" w:cs="宋体"/>
@@ -7996,7 +8005,7 @@
         </w:rPr>
         <w:t xml:space="preserve">]</w:t>
       </w:r>
-      <w:del w:id="421" w:author="Kiro润色" w:date="2026-06-17T00:00:00Z">
+      <w:del w:id="422" w:author="Kiro润色" w:date="2026-06-17T00:00:00Z">
         <w:r>
           <w:rPr>
             <w:rFonts w:hint="eastAsia" w:ascii="宋体" w:hAnsi="宋体" w:eastAsia="宋体" w:cs="宋体"/>
@@ -8005,7 +8014,7 @@
           <w:delText xml:space="preserve">进</w:delText>
         </w:r>
       </w:del>
-      <w:ins w:id="422" w:author="Kiro润色" w:date="2026-06-17T00:00:00Z">
+      <w:ins w:id="423" w:author="Kiro润色" w:date="2026-06-17T00:00:00Z">
         <w:r>
           <w:rPr>
             <w:rFonts w:hint="eastAsia" w:ascii="宋体" w:hAnsi="宋体" w:eastAsia="宋体" w:cs="宋体"/>
@@ -8021,7 +8030,7 @@
         </w:rPr>
         <w:t xml:space="preserve">一</w:t>
       </w:r>
-      <w:del w:id="423" w:author="Kiro润色" w:date="2026-06-17T00:00:00Z">
+      <w:del w:id="424" w:author="Kiro润色" w:date="2026-06-17T00:00:00Z">
         <w:r>
           <w:rPr>
             <w:rFonts w:hint="eastAsia" w:ascii="宋体" w:hAnsi="宋体" w:eastAsia="宋体" w:cs="宋体"/>
@@ -8030,7 +8039,7 @@
           <w:delText xml:space="preserve">步指出</w:delText>
         </w:r>
       </w:del>
-      <w:ins w:id="424" w:author="Kiro润色" w:date="2026-06-17T00:00:00Z">
+      <w:ins w:id="425" w:author="Kiro润色" w:date="2026-06-17T00:00:00Z">
         <w:r>
           <w:rPr>
             <w:rFonts w:hint="eastAsia" w:ascii="宋体" w:hAnsi="宋体" w:eastAsia="宋体" w:cs="宋体"/>
@@ -8046,7 +8055,7 @@
         </w:rPr>
         <w:t xml:space="preserve">不同国家研发的模型在中医任务上存在</w:t>
       </w:r>
-      <w:ins w:id="425" w:author="Kiro润色" w:date="2026-06-17T00:00:00Z">
+      <w:ins w:id="426" w:author="Kiro润色" w:date="2026-06-17T00:00:00Z">
         <w:r>
           <w:rPr>
             <w:rFonts w:hint="eastAsia" w:ascii="宋体" w:hAnsi="宋体" w:eastAsia="宋体" w:cs="宋体"/>
@@ -8062,7 +8071,7 @@
         </w:rPr>
         <w:t xml:space="preserve">偏差，</w:t>
       </w:r>
-      <w:del w:id="426" w:author="Kiro润色" w:date="2026-06-17T00:00:00Z">
+      <w:del w:id="427" w:author="Kiro润色" w:date="2026-06-17T00:00:00Z">
         <w:r>
           <w:rPr>
             <w:rFonts w:hint="eastAsia" w:ascii="宋体" w:hAnsi="宋体" w:eastAsia="宋体" w:cs="宋体"/>
@@ -8078,7 +8087,7 @@
         </w:rPr>
         <w:t xml:space="preserve">本地化模型</w:t>
       </w:r>
-      <w:del w:id="427" w:author="Kiro润色" w:date="2026-06-17T00:00:00Z">
+      <w:del w:id="428" w:author="Kiro润色" w:date="2026-06-17T00:00:00Z">
         <w:r>
           <w:rPr>
             <w:rFonts w:hint="eastAsia" w:ascii="宋体" w:hAnsi="宋体" w:eastAsia="宋体" w:cs="宋体"/>
@@ -8087,7 +8096,7 @@
           <w:delText xml:space="preserve">的必要性。研究表明，大部分</w:delText>
         </w:r>
       </w:del>
-      <w:ins w:id="428" w:author="Kiro润色" w:date="2026-06-17T00:00:00Z">
+      <w:ins w:id="429" w:author="Kiro润色" w:date="2026-06-17T00:00:00Z">
         <w:r>
           <w:rPr>
             <w:rFonts w:hint="eastAsia" w:ascii="宋体" w:hAnsi="宋体" w:eastAsia="宋体" w:cs="宋体"/>
@@ -8103,7 +8112,7 @@
         </w:rPr>
         <w:t xml:space="preserve">模型在中文提示下</w:t>
       </w:r>
-      <w:ins w:id="429" w:author="Kiro润色" w:date="2026-06-17T00:00:00Z">
+      <w:ins w:id="430" w:author="Kiro润色" w:date="2026-06-17T00:00:00Z">
         <w:r>
           <w:rPr>
             <w:rFonts w:hint="eastAsia" w:ascii="宋体" w:hAnsi="宋体" w:eastAsia="宋体" w:cs="宋体"/>
@@ -8119,7 +8128,7 @@
         </w:rPr>
         <w:t xml:space="preserve">表现更好</w:t>
       </w:r>
-      <w:del w:id="430" w:author="Kiro润色" w:date="2026-06-17T00:00:00Z">
+      <w:del w:id="431" w:author="Kiro润色" w:date="2026-06-17T00:00:00Z">
         <w:r>
           <w:rPr>
             <w:rFonts w:hint="eastAsia" w:ascii="宋体" w:hAnsi="宋体" w:eastAsia="宋体" w:cs="宋体"/>
@@ -8128,7 +8137,7 @@
           <w:delText xml:space="preserve">，因此</w:delText>
         </w:r>
       </w:del>
-      <w:ins w:id="431" w:author="Kiro润色" w:date="2026-06-17T00:00:00Z">
+      <w:ins w:id="432" w:author="Kiro润色" w:date="2026-06-17T00:00:00Z">
         <w:r>
           <w:rPr>
             <w:rFonts w:hint="eastAsia" w:ascii="宋体" w:hAnsi="宋体" w:eastAsia="宋体" w:cs="宋体"/>
@@ -8144,7 +8153,7 @@
         </w:rPr>
         <w:t xml:space="preserve">要构建具备跨文化</w:t>
       </w:r>
-      <w:del w:id="432" w:author="Kiro润色" w:date="2026-06-17T00:00:00Z">
+      <w:del w:id="433" w:author="Kiro润色" w:date="2026-06-17T00:00:00Z">
         <w:r>
           <w:rPr>
             <w:rFonts w:hint="eastAsia" w:ascii="宋体" w:hAnsi="宋体" w:eastAsia="宋体" w:cs="宋体"/>
@@ -8160,7 +8169,7 @@
         </w:rPr>
         <w:t xml:space="preserve">服务能力的</w:t>
       </w:r>
-      <w:del w:id="433" w:author="Kiro润色" w:date="2026-06-17T00:00:00Z">
+      <w:del w:id="434" w:author="Kiro润色" w:date="2026-06-17T00:00:00Z">
         <w:r>
           <w:rPr>
             <w:rFonts w:hint="eastAsia" w:ascii="宋体" w:hAnsi="宋体" w:eastAsia="宋体" w:cs="宋体"/>
@@ -8169,7 +8178,7 @@
           <w:delText xml:space="preserve">LLM</w:delText>
         </w:r>
       </w:del>
-      <w:ins w:id="434" w:author="Kiro润色" w:date="2026-06-17T00:00:00Z">
+      <w:ins w:id="435" w:author="Kiro润色" w:date="2026-06-17T00:00:00Z">
         <w:r>
           <w:rPr>
             <w:rFonts w:hint="eastAsia" w:ascii="宋体" w:hAnsi="宋体" w:eastAsia="宋体" w:cs="宋体"/>
@@ -8185,7 +8194,7 @@
         </w:rPr>
         <w:t xml:space="preserve">，评测数据需覆盖多语言</w:t>
       </w:r>
-      <w:del w:id="435" w:author="Kiro润色" w:date="2026-06-17T00:00:00Z">
+      <w:del w:id="436" w:author="Kiro润色" w:date="2026-06-17T00:00:00Z">
         <w:r>
           <w:rPr>
             <w:rFonts w:hint="eastAsia" w:ascii="宋体" w:hAnsi="宋体" w:eastAsia="宋体" w:cs="宋体"/>
@@ -8194,7 +8203,7 @@
           <w:delText xml:space="preserve">和</w:delText>
         </w:r>
       </w:del>
-      <w:ins w:id="436" w:author="Kiro润色" w:date="2026-06-17T00:00:00Z">
+      <w:ins w:id="437" w:author="Kiro润色" w:date="2026-06-17T00:00:00Z">
         <w:r>
           <w:rPr>
             <w:rFonts w:hint="eastAsia" w:ascii="宋体" w:hAnsi="宋体" w:eastAsia="宋体" w:cs="宋体"/>
@@ -8234,13 +8243,197 @@
           <w:rFonts w:hint="eastAsia" w:ascii="宋体" w:hAnsi="宋体" w:eastAsia="宋体" w:cs="宋体"/>
         </w:rPr>
       </w:pPr>
-      <w:r>
-        <w:rPr>
-          <w:rFonts w:hint="eastAsia" w:ascii="宋体" w:hAnsi="宋体" w:eastAsia="宋体" w:cs="宋体"/>
-          <w:color w:val="FF0000"/>
-        </w:rPr>
-        <w:t>除横向比较模型能力外，评测还用于检验集成系统在具体场景中的落地效果。关注点从单纯的答题准确率转向系统如何融合外部知识、与专家意见是否一致、能否支撑完整诊疗流程。</w:t>
-      </w:r>
+      <w:del w:id="438" w:author="Kiro润色" w:date="2026-06-17T00:00:00Z">
+        <w:r>
+          <w:rPr>
+            <w:rFonts w:hint="eastAsia" w:ascii="宋体" w:hAnsi="宋体" w:eastAsia="宋体" w:cs="宋体"/>
+            <w:color w:val="FF0000"/>
+          </w:rPr>
+          <w:delText xml:space="preserve">除横向比较</w:delText>
+        </w:r>
+      </w:del>
+      <w:ins w:id="439" w:author="Kiro润色" w:date="2026-06-17T00:00:00Z">
+        <w:r>
+          <w:rPr>
+            <w:rFonts w:hint="eastAsia" w:ascii="宋体" w:hAnsi="宋体" w:eastAsia="宋体" w:cs="宋体"/>
+            <w:color w:val="FF0000"/>
+          </w:rPr>
+          <w:t xml:space="preserve">与3.2节考查</w:t>
+        </w:r>
+      </w:ins>
+      <w:r>
+        <w:rPr>
+          <w:rFonts w:hint="eastAsia" w:ascii="宋体" w:hAnsi="宋体" w:eastAsia="宋体" w:cs="宋体"/>
+          <w:color w:val="FF0000"/>
+        </w:rPr>
+        <w:t xml:space="preserve">模型</w:t>
+      </w:r>
+      <w:ins w:id="440" w:author="Kiro润色" w:date="2026-06-17T00:00:00Z">
+        <w:r>
+          <w:rPr>
+            <w:rFonts w:hint="eastAsia" w:ascii="宋体" w:hAnsi="宋体" w:eastAsia="宋体" w:cs="宋体"/>
+            <w:color w:val="FF0000"/>
+          </w:rPr>
+          <w:t xml:space="preserve">固有</w:t>
+        </w:r>
+      </w:ins>
+      <w:r>
+        <w:rPr>
+          <w:rFonts w:hint="eastAsia" w:ascii="宋体" w:hAnsi="宋体" w:eastAsia="宋体" w:cs="宋体"/>
+          <w:color w:val="FF0000"/>
+        </w:rPr>
+        <w:t xml:space="preserve">能力</w:t>
+      </w:r>
+      <w:del w:id="441" w:author="Kiro润色" w:date="2026-06-17T00:00:00Z">
+        <w:r>
+          <w:rPr>
+            <w:rFonts w:hint="eastAsia" w:ascii="宋体" w:hAnsi="宋体" w:eastAsia="宋体" w:cs="宋体"/>
+            <w:color w:val="FF0000"/>
+          </w:rPr>
+          <w:delText xml:space="preserve">外</w:delText>
+        </w:r>
+      </w:del>
+      <w:ins w:id="442" w:author="Kiro润色" w:date="2026-06-17T00:00:00Z">
+        <w:r>
+          <w:rPr>
+            <w:rFonts w:hint="eastAsia" w:ascii="宋体" w:hAnsi="宋体" w:eastAsia="宋体" w:cs="宋体"/>
+            <w:color w:val="FF0000"/>
+          </w:rPr>
+          <w:t xml:space="preserve">不同</w:t>
+        </w:r>
+      </w:ins>
+      <w:r>
+        <w:rPr>
+          <w:rFonts w:hint="eastAsia" w:ascii="宋体" w:hAnsi="宋体" w:eastAsia="宋体" w:cs="宋体"/>
+          <w:color w:val="FF0000"/>
+        </w:rPr>
+        <w:t xml:space="preserve">，</w:t>
+      </w:r>
+      <w:del w:id="443" w:author="Kiro润色" w:date="2026-06-17T00:00:00Z">
+        <w:r>
+          <w:rPr>
+            <w:rFonts w:hint="eastAsia" w:ascii="宋体" w:hAnsi="宋体" w:eastAsia="宋体" w:cs="宋体"/>
+            <w:color w:val="FF0000"/>
+          </w:rPr>
+          <w:delText xml:space="preserve">评测还用于</w:delText>
+        </w:r>
+      </w:del>
+      <w:ins w:id="444" w:author="Kiro润色" w:date="2026-06-17T00:00:00Z">
+        <w:r>
+          <w:rPr>
+            <w:rFonts w:hint="eastAsia" w:ascii="宋体" w:hAnsi="宋体" w:eastAsia="宋体" w:cs="宋体"/>
+            <w:color w:val="FF0000"/>
+          </w:rPr>
+          <w:t xml:space="preserve">本节关注由</w:t>
+        </w:r>
+      </w:ins>
+      <w:r>
+        <w:rPr>
+          <w:rFonts w:hint="eastAsia" w:ascii="宋体" w:hAnsi="宋体" w:eastAsia="宋体" w:cs="宋体"/>
+          <w:color w:val="FF0000"/>
+        </w:rPr>
+        <w:t xml:space="preserve">检</w:t>
+      </w:r>
+      <w:del w:id="445" w:author="Kiro润色" w:date="2026-06-17T00:00:00Z">
+        <w:r>
+          <w:rPr>
+            <w:rFonts w:hint="eastAsia" w:ascii="宋体" w:hAnsi="宋体" w:eastAsia="宋体" w:cs="宋体"/>
+            <w:color w:val="FF0000"/>
+          </w:rPr>
+          <w:delText xml:space="preserve">验</w:delText>
+        </w:r>
+      </w:del>
+      <w:ins w:id="446" w:author="Kiro润色" w:date="2026-06-17T00:00:00Z">
+        <w:r>
+          <w:rPr>
+            <w:rFonts w:hint="eastAsia" w:ascii="宋体" w:hAnsi="宋体" w:eastAsia="宋体" w:cs="宋体"/>
+            <w:color w:val="FF0000"/>
+          </w:rPr>
+          <w:t xml:space="preserve">索增强、知识图谱、智能体等技术构成的</w:t>
+        </w:r>
+      </w:ins>
+      <w:r>
+        <w:rPr>
+          <w:rFonts w:hint="eastAsia" w:ascii="宋体" w:hAnsi="宋体" w:eastAsia="宋体" w:cs="宋体"/>
+          <w:color w:val="FF0000"/>
+        </w:rPr>
+        <w:t xml:space="preserve">集成系统在具体场景中的落地效果</w:t>
+      </w:r>
+      <w:del w:id="447" w:author="Kiro润色" w:date="2026-06-17T00:00:00Z">
+        <w:r>
+          <w:rPr>
+            <w:rFonts w:hint="eastAsia" w:ascii="宋体" w:hAnsi="宋体" w:eastAsia="宋体" w:cs="宋体"/>
+            <w:color w:val="FF0000"/>
+          </w:rPr>
+          <w:delText xml:space="preserve">。关注点</w:delText>
+        </w:r>
+      </w:del>
+      <w:ins w:id="448" w:author="Kiro润色" w:date="2026-06-17T00:00:00Z">
+        <w:r>
+          <w:rPr>
+            <w:rFonts w:hint="eastAsia" w:ascii="宋体" w:hAnsi="宋体" w:eastAsia="宋体" w:cs="宋体"/>
+            <w:color w:val="FF0000"/>
+          </w:rPr>
+          <w:t xml:space="preserve">：评价重心</w:t>
+        </w:r>
+      </w:ins>
+      <w:r>
+        <w:rPr>
+          <w:rFonts w:hint="eastAsia" w:ascii="宋体" w:hAnsi="宋体" w:eastAsia="宋体" w:cs="宋体"/>
+          <w:color w:val="FF0000"/>
+        </w:rPr>
+        <w:t xml:space="preserve">从单纯的答题准确率</w:t>
+      </w:r>
+      <w:ins w:id="449" w:author="Kiro润色" w:date="2026-06-17T00:00:00Z">
+        <w:r>
+          <w:rPr>
+            <w:rFonts w:hint="eastAsia" w:ascii="宋体" w:hAnsi="宋体" w:eastAsia="宋体" w:cs="宋体"/>
+            <w:color w:val="FF0000"/>
+          </w:rPr>
+          <w:t xml:space="preserve">，</w:t>
+        </w:r>
+      </w:ins>
+      <w:r>
+        <w:rPr>
+          <w:rFonts w:hint="eastAsia" w:ascii="宋体" w:hAnsi="宋体" w:eastAsia="宋体" w:cs="宋体"/>
+          <w:color w:val="FF0000"/>
+        </w:rPr>
+        <w:t xml:space="preserve">转向系统</w:t>
+      </w:r>
+      <w:del w:id="450" w:author="Kiro润色" w:date="2026-06-17T00:00:00Z">
+        <w:r>
+          <w:rPr>
+            <w:rFonts w:hint="eastAsia" w:ascii="宋体" w:hAnsi="宋体" w:eastAsia="宋体" w:cs="宋体"/>
+            <w:color w:val="FF0000"/>
+          </w:rPr>
+          <w:delText xml:space="preserve">如何</w:delText>
+        </w:r>
+      </w:del>
+      <w:ins w:id="451" w:author="Kiro润色" w:date="2026-06-17T00:00:00Z">
+        <w:r>
+          <w:rPr>
+            <w:rFonts w:hint="eastAsia" w:ascii="宋体" w:hAnsi="宋体" w:eastAsia="宋体" w:cs="宋体"/>
+            <w:color w:val="FF0000"/>
+          </w:rPr>
+          <w:t xml:space="preserve">能否</w:t>
+        </w:r>
+      </w:ins>
+      <w:r>
+        <w:rPr>
+          <w:rFonts w:hint="eastAsia" w:ascii="宋体" w:hAnsi="宋体" w:eastAsia="宋体" w:cs="宋体"/>
+          <w:color w:val="FF0000"/>
+        </w:rPr>
+        <w:t xml:space="preserve">融合外部知识、与专家意见是否一致、能否支撑完整诊疗流程。</w:t>
+      </w:r>
+      <w:ins w:id="452" w:author="Kiro润色" w:date="2026-06-17T00:00:00Z">
+        <w:r>
+          <w:rPr>
+            <w:rFonts w:hint="eastAsia" w:ascii="宋体" w:hAnsi="宋体" w:eastAsia="宋体" w:cs="宋体"/>
+            <w:color w:val="FF0000"/>
+          </w:rPr>
+          <w:t xml:space="preserve">简言之，3.2看“模型本身行不行”，本节看“系统好不好用”。</w:t>
+        </w:r>
+      </w:ins>
     </w:p>
     <w:p>
       <w:pPr>
@@ -8258,7 +8451,27 @@
           <w:iCs w:val="0"/>
           <w:color w:val="000000"/>
         </w:rPr>
-        <w:t>3.3.1 知识增强型问答与辨证系统</w:t>
+        <w:t xml:space="preserve">3.3.1 知识增强型问答</w:t>
+      </w:r>
+      <w:del w:id="453" w:author="Kiro润色" w:date="2026-06-17T00:00:00Z">
+        <w:r>
+          <w:rPr>
+            <w:rFonts w:hint="eastAsia" w:ascii="宋体" w:hAnsi="宋体" w:eastAsia="宋体" w:cs="宋体"/>
+            <w:i w:val="0"/>
+            <w:iCs w:val="0"/>
+            <w:color w:val="000000"/>
+          </w:rPr>
+          <w:delText xml:space="preserve">与辨证</w:delText>
+        </w:r>
+      </w:del>
+      <w:r>
+        <w:rPr>
+          <w:rFonts w:hint="eastAsia" w:ascii="宋体" w:hAnsi="宋体" w:eastAsia="宋体" w:cs="宋体"/>
+          <w:i w:val="0"/>
+          <w:iCs w:val="0"/>
+          <w:color w:val="000000"/>
+        </w:rPr>
+        <w:t xml:space="preserve">系统</w:t>
       </w:r>
     </w:p>
     <w:p>
@@ -8277,7 +8490,7 @@
         </w:rPr>
         <w:t xml:space="preserve">为提升回答的准确性与可靠性，研究者多在</w:t>
       </w:r>
-      <w:del w:id="437" w:author="Kiro润色" w:date="2026-06-17T00:00:00Z">
+      <w:del w:id="454" w:author="Kiro润色" w:date="2026-06-17T00:00:00Z">
         <w:r>
           <w:rPr>
             <w:rFonts w:hint="eastAsia" w:ascii="宋体" w:hAnsi="宋体" w:eastAsia="宋体" w:cs="宋体"/>
@@ -8286,7 +8499,7 @@
           <w:delText xml:space="preserve">LLM基础上</w:delText>
         </w:r>
       </w:del>
-      <w:ins w:id="438" w:author="Kiro润色" w:date="2026-06-17T00:00:00Z">
+      <w:ins w:id="455" w:author="Kiro润色" w:date="2026-06-17T00:00:00Z">
         <w:r>
           <w:rPr>
             <w:rFonts w:hint="eastAsia" w:ascii="宋体" w:hAnsi="宋体" w:eastAsia="宋体" w:cs="宋体"/>
@@ -8302,7 +8515,7 @@
         </w:rPr>
         <w:t xml:space="preserve">引入知识库、知识图谱与检索增强生成（RAG）等技术。</w:t>
       </w:r>
-      <w:ins w:id="439" w:author="Kiro润色" w:date="2026-06-17T00:00:00Z">
+      <w:ins w:id="456" w:author="Kiro润色" w:date="2026-06-17T00:00:00Z">
         <w:r>
           <w:rPr>
             <w:rFonts w:hint="eastAsia" w:ascii="宋体" w:hAnsi="宋体" w:eastAsia="宋体" w:cs="宋体"/>
@@ -8318,7 +8531,7 @@
         </w:rPr>
         <w:t xml:space="preserve">TCMChat[19]、Tianyi[26]、XuanHuGPT[20]</w:t>
       </w:r>
-      <w:del w:id="440" w:author="Kiro润色" w:date="2026-06-17T00:00:00Z">
+      <w:del w:id="457" w:author="Kiro润色" w:date="2026-06-17T00:00:00Z">
         <w:r>
           <w:rPr>
             <w:rFonts w:hint="eastAsia" w:ascii="宋体" w:hAnsi="宋体" w:eastAsia="宋体" w:cs="宋体"/>
@@ -8327,7 +8540,7 @@
           <w:delText xml:space="preserve">等中医专</w:delText>
         </w:r>
       </w:del>
-      <w:ins w:id="441" w:author="Kiro润色" w:date="2026-06-17T00:00:00Z">
+      <w:ins w:id="458" w:author="Kiro润色" w:date="2026-06-17T00:00:00Z">
         <w:r>
           <w:rPr>
             <w:rFonts w:hint="eastAsia" w:ascii="宋体" w:hAnsi="宋体" w:eastAsia="宋体" w:cs="宋体"/>
@@ -8343,7 +8556,7 @@
         </w:rPr>
         <w:t xml:space="preserve">用</w:t>
       </w:r>
-      <w:del w:id="442" w:author="Kiro润色" w:date="2026-06-17T00:00:00Z">
+      <w:del w:id="459" w:author="Kiro润色" w:date="2026-06-17T00:00:00Z">
         <w:r>
           <w:rPr>
             <w:rFonts w:hint="eastAsia" w:ascii="宋体" w:hAnsi="宋体" w:eastAsia="宋体" w:cs="宋体"/>
@@ -8352,7 +8565,7 @@
           <w:delText xml:space="preserve">模型以高质量知识库支撑问答；</w:delText>
         </w:r>
       </w:del>
-      <w:ins w:id="443" w:author="Kiro润色" w:date="2026-06-17T00:00:00Z">
+      <w:ins w:id="460" w:author="Kiro润色" w:date="2026-06-17T00:00:00Z">
         <w:r>
           <w:rPr>
             <w:rFonts w:hint="eastAsia" w:ascii="宋体" w:hAnsi="宋体" w:eastAsia="宋体" w:cs="宋体"/>
@@ -8368,7 +8581,7 @@
         </w:rPr>
         <w:t xml:space="preserve">知识图谱</w:t>
       </w:r>
-      <w:del w:id="444" w:author="Kiro润色" w:date="2026-06-17T00:00:00Z">
+      <w:del w:id="461" w:author="Kiro润色" w:date="2026-06-17T00:00:00Z">
         <w:r>
           <w:rPr>
             <w:rFonts w:hint="eastAsia" w:ascii="宋体" w:hAnsi="宋体" w:eastAsia="宋体" w:cs="宋体"/>
@@ -8377,7 +8590,7 @@
           <w:delText xml:space="preserve">增强的</w:delText>
         </w:r>
       </w:del>
-      <w:ins w:id="445" w:author="Kiro润色" w:date="2026-06-17T00:00:00Z">
+      <w:ins w:id="462" w:author="Kiro润色" w:date="2026-06-17T00:00:00Z">
         <w:r>
           <w:rPr>
             <w:rFonts w:hint="eastAsia" w:ascii="宋体" w:hAnsi="宋体" w:eastAsia="宋体" w:cs="宋体"/>
@@ -8393,7 +8606,7 @@
         </w:rPr>
         <w:t xml:space="preserve">问答</w:t>
       </w:r>
-      <w:del w:id="446" w:author="Kiro润色" w:date="2026-06-17T00:00:00Z">
+      <w:del w:id="463" w:author="Kiro润色" w:date="2026-06-17T00:00:00Z">
         <w:r>
           <w:rPr>
             <w:rFonts w:hint="eastAsia" w:ascii="宋体" w:hAnsi="宋体" w:eastAsia="宋体" w:cs="宋体"/>
@@ -8402,7 +8615,7 @@
           <w:delText xml:space="preserve">系统</w:delText>
         </w:r>
       </w:del>
-      <w:ins w:id="447" w:author="Kiro润色" w:date="2026-06-17T00:00:00Z">
+      <w:ins w:id="464" w:author="Kiro润色" w:date="2026-06-17T00:00:00Z">
         <w:r>
           <w:rPr>
             <w:rFonts w:hint="eastAsia" w:ascii="宋体" w:hAnsi="宋体" w:eastAsia="宋体" w:cs="宋体"/>
@@ -8418,7 +8631,7 @@
         </w:rPr>
         <w:t xml:space="preserve">[27</w:t>
       </w:r>
-      <w:ins w:id="448" w:author="Kiro润色" w:date="2026-06-17T00:00:00Z">
+      <w:ins w:id="465" w:author="Kiro润色" w:date="2026-06-17T00:00:00Z">
         <w:r>
           <w:rPr>
             <w:rFonts w:hint="eastAsia" w:ascii="宋体" w:hAnsi="宋体" w:eastAsia="宋体" w:cs="宋体"/>
@@ -8434,7 +8647,7 @@
         </w:rPr>
         <w:t xml:space="preserve">]</w:t>
       </w:r>
-      <w:del w:id="449" w:author="Kiro润色" w:date="2026-06-17T00:00:00Z">
+      <w:del w:id="466" w:author="Kiro润色" w:date="2026-06-17T00:00:00Z">
         <w:r>
           <w:rPr>
             <w:rFonts w:hint="eastAsia" w:ascii="宋体" w:hAnsi="宋体" w:eastAsia="宋体" w:cs="宋体"/>
@@ -8443,7 +8656,7 @@
           <w:delText xml:space="preserve">及融合</w:delText>
         </w:r>
       </w:del>
-      <w:ins w:id="450" w:author="Kiro润色" w:date="2026-06-17T00:00:00Z">
+      <w:ins w:id="467" w:author="Kiro润色" w:date="2026-06-17T00:00:00Z">
         <w:r>
           <w:rPr>
             <w:rFonts w:hint="eastAsia" w:ascii="宋体" w:hAnsi="宋体" w:eastAsia="宋体" w:cs="宋体"/>
@@ -8459,7 +8672,7 @@
         </w:rPr>
         <w:t xml:space="preserve">知识图谱</w:t>
       </w:r>
-      <w:del w:id="451" w:author="Kiro润色" w:date="2026-06-17T00:00:00Z">
+      <w:del w:id="468" w:author="Kiro润色" w:date="2026-06-17T00:00:00Z">
         <w:r>
           <w:rPr>
             <w:rFonts w:hint="eastAsia" w:ascii="宋体" w:hAnsi="宋体" w:eastAsia="宋体" w:cs="宋体"/>
@@ -8468,7 +8681,7 @@
           <w:delText xml:space="preserve">的医案问答系统[28]通过</w:delText>
         </w:r>
       </w:del>
-      <w:ins w:id="452" w:author="Kiro润色" w:date="2026-06-17T00:00:00Z">
+      <w:ins w:id="469" w:author="Kiro润色" w:date="2026-06-17T00:00:00Z">
         <w:r>
           <w:rPr>
             <w:rFonts w:hint="eastAsia" w:ascii="宋体" w:hAnsi="宋体" w:eastAsia="宋体" w:cs="宋体"/>
@@ -8484,47 +8697,22 @@
         </w:rPr>
         <w:t xml:space="preserve">结</w:t>
       </w:r>
-      <w:del w:id="453" w:author="Kiro润色" w:date="2026-06-17T00:00:00Z">
-        <w:r>
-          <w:rPr>
-            <w:rFonts w:hint="eastAsia" w:ascii="宋体" w:hAnsi="宋体" w:eastAsia="宋体" w:cs="宋体"/>
-            <w:color w:val="FF0000"/>
-          </w:rPr>
-          <w:delText xml:space="preserve">构化知识约束生成过程、减少模型臆测。在辨证方向</w:delText>
-        </w:r>
-      </w:del>
-      <w:ins w:id="454" w:author="Kiro润色" w:date="2026-06-17T00:00:00Z">
-        <w:r>
-          <w:rPr>
-            <w:rFonts w:hint="eastAsia" w:ascii="宋体" w:hAnsi="宋体" w:eastAsia="宋体" w:cs="宋体"/>
-            <w:color w:val="FF0000"/>
-          </w:rPr>
-          <w:t xml:space="preserve">合</w:t>
-        </w:r>
-      </w:ins>
-      <w:r>
-        <w:rPr>
-          <w:rFonts w:hint="eastAsia" w:ascii="宋体" w:hAnsi="宋体" w:eastAsia="宋体" w:cs="宋体"/>
-          <w:color w:val="FF0000"/>
-        </w:rPr>
-        <w:t xml:space="preserve">，</w:t>
-      </w:r>
-      <w:del w:id="455" w:author="Kiro润色" w:date="2026-06-17T00:00:00Z">
-        <w:r>
-          <w:rPr>
-            <w:rFonts w:hint="eastAsia" w:ascii="宋体" w:hAnsi="宋体" w:eastAsia="宋体" w:cs="宋体"/>
-            <w:color w:val="FF0000"/>
-          </w:rPr>
-          <w:delText xml:space="preserve">Lingdan通过</w:delText>
-        </w:r>
-      </w:del>
-      <w:ins w:id="456" w:author="Kiro润色" w:date="2026-06-17T00:00:00Z">
-        <w:r>
-          <w:rPr>
-            <w:rFonts w:hint="eastAsia" w:ascii="宋体" w:hAnsi="宋体" w:eastAsia="宋体" w:cs="宋体"/>
-            <w:color w:val="FF0000"/>
-          </w:rPr>
-          <w:t xml:space="preserve">并辅以</w:t>
+      <w:del w:id="470" w:author="Kiro润色" w:date="2026-06-17T00:00:00Z">
+        <w:r>
+          <w:rPr>
+            <w:rFonts w:hint="eastAsia" w:ascii="宋体" w:hAnsi="宋体" w:eastAsia="宋体" w:cs="宋体"/>
+            <w:color w:val="FF0000"/>
+          </w:rPr>
+          <w:delText xml:space="preserve">构化知识约束生成过程、减少模型臆测。在辨证方向，Lingdan通过</w:delText>
+        </w:r>
+      </w:del>
+      <w:ins w:id="471" w:author="Kiro润色" w:date="2026-06-17T00:00:00Z">
+        <w:r>
+          <w:rPr>
+            <w:rFonts w:hint="eastAsia" w:ascii="宋体" w:hAnsi="宋体" w:eastAsia="宋体" w:cs="宋体"/>
+            <w:color w:val="FF0000"/>
+          </w:rPr>
+          <w:t xml:space="preserve">合并辅以</w:t>
         </w:r>
       </w:ins>
       <w:r>
@@ -8534,7 +8722,7 @@
         </w:rPr>
         <w:t xml:space="preserve">思维链</w:t>
       </w:r>
-      <w:del w:id="457" w:author="Kiro润色" w:date="2026-06-17T00:00:00Z">
+      <w:del w:id="472" w:author="Kiro润色" w:date="2026-06-17T00:00:00Z">
         <w:r>
           <w:rPr>
             <w:rFonts w:hint="eastAsia" w:ascii="宋体" w:hAnsi="宋体" w:eastAsia="宋体" w:cs="宋体"/>
@@ -8543,13 +8731,13 @@
           <w:delText xml:space="preserve">进行</w:delText>
         </w:r>
       </w:del>
-      <w:ins w:id="458" w:author="Kiro润色" w:date="2026-06-17T00:00:00Z">
-        <w:r>
-          <w:rPr>
-            <w:rFonts w:hint="eastAsia" w:ascii="宋体" w:hAnsi="宋体" w:eastAsia="宋体" w:cs="宋体"/>
-            <w:color w:val="FF0000"/>
-          </w:rPr>
-          <w:t xml:space="preserve">推理，分别用于</w:t>
+      <w:ins w:id="473" w:author="Kiro润色" w:date="2026-06-17T00:00:00Z">
+        <w:r>
+          <w:rPr>
+            <w:rFonts w:hint="eastAsia" w:ascii="宋体" w:hAnsi="宋体" w:eastAsia="宋体" w:cs="宋体"/>
+            <w:color w:val="FF0000"/>
+          </w:rPr>
+          <w:t xml:space="preserve">推理，用于</w:t>
         </w:r>
       </w:ins>
       <w:r>
@@ -8559,16 +8747,16 @@
         </w:rPr>
         <w:t xml:space="preserve">症状分析与中成药推荐[29]</w:t>
       </w:r>
-      <w:del w:id="459" w:author="Kiro润色" w:date="2026-06-17T00:00:00Z">
-        <w:r>
-          <w:rPr>
-            <w:rFonts w:hint="eastAsia" w:ascii="宋体" w:hAnsi="宋体" w:eastAsia="宋体" w:cs="宋体"/>
-            <w:color w:val="FF0000"/>
-          </w:rPr>
-          <w:delText xml:space="preserve">；DiagX-DT融合外部知识库与</w:delText>
-        </w:r>
-      </w:del>
-      <w:ins w:id="460" w:author="Kiro润色" w:date="2026-06-17T00:00:00Z">
+      <w:del w:id="474" w:author="Kiro润色" w:date="2026-06-17T00:00:00Z">
+        <w:r>
+          <w:rPr>
+            <w:rFonts w:hint="eastAsia" w:ascii="宋体" w:hAnsi="宋体" w:eastAsia="宋体" w:cs="宋体"/>
+            <w:color w:val="FF0000"/>
+          </w:rPr>
+          <w:delText xml:space="preserve">；DiagX-DT融合外部知识库与排除推理机制用于诊断[8]；AcuGPT-Agent面向</w:delText>
+        </w:r>
+      </w:del>
+      <w:ins w:id="475" w:author="Kiro润色" w:date="2026-06-17T00:00:00Z">
         <w:r>
           <w:rPr>
             <w:rFonts w:hint="eastAsia" w:ascii="宋体" w:hAnsi="宋体" w:eastAsia="宋体" w:cs="宋体"/>
@@ -8582,59 +8770,9 @@
           <w:rFonts w:hint="eastAsia" w:ascii="宋体" w:hAnsi="宋体" w:eastAsia="宋体" w:cs="宋体"/>
           <w:color w:val="FF0000"/>
         </w:rPr>
-        <w:t xml:space="preserve">排除</w:t>
-      </w:r>
-      <w:del w:id="461" w:author="Kiro润色" w:date="2026-06-17T00:00:00Z">
-        <w:r>
-          <w:rPr>
-            <w:rFonts w:hint="eastAsia" w:ascii="宋体" w:hAnsi="宋体" w:eastAsia="宋体" w:cs="宋体"/>
-            <w:color w:val="FF0000"/>
-          </w:rPr>
-          <w:delText xml:space="preserve">推理机制用于</w:delText>
-        </w:r>
-      </w:del>
-      <w:ins w:id="462" w:author="Kiro润色" w:date="2026-06-17T00:00:00Z">
-        <w:r>
-          <w:rPr>
-            <w:rFonts w:hint="eastAsia" w:ascii="宋体" w:hAnsi="宋体" w:eastAsia="宋体" w:cs="宋体"/>
-            <w:color w:val="FF0000"/>
-          </w:rPr>
-          <w:t xml:space="preserve">式</w:t>
-        </w:r>
-      </w:ins>
-      <w:r>
-        <w:rPr>
-          <w:rFonts w:hint="eastAsia" w:ascii="宋体" w:hAnsi="宋体" w:eastAsia="宋体" w:cs="宋体"/>
-          <w:color w:val="FF0000"/>
-        </w:rPr>
-        <w:t xml:space="preserve">诊断[8]</w:t>
-      </w:r>
-      <w:del w:id="463" w:author="Kiro润色" w:date="2026-06-17T00:00:00Z">
-        <w:r>
-          <w:rPr>
-            <w:rFonts w:hint="eastAsia" w:ascii="宋体" w:hAnsi="宋体" w:eastAsia="宋体" w:cs="宋体"/>
-            <w:color w:val="FF0000"/>
-          </w:rPr>
-          <w:delText xml:space="preserve">；AcuGPT-Agent面向</w:delText>
-        </w:r>
-      </w:del>
-      <w:ins w:id="464" w:author="Kiro润色" w:date="2026-06-17T00:00:00Z">
-        <w:r>
-          <w:rPr>
-            <w:rFonts w:hint="eastAsia" w:ascii="宋体" w:hAnsi="宋体" w:eastAsia="宋体" w:cs="宋体"/>
-            <w:color w:val="FF0000"/>
-          </w:rPr>
-          <w:t xml:space="preserve">以及</w:t>
-        </w:r>
-      </w:ins>
-      <w:r>
-        <w:rPr>
-          <w:rFonts w:hint="eastAsia" w:ascii="宋体" w:hAnsi="宋体" w:eastAsia="宋体" w:cs="宋体"/>
-          <w:color w:val="FF0000"/>
-        </w:rPr>
         <w:t xml:space="preserve">针灸治疗不孕症</w:t>
       </w:r>
-      <w:del w:id="465" w:author="Kiro润色" w:date="2026-06-17T00:00:00Z">
+      <w:del w:id="476" w:author="Kiro润色" w:date="2026-06-17T00:00:00Z">
         <w:r>
           <w:rPr>
             <w:rFonts w:hint="eastAsia" w:ascii="宋体" w:hAnsi="宋体" w:eastAsia="宋体" w:cs="宋体"/>
@@ -8643,23 +8781,39 @@
           <w:delText xml:space="preserve">场景集成了领域模型、知识图谱与检索机制</w:delText>
         </w:r>
       </w:del>
-      <w:ins w:id="466" w:author="Kiro润色" w:date="2026-06-17T00:00:00Z">
-        <w:r>
-          <w:rPr>
-            <w:rFonts w:hint="eastAsia" w:ascii="宋体" w:hAnsi="宋体" w:eastAsia="宋体" w:cs="宋体"/>
-            <w:color w:val="FF0000"/>
-          </w:rPr>
-          <w:t xml:space="preserve">的辅助</w:t>
-        </w:r>
-      </w:ins>
-      <w:r>
-        <w:rPr>
-          <w:rFonts w:hint="eastAsia" w:ascii="宋体" w:hAnsi="宋体" w:eastAsia="宋体" w:cs="宋体"/>
-          <w:color w:val="FF0000"/>
-        </w:rPr>
-        <w:t xml:space="preserve">[30]。</w:t>
-      </w:r>
-      <w:del w:id="467" w:author="Kiro润色" w:date="2026-06-17T00:00:00Z">
+      <w:ins w:id="477" w:author="Kiro润色" w:date="2026-06-17T00:00:00Z">
+        <w:r>
+          <w:rPr>
+            <w:rFonts w:hint="eastAsia" w:ascii="宋体" w:hAnsi="宋体" w:eastAsia="宋体" w:cs="宋体"/>
+            <w:color w:val="FF0000"/>
+          </w:rPr>
+          <w:t xml:space="preserve">辅助</w:t>
+        </w:r>
+      </w:ins>
+      <w:r>
+        <w:rPr>
+          <w:rFonts w:hint="eastAsia" w:ascii="宋体" w:hAnsi="宋体" w:eastAsia="宋体" w:cs="宋体"/>
+          <w:color w:val="FF0000"/>
+        </w:rPr>
+        <w:t xml:space="preserve">[30]</w:t>
+      </w:r>
+      <w:ins w:id="478" w:author="Kiro润色" w:date="2026-06-17T00:00:00Z">
+        <w:r>
+          <w:rPr>
+            <w:rFonts w:hint="eastAsia" w:ascii="宋体" w:hAnsi="宋体" w:eastAsia="宋体" w:cs="宋体"/>
+            <w:color w:val="FF0000"/>
+          </w:rPr>
+          <w:t xml:space="preserve">等场景</w:t>
+        </w:r>
+      </w:ins>
+      <w:r>
+        <w:rPr>
+          <w:rFonts w:hint="eastAsia" w:ascii="宋体" w:hAnsi="宋体" w:eastAsia="宋体" w:cs="宋体"/>
+          <w:color w:val="FF0000"/>
+        </w:rPr>
+        <w:t xml:space="preserve">。</w:t>
+      </w:r>
+      <w:del w:id="479" w:author="Kiro润色" w:date="2026-06-17T00:00:00Z">
         <w:r>
           <w:rPr>
             <w:rFonts w:hint="eastAsia" w:ascii="宋体" w:hAnsi="宋体" w:eastAsia="宋体" w:cs="宋体"/>
@@ -8668,7 +8822,7 @@
           <w:delText xml:space="preserve">对该</w:delText>
         </w:r>
       </w:del>
-      <w:ins w:id="468" w:author="Kiro润色" w:date="2026-06-17T00:00:00Z">
+      <w:ins w:id="480" w:author="Kiro润色" w:date="2026-06-17T00:00:00Z">
         <w:r>
           <w:rPr>
             <w:rFonts w:hint="eastAsia" w:ascii="宋体" w:hAnsi="宋体" w:eastAsia="宋体" w:cs="宋体"/>
@@ -8684,7 +8838,7 @@
         </w:rPr>
         <w:t xml:space="preserve">类系统的评测不</w:t>
       </w:r>
-      <w:del w:id="469" w:author="Kiro润色" w:date="2026-06-17T00:00:00Z">
+      <w:del w:id="481" w:author="Kiro润色" w:date="2026-06-17T00:00:00Z">
         <w:r>
           <w:rPr>
             <w:rFonts w:hint="eastAsia" w:ascii="宋体" w:hAnsi="宋体" w:eastAsia="宋体" w:cs="宋体"/>
@@ -8693,13 +8847,13 @@
           <w:delText xml:space="preserve">仅关注</w:delText>
         </w:r>
       </w:del>
-      <w:ins w:id="470" w:author="Kiro润色" w:date="2026-06-17T00:00:00Z">
-        <w:r>
-          <w:rPr>
-            <w:rFonts w:hint="eastAsia" w:ascii="宋体" w:hAnsi="宋体" w:eastAsia="宋体" w:cs="宋体"/>
-            <w:color w:val="FF0000"/>
-          </w:rPr>
-          <w:t xml:space="preserve">再只看</w:t>
+      <w:ins w:id="482" w:author="Kiro润色" w:date="2026-06-17T00:00:00Z">
+        <w:r>
+          <w:rPr>
+            <w:rFonts w:hint="eastAsia" w:ascii="宋体" w:hAnsi="宋体" w:eastAsia="宋体" w:cs="宋体"/>
+            <w:color w:val="FF0000"/>
+          </w:rPr>
+          <w:t xml:space="preserve">再只看答题</w:t>
         </w:r>
       </w:ins>
       <w:r>
@@ -8709,7 +8863,7 @@
         </w:rPr>
         <w:t xml:space="preserve">准确率，</w:t>
       </w:r>
-      <w:ins w:id="471" w:author="Kiro润色" w:date="2026-06-17T00:00:00Z">
+      <w:ins w:id="483" w:author="Kiro润色" w:date="2026-06-17T00:00:00Z">
         <w:r>
           <w:rPr>
             <w:rFonts w:hint="eastAsia" w:ascii="宋体" w:hAnsi="宋体" w:eastAsia="宋体" w:cs="宋体"/>
@@ -8725,7 +8879,7 @@
         </w:rPr>
         <w:t xml:space="preserve">更</w:t>
       </w:r>
-      <w:del w:id="472" w:author="Kiro润色" w:date="2026-06-17T00:00:00Z">
+      <w:del w:id="484" w:author="Kiro润色" w:date="2026-06-17T00:00:00Z">
         <w:r>
           <w:rPr>
             <w:rFonts w:hint="eastAsia" w:ascii="宋体" w:hAnsi="宋体" w:eastAsia="宋体" w:cs="宋体"/>
@@ -8734,7 +8888,7 @@
           <w:delText xml:space="preserve">强调</w:delText>
         </w:r>
       </w:del>
-      <w:ins w:id="473" w:author="Kiro润色" w:date="2026-06-17T00:00:00Z">
+      <w:ins w:id="485" w:author="Kiro润色" w:date="2026-06-17T00:00:00Z">
         <w:r>
           <w:rPr>
             <w:rFonts w:hint="eastAsia" w:ascii="宋体" w:hAnsi="宋体" w:eastAsia="宋体" w:cs="宋体"/>
@@ -8750,13 +8904,13 @@
         </w:rPr>
         <w:t xml:space="preserve">推理逻辑</w:t>
       </w:r>
-      <w:ins w:id="474" w:author="Kiro润色" w:date="2026-06-17T00:00:00Z">
-        <w:r>
-          <w:rPr>
-            <w:rFonts w:hint="eastAsia" w:ascii="宋体" w:hAnsi="宋体" w:eastAsia="宋体" w:cs="宋体"/>
-            <w:color w:val="FF0000"/>
-          </w:rPr>
-          <w:t xml:space="preserve">是否成立、是否</w:t>
+      <w:ins w:id="486" w:author="Kiro润色" w:date="2026-06-17T00:00:00Z">
+        <w:r>
+          <w:rPr>
+            <w:rFonts w:hint="eastAsia" w:ascii="宋体" w:hAnsi="宋体" w:eastAsia="宋体" w:cs="宋体"/>
+            <w:color w:val="FF0000"/>
+          </w:rPr>
+          <w:t xml:space="preserve">是否成立、</w:t>
         </w:r>
       </w:ins>
       <w:r>
@@ -8766,7 +8920,7 @@
         </w:rPr>
         <w:t xml:space="preserve">与专家意见</w:t>
       </w:r>
-      <w:del w:id="475" w:author="Kiro润色" w:date="2026-06-17T00:00:00Z">
+      <w:del w:id="487" w:author="Kiro润色" w:date="2026-06-17T00:00:00Z">
         <w:r>
           <w:rPr>
             <w:rFonts w:hint="eastAsia" w:ascii="宋体" w:hAnsi="宋体" w:eastAsia="宋体" w:cs="宋体"/>
@@ -8775,6 +8929,15 @@
           <w:delText xml:space="preserve">之间的</w:delText>
         </w:r>
       </w:del>
+      <w:ins w:id="488" w:author="Kiro润色" w:date="2026-06-17T00:00:00Z">
+        <w:r>
+          <w:rPr>
+            <w:rFonts w:hint="eastAsia" w:ascii="宋体" w:hAnsi="宋体" w:eastAsia="宋体" w:cs="宋体"/>
+            <w:color w:val="FF0000"/>
+          </w:rPr>
+          <w:t xml:space="preserve">是否</w:t>
+        </w:r>
+      </w:ins>
       <w:r>
         <w:rPr>
           <w:rFonts w:hint="eastAsia" w:ascii="宋体" w:hAnsi="宋体" w:eastAsia="宋体" w:cs="宋体"/>
@@ -8782,7 +8945,7 @@
         </w:rPr>
         <w:t xml:space="preserve">一致</w:t>
       </w:r>
-      <w:del w:id="476" w:author="Kiro润色" w:date="2026-06-17T00:00:00Z">
+      <w:del w:id="489" w:author="Kiro润色" w:date="2026-06-17T00:00:00Z">
         <w:r>
           <w:rPr>
             <w:rFonts w:hint="eastAsia" w:ascii="宋体" w:hAnsi="宋体" w:eastAsia="宋体" w:cs="宋体"/>
@@ -8791,6 +8954,15 @@
           <w:delText xml:space="preserve">性</w:delText>
         </w:r>
       </w:del>
+      <w:ins w:id="490" w:author="Kiro润色" w:date="2026-06-17T00:00:00Z">
+        <w:r>
+          <w:rPr>
+            <w:rFonts w:hint="eastAsia" w:ascii="宋体" w:hAnsi="宋体" w:eastAsia="宋体" w:cs="宋体"/>
+            <w:color w:val="FF0000"/>
+          </w:rPr>
+          <w:t xml:space="preserve">（模型自身的辨证推理能力评测见3.2.2）</w:t>
+        </w:r>
+      </w:ins>
       <w:r>
         <w:rPr>
           <w:rFonts w:hint="eastAsia" w:ascii="宋体" w:hAnsi="宋体" w:eastAsia="宋体" w:cs="宋体"/>
@@ -8828,7 +9000,7 @@
           <w:color w:val="FF0000"/>
         </w:rPr>
       </w:pPr>
-      <w:del w:id="477" w:author="Kiro润色" w:date="2026-06-17T00:00:00Z">
+      <w:del w:id="491" w:author="Kiro润色" w:date="2026-06-17T00:00:00Z">
         <w:r>
           <w:rPr>
             <w:rFonts w:hint="eastAsia" w:ascii="宋体" w:hAnsi="宋体" w:eastAsia="宋体" w:cs="宋体"/>
@@ -8837,7 +9009,7 @@
           <w:delText xml:space="preserve">Wang等[31]采用</w:delText>
         </w:r>
       </w:del>
-      <w:ins w:id="478" w:author="Kiro润色" w:date="2026-06-17T00:00:00Z">
+      <w:ins w:id="492" w:author="Kiro润色" w:date="2026-06-17T00:00:00Z">
         <w:r>
           <w:rPr>
             <w:rFonts w:hint="eastAsia" w:ascii="宋体" w:hAnsi="宋体" w:eastAsia="宋体" w:cs="宋体"/>
@@ -8853,7 +9025,7 @@
         </w:rPr>
         <w:t xml:space="preserve">加权投票集成多个微调</w:t>
       </w:r>
-      <w:del w:id="479" w:author="Kiro润色" w:date="2026-06-17T00:00:00Z">
+      <w:del w:id="493" w:author="Kiro润色" w:date="2026-06-17T00:00:00Z">
         <w:r>
           <w:rPr>
             <w:rFonts w:hint="eastAsia" w:ascii="宋体" w:hAnsi="宋体" w:eastAsia="宋体" w:cs="宋体"/>
@@ -8862,7 +9034,7 @@
           <w:delText xml:space="preserve">LLM进行</w:delText>
         </w:r>
       </w:del>
-      <w:ins w:id="480" w:author="Kiro润色" w:date="2026-06-17T00:00:00Z">
+      <w:ins w:id="494" w:author="Kiro润色" w:date="2026-06-17T00:00:00Z">
         <w:r>
           <w:rPr>
             <w:rFonts w:hint="eastAsia" w:ascii="宋体" w:hAnsi="宋体" w:eastAsia="宋体" w:cs="宋体"/>
@@ -8878,7 +9050,7 @@
         </w:rPr>
         <w:t xml:space="preserve">方剂</w:t>
       </w:r>
-      <w:del w:id="481" w:author="Kiro润色" w:date="2026-06-17T00:00:00Z">
+      <w:del w:id="495" w:author="Kiro润色" w:date="2026-06-17T00:00:00Z">
         <w:r>
           <w:rPr>
             <w:rFonts w:hint="eastAsia" w:ascii="宋体" w:hAnsi="宋体" w:eastAsia="宋体" w:cs="宋体"/>
@@ -8894,7 +9066,7 @@
         </w:rPr>
         <w:t xml:space="preserve">分类准确性</w:t>
       </w:r>
-      <w:del w:id="482" w:author="Kiro润色" w:date="2026-06-17T00:00:00Z">
+      <w:del w:id="496" w:author="Kiro润色" w:date="2026-06-17T00:00:00Z">
         <w:r>
           <w:rPr>
             <w:rFonts w:hint="eastAsia" w:ascii="宋体" w:hAnsi="宋体" w:eastAsia="宋体" w:cs="宋体"/>
@@ -8903,7 +9075,7 @@
           <w:delText xml:space="preserve">；Lingdan</w:delText>
         </w:r>
       </w:del>
-      <w:ins w:id="483" w:author="Kiro润色" w:date="2026-06-17T00:00:00Z">
+      <w:ins w:id="497" w:author="Kiro润色" w:date="2026-06-17T00:00:00Z">
         <w:r>
           <w:rPr>
             <w:rFonts w:hint="eastAsia" w:ascii="宋体" w:hAnsi="宋体" w:eastAsia="宋体" w:cs="宋体"/>
@@ -8919,7 +9091,7 @@
         </w:rPr>
         <w:t xml:space="preserve">在草药处方推荐</w:t>
       </w:r>
-      <w:del w:id="484" w:author="Kiro润色" w:date="2026-06-17T00:00:00Z">
+      <w:del w:id="498" w:author="Kiro润色" w:date="2026-06-17T00:00:00Z">
         <w:r>
           <w:rPr>
             <w:rFonts w:hint="eastAsia" w:ascii="宋体" w:hAnsi="宋体" w:eastAsia="宋体" w:cs="宋体"/>
@@ -8935,7 +9107,7 @@
         </w:rPr>
         <w:t xml:space="preserve">上</w:t>
       </w:r>
-      <w:del w:id="485" w:author="Kiro润色" w:date="2026-06-17T00:00:00Z">
+      <w:del w:id="499" w:author="Kiro润色" w:date="2026-06-17T00:00:00Z">
         <w:r>
           <w:rPr>
             <w:rFonts w:hint="eastAsia" w:ascii="宋体" w:hAnsi="宋体" w:eastAsia="宋体" w:cs="宋体"/>
@@ -8944,7 +9116,7 @@
           <w:delText xml:space="preserve">取得了</w:delText>
         </w:r>
       </w:del>
-      <w:ins w:id="486" w:author="Kiro润色" w:date="2026-06-17T00:00:00Z">
+      <w:ins w:id="500" w:author="Kiro润色" w:date="2026-06-17T00:00:00Z">
         <w:r>
           <w:rPr>
             <w:rFonts w:hint="eastAsia" w:ascii="宋体" w:hAnsi="宋体" w:eastAsia="宋体" w:cs="宋体"/>
@@ -8960,7 +9132,7 @@
         </w:rPr>
         <w:t xml:space="preserve">领先</w:t>
       </w:r>
-      <w:del w:id="487" w:author="Kiro润色" w:date="2026-06-17T00:00:00Z">
+      <w:del w:id="501" w:author="Kiro润色" w:date="2026-06-17T00:00:00Z">
         <w:r>
           <w:rPr>
             <w:rFonts w:hint="eastAsia" w:ascii="宋体" w:hAnsi="宋体" w:eastAsia="宋体" w:cs="宋体"/>
@@ -8976,7 +9148,7 @@
         </w:rPr>
         <w:t xml:space="preserve">[29]</w:t>
       </w:r>
-      <w:del w:id="488" w:author="Kiro润色" w:date="2026-06-17T00:00:00Z">
+      <w:del w:id="502" w:author="Kiro润色" w:date="2026-06-17T00:00:00Z">
         <w:r>
           <w:rPr>
             <w:rFonts w:hint="eastAsia" w:ascii="宋体" w:hAnsi="宋体" w:eastAsia="宋体" w:cs="宋体"/>
@@ -8985,7 +9157,7 @@
           <w:delText xml:space="preserve">；TCMEval-PA基准用于评估模型审核</w:delText>
         </w:r>
       </w:del>
-      <w:ins w:id="489" w:author="Kiro润色" w:date="2026-06-17T00:00:00Z">
+      <w:ins w:id="503" w:author="Kiro润色" w:date="2026-06-17T00:00:00Z">
         <w:r>
           <w:rPr>
             <w:rFonts w:hint="eastAsia" w:ascii="宋体" w:hAnsi="宋体" w:eastAsia="宋体" w:cs="宋体"/>
@@ -9001,7 +9173,7 @@
         </w:rPr>
         <w:t xml:space="preserve">处方安全</w:t>
       </w:r>
-      <w:del w:id="490" w:author="Kiro润色" w:date="2026-06-17T00:00:00Z">
+      <w:del w:id="504" w:author="Kiro润色" w:date="2026-06-17T00:00:00Z">
         <w:r>
           <w:rPr>
             <w:rFonts w:hint="eastAsia" w:ascii="宋体" w:hAnsi="宋体" w:eastAsia="宋体" w:cs="宋体"/>
@@ -9010,7 +9182,7 @@
           <w:delText xml:space="preserve">性的能力</w:delText>
         </w:r>
       </w:del>
-      <w:ins w:id="491" w:author="Kiro润色" w:date="2026-06-17T00:00:00Z">
+      <w:ins w:id="505" w:author="Kiro润色" w:date="2026-06-17T00:00:00Z">
         <w:r>
           <w:rPr>
             <w:rFonts w:hint="eastAsia" w:ascii="宋体" w:hAnsi="宋体" w:eastAsia="宋体" w:cs="宋体"/>
@@ -9026,7 +9198,7 @@
         </w:rPr>
         <w:t xml:space="preserve">[12]。</w:t>
       </w:r>
-      <w:del w:id="492" w:author="Kiro润色" w:date="2026-06-17T00:00:00Z">
+      <w:del w:id="506" w:author="Kiro润色" w:date="2026-06-17T00:00:00Z">
         <w:r>
           <w:rPr>
             <w:rFonts w:hint="eastAsia" w:ascii="宋体" w:hAnsi="宋体" w:eastAsia="宋体" w:cs="宋体"/>
@@ -9035,7 +9207,7 @@
           <w:delText xml:space="preserve">上述评测着重</w:delText>
         </w:r>
       </w:del>
-      <w:ins w:id="493" w:author="Kiro润色" w:date="2026-06-17T00:00:00Z">
+      <w:ins w:id="507" w:author="Kiro润色" w:date="2026-06-17T00:00:00Z">
         <w:r>
           <w:rPr>
             <w:rFonts w:hint="eastAsia" w:ascii="宋体" w:hAnsi="宋体" w:eastAsia="宋体" w:cs="宋体"/>
@@ -9096,7 +9268,7 @@
         </w:rPr>
         <w:t xml:space="preserve">中医诊疗有赖于望闻问切</w:t>
       </w:r>
-      <w:ins w:id="494" w:author="Kiro润色" w:date="2026-06-17T00:00:00Z">
+      <w:ins w:id="508" w:author="Kiro润色" w:date="2026-06-17T00:00:00Z">
         <w:r>
           <w:rPr>
             <w:rFonts w:hint="eastAsia" w:ascii="宋体" w:hAnsi="宋体" w:eastAsia="宋体" w:cs="宋体"/>
@@ -9112,7 +9284,7 @@
         </w:rPr>
         <w:t xml:space="preserve">的多感官信息</w:t>
       </w:r>
-      <w:del w:id="495" w:author="Kiro润色" w:date="2026-06-17T00:00:00Z">
+      <w:del w:id="509" w:author="Kiro润色" w:date="2026-06-17T00:00:00Z">
         <w:r>
           <w:rPr>
             <w:rFonts w:hint="eastAsia" w:ascii="宋体" w:hAnsi="宋体" w:eastAsia="宋体" w:cs="宋体"/>
@@ -9128,7 +9300,7 @@
         </w:rPr>
         <w:t xml:space="preserve">，相关系统与评测正逐步向多模态</w:t>
       </w:r>
-      <w:del w:id="496" w:author="Kiro润色" w:date="2026-06-17T00:00:00Z">
+      <w:del w:id="510" w:author="Kiro润色" w:date="2026-06-17T00:00:00Z">
         <w:r>
           <w:rPr>
             <w:rFonts w:hint="eastAsia" w:ascii="宋体" w:hAnsi="宋体" w:eastAsia="宋体" w:cs="宋体"/>
@@ -9137,7 +9309,7 @@
           <w:delText xml:space="preserve">和</w:delText>
         </w:r>
       </w:del>
-      <w:ins w:id="497" w:author="Kiro润色" w:date="2026-06-17T00:00:00Z">
+      <w:ins w:id="511" w:author="Kiro润色" w:date="2026-06-17T00:00:00Z">
         <w:r>
           <w:rPr>
             <w:rFonts w:hint="eastAsia" w:ascii="宋体" w:hAnsi="宋体" w:eastAsia="宋体" w:cs="宋体"/>
@@ -9153,7 +9325,7 @@
         </w:rPr>
         <w:t xml:space="preserve">交互式方向延伸</w:t>
       </w:r>
-      <w:del w:id="498" w:author="Kiro润色" w:date="2026-06-17T00:00:00Z">
+      <w:del w:id="512" w:author="Kiro润色" w:date="2026-06-17T00:00:00Z">
         <w:r>
           <w:rPr>
             <w:rFonts w:hint="eastAsia" w:ascii="宋体" w:hAnsi="宋体" w:eastAsia="宋体" w:cs="宋体"/>
@@ -9162,7 +9334,7 @@
           <w:delText xml:space="preserve">。TongueVLM</w:delText>
         </w:r>
       </w:del>
-      <w:ins w:id="499" w:author="Kiro润色" w:date="2026-06-17T00:00:00Z">
+      <w:ins w:id="513" w:author="Kiro润色" w:date="2026-06-17T00:00:00Z">
         <w:r>
           <w:rPr>
             <w:rFonts w:hint="eastAsia" w:ascii="宋体" w:hAnsi="宋体" w:eastAsia="宋体" w:cs="宋体"/>
@@ -9178,7 +9350,7 @@
         </w:rPr>
         <w:t xml:space="preserve">面向舌象描述与体质推理，模拟医师依据舌象特征</w:t>
       </w:r>
-      <w:del w:id="500" w:author="Kiro润色" w:date="2026-06-17T00:00:00Z">
+      <w:del w:id="514" w:author="Kiro润色" w:date="2026-06-17T00:00:00Z">
         <w:r>
           <w:rPr>
             <w:rFonts w:hint="eastAsia" w:ascii="宋体" w:hAnsi="宋体" w:eastAsia="宋体" w:cs="宋体"/>
@@ -9187,7 +9359,7 @@
           <w:delText xml:space="preserve">进行</w:delText>
         </w:r>
       </w:del>
-      <w:ins w:id="501" w:author="Kiro润色" w:date="2026-06-17T00:00:00Z">
+      <w:ins w:id="515" w:author="Kiro润色" w:date="2026-06-17T00:00:00Z">
         <w:r>
           <w:rPr>
             <w:rFonts w:hint="eastAsia" w:ascii="宋体" w:hAnsi="宋体" w:eastAsia="宋体" w:cs="宋体"/>
@@ -9203,7 +9375,7 @@
         </w:rPr>
         <w:t xml:space="preserve">专业对话[16]；</w:t>
       </w:r>
-      <w:del w:id="502" w:author="Kiro润色" w:date="2026-06-17T00:00:00Z">
+      <w:del w:id="516" w:author="Kiro润色" w:date="2026-06-17T00:00:00Z">
         <w:r>
           <w:rPr>
             <w:rFonts w:hint="eastAsia" w:ascii="宋体" w:hAnsi="宋体" w:eastAsia="宋体" w:cs="宋体"/>
@@ -9212,7 +9384,7 @@
           <w:delText xml:space="preserve">DCB等动态基准</w:delText>
         </w:r>
       </w:del>
-      <w:ins w:id="503" w:author="Kiro润色" w:date="2026-06-17T00:00:00Z">
+      <w:ins w:id="517" w:author="Kiro润色" w:date="2026-06-17T00:00:00Z">
         <w:r>
           <w:rPr>
             <w:rFonts w:hint="eastAsia" w:ascii="宋体" w:hAnsi="宋体" w:eastAsia="宋体" w:cs="宋体"/>
@@ -9228,7 +9400,7 @@
         </w:rPr>
         <w:t xml:space="preserve">以医患对话形式还原接诊过程[10]。此类场景对模型</w:t>
       </w:r>
-      <w:del w:id="504" w:author="Kiro润色" w:date="2026-06-17T00:00:00Z">
+      <w:del w:id="518" w:author="Kiro润色" w:date="2026-06-17T00:00:00Z">
         <w:r>
           <w:rPr>
             <w:rFonts w:hint="eastAsia" w:ascii="宋体" w:hAnsi="宋体" w:eastAsia="宋体" w:cs="宋体"/>
@@ -9244,7 +9416,7 @@
         </w:rPr>
         <w:t xml:space="preserve">提出了超越文本问答的新要求</w:t>
       </w:r>
-      <w:ins w:id="505" w:author="Kiro润色" w:date="2026-06-17T00:00:00Z">
+      <w:ins w:id="519" w:author="Kiro润色" w:date="2026-06-17T00:00:00Z">
         <w:r>
           <w:rPr>
             <w:rFonts w:hint="eastAsia" w:ascii="宋体" w:hAnsi="宋体" w:eastAsia="宋体" w:cs="宋体"/>
@@ -9297,7 +9469,7 @@
           <w:color w:val="FF0000"/>
         </w:rPr>
       </w:pPr>
-      <w:del w:id="506" w:author="Kiro润色" w:date="2026-06-17T00:00:00Z">
+      <w:del w:id="520" w:author="Kiro润色" w:date="2026-06-17T00:00:00Z">
         <w:r>
           <w:rPr>
             <w:rFonts w:hint="eastAsia" w:ascii="宋体" w:hAnsi="宋体" w:eastAsia="宋体" w:cs="宋体"/>
@@ -9306,7 +9478,7 @@
           <w:delText xml:space="preserve">TCM-Align</w:delText>
         </w:r>
       </w:del>
-      <w:ins w:id="507" w:author="Kiro润色" w:date="2026-06-17T00:00:00Z">
+      <w:ins w:id="521" w:author="Kiro润色" w:date="2026-06-17T00:00:00Z">
         <w:r>
           <w:rPr>
             <w:rFonts w:hint="eastAsia" w:ascii="宋体" w:hAnsi="宋体" w:eastAsia="宋体" w:cs="宋体"/>
@@ -9322,7 +9494,7 @@
         </w:rPr>
         <w:t xml:space="preserve">可自动生成与课程大纲对齐的多项选择题</w:t>
       </w:r>
-      <w:ins w:id="508" w:author="Kiro润色" w:date="2026-06-17T00:00:00Z">
+      <w:ins w:id="522" w:author="Kiro润色" w:date="2026-06-17T00:00:00Z">
         <w:r>
           <w:rPr>
             <w:rFonts w:hint="eastAsia" w:ascii="宋体" w:hAnsi="宋体" w:eastAsia="宋体" w:cs="宋体"/>
@@ -9338,7 +9510,7 @@
         </w:rPr>
         <w:t xml:space="preserve">[13]。</w:t>
       </w:r>
-      <w:del w:id="509" w:author="Kiro润色" w:date="2026-06-17T00:00:00Z">
+      <w:del w:id="523" w:author="Kiro润色" w:date="2026-06-17T00:00:00Z">
         <w:r>
           <w:rPr>
             <w:rFonts w:hint="eastAsia" w:ascii="宋体" w:hAnsi="宋体" w:eastAsia="宋体" w:cs="宋体"/>
@@ -9347,7 +9519,7 @@
           <w:delText xml:space="preserve">多项研究评估了LLM在</w:delText>
         </w:r>
       </w:del>
-      <w:ins w:id="510" w:author="Kiro润色" w:date="2026-06-17T00:00:00Z">
+      <w:ins w:id="524" w:author="Kiro润色" w:date="2026-06-17T00:00:00Z">
         <w:r>
           <w:rPr>
             <w:rFonts w:hint="eastAsia" w:ascii="宋体" w:hAnsi="宋体" w:eastAsia="宋体" w:cs="宋体"/>
@@ -9363,7 +9535,7 @@
         </w:rPr>
         <w:t xml:space="preserve">中医研究生、执业医师考试</w:t>
       </w:r>
-      <w:del w:id="511" w:author="Kiro润色" w:date="2026-06-17T00:00:00Z">
+      <w:del w:id="525" w:author="Kiro润色" w:date="2026-06-17T00:00:00Z">
         <w:r>
           <w:rPr>
             <w:rFonts w:hint="eastAsia" w:ascii="宋体" w:hAnsi="宋体" w:eastAsia="宋体" w:cs="宋体"/>
@@ -9379,7 +9551,7 @@
         </w:rPr>
         <w:t xml:space="preserve">的</w:t>
       </w:r>
-      <w:del w:id="512" w:author="Kiro润色" w:date="2026-06-17T00:00:00Z">
+      <w:del w:id="526" w:author="Kiro润色" w:date="2026-06-17T00:00:00Z">
         <w:r>
           <w:rPr>
             <w:rFonts w:hint="eastAsia" w:ascii="宋体" w:hAnsi="宋体" w:eastAsia="宋体" w:cs="宋体"/>
@@ -9388,7 +9560,7 @@
           <w:delText xml:space="preserve">表现[23]，</w:delText>
         </w:r>
       </w:del>
-      <w:ins w:id="513" w:author="Kiro润色" w:date="2026-06-17T00:00:00Z">
+      <w:ins w:id="527" w:author="Kiro润色" w:date="2026-06-17T00:00:00Z">
         <w:r>
           <w:rPr>
             <w:rFonts w:hint="eastAsia" w:ascii="宋体" w:hAnsi="宋体" w:eastAsia="宋体" w:cs="宋体"/>
@@ -9404,7 +9576,7 @@
         </w:rPr>
         <w:t xml:space="preserve">除</w:t>
       </w:r>
-      <w:ins w:id="514" w:author="Kiro润色" w:date="2026-06-17T00:00:00Z">
+      <w:ins w:id="528" w:author="Kiro润色" w:date="2026-06-17T00:00:00Z">
         <w:r>
           <w:rPr>
             <w:rFonts w:hint="eastAsia" w:ascii="宋体" w:hAnsi="宋体" w:eastAsia="宋体" w:cs="宋体"/>
@@ -9420,7 +9592,7 @@
         </w:rPr>
         <w:t xml:space="preserve">答题正确率外，还分析</w:t>
       </w:r>
-      <w:del w:id="515" w:author="Kiro润色" w:date="2026-06-17T00:00:00Z">
+      <w:del w:id="529" w:author="Kiro润色" w:date="2026-06-17T00:00:00Z">
         <w:r>
           <w:rPr>
             <w:rFonts w:hint="eastAsia" w:ascii="宋体" w:hAnsi="宋体" w:eastAsia="宋体" w:cs="宋体"/>
@@ -9429,7 +9601,7 @@
           <w:delText xml:space="preserve">其</w:delText>
         </w:r>
       </w:del>
-      <w:ins w:id="516" w:author="Kiro润色" w:date="2026-06-17T00:00:00Z">
+      <w:ins w:id="530" w:author="Kiro润色" w:date="2026-06-17T00:00:00Z">
         <w:r>
           <w:rPr>
             <w:rFonts w:hint="eastAsia" w:ascii="宋体" w:hAnsi="宋体" w:eastAsia="宋体" w:cs="宋体"/>
@@ -9445,7 +9617,7 @@
         </w:rPr>
         <w:t xml:space="preserve">解题逻辑</w:t>
       </w:r>
-      <w:del w:id="517" w:author="Kiro润色" w:date="2026-06-17T00:00:00Z">
+      <w:del w:id="531" w:author="Kiro润色" w:date="2026-06-17T00:00:00Z">
         <w:r>
           <w:rPr>
             <w:rFonts w:hint="eastAsia" w:ascii="宋体" w:hAnsi="宋体" w:eastAsia="宋体" w:cs="宋体"/>
@@ -9454,7 +9626,7 @@
           <w:delText xml:space="preserve">和</w:delText>
         </w:r>
       </w:del>
-      <w:ins w:id="518" w:author="Kiro润色" w:date="2026-06-17T00:00:00Z">
+      <w:ins w:id="532" w:author="Kiro润色" w:date="2026-06-17T00:00:00Z">
         <w:r>
           <w:rPr>
             <w:rFonts w:hint="eastAsia" w:ascii="宋体" w:hAnsi="宋体" w:eastAsia="宋体" w:cs="宋体"/>
@@ -9470,7 +9642,7 @@
         </w:rPr>
         <w:t xml:space="preserve">信息使用方式，以</w:t>
       </w:r>
-      <w:del w:id="519" w:author="Kiro润色" w:date="2026-06-17T00:00:00Z">
+      <w:del w:id="533" w:author="Kiro润色" w:date="2026-06-17T00:00:00Z">
         <w:r>
           <w:rPr>
             <w:rFonts w:hint="eastAsia" w:ascii="宋体" w:hAnsi="宋体" w:eastAsia="宋体" w:cs="宋体"/>
@@ -9479,7 +9651,7 @@
           <w:delText xml:space="preserve">评估</w:delText>
         </w:r>
       </w:del>
-      <w:ins w:id="520" w:author="Kiro润色" w:date="2026-06-17T00:00:00Z">
+      <w:ins w:id="534" w:author="Kiro润色" w:date="2026-06-17T00:00:00Z">
         <w:r>
           <w:rPr>
             <w:rFonts w:hint="eastAsia" w:ascii="宋体" w:hAnsi="宋体" w:eastAsia="宋体" w:cs="宋体"/>
@@ -9495,7 +9667,7 @@
         </w:rPr>
         <w:t xml:space="preserve">其作为教育工具的可行性与潜在风险</w:t>
       </w:r>
-      <w:ins w:id="521" w:author="Kiro润色" w:date="2026-06-17T00:00:00Z">
+      <w:ins w:id="535" w:author="Kiro润色" w:date="2026-06-17T00:00:00Z">
         <w:r>
           <w:rPr>
             <w:rFonts w:hint="eastAsia" w:ascii="宋体" w:hAnsi="宋体" w:eastAsia="宋体" w:cs="宋体"/>
@@ -9547,7 +9719,7 @@
           <w:rFonts w:hint="eastAsia" w:ascii="宋体" w:hAnsi="宋体" w:eastAsia="宋体" w:cs="宋体"/>
         </w:rPr>
       </w:pPr>
-      <w:ins w:id="522" w:author="Kiro润色" w:date="2026-06-17T00:00:00Z">
+      <w:ins w:id="536" w:author="Kiro润色" w:date="2026-06-17T00:00:00Z">
         <w:r>
           <w:rPr>
             <w:rFonts w:hint="eastAsia" w:eastAsia="宋体" w:cs="宋体"/>
@@ -9565,7 +9737,7 @@
         </w:rPr>
         <w:t xml:space="preserve">研究</w:t>
       </w:r>
-      <w:del w:id="523" w:author="Kiro润色" w:date="2026-06-17T00:00:00Z">
+      <w:del w:id="537" w:author="Kiro润色" w:date="2026-06-17T00:00:00Z">
         <w:r>
           <w:rPr>
             <w:rFonts w:hint="eastAsia" w:eastAsia="宋体" w:cs="宋体"/>
@@ -9575,7 +9747,7 @@
           <w:delText xml:space="preserve">表明[32]，TEmbed-DDI利用LLM</w:delText>
         </w:r>
       </w:del>
-      <w:ins w:id="524" w:author="Kiro润色" w:date="2026-06-17T00:00:00Z">
+      <w:ins w:id="538" w:author="Kiro润色" w:date="2026-06-17T00:00:00Z">
         <w:r>
           <w:rPr>
             <w:rFonts w:hint="eastAsia" w:eastAsia="宋体" w:cs="宋体"/>
@@ -9593,7 +9765,7 @@
         </w:rPr>
         <w:t xml:space="preserve">嵌入</w:t>
       </w:r>
-      <w:del w:id="525" w:author="Kiro润色" w:date="2026-06-17T00:00:00Z">
+      <w:del w:id="539" w:author="Kiro润色" w:date="2026-06-17T00:00:00Z">
         <w:r>
           <w:rPr>
             <w:rFonts w:hint="eastAsia" w:eastAsia="宋体" w:cs="宋体"/>
@@ -9603,7 +9775,7 @@
           <w:delText xml:space="preserve">和</w:delText>
         </w:r>
       </w:del>
-      <w:ins w:id="526" w:author="Kiro润色" w:date="2026-06-17T00:00:00Z">
+      <w:ins w:id="540" w:author="Kiro润色" w:date="2026-06-17T00:00:00Z">
         <w:r>
           <w:rPr>
             <w:rFonts w:hint="eastAsia" w:eastAsia="宋体" w:cs="宋体"/>
@@ -9621,7 +9793,7 @@
         </w:rPr>
         <w:t xml:space="preserve">双向神经网络</w:t>
       </w:r>
-      <w:del w:id="527" w:author="Kiro润色" w:date="2026-06-17T00:00:00Z">
+      <w:del w:id="541" w:author="Kiro润色" w:date="2026-06-17T00:00:00Z">
         <w:r>
           <w:rPr>
             <w:rFonts w:hint="eastAsia" w:eastAsia="宋体" w:cs="宋体"/>
@@ -9631,7 +9803,7 @@
           <w:delText xml:space="preserve">进行</w:delText>
         </w:r>
       </w:del>
-      <w:ins w:id="528" w:author="Kiro润色" w:date="2026-06-17T00:00:00Z">
+      <w:ins w:id="542" w:author="Kiro润色" w:date="2026-06-17T00:00:00Z">
         <w:r>
           <w:rPr>
             <w:rFonts w:hint="eastAsia" w:eastAsia="宋体" w:cs="宋体"/>
@@ -9649,7 +9821,7 @@
         </w:rPr>
         <w:t xml:space="preserve">跨领域药物相互作用注释，展示</w:t>
       </w:r>
-      <w:del w:id="529" w:author="Kiro润色" w:date="2026-06-17T00:00:00Z">
+      <w:del w:id="543" w:author="Kiro润色" w:date="2026-06-17T00:00:00Z">
         <w:r>
           <w:rPr>
             <w:rFonts w:hint="eastAsia" w:eastAsia="宋体" w:cs="宋体"/>
@@ -9659,7 +9831,7 @@
           <w:delText xml:space="preserve">LLM在</w:delText>
         </w:r>
       </w:del>
-      <w:ins w:id="530" w:author="Kiro润色" w:date="2026-06-17T00:00:00Z">
+      <w:ins w:id="544" w:author="Kiro润色" w:date="2026-06-17T00:00:00Z">
         <w:r>
           <w:rPr>
             <w:rFonts w:hint="eastAsia" w:eastAsia="宋体" w:cs="宋体"/>
@@ -9677,7 +9849,7 @@
         </w:rPr>
         <w:t xml:space="preserve">发现潜在药物相互作用</w:t>
       </w:r>
-      <w:del w:id="531" w:author="Kiro润色" w:date="2026-06-17T00:00:00Z">
+      <w:del w:id="545" w:author="Kiro润色" w:date="2026-06-17T00:00:00Z">
         <w:r>
           <w:rPr>
             <w:rFonts w:hint="eastAsia" w:eastAsia="宋体" w:cs="宋体"/>
@@ -9695,7 +9867,7 @@
         </w:rPr>
         <w:t xml:space="preserve">的能力</w:t>
       </w:r>
-      <w:del w:id="532" w:author="Kiro润色" w:date="2026-06-17T00:00:00Z">
+      <w:del w:id="546" w:author="Kiro润色" w:date="2026-06-17T00:00:00Z">
         <w:r>
           <w:rPr>
             <w:rFonts w:hint="eastAsia" w:eastAsia="宋体" w:cs="宋体"/>
@@ -9713,7 +9885,7 @@
         </w:rPr>
         <w:t xml:space="preserve">[3</w:t>
       </w:r>
-      <w:del w:id="533" w:author="Kiro润色" w:date="2026-06-17T00:00:00Z">
+      <w:del w:id="547" w:author="Kiro润色" w:date="2026-06-17T00:00:00Z">
         <w:r>
           <w:rPr>
             <w:rFonts w:hint="eastAsia" w:eastAsia="宋体" w:cs="宋体"/>
@@ -9723,7 +9895,7 @@
           <w:delText xml:space="preserve">3</w:delText>
         </w:r>
       </w:del>
-      <w:ins w:id="534" w:author="Kiro润色" w:date="2026-06-17T00:00:00Z">
+      <w:ins w:id="548" w:author="Kiro润色" w:date="2026-06-17T00:00:00Z">
         <w:r>
           <w:rPr>
             <w:rFonts w:hint="eastAsia" w:eastAsia="宋体" w:cs="宋体"/>
@@ -9741,7 +9913,7 @@
         </w:rPr>
         <w:t xml:space="preserve">]</w:t>
       </w:r>
-      <w:ins w:id="535" w:author="Kiro润色" w:date="2026-06-17T00:00:00Z">
+      <w:ins w:id="549" w:author="Kiro润色" w:date="2026-06-17T00:00:00Z">
         <w:r>
           <w:rPr>
             <w:rFonts w:hint="eastAsia" w:eastAsia="宋体" w:cs="宋体"/>
@@ -9759,7 +9931,7 @@
         </w:rPr>
         <w:t xml:space="preserve">提出</w:t>
       </w:r>
-      <w:del w:id="536" w:author="Kiro润色" w:date="2026-06-17T00:00:00Z">
+      <w:del w:id="550" w:author="Kiro润色" w:date="2026-06-17T00:00:00Z">
         <w:r>
           <w:rPr>
             <w:rFonts w:hint="eastAsia" w:eastAsia="宋体" w:cs="宋体"/>
@@ -9777,7 +9949,7 @@
         </w:rPr>
         <w:t xml:space="preserve">字符级卷积循环交互网络（CCRIN）</w:t>
       </w:r>
-      <w:del w:id="537" w:author="Kiro润色" w:date="2026-06-17T00:00:00Z">
+      <w:del w:id="551" w:author="Kiro润色" w:date="2026-06-17T00:00:00Z">
         <w:r>
           <w:rPr>
             <w:rFonts w:hint="eastAsia" w:eastAsia="宋体" w:cs="宋体"/>
@@ -9787,7 +9959,7 @@
           <w:delText xml:space="preserve">可</w:delText>
         </w:r>
       </w:del>
-      <w:ins w:id="538" w:author="Kiro润色" w:date="2026-06-17T00:00:00Z">
+      <w:ins w:id="552" w:author="Kiro润色" w:date="2026-06-17T00:00:00Z">
         <w:r>
           <w:rPr>
             <w:rFonts w:hint="eastAsia" w:eastAsia="宋体" w:cs="宋体"/>
@@ -9805,7 +9977,7 @@
         </w:rPr>
         <w:t xml:space="preserve">从中医临床文本中联合抽取实体</w:t>
       </w:r>
-      <w:del w:id="539" w:author="Kiro润色" w:date="2026-06-17T00:00:00Z">
+      <w:del w:id="553" w:author="Kiro润色" w:date="2026-06-17T00:00:00Z">
         <w:r>
           <w:rPr>
             <w:rFonts w:hint="eastAsia" w:eastAsia="宋体" w:cs="宋体"/>
@@ -9815,7 +9987,7 @@
           <w:delText xml:space="preserve">和</w:delText>
         </w:r>
       </w:del>
-      <w:ins w:id="540" w:author="Kiro润色" w:date="2026-06-17T00:00:00Z">
+      <w:ins w:id="554" w:author="Kiro润色" w:date="2026-06-17T00:00:00Z">
         <w:r>
           <w:rPr>
             <w:rFonts w:hint="eastAsia" w:eastAsia="宋体" w:cs="宋体"/>
@@ -9833,7 +10005,7 @@
         </w:rPr>
         <w:t xml:space="preserve">关系，为构建知识图谱提供支持</w:t>
       </w:r>
-      <w:ins w:id="541" w:author="Kiro润色" w:date="2026-06-17T00:00:00Z">
+      <w:ins w:id="555" w:author="Kiro润色" w:date="2026-06-17T00:00:00Z">
         <w:r>
           <w:rPr>
             <w:rFonts w:hint="eastAsia" w:eastAsia="宋体" w:cs="宋体"/>
@@ -9947,7 +10119,7 @@
           <w:color w:val="FF0000"/>
         </w:rPr>
       </w:pPr>
-      <w:del w:id="542" w:author="Kiro润色" w:date="2026-06-17T00:00:00Z">
+      <w:del w:id="556" w:author="Kiro润色" w:date="2026-06-17T00:00:00Z">
         <w:r>
           <w:rPr>
             <w:rFonts w:hint="eastAsia" w:ascii="宋体" w:hAnsi="宋体" w:eastAsia="宋体" w:cs="宋体"/>
@@ -9956,7 +10128,7 @@
           <w:delText xml:space="preserve">LLM</w:delText>
         </w:r>
       </w:del>
-      <w:ins w:id="543" w:author="Kiro润色" w:date="2026-06-17T00:00:00Z">
+      <w:ins w:id="557" w:author="Kiro润色" w:date="2026-06-17T00:00:00Z">
         <w:r>
           <w:rPr>
             <w:rFonts w:hint="eastAsia" w:ascii="宋体" w:hAnsi="宋体" w:eastAsia="宋体" w:cs="宋体"/>
@@ -9972,7 +10144,7 @@
         </w:rPr>
         <w:t xml:space="preserve">能够通过执业医师考试</w:t>
       </w:r>
-      <w:del w:id="544" w:author="Kiro润色" w:date="2026-06-17T00:00:00Z">
+      <w:del w:id="558" w:author="Kiro润色" w:date="2026-06-17T00:00:00Z">
         <w:r>
           <w:rPr>
             <w:rFonts w:hint="eastAsia" w:ascii="宋体" w:hAnsi="宋体" w:eastAsia="宋体" w:cs="宋体"/>
@@ -9981,7 +10153,7 @@
           <w:delText xml:space="preserve">并</w:delText>
         </w:r>
       </w:del>
-      <w:ins w:id="545" w:author="Kiro润色" w:date="2026-06-17T00:00:00Z">
+      <w:ins w:id="559" w:author="Kiro润色" w:date="2026-06-17T00:00:00Z">
         <w:r>
           <w:rPr>
             <w:rFonts w:hint="eastAsia" w:ascii="宋体" w:hAnsi="宋体" w:eastAsia="宋体" w:cs="宋体"/>
@@ -9997,7 +10169,7 @@
         </w:rPr>
         <w:t xml:space="preserve">在选择题上达</w:t>
       </w:r>
-      <w:ins w:id="546" w:author="Kiro润色" w:date="2026-06-17T00:00:00Z">
+      <w:ins w:id="560" w:author="Kiro润色" w:date="2026-06-17T00:00:00Z">
         <w:r>
           <w:rPr>
             <w:rFonts w:hint="eastAsia" w:ascii="宋体" w:hAnsi="宋体" w:eastAsia="宋体" w:cs="宋体"/>
@@ -10013,7 +10185,7 @@
         </w:rPr>
         <w:t xml:space="preserve">90%以上的准确率，</w:t>
       </w:r>
-      <w:del w:id="547" w:author="Kiro润色" w:date="2026-06-17T00:00:00Z">
+      <w:del w:id="561" w:author="Kiro润色" w:date="2026-06-17T00:00:00Z">
         <w:r>
           <w:rPr>
             <w:rFonts w:hint="eastAsia" w:ascii="宋体" w:hAnsi="宋体" w:eastAsia="宋体" w:cs="宋体"/>
@@ -10022,7 +10194,7 @@
           <w:delText xml:space="preserve">这本质上</w:delText>
         </w:r>
       </w:del>
-      <w:ins w:id="548" w:author="Kiro润色" w:date="2026-06-17T00:00:00Z">
+      <w:ins w:id="562" w:author="Kiro润色" w:date="2026-06-17T00:00:00Z">
         <w:r>
           <w:rPr>
             <w:rFonts w:hint="eastAsia" w:ascii="宋体" w:hAnsi="宋体" w:eastAsia="宋体" w:cs="宋体"/>
@@ -10038,7 +10210,7 @@
         </w:rPr>
         <w:t xml:space="preserve">度量的</w:t>
       </w:r>
-      <w:ins w:id="549" w:author="Kiro润色" w:date="2026-06-17T00:00:00Z">
+      <w:ins w:id="563" w:author="Kiro润色" w:date="2026-06-17T00:00:00Z">
         <w:r>
           <w:rPr>
             <w:rFonts w:hint="eastAsia" w:ascii="宋体" w:hAnsi="宋体" w:eastAsia="宋体" w:cs="宋体"/>
@@ -10054,7 +10226,7 @@
         </w:rPr>
         <w:t xml:space="preserve">是文本到文本的符号映射能力，与真实中医诊疗所需的跨模态感知综合判断能力</w:t>
       </w:r>
-      <w:del w:id="550" w:author="Kiro润色" w:date="2026-06-17T00:00:00Z">
+      <w:del w:id="564" w:author="Kiro润色" w:date="2026-06-17T00:00:00Z">
         <w:r>
           <w:rPr>
             <w:rFonts w:hint="eastAsia" w:ascii="宋体" w:hAnsi="宋体" w:eastAsia="宋体" w:cs="宋体"/>
@@ -10070,7 +10242,7 @@
         </w:rPr>
         <w:t xml:space="preserve">存在</w:t>
       </w:r>
-      <w:del w:id="551" w:author="Kiro润色" w:date="2026-06-17T00:00:00Z">
+      <w:del w:id="565" w:author="Kiro润色" w:date="2026-06-17T00:00:00Z">
         <w:r>
           <w:rPr>
             <w:rFonts w:hint="eastAsia" w:ascii="宋体" w:hAnsi="宋体" w:eastAsia="宋体" w:cs="宋体"/>
@@ -10079,7 +10251,7 @@
           <w:delText xml:space="preserve">本质</w:delText>
         </w:r>
       </w:del>
-      <w:ins w:id="552" w:author="Kiro润色" w:date="2026-06-17T00:00:00Z">
+      <w:ins w:id="566" w:author="Kiro润色" w:date="2026-06-17T00:00:00Z">
         <w:r>
           <w:rPr>
             <w:rFonts w:hint="eastAsia" w:ascii="宋体" w:hAnsi="宋体" w:eastAsia="宋体" w:cs="宋体"/>
@@ -10095,7 +10267,7 @@
         </w:rPr>
         <w:t xml:space="preserve">区别。文本</w:t>
       </w:r>
-      <w:del w:id="553" w:author="Kiro润色" w:date="2026-06-17T00:00:00Z">
+      <w:del w:id="567" w:author="Kiro润色" w:date="2026-06-17T00:00:00Z">
         <w:r>
           <w:rPr>
             <w:rFonts w:hint="eastAsia" w:ascii="宋体" w:hAnsi="宋体" w:eastAsia="宋体" w:cs="宋体"/>
@@ -10111,7 +10283,7 @@
         </w:rPr>
         <w:t xml:space="preserve">任务上的良好表现，可能</w:t>
       </w:r>
-      <w:del w:id="554" w:author="Kiro润色" w:date="2026-06-17T00:00:00Z">
+      <w:del w:id="568" w:author="Kiro润色" w:date="2026-06-17T00:00:00Z">
         <w:r>
           <w:rPr>
             <w:rFonts w:hint="eastAsia" w:ascii="宋体" w:hAnsi="宋体" w:eastAsia="宋体" w:cs="宋体"/>
@@ -10127,7 +10299,7 @@
         </w:rPr>
         <w:t xml:space="preserve">掩盖</w:t>
       </w:r>
-      <w:del w:id="555" w:author="Kiro润色" w:date="2026-06-17T00:00:00Z">
+      <w:del w:id="569" w:author="Kiro润色" w:date="2026-06-17T00:00:00Z">
         <w:r>
           <w:rPr>
             <w:rFonts w:hint="eastAsia" w:ascii="宋体" w:hAnsi="宋体" w:eastAsia="宋体" w:cs="宋体"/>
@@ -10136,7 +10308,7 @@
           <w:delText xml:space="preserve">中医临床所需的</w:delText>
         </w:r>
       </w:del>
-      <w:ins w:id="556" w:author="Kiro润色" w:date="2026-06-17T00:00:00Z">
+      <w:ins w:id="570" w:author="Kiro润色" w:date="2026-06-17T00:00:00Z">
         <w:r>
           <w:rPr>
             <w:rFonts w:hint="eastAsia" w:ascii="宋体" w:hAnsi="宋体" w:eastAsia="宋体" w:cs="宋体"/>
@@ -10152,7 +10324,7 @@
         </w:rPr>
         <w:t xml:space="preserve">多感官、具身、情境依赖</w:t>
       </w:r>
-      <w:ins w:id="557" w:author="Kiro润色" w:date="2026-06-17T00:00:00Z">
+      <w:ins w:id="571" w:author="Kiro润色" w:date="2026-06-17T00:00:00Z">
         <w:r>
           <w:rPr>
             <w:rFonts w:hint="eastAsia" w:ascii="宋体" w:hAnsi="宋体" w:eastAsia="宋体" w:cs="宋体"/>
@@ -10168,7 +10340,7 @@
         </w:rPr>
         <w:t xml:space="preserve">认知过程的评估缺失，从而</w:t>
       </w:r>
-      <w:del w:id="558" w:author="Kiro润色" w:date="2026-06-17T00:00:00Z">
+      <w:del w:id="572" w:author="Kiro润色" w:date="2026-06-17T00:00:00Z">
         <w:r>
           <w:rPr>
             <w:rFonts w:hint="eastAsia" w:ascii="宋体" w:hAnsi="宋体" w:eastAsia="宋体" w:cs="宋体"/>
@@ -10177,7 +10349,7 @@
           <w:delText xml:space="preserve">导致对</w:delText>
         </w:r>
       </w:del>
-      <w:ins w:id="559" w:author="Kiro润色" w:date="2026-06-17T00:00:00Z">
+      <w:ins w:id="573" w:author="Kiro润色" w:date="2026-06-17T00:00:00Z">
         <w:r>
           <w:rPr>
             <w:rFonts w:hint="eastAsia" w:ascii="宋体" w:hAnsi="宋体" w:eastAsia="宋体" w:cs="宋体"/>
@@ -10193,7 +10365,7 @@
         </w:rPr>
         <w:t xml:space="preserve">模型</w:t>
       </w:r>
-      <w:ins w:id="560" w:author="Kiro润色" w:date="2026-06-17T00:00:00Z">
+      <w:ins w:id="574" w:author="Kiro润色" w:date="2026-06-17T00:00:00Z">
         <w:r>
           <w:rPr>
             <w:rFonts w:hint="eastAsia" w:ascii="宋体" w:hAnsi="宋体" w:eastAsia="宋体" w:cs="宋体"/>
@@ -10209,7 +10381,7 @@
         </w:rPr>
         <w:t xml:space="preserve">实际临床能力</w:t>
       </w:r>
-      <w:del w:id="561" w:author="Kiro润色" w:date="2026-06-17T00:00:00Z">
+      <w:del w:id="575" w:author="Kiro润色" w:date="2026-06-17T00:00:00Z">
         <w:r>
           <w:rPr>
             <w:rFonts w:hint="eastAsia" w:ascii="宋体" w:hAnsi="宋体" w:eastAsia="宋体" w:cs="宋体"/>
@@ -10225,7 +10397,7 @@
         </w:rPr>
         <w:t xml:space="preserve">。</w:t>
       </w:r>
-      <w:ins w:id="562" w:author="Kiro润色" w:date="2026-06-17T00:00:00Z">
+      <w:ins w:id="576" w:author="Kiro润色" w:date="2026-06-17T00:00:00Z">
         <w:r>
           <w:rPr>
             <w:rFonts w:hint="eastAsia" w:ascii="宋体" w:hAnsi="宋体" w:eastAsia="宋体" w:cs="宋体"/>
@@ -10241,7 +10413,7 @@
         </w:rPr>
         <w:t xml:space="preserve">“知道”舌红苔黄腻主湿热的模型，未必能在真实舌象图像中</w:t>
       </w:r>
-      <w:del w:id="563" w:author="Kiro润色" w:date="2026-06-17T00:00:00Z">
+      <w:del w:id="577" w:author="Kiro润色" w:date="2026-06-17T00:00:00Z">
         <w:r>
           <w:rPr>
             <w:rFonts w:hint="eastAsia" w:ascii="宋体" w:hAnsi="宋体" w:eastAsia="宋体" w:cs="宋体"/>
@@ -10257,7 +10429,7 @@
         </w:rPr>
         <w:t xml:space="preserve">识别该特征，</w:t>
       </w:r>
-      <w:del w:id="564" w:author="Kiro润色" w:date="2026-06-17T00:00:00Z">
+      <w:del w:id="578" w:author="Kiro润色" w:date="2026-06-17T00:00:00Z">
         <w:r>
           <w:rPr>
             <w:rFonts w:hint="eastAsia" w:ascii="宋体" w:hAnsi="宋体" w:eastAsia="宋体" w:cs="宋体"/>
@@ -10266,7 +10438,7 @@
           <w:delText xml:space="preserve">更</w:delText>
         </w:r>
       </w:del>
-      <w:ins w:id="565" w:author="Kiro润色" w:date="2026-06-17T00:00:00Z">
+      <w:ins w:id="579" w:author="Kiro润色" w:date="2026-06-17T00:00:00Z">
         <w:r>
           <w:rPr>
             <w:rFonts w:hint="eastAsia" w:ascii="宋体" w:hAnsi="宋体" w:eastAsia="宋体" w:cs="宋体"/>
@@ -10282,7 +10454,7 @@
         </w:rPr>
         <w:t xml:space="preserve">难以结合脉象、面色</w:t>
       </w:r>
-      <w:del w:id="566" w:author="Kiro润色" w:date="2026-06-17T00:00:00Z">
+      <w:del w:id="580" w:author="Kiro润色" w:date="2026-06-17T00:00:00Z">
         <w:r>
           <w:rPr>
             <w:rFonts w:hint="eastAsia" w:ascii="宋体" w:hAnsi="宋体" w:eastAsia="宋体" w:cs="宋体"/>
@@ -10291,7 +10463,7 @@
           <w:delText xml:space="preserve">和</w:delText>
         </w:r>
       </w:del>
-      <w:ins w:id="567" w:author="Kiro润色" w:date="2026-06-17T00:00:00Z">
+      <w:ins w:id="581" w:author="Kiro润色" w:date="2026-06-17T00:00:00Z">
         <w:r>
           <w:rPr>
             <w:rFonts w:hint="eastAsia" w:ascii="宋体" w:hAnsi="宋体" w:eastAsia="宋体" w:cs="宋体"/>
@@ -10307,7 +10479,7 @@
         </w:rPr>
         <w:t xml:space="preserve">问诊信息完成综合辨证。</w:t>
       </w:r>
-      <w:del w:id="568" w:author="Kiro润色" w:date="2026-06-17T00:00:00Z">
+      <w:del w:id="582" w:author="Kiro润色" w:date="2026-06-17T00:00:00Z">
         <w:r>
           <w:rPr>
             <w:rFonts w:hint="eastAsia" w:ascii="宋体" w:hAnsi="宋体" w:eastAsia="宋体" w:cs="宋体"/>
@@ -10323,7 +10495,7 @@
         </w:rPr>
         <w:t xml:space="preserve">医</w:t>
       </w:r>
-      <w:del w:id="569" w:author="Kiro润色" w:date="2026-06-17T00:00:00Z">
+      <w:del w:id="583" w:author="Kiro润色" w:date="2026-06-17T00:00:00Z">
         <w:r>
           <w:rPr>
             <w:rFonts w:hint="eastAsia" w:ascii="宋体" w:hAnsi="宋体" w:eastAsia="宋体" w:cs="宋体"/>
@@ -10364,7 +10536,7 @@
           <w:rFonts w:hint="eastAsia" w:ascii="宋体" w:hAnsi="宋体" w:eastAsia="宋体" w:cs="宋体"/>
         </w:rPr>
       </w:pPr>
-      <w:del w:id="570" w:author="Kiro润色" w:date="2026-06-17T00:00:00Z">
+      <w:del w:id="584" w:author="Kiro润色" w:date="2026-06-17T00:00:00Z">
         <w:r>
           <w:rPr>
             <w:rFonts w:hint="default" w:ascii="Times New Roman" w:hAnsi="Times New Roman" w:eastAsia="宋体" w:cs="Times New Roman"/>
@@ -10374,7 +10546,7 @@
           <w:delText xml:space="preserve">研究</w:delText>
         </w:r>
       </w:del>
-      <w:ins w:id="571" w:author="Kiro润色" w:date="2026-06-17T00:00:00Z">
+      <w:ins w:id="585" w:author="Kiro润色" w:date="2026-06-17T00:00:00Z">
         <w:r>
           <w:rPr>
             <w:rFonts w:hint="default" w:ascii="Times New Roman" w:hAnsi="Times New Roman" w:eastAsia="宋体" w:cs="Times New Roman"/>
@@ -10392,7 +10564,7 @@
         </w:rPr>
         <w:t xml:space="preserve">发现</w:t>
       </w:r>
-      <w:del w:id="572" w:author="Kiro润色" w:date="2026-06-17T00:00:00Z">
+      <w:del w:id="586" w:author="Kiro润色" w:date="2026-06-17T00:00:00Z">
         <w:r>
           <w:rPr>
             <w:rFonts w:hint="default" w:ascii="Times New Roman" w:hAnsi="Times New Roman" w:eastAsia="宋体" w:cs="Times New Roman"/>
@@ -10402,7 +10574,7 @@
           <w:delText xml:space="preserve">，</w:delText>
         </w:r>
       </w:del>
-      <w:ins w:id="573" w:author="Kiro润色" w:date="2026-06-17T00:00:00Z">
+      <w:ins w:id="587" w:author="Kiro润色" w:date="2026-06-17T00:00:00Z">
         <w:r>
           <w:rPr>
             <w:rFonts w:hint="default" w:ascii="Times New Roman" w:hAnsi="Times New Roman" w:eastAsia="宋体" w:cs="Times New Roman"/>
@@ -10420,7 +10592,7 @@
         </w:rPr>
         <w:t xml:space="preserve">“正负向能力鸿沟”</w:t>
       </w:r>
-      <w:del w:id="574" w:author="Kiro润色" w:date="2026-06-17T00:00:00Z">
+      <w:del w:id="588" w:author="Kiro润色" w:date="2026-06-17T00:00:00Z">
         <w:r>
           <w:rPr>
             <w:rFonts w:hint="default" w:ascii="Times New Roman" w:hAnsi="Times New Roman" w:eastAsia="宋体" w:cs="Times New Roman"/>
@@ -10430,7 +10602,7 @@
           <w:delText xml:space="preserve">仅</w:delText>
         </w:r>
       </w:del>
-      <w:ins w:id="575" w:author="Kiro润色" w:date="2026-06-17T00:00:00Z">
+      <w:ins w:id="589" w:author="Kiro润色" w:date="2026-06-17T00:00:00Z">
         <w:r>
           <w:rPr>
             <w:rFonts w:hint="default" w:ascii="Times New Roman" w:hAnsi="Times New Roman" w:eastAsia="宋体" w:cs="Times New Roman"/>
@@ -10448,7 +10620,7 @@
         </w:rPr>
         <w:t xml:space="preserve">是文本层面安全问题的一部分[11]</w:t>
       </w:r>
-      <w:del w:id="576" w:author="Kiro润色" w:date="2026-06-17T00:00:00Z">
+      <w:del w:id="590" w:author="Kiro润色" w:date="2026-06-17T00:00:00Z">
         <w:r>
           <w:rPr>
             <w:rFonts w:hint="default" w:ascii="Times New Roman" w:hAnsi="Times New Roman" w:eastAsia="宋体" w:cs="Times New Roman"/>
@@ -10458,7 +10630,7 @@
           <w:delText xml:space="preserve">，</w:delText>
         </w:r>
       </w:del>
-      <w:ins w:id="577" w:author="Kiro润色" w:date="2026-06-17T00:00:00Z">
+      <w:ins w:id="591" w:author="Kiro润色" w:date="2026-06-17T00:00:00Z">
         <w:r>
           <w:rPr>
             <w:rFonts w:hint="default" w:ascii="Times New Roman" w:hAnsi="Times New Roman" w:eastAsia="宋体" w:cs="Times New Roman"/>
@@ -10476,7 +10648,7 @@
         </w:rPr>
         <w:t xml:space="preserve">现有评测大多</w:t>
       </w:r>
-      <w:del w:id="578" w:author="Kiro润色" w:date="2026-06-17T00:00:00Z">
+      <w:del w:id="592" w:author="Kiro润色" w:date="2026-06-17T00:00:00Z">
         <w:r>
           <w:rPr>
             <w:rFonts w:hint="default" w:ascii="Times New Roman" w:hAnsi="Times New Roman" w:eastAsia="宋体" w:cs="Times New Roman"/>
@@ -10486,7 +10658,7 @@
           <w:delText xml:space="preserve">仅</w:delText>
         </w:r>
       </w:del>
-      <w:ins w:id="579" w:author="Kiro润色" w:date="2026-06-17T00:00:00Z">
+      <w:ins w:id="593" w:author="Kiro润色" w:date="2026-06-17T00:00:00Z">
         <w:r>
           <w:rPr>
             <w:rFonts w:hint="default" w:ascii="Times New Roman" w:hAnsi="Times New Roman" w:eastAsia="宋体" w:cs="Times New Roman"/>
@@ -10504,7 +10676,7 @@
         </w:rPr>
         <w:t xml:space="preserve">关注文本准确率，对幻觉（</w:t>
       </w:r>
-      <w:del w:id="580" w:author="Kiro润色" w:date="2026-06-17T00:00:00Z">
+      <w:del w:id="594" w:author="Kiro润色" w:date="2026-06-17T00:00:00Z">
         <w:r>
           <w:rPr>
             <w:rFonts w:hint="default" w:ascii="Times New Roman" w:hAnsi="Times New Roman" w:eastAsia="宋体" w:cs="Times New Roman"/>
@@ -10514,7 +10686,7 @@
           <w:delText xml:space="preserve">H</w:delText>
         </w:r>
       </w:del>
-      <w:ins w:id="581" w:author="Kiro润色" w:date="2026-06-17T00:00:00Z">
+      <w:ins w:id="595" w:author="Kiro润色" w:date="2026-06-17T00:00:00Z">
         <w:r>
           <w:rPr>
             <w:rFonts w:hint="default" w:ascii="Times New Roman" w:hAnsi="Times New Roman" w:eastAsia="宋体" w:cs="Times New Roman"/>
@@ -10532,7 +10704,7 @@
         </w:rPr>
         <w:t xml:space="preserve">allucination）、错误信息识别</w:t>
       </w:r>
-      <w:del w:id="582" w:author="Kiro润色" w:date="2026-06-17T00:00:00Z">
+      <w:del w:id="596" w:author="Kiro润色" w:date="2026-06-17T00:00:00Z">
         <w:r>
           <w:rPr>
             <w:rFonts w:hint="default" w:ascii="Times New Roman" w:hAnsi="Times New Roman" w:eastAsia="宋体" w:cs="Times New Roman"/>
@@ -10542,7 +10714,7 @@
           <w:delText xml:space="preserve">和</w:delText>
         </w:r>
       </w:del>
-      <w:ins w:id="583" w:author="Kiro润色" w:date="2026-06-17T00:00:00Z">
+      <w:ins w:id="597" w:author="Kiro润色" w:date="2026-06-17T00:00:00Z">
         <w:r>
           <w:rPr>
             <w:rFonts w:hint="default" w:ascii="Times New Roman" w:hAnsi="Times New Roman" w:eastAsia="宋体" w:cs="Times New Roman"/>
@@ -10560,7 +10732,7 @@
         </w:rPr>
         <w:t xml:space="preserve">不确定性校准（</w:t>
       </w:r>
-      <w:del w:id="584" w:author="Kiro润色" w:date="2026-06-17T00:00:00Z">
+      <w:del w:id="598" w:author="Kiro润色" w:date="2026-06-17T00:00:00Z">
         <w:r>
           <w:rPr>
             <w:rFonts w:hint="default" w:ascii="Times New Roman" w:hAnsi="Times New Roman" w:eastAsia="宋体" w:cs="Times New Roman"/>
@@ -10570,7 +10742,7 @@
           <w:delText xml:space="preserve">U</w:delText>
         </w:r>
       </w:del>
-      <w:ins w:id="585" w:author="Kiro润色" w:date="2026-06-17T00:00:00Z">
+      <w:ins w:id="599" w:author="Kiro润色" w:date="2026-06-17T00:00:00Z">
         <w:r>
           <w:rPr>
             <w:rFonts w:hint="default" w:ascii="Times New Roman" w:hAnsi="Times New Roman" w:eastAsia="宋体" w:cs="Times New Roman"/>
@@ -10588,7 +10760,7 @@
         </w:rPr>
         <w:t xml:space="preserve">ncertainty </w:t>
       </w:r>
-      <w:del w:id="586" w:author="Kiro润色" w:date="2026-06-17T00:00:00Z">
+      <w:del w:id="600" w:author="Kiro润色" w:date="2026-06-17T00:00:00Z">
         <w:r>
           <w:rPr>
             <w:rFonts w:hint="default" w:ascii="Times New Roman" w:hAnsi="Times New Roman" w:eastAsia="宋体" w:cs="Times New Roman"/>
@@ -10598,7 +10770,7 @@
           <w:delText xml:space="preserve">C</w:delText>
         </w:r>
       </w:del>
-      <w:ins w:id="587" w:author="Kiro润色" w:date="2026-06-17T00:00:00Z">
+      <w:ins w:id="601" w:author="Kiro润色" w:date="2026-06-17T00:00:00Z">
         <w:r>
           <w:rPr>
             <w:rFonts w:hint="default" w:ascii="Times New Roman" w:hAnsi="Times New Roman" w:eastAsia="宋体" w:cs="Times New Roman"/>
@@ -10616,7 +10788,7 @@
         </w:rPr>
         <w:t xml:space="preserve">alibration）</w:t>
       </w:r>
-      <w:del w:id="588" w:author="Kiro润色" w:date="2026-06-17T00:00:00Z">
+      <w:del w:id="602" w:author="Kiro润色" w:date="2026-06-17T00:00:00Z">
         <w:r>
           <w:rPr>
             <w:rFonts w:hint="default" w:ascii="Times New Roman" w:hAnsi="Times New Roman" w:eastAsia="宋体" w:cs="Times New Roman"/>
@@ -10634,7 +10806,7 @@
         </w:rPr>
         <w:t xml:space="preserve">等核心安全属性关注不足。在多模态临床场景中，还存在图像质量欺骗</w:t>
       </w:r>
-      <w:del w:id="589" w:author="Kiro润色" w:date="2026-06-17T00:00:00Z">
+      <w:del w:id="603" w:author="Kiro润色" w:date="2026-06-17T00:00:00Z">
         <w:r>
           <w:rPr>
             <w:rFonts w:hint="default" w:ascii="Times New Roman" w:hAnsi="Times New Roman" w:eastAsia="宋体" w:cs="Times New Roman"/>
@@ -10644,7 +10816,7 @@
           <w:delText xml:space="preserve">，</w:delText>
         </w:r>
       </w:del>
-      <w:ins w:id="590" w:author="Kiro润色" w:date="2026-06-17T00:00:00Z">
+      <w:ins w:id="604" w:author="Kiro润色" w:date="2026-06-17T00:00:00Z">
         <w:r>
           <w:rPr>
             <w:rFonts w:hint="default" w:ascii="Times New Roman" w:hAnsi="Times New Roman" w:eastAsia="宋体" w:cs="Times New Roman"/>
@@ -10662,7 +10834,7 @@
         </w:rPr>
         <w:t xml:space="preserve">如色彩被篡改的舌诊图</w:t>
       </w:r>
-      <w:ins w:id="591" w:author="Kiro润色" w:date="2026-06-17T00:00:00Z">
+      <w:ins w:id="605" w:author="Kiro润色" w:date="2026-06-17T00:00:00Z">
         <w:r>
           <w:rPr>
             <w:rFonts w:hint="default" w:ascii="Times New Roman" w:hAnsi="Times New Roman" w:eastAsia="宋体" w:cs="Times New Roman"/>
@@ -10680,7 +10852,7 @@
         </w:rPr>
         <w:t xml:space="preserve">、跨模态信息矛盾</w:t>
       </w:r>
-      <w:del w:id="592" w:author="Kiro润色" w:date="2026-06-17T00:00:00Z">
+      <w:del w:id="606" w:author="Kiro润色" w:date="2026-06-17T00:00:00Z">
         <w:r>
           <w:rPr>
             <w:rFonts w:hint="default" w:ascii="Times New Roman" w:hAnsi="Times New Roman" w:eastAsia="宋体" w:cs="Times New Roman"/>
@@ -10690,7 +10862,7 @@
           <w:delText xml:space="preserve">，</w:delText>
         </w:r>
       </w:del>
-      <w:ins w:id="593" w:author="Kiro润色" w:date="2026-06-17T00:00:00Z">
+      <w:ins w:id="607" w:author="Kiro润色" w:date="2026-06-17T00:00:00Z">
         <w:r>
           <w:rPr>
             <w:rFonts w:hint="default" w:ascii="Times New Roman" w:hAnsi="Times New Roman" w:eastAsia="宋体" w:cs="Times New Roman"/>
@@ -10708,7 +10880,7 @@
         </w:rPr>
         <w:t xml:space="preserve">如舌脉不一致时如何取舍</w:t>
       </w:r>
-      <w:ins w:id="594" w:author="Kiro润色" w:date="2026-06-17T00:00:00Z">
+      <w:ins w:id="608" w:author="Kiro润色" w:date="2026-06-17T00:00:00Z">
         <w:r>
           <w:rPr>
             <w:rFonts w:hint="default" w:ascii="Times New Roman" w:hAnsi="Times New Roman" w:eastAsia="宋体" w:cs="Times New Roman"/>
@@ -10726,7 +10898,7 @@
         </w:rPr>
         <w:t xml:space="preserve">以及模态缺失时</w:t>
       </w:r>
-      <w:ins w:id="595" w:author="Kiro润色" w:date="2026-06-17T00:00:00Z">
+      <w:ins w:id="609" w:author="Kiro润色" w:date="2026-06-17T00:00:00Z">
         <w:r>
           <w:rPr>
             <w:rFonts w:hint="default" w:ascii="Times New Roman" w:hAnsi="Times New Roman" w:eastAsia="宋体" w:cs="Times New Roman"/>
@@ -10744,7 +10916,7 @@
         </w:rPr>
         <w:t xml:space="preserve">过度自信推断等风险，而这些在现有评测体系中几乎未被</w:t>
       </w:r>
-      <w:del w:id="596" w:author="Kiro润色" w:date="2026-06-17T00:00:00Z">
+      <w:del w:id="610" w:author="Kiro润色" w:date="2026-06-17T00:00:00Z">
         <w:r>
           <w:rPr>
             <w:rFonts w:hint="default" w:ascii="Times New Roman" w:hAnsi="Times New Roman" w:eastAsia="宋体" w:cs="Times New Roman"/>
@@ -10754,7 +10926,7 @@
           <w:delText xml:space="preserve">涉</w:delText>
         </w:r>
       </w:del>
-      <w:ins w:id="597" w:author="Kiro润色" w:date="2026-06-17T00:00:00Z">
+      <w:ins w:id="611" w:author="Kiro润色" w:date="2026-06-17T00:00:00Z">
         <w:r>
           <w:rPr>
             <w:rFonts w:hint="default" w:ascii="Times New Roman" w:hAnsi="Times New Roman" w:eastAsia="宋体" w:cs="Times New Roman"/>
@@ -10772,7 +10944,7 @@
         </w:rPr>
         <w:t xml:space="preserve">及。</w:t>
       </w:r>
-      <w:del w:id="598" w:author="Kiro润色" w:date="2026-06-17T00:00:00Z">
+      <w:del w:id="612" w:author="Kiro润色" w:date="2026-06-17T00:00:00Z">
         <w:r>
           <w:rPr>
             <w:rFonts w:hint="default" w:ascii="Times New Roman" w:hAnsi="Times New Roman" w:eastAsia="宋体" w:cs="Times New Roman"/>
@@ -10782,7 +10954,7 @@
           <w:delText xml:space="preserve">Singhal等[35]在Med-PaLM</w:delText>
         </w:r>
       </w:del>
-      <w:ins w:id="599" w:author="Kiro润色" w:date="2026-06-17T00:00:00Z">
+      <w:ins w:id="613" w:author="Kiro润色" w:date="2026-06-17T00:00:00Z">
         <w:r>
           <w:rPr>
             <w:rFonts w:hint="default" w:ascii="Times New Roman" w:hAnsi="Times New Roman" w:eastAsia="宋体" w:cs="Times New Roman"/>
@@ -10800,7 +10972,7 @@
         </w:rPr>
         <w:t xml:space="preserve">研究</w:t>
       </w:r>
-      <w:del w:id="600" w:author="Kiro润色" w:date="2026-06-17T00:00:00Z">
+      <w:del w:id="614" w:author="Kiro润色" w:date="2026-06-17T00:00:00Z">
         <w:r>
           <w:rPr>
             <w:rFonts w:hint="default" w:ascii="Times New Roman" w:hAnsi="Times New Roman" w:eastAsia="宋体" w:cs="Times New Roman"/>
@@ -10818,7 +10990,7 @@
         </w:rPr>
         <w:t xml:space="preserve">强调</w:t>
       </w:r>
-      <w:ins w:id="601" w:author="Kiro润色" w:date="2026-06-17T00:00:00Z">
+      <w:ins w:id="615" w:author="Kiro润色" w:date="2026-06-17T00:00:00Z">
         <w:r>
           <w:rPr>
             <w:rFonts w:hint="default" w:ascii="Times New Roman" w:hAnsi="Times New Roman" w:eastAsia="宋体" w:cs="Times New Roman"/>
@@ -10836,7 +11008,7 @@
         </w:rPr>
         <w:t xml:space="preserve">医学</w:t>
       </w:r>
-      <w:del w:id="602" w:author="Kiro润色" w:date="2026-06-17T00:00:00Z">
+      <w:del w:id="616" w:author="Kiro润色" w:date="2026-06-17T00:00:00Z">
         <w:r>
           <w:rPr>
             <w:rFonts w:hint="default" w:ascii="Times New Roman" w:hAnsi="Times New Roman" w:eastAsia="宋体" w:cs="Times New Roman"/>
@@ -10846,7 +11018,7 @@
           <w:delText xml:space="preserve">LLM</w:delText>
         </w:r>
       </w:del>
-      <w:ins w:id="603" w:author="Kiro润色" w:date="2026-06-17T00:00:00Z">
+      <w:ins w:id="617" w:author="Kiro润色" w:date="2026-06-17T00:00:00Z">
         <w:r>
           <w:rPr>
             <w:rFonts w:hint="default" w:ascii="Times New Roman" w:hAnsi="Times New Roman" w:eastAsia="宋体" w:cs="Times New Roman"/>
@@ -10864,7 +11036,7 @@
         </w:rPr>
         <w:t xml:space="preserve">的安全评测应超越准确率，</w:t>
       </w:r>
-      <w:del w:id="604" w:author="Kiro润色" w:date="2026-06-17T00:00:00Z">
+      <w:del w:id="618" w:author="Kiro润色" w:date="2026-06-17T00:00:00Z">
         <w:r>
           <w:rPr>
             <w:rFonts w:hint="default" w:ascii="Times New Roman" w:hAnsi="Times New Roman" w:eastAsia="宋体" w:cs="Times New Roman"/>
@@ -10874,7 +11046,7 @@
           <w:delText xml:space="preserve">将</w:delText>
         </w:r>
       </w:del>
-      <w:ins w:id="605" w:author="Kiro润色" w:date="2026-06-17T00:00:00Z">
+      <w:ins w:id="619" w:author="Kiro润色" w:date="2026-06-17T00:00:00Z">
         <w:r>
           <w:rPr>
             <w:rFonts w:hint="default" w:ascii="Times New Roman" w:hAnsi="Times New Roman" w:eastAsia="宋体" w:cs="Times New Roman"/>
@@ -10892,7 +11064,7 @@
         </w:rPr>
         <w:t xml:space="preserve">“模型是否自知其知识边界”的不确定性校准纳入核心指标</w:t>
       </w:r>
-      <w:ins w:id="606" w:author="Kiro润色" w:date="2026-06-17T00:00:00Z">
+      <w:ins w:id="620" w:author="Kiro润色" w:date="2026-06-17T00:00:00Z">
         <w:r>
           <w:rPr>
             <w:rFonts w:hint="default" w:ascii="Times New Roman" w:hAnsi="Times New Roman" w:eastAsia="宋体" w:cs="Times New Roman"/>
@@ -10910,7 +11082,7 @@
         </w:rPr>
         <w:t xml:space="preserve">。</w:t>
       </w:r>
-      <w:del w:id="607" w:author="Kiro润色" w:date="2026-06-17T00:00:00Z">
+      <w:del w:id="621" w:author="Kiro润色" w:date="2026-06-17T00:00:00Z">
         <w:r>
           <w:rPr>
             <w:rFonts w:hint="default" w:ascii="Times New Roman" w:hAnsi="Times New Roman" w:eastAsia="宋体" w:cs="Times New Roman"/>
@@ -10928,7 +11100,7 @@
         </w:rPr>
         <w:t xml:space="preserve">处方审核基准在用药安全维度上</w:t>
       </w:r>
-      <w:del w:id="608" w:author="Kiro润色" w:date="2026-06-17T00:00:00Z">
+      <w:del w:id="622" w:author="Kiro润色" w:date="2026-06-17T00:00:00Z">
         <w:r>
           <w:rPr>
             <w:rFonts w:hint="default" w:ascii="Times New Roman" w:hAnsi="Times New Roman" w:eastAsia="宋体" w:cs="Times New Roman"/>
@@ -10938,7 +11110,7 @@
           <w:delText xml:space="preserve">已取得初</w:delText>
         </w:r>
       </w:del>
-      <w:ins w:id="609" w:author="Kiro润色" w:date="2026-06-17T00:00:00Z">
+      <w:ins w:id="623" w:author="Kiro润色" w:date="2026-06-17T00:00:00Z">
         <w:r>
           <w:rPr>
             <w:rFonts w:hint="default" w:ascii="Times New Roman" w:hAnsi="Times New Roman" w:eastAsia="宋体" w:cs="Times New Roman"/>
@@ -10956,7 +11128,7 @@
         </w:rPr>
         <w:t xml:space="preserve">步</w:t>
       </w:r>
-      <w:del w:id="610" w:author="Kiro润色" w:date="2026-06-17T00:00:00Z">
+      <w:del w:id="624" w:author="Kiro润色" w:date="2026-06-17T00:00:00Z">
         <w:r>
           <w:rPr>
             <w:rFonts w:hint="default" w:ascii="Times New Roman" w:hAnsi="Times New Roman" w:eastAsia="宋体" w:cs="Times New Roman"/>
@@ -10966,7 +11138,7 @@
           <w:delText xml:space="preserve">进展</w:delText>
         </w:r>
       </w:del>
-      <w:ins w:id="611" w:author="Kiro润色" w:date="2026-06-17T00:00:00Z">
+      <w:ins w:id="625" w:author="Kiro润色" w:date="2026-06-17T00:00:00Z">
         <w:r>
           <w:rPr>
             <w:rFonts w:hint="default" w:ascii="Times New Roman" w:hAnsi="Times New Roman" w:eastAsia="宋体" w:cs="Times New Roman"/>
@@ -11458,7 +11630,7 @@
         </w:rPr>
         <w:t xml:space="preserve">各层逐层递进，采用条件化评分（</w:t>
       </w:r>
-      <w:del w:id="612" w:author="Kiro润色" w:date="2026-06-17T00:00:00Z">
+      <w:del w:id="626" w:author="Kiro润色" w:date="2026-06-17T00:00:00Z">
         <w:r>
           <w:rPr>
             <w:rFonts w:hint="eastAsia" w:ascii="宋体" w:hAnsi="宋体" w:eastAsia="宋体" w:cs="宋体"/>
@@ -11467,7 +11639,7 @@
           <w:delText xml:space="preserve">C</w:delText>
         </w:r>
       </w:del>
-      <w:ins w:id="613" w:author="Kiro润色" w:date="2026-06-17T00:00:00Z">
+      <w:ins w:id="627" w:author="Kiro润色" w:date="2026-06-17T00:00:00Z">
         <w:r>
           <w:rPr>
             <w:rFonts w:hint="eastAsia" w:ascii="宋体" w:hAnsi="宋体" w:eastAsia="宋体" w:cs="宋体"/>
@@ -11483,7 +11655,7 @@
         </w:rPr>
         <w:t xml:space="preserve">onditional </w:t>
       </w:r>
-      <w:del w:id="614" w:author="Kiro润色" w:date="2026-06-17T00:00:00Z">
+      <w:del w:id="628" w:author="Kiro润色" w:date="2026-06-17T00:00:00Z">
         <w:r>
           <w:rPr>
             <w:rFonts w:hint="eastAsia" w:ascii="宋体" w:hAnsi="宋体" w:eastAsia="宋体" w:cs="宋体"/>
@@ -11492,7 +11664,7 @@
           <w:delText xml:space="preserve">S</w:delText>
         </w:r>
       </w:del>
-      <w:ins w:id="615" w:author="Kiro润色" w:date="2026-06-17T00:00:00Z">
+      <w:ins w:id="629" w:author="Kiro润色" w:date="2026-06-17T00:00:00Z">
         <w:r>
           <w:rPr>
             <w:rFonts w:hint="eastAsia" w:ascii="宋体" w:hAnsi="宋体" w:eastAsia="宋体" w:cs="宋体"/>
@@ -11508,7 +11680,7 @@
         </w:rPr>
         <w:t xml:space="preserve">coring）</w:t>
       </w:r>
-      <w:del w:id="616" w:author="Kiro润色" w:date="2026-06-17T00:00:00Z">
+      <w:del w:id="630" w:author="Kiro润色" w:date="2026-06-17T00:00:00Z">
         <w:r>
           <w:rPr>
             <w:rFonts w:hint="eastAsia" w:ascii="宋体" w:hAnsi="宋体" w:eastAsia="宋体" w:cs="宋体"/>
@@ -11524,7 +11696,7 @@
         </w:rPr>
         <w:t xml:space="preserve">机制：上一层推理错误则终止后续评测，并报告误差沿链条的传导与放大效应。同时为各层设定准入阈值，未通过知识层与辨证层阈值者，其方药层、疗效层的高分不予采信。疗效层有赖于真实世界随访与前瞻性数据，目前仍属亟待建设的目标层次。各层与评测内容、代表指标及对应基准类别的对应关系见图3。</w:t>
       </w:r>
-      <w:ins w:id="617" w:author="Kiro润色" w:date="2026-06-17T00:00:00Z">
+      <w:ins w:id="631" w:author="Kiro润色" w:date="2026-06-17T00:00:00Z">
         <w:r>
           <w:rPr>
             <w:rFonts w:hint="eastAsia" w:ascii="宋体" w:hAnsi="宋体" w:eastAsia="宋体" w:cs="宋体"/>
@@ -12203,7 +12375,7 @@
         </w:rPr>
         <w:t xml:space="preserve">现有评测体系过度聚焦于模型的“文本输出正确性”，而未能有效度量其“临床认知充分性”与“决策过程可靠性”。要使中医药大语言模型从“可用”走向“可信、可靠”，</w:t>
       </w:r>
-      <w:del w:id="618" w:author="Kiro润色" w:date="2026-06-17T00:00:00Z">
+      <w:del w:id="632" w:author="Kiro润色" w:date="2026-06-17T00:00:00Z">
         <w:r>
           <w:rPr>
             <w:rFonts w:hint="eastAsia" w:ascii="宋体" w:hAnsi="宋体" w:eastAsia="宋体" w:cs="宋体"/>
@@ -12212,7 +12384,7 @@
           <w:delText xml:space="preserve">其核心路径</w:delText>
         </w:r>
       </w:del>
-      <w:ins w:id="619" w:author="Kiro润色" w:date="2026-06-17T00:00:00Z">
+      <w:ins w:id="633" w:author="Kiro润色" w:date="2026-06-17T00:00:00Z">
         <w:r>
           <w:rPr>
             <w:rFonts w:hint="eastAsia" w:ascii="宋体" w:hAnsi="宋体" w:eastAsia="宋体" w:cs="宋体"/>
@@ -12228,7 +12400,7 @@
         </w:rPr>
         <w:t xml:space="preserve">在于重构评测范式</w:t>
       </w:r>
-      <w:del w:id="620" w:author="Kiro润色" w:date="2026-06-17T00:00:00Z">
+      <w:del w:id="634" w:author="Kiro润色" w:date="2026-06-17T00:00:00Z">
         <w:r>
           <w:rPr>
             <w:rFonts w:hint="eastAsia" w:ascii="宋体" w:hAnsi="宋体" w:eastAsia="宋体" w:cs="宋体"/>
@@ -12237,7 +12409,7 @@
           <w:delText xml:space="preserve">，将</w:delText>
         </w:r>
       </w:del>
-      <w:ins w:id="621" w:author="Kiro润色" w:date="2026-06-17T00:00:00Z">
+      <w:ins w:id="635" w:author="Kiro润色" w:date="2026-06-17T00:00:00Z">
         <w:r>
           <w:rPr>
             <w:rFonts w:hint="eastAsia" w:ascii="宋体" w:hAnsi="宋体" w:eastAsia="宋体" w:cs="宋体"/>
@@ -12253,7 +12425,7 @@
         </w:rPr>
         <w:t xml:space="preserve">评价重心从文本问答的准确率转向临床多模态综合判断能力，</w:t>
       </w:r>
-      <w:del w:id="622" w:author="Kiro润色" w:date="2026-06-17T00:00:00Z">
+      <w:del w:id="636" w:author="Kiro润色" w:date="2026-06-17T00:00:00Z">
         <w:r>
           <w:rPr>
             <w:rFonts w:hint="eastAsia" w:ascii="宋体" w:hAnsi="宋体" w:eastAsia="宋体" w:cs="宋体"/>
@@ -12269,7 +12441,7 @@
         </w:rPr>
         <w:t xml:space="preserve">以真实世界的前瞻性结局数据作为最终验证尺度，构建“能力评估—安全审查—效用验证”三位一体的评测闭环。这既是人工智能与中医药交叉领域</w:t>
       </w:r>
-      <w:ins w:id="623" w:author="Kiro润色" w:date="2026-06-17T00:00:00Z">
+      <w:ins w:id="637" w:author="Kiro润色" w:date="2026-06-17T00:00:00Z">
         <w:r>
           <w:rPr>
             <w:rFonts w:hint="eastAsia" w:ascii="宋体" w:hAnsi="宋体" w:eastAsia="宋体" w:cs="宋体"/>
@@ -12285,7 +12457,7 @@
         </w:rPr>
         <w:t xml:space="preserve">方法学</w:t>
       </w:r>
-      <w:del w:id="624" w:author="Kiro润色" w:date="2026-06-17T00:00:00Z">
+      <w:del w:id="638" w:author="Kiro润色" w:date="2026-06-17T00:00:00Z">
         <w:r>
           <w:rPr>
             <w:rFonts w:hint="eastAsia" w:ascii="宋体" w:hAnsi="宋体" w:eastAsia="宋体" w:cs="宋体"/>
@@ -12301,7 +12473,7 @@
         </w:rPr>
         <w:t xml:space="preserve">挑战，也是推动中医药</w:t>
       </w:r>
-      <w:del w:id="625" w:author="Kiro润色" w:date="2026-06-17T00:00:00Z">
+      <w:del w:id="639" w:author="Kiro润色" w:date="2026-06-17T00:00:00Z">
         <w:r>
           <w:rPr>
             <w:rFonts w:hint="eastAsia" w:ascii="宋体" w:hAnsi="宋体" w:eastAsia="宋体" w:cs="宋体"/>
@@ -12317,7 +12489,7 @@
         </w:rPr>
         <w:t xml:space="preserve">智能化</w:t>
       </w:r>
-      <w:del w:id="626" w:author="Kiro润色" w:date="2026-06-17T00:00:00Z">
+      <w:del w:id="640" w:author="Kiro润色" w:date="2026-06-17T00:00:00Z">
         <w:r>
           <w:rPr>
             <w:rFonts w:hint="eastAsia" w:ascii="宋体" w:hAnsi="宋体" w:eastAsia="宋体" w:cs="宋体"/>
@@ -12333,7 +12505,7 @@
         </w:rPr>
         <w:t xml:space="preserve">规范发展的基础性工</w:t>
       </w:r>
-      <w:del w:id="627" w:author="Kiro润色" w:date="2026-06-17T00:00:00Z">
+      <w:del w:id="641" w:author="Kiro润色" w:date="2026-06-17T00:00:00Z">
         <w:r>
           <w:rPr>
             <w:rFonts w:hint="eastAsia" w:ascii="宋体" w:hAnsi="宋体" w:eastAsia="宋体" w:cs="宋体"/>
@@ -12342,7 +12514,7 @@
           <w:delText xml:space="preserve">程</w:delText>
         </w:r>
       </w:del>
-      <w:ins w:id="628" w:author="Kiro润色" w:date="2026-06-17T00:00:00Z">
+      <w:ins w:id="642" w:author="Kiro润色" w:date="2026-06-17T00:00:00Z">
         <w:r>
           <w:rPr>
             <w:rFonts w:hint="eastAsia" w:ascii="宋体" w:hAnsi="宋体" w:eastAsia="宋体" w:cs="宋体"/>
@@ -12358,7 +12530,7 @@
         </w:rPr>
         <w:t xml:space="preserve">，</w:t>
       </w:r>
-      <w:del w:id="629" w:author="Kiro润色" w:date="2026-06-17T00:00:00Z">
+      <w:del w:id="643" w:author="Kiro润色" w:date="2026-06-17T00:00:00Z">
         <w:r>
           <w:rPr>
             <w:rFonts w:hint="eastAsia" w:ascii="宋体" w:hAnsi="宋体" w:eastAsia="宋体" w:cs="宋体"/>
@@ -12367,7 +12539,7 @@
           <w:delText xml:space="preserve">亟</w:delText>
         </w:r>
       </w:del>
-      <w:ins w:id="630" w:author="Kiro润色" w:date="2026-06-17T00:00:00Z">
+      <w:ins w:id="644" w:author="Kiro润色" w:date="2026-06-17T00:00:00Z">
         <w:r>
           <w:rPr>
             <w:rFonts w:hint="eastAsia" w:ascii="宋体" w:hAnsi="宋体" w:eastAsia="宋体" w:cs="宋体"/>
@@ -12383,7 +12555,7 @@
         </w:rPr>
         <w:t xml:space="preserve">需在高质量多模态数据</w:t>
       </w:r>
-      <w:del w:id="631" w:author="Kiro润色" w:date="2026-06-17T00:00:00Z">
+      <w:del w:id="645" w:author="Kiro润色" w:date="2026-06-17T00:00:00Z">
         <w:r>
           <w:rPr>
             <w:rFonts w:hint="eastAsia" w:ascii="宋体" w:hAnsi="宋体" w:eastAsia="宋体" w:cs="宋体"/>
@@ -12399,7 +12571,7 @@
         </w:rPr>
         <w:t xml:space="preserve">建设、动态交互式评测协议</w:t>
       </w:r>
-      <w:del w:id="632" w:author="Kiro润色" w:date="2026-06-17T00:00:00Z">
+      <w:del w:id="646" w:author="Kiro润色" w:date="2026-06-17T00:00:00Z">
         <w:r>
           <w:rPr>
             <w:rFonts w:hint="eastAsia" w:ascii="宋体" w:hAnsi="宋体" w:eastAsia="宋体" w:cs="宋体"/>
@@ -12408,7 +12580,7 @@
           <w:delText xml:space="preserve">开发及</w:delText>
         </w:r>
       </w:del>
-      <w:ins w:id="633" w:author="Kiro润色" w:date="2026-06-17T00:00:00Z">
+      <w:ins w:id="647" w:author="Kiro润色" w:date="2026-06-17T00:00:00Z">
         <w:r>
           <w:rPr>
             <w:rFonts w:hint="eastAsia" w:ascii="宋体" w:hAnsi="宋体" w:eastAsia="宋体" w:cs="宋体"/>
@@ -12424,7 +12596,7 @@
         </w:rPr>
         <w:t xml:space="preserve">人机协同临床验证等方面</w:t>
       </w:r>
-      <w:del w:id="634" w:author="Kiro润色" w:date="2026-06-17T00:00:00Z">
+      <w:del w:id="648" w:author="Kiro润色" w:date="2026-06-17T00:00:00Z">
         <w:r>
           <w:rPr>
             <w:rFonts w:hint="eastAsia" w:ascii="宋体" w:hAnsi="宋体" w:eastAsia="宋体" w:cs="宋体"/>
@@ -12433,7 +12605,7 @@
           <w:delText xml:space="preserve">形成系统性</w:delText>
         </w:r>
       </w:del>
-      <w:ins w:id="635" w:author="Kiro润色" w:date="2026-06-17T00:00:00Z">
+      <w:ins w:id="649" w:author="Kiro润色" w:date="2026-06-17T00:00:00Z">
         <w:r>
           <w:rPr>
             <w:rFonts w:hint="eastAsia" w:ascii="宋体" w:hAnsi="宋体" w:eastAsia="宋体" w:cs="宋体"/>
@@ -12449,7 +12621,7 @@
         </w:rPr>
         <w:t xml:space="preserve">突破</w:t>
       </w:r>
-      <w:del w:id="636" w:author="Kiro润色" w:date="2026-06-17T00:00:00Z">
+      <w:del w:id="650" w:author="Kiro润色" w:date="2026-06-17T00:00:00Z">
         <w:r>
           <w:rPr>
             <w:rFonts w:hint="eastAsia" w:ascii="宋体" w:hAnsi="宋体" w:eastAsia="宋体" w:cs="宋体"/>
@@ -12787,7 +12959,7 @@
         </w:rPr>
         <w:t xml:space="preserve">[18] 张童, 王一凡, 王若佳, 等. 面向中医药领域专业能力的生成式大语言模型对比研究[J]. 中华中医药学刊, 2025, 43(10): 19-27</w:t>
       </w:r>
-      <w:ins w:id="637" w:author="Kiro润色" w:date="2026-06-17T00:00:00Z">
+      <w:ins w:id="651" w:author="Kiro润色" w:date="2026-06-17T00:00:00Z">
         <w:r>
           <w:rPr>
             <w:rFonts w:hint="eastAsia" w:ascii="宋体" w:hAnsi="宋体" w:eastAsia="宋体" w:cs="宋体"/>
@@ -12936,7 +13108,7 @@
         </w:rPr>
         <w:t xml:space="preserve">[27] YANG Q R, HAN J X, WANG H Z, et al. Knowledge graph enhanced large language models for traditional Chinese medicine question-answering[C]// 2026 IEEE International Conference on Big Data and Smart Computing (BigComp). Piscataway: IEEE, 202</w:t>
       </w:r>
-      <w:del w:id="638" w:author="Kiro润色" w:date="2026-06-17T00:00:00Z">
+      <w:del w:id="652" w:author="Kiro润色" w:date="2026-06-17T00:00:00Z">
         <w:r>
           <w:rPr>
             <w:rFonts w:hint="eastAsia" w:ascii="宋体" w:hAnsi="宋体" w:eastAsia="宋体" w:cs="宋体"/>
@@ -12944,7 +13116,7 @@
           <w:delText xml:space="preserve">5</w:delText>
         </w:r>
       </w:del>
-      <w:ins w:id="639" w:author="Kiro润色" w:date="2026-06-17T00:00:00Z">
+      <w:ins w:id="653" w:author="Kiro润色" w:date="2026-06-17T00:00:00Z">
         <w:r>
           <w:rPr>
             <w:rFonts w:hint="eastAsia" w:ascii="宋体" w:hAnsi="宋体" w:eastAsia="宋体" w:cs="宋体"/>
@@ -12973,7 +13145,7 @@
         </w:rPr>
         <w:t xml:space="preserve">[28] DUAN Y C, ZHOU Q Q, LI Y, et al. Research on a traditional Chinese medicine case-based question-answering system integrating large language models and knowledge graphs[J]. Frontiers in Medicine, 202</w:t>
       </w:r>
-      <w:del w:id="640" w:author="Kiro润色" w:date="2026-06-17T00:00:00Z">
+      <w:del w:id="654" w:author="Kiro润色" w:date="2026-06-17T00:00:00Z">
         <w:r>
           <w:rPr>
             <w:rFonts w:hint="eastAsia" w:ascii="宋体" w:hAnsi="宋体" w:eastAsia="宋体" w:cs="宋体"/>
@@ -12981,7 +13153,7 @@
           <w:delText xml:space="preserve">5</w:delText>
         </w:r>
       </w:del>
-      <w:ins w:id="641" w:author="Kiro润色" w:date="2026-06-17T00:00:00Z">
+      <w:ins w:id="655" w:author="Kiro润色" w:date="2026-06-17T00:00:00Z">
         <w:r>
           <w:rPr>
             <w:rFonts w:hint="eastAsia" w:ascii="宋体" w:hAnsi="宋体" w:eastAsia="宋体" w:cs="宋体"/>

</xml_diff>

<commit_message>
Delete off-topic 3.3.5 (科研与知识发现) + refs [32][33]; renumber [34-38]->[32-36]; refresh track-changes
</commit_message>
<xml_diff>
--- a/大语言模型在中医药领域评测研究0617_修订模式.docx
+++ b/大语言模型在中医药领域评测研究0617_修订模式.docx
@@ -9701,15 +9701,17 @@
           <w:color w:val="000000"/>
         </w:rPr>
       </w:pPr>
-      <w:r>
-        <w:rPr>
-          <w:rFonts w:hint="eastAsia" w:ascii="宋体" w:hAnsi="宋体" w:eastAsia="宋体" w:cs="宋体"/>
-          <w:i w:val="0"/>
-          <w:iCs w:val="0"/>
-          <w:color w:val="000000"/>
-        </w:rPr>
-        <w:t>3.3.5 科研与知识发现</w:t>
-      </w:r>
+      <w:del w:id="536" w:author="Kiro润色" w:date="2026-06-17T00:00:00Z">
+        <w:r>
+          <w:rPr>
+            <w:rFonts w:hint="eastAsia" w:ascii="宋体" w:hAnsi="宋体" w:eastAsia="宋体" w:cs="宋体"/>
+            <w:i w:val="0"/>
+            <w:iCs w:val="0"/>
+            <w:color w:val="000000"/>
+          </w:rPr>
+          <w:delText xml:space="preserve">3.3.5 科研与知识发现</w:delText>
+        </w:r>
+      </w:del>
     </w:p>
     <w:p>
       <w:pPr>
@@ -9719,310 +9721,16 @@
           <w:rFonts w:hint="eastAsia" w:ascii="宋体" w:hAnsi="宋体" w:eastAsia="宋体" w:cs="宋体"/>
         </w:rPr>
       </w:pPr>
-      <w:ins w:id="536" w:author="Kiro润色" w:date="2026-06-17T00:00:00Z">
+      <w:del w:id="537" w:author="Kiro润色" w:date="2026-06-17T00:00:00Z">
         <w:r>
           <w:rPr>
             <w:rFonts w:hint="eastAsia" w:eastAsia="宋体" w:cs="宋体"/>
             <w:color w:val="FF0000"/>
             <w:lang w:val="en-US" w:eastAsia="zh-CN"/>
           </w:rPr>
-          <w:t xml:space="preserve">在科研与知识发现方向，有</w:t>
-        </w:r>
-      </w:ins>
-      <w:r>
-        <w:rPr>
-          <w:rFonts w:hint="eastAsia" w:eastAsia="宋体" w:cs="宋体"/>
-          <w:color w:val="FF0000"/>
-          <w:lang w:val="en-US" w:eastAsia="zh-CN"/>
-        </w:rPr>
-        <w:t xml:space="preserve">研究</w:t>
-      </w:r>
-      <w:del w:id="537" w:author="Kiro润色" w:date="2026-06-17T00:00:00Z">
-        <w:r>
-          <w:rPr>
-            <w:rFonts w:hint="eastAsia" w:eastAsia="宋体" w:cs="宋体"/>
-            <w:color w:val="FF0000"/>
-            <w:lang w:val="en-US" w:eastAsia="zh-CN"/>
-          </w:rPr>
-          <w:delText xml:space="preserve">表明[32]，TEmbed-DDI利用LLM</w:delText>
-        </w:r>
-      </w:del>
-      <w:ins w:id="538" w:author="Kiro润色" w:date="2026-06-17T00:00:00Z">
-        <w:r>
-          <w:rPr>
-            <w:rFonts w:hint="eastAsia" w:eastAsia="宋体" w:cs="宋体"/>
-            <w:color w:val="FF0000"/>
-            <w:lang w:val="en-US" w:eastAsia="zh-CN"/>
-          </w:rPr>
-          <w:t xml:space="preserve">借助大语言模型</w:t>
-        </w:r>
-      </w:ins>
-      <w:r>
-        <w:rPr>
-          <w:rFonts w:hint="eastAsia" w:eastAsia="宋体" w:cs="宋体"/>
-          <w:color w:val="FF0000"/>
-          <w:lang w:val="en-US" w:eastAsia="zh-CN"/>
-        </w:rPr>
-        <w:t xml:space="preserve">嵌入</w:t>
-      </w:r>
-      <w:del w:id="539" w:author="Kiro润色" w:date="2026-06-17T00:00:00Z">
-        <w:r>
-          <w:rPr>
-            <w:rFonts w:hint="eastAsia" w:eastAsia="宋体" w:cs="宋体"/>
-            <w:color w:val="FF0000"/>
-            <w:lang w:val="en-US" w:eastAsia="zh-CN"/>
-          </w:rPr>
-          <w:delText xml:space="preserve">和</w:delText>
-        </w:r>
-      </w:del>
-      <w:ins w:id="540" w:author="Kiro润色" w:date="2026-06-17T00:00:00Z">
-        <w:r>
-          <w:rPr>
-            <w:rFonts w:hint="eastAsia" w:eastAsia="宋体" w:cs="宋体"/>
-            <w:color w:val="FF0000"/>
-            <w:lang w:val="en-US" w:eastAsia="zh-CN"/>
-          </w:rPr>
-          <w:t xml:space="preserve">与</w:t>
-        </w:r>
-      </w:ins>
-      <w:r>
-        <w:rPr>
-          <w:rFonts w:hint="eastAsia" w:eastAsia="宋体" w:cs="宋体"/>
-          <w:color w:val="FF0000"/>
-          <w:lang w:val="en-US" w:eastAsia="zh-CN"/>
-        </w:rPr>
-        <w:t xml:space="preserve">双向神经网络</w:t>
-      </w:r>
-      <w:del w:id="541" w:author="Kiro润色" w:date="2026-06-17T00:00:00Z">
-        <w:r>
-          <w:rPr>
-            <w:rFonts w:hint="eastAsia" w:eastAsia="宋体" w:cs="宋体"/>
-            <w:color w:val="FF0000"/>
-            <w:lang w:val="en-US" w:eastAsia="zh-CN"/>
-          </w:rPr>
-          <w:delText xml:space="preserve">进行</w:delText>
-        </w:r>
-      </w:del>
-      <w:ins w:id="542" w:author="Kiro润色" w:date="2026-06-17T00:00:00Z">
-        <w:r>
-          <w:rPr>
-            <w:rFonts w:hint="eastAsia" w:eastAsia="宋体" w:cs="宋体"/>
-            <w:color w:val="FF0000"/>
-            <w:lang w:val="en-US" w:eastAsia="zh-CN"/>
-          </w:rPr>
-          <w:t xml:space="preserve">完成</w:t>
-        </w:r>
-      </w:ins>
-      <w:r>
-        <w:rPr>
-          <w:rFonts w:hint="eastAsia" w:eastAsia="宋体" w:cs="宋体"/>
-          <w:color w:val="FF0000"/>
-          <w:lang w:val="en-US" w:eastAsia="zh-CN"/>
-        </w:rPr>
-        <w:t xml:space="preserve">跨领域药物相互作用注释，展示</w:t>
-      </w:r>
-      <w:del w:id="543" w:author="Kiro润色" w:date="2026-06-17T00:00:00Z">
-        <w:r>
-          <w:rPr>
-            <w:rFonts w:hint="eastAsia" w:eastAsia="宋体" w:cs="宋体"/>
-            <w:color w:val="FF0000"/>
-            <w:lang w:val="en-US" w:eastAsia="zh-CN"/>
-          </w:rPr>
-          <w:delText xml:space="preserve">LLM在</w:delText>
-        </w:r>
-      </w:del>
-      <w:ins w:id="544" w:author="Kiro润色" w:date="2026-06-17T00:00:00Z">
-        <w:r>
-          <w:rPr>
-            <w:rFonts w:hint="eastAsia" w:eastAsia="宋体" w:cs="宋体"/>
-            <w:color w:val="FF0000"/>
-            <w:lang w:val="en-US" w:eastAsia="zh-CN"/>
-          </w:rPr>
-          <w:t xml:space="preserve">了模型</w:t>
-        </w:r>
-      </w:ins>
-      <w:r>
-        <w:rPr>
-          <w:rFonts w:hint="eastAsia" w:eastAsia="宋体" w:cs="宋体"/>
-          <w:color w:val="FF0000"/>
-          <w:lang w:val="en-US" w:eastAsia="zh-CN"/>
-        </w:rPr>
-        <w:t xml:space="preserve">发现潜在药物相互作用</w:t>
-      </w:r>
-      <w:del w:id="545" w:author="Kiro润色" w:date="2026-06-17T00:00:00Z">
-        <w:r>
-          <w:rPr>
-            <w:rFonts w:hint="eastAsia" w:eastAsia="宋体" w:cs="宋体"/>
-            <w:color w:val="FF0000"/>
-            <w:lang w:val="en-US" w:eastAsia="zh-CN"/>
-          </w:rPr>
-          <w:delText xml:space="preserve">方面</w:delText>
-        </w:r>
-      </w:del>
-      <w:r>
-        <w:rPr>
-          <w:rFonts w:hint="eastAsia" w:eastAsia="宋体" w:cs="宋体"/>
-          <w:color w:val="FF0000"/>
-          <w:lang w:val="en-US" w:eastAsia="zh-CN"/>
-        </w:rPr>
-        <w:t xml:space="preserve">的能力</w:t>
-      </w:r>
-      <w:del w:id="546" w:author="Kiro润色" w:date="2026-06-17T00:00:00Z">
-        <w:r>
-          <w:rPr>
-            <w:rFonts w:hint="eastAsia" w:eastAsia="宋体" w:cs="宋体"/>
-            <w:color w:val="FF0000"/>
-            <w:lang w:val="en-US" w:eastAsia="zh-CN"/>
-          </w:rPr>
-          <w:delText xml:space="preserve">。Xu等</w:delText>
-        </w:r>
-      </w:del>
-      <w:r>
-        <w:rPr>
-          <w:rFonts w:hint="eastAsia" w:eastAsia="宋体" w:cs="宋体"/>
-          <w:color w:val="FF0000"/>
-          <w:lang w:val="en-US" w:eastAsia="zh-CN"/>
-        </w:rPr>
-        <w:t xml:space="preserve">[3</w:t>
-      </w:r>
-      <w:del w:id="547" w:author="Kiro润色" w:date="2026-06-17T00:00:00Z">
-        <w:r>
-          <w:rPr>
-            <w:rFonts w:hint="eastAsia" w:eastAsia="宋体" w:cs="宋体"/>
-            <w:color w:val="FF0000"/>
-            <w:lang w:val="en-US" w:eastAsia="zh-CN"/>
-          </w:rPr>
-          <w:delText xml:space="preserve">3</w:delText>
-        </w:r>
-      </w:del>
-      <w:ins w:id="548" w:author="Kiro润色" w:date="2026-06-17T00:00:00Z">
-        <w:r>
-          <w:rPr>
-            <w:rFonts w:hint="eastAsia" w:eastAsia="宋体" w:cs="宋体"/>
-            <w:color w:val="FF0000"/>
-            <w:lang w:val="en-US" w:eastAsia="zh-CN"/>
-          </w:rPr>
-          <w:t xml:space="preserve">2</w:t>
-        </w:r>
-      </w:ins>
-      <w:r>
-        <w:rPr>
-          <w:rFonts w:hint="eastAsia" w:eastAsia="宋体" w:cs="宋体"/>
-          <w:color w:val="FF0000"/>
-          <w:lang w:val="en-US" w:eastAsia="zh-CN"/>
-        </w:rPr>
-        <w:t xml:space="preserve">]</w:t>
-      </w:r>
-      <w:ins w:id="549" w:author="Kiro润色" w:date="2026-06-17T00:00:00Z">
-        <w:r>
-          <w:rPr>
-            <w:rFonts w:hint="eastAsia" w:eastAsia="宋体" w:cs="宋体"/>
-            <w:color w:val="FF0000"/>
-            <w:lang w:val="en-US" w:eastAsia="zh-CN"/>
-          </w:rPr>
-          <w:t xml:space="preserve">；也有研究</w:t>
-        </w:r>
-      </w:ins>
-      <w:r>
-        <w:rPr>
-          <w:rFonts w:hint="eastAsia" w:eastAsia="宋体" w:cs="宋体"/>
-          <w:color w:val="FF0000"/>
-          <w:lang w:val="en-US" w:eastAsia="zh-CN"/>
-        </w:rPr>
-        <w:t xml:space="preserve">提出</w:t>
-      </w:r>
-      <w:del w:id="550" w:author="Kiro润色" w:date="2026-06-17T00:00:00Z">
-        <w:r>
-          <w:rPr>
-            <w:rFonts w:hint="eastAsia" w:eastAsia="宋体" w:cs="宋体"/>
-            <w:color w:val="FF0000"/>
-            <w:lang w:val="en-US" w:eastAsia="zh-CN"/>
-          </w:rPr>
-          <w:delText xml:space="preserve">的</w:delText>
-        </w:r>
-      </w:del>
-      <w:r>
-        <w:rPr>
-          <w:rFonts w:hint="eastAsia" w:eastAsia="宋体" w:cs="宋体"/>
-          <w:color w:val="FF0000"/>
-          <w:lang w:val="en-US" w:eastAsia="zh-CN"/>
-        </w:rPr>
-        <w:t xml:space="preserve">字符级卷积循环交互网络（CCRIN）</w:t>
-      </w:r>
-      <w:del w:id="551" w:author="Kiro润色" w:date="2026-06-17T00:00:00Z">
-        <w:r>
-          <w:rPr>
-            <w:rFonts w:hint="eastAsia" w:eastAsia="宋体" w:cs="宋体"/>
-            <w:color w:val="FF0000"/>
-            <w:lang w:val="en-US" w:eastAsia="zh-CN"/>
-          </w:rPr>
-          <w:delText xml:space="preserve">可</w:delText>
-        </w:r>
-      </w:del>
-      <w:ins w:id="552" w:author="Kiro润色" w:date="2026-06-17T00:00:00Z">
-        <w:r>
-          <w:rPr>
-            <w:rFonts w:hint="eastAsia" w:eastAsia="宋体" w:cs="宋体"/>
-            <w:color w:val="FF0000"/>
-            <w:lang w:val="en-US" w:eastAsia="zh-CN"/>
-          </w:rPr>
-          <w:t xml:space="preserve">，</w:t>
-        </w:r>
-      </w:ins>
-      <w:r>
-        <w:rPr>
-          <w:rFonts w:hint="eastAsia" w:eastAsia="宋体" w:cs="宋体"/>
-          <w:color w:val="FF0000"/>
-          <w:lang w:val="en-US" w:eastAsia="zh-CN"/>
-        </w:rPr>
-        <w:t xml:space="preserve">从中医临床文本中联合抽取实体</w:t>
-      </w:r>
-      <w:del w:id="553" w:author="Kiro润色" w:date="2026-06-17T00:00:00Z">
-        <w:r>
-          <w:rPr>
-            <w:rFonts w:hint="eastAsia" w:eastAsia="宋体" w:cs="宋体"/>
-            <w:color w:val="FF0000"/>
-            <w:lang w:val="en-US" w:eastAsia="zh-CN"/>
-          </w:rPr>
-          <w:delText xml:space="preserve">和</w:delText>
-        </w:r>
-      </w:del>
-      <w:ins w:id="554" w:author="Kiro润色" w:date="2026-06-17T00:00:00Z">
-        <w:r>
-          <w:rPr>
-            <w:rFonts w:hint="eastAsia" w:eastAsia="宋体" w:cs="宋体"/>
-            <w:color w:val="FF0000"/>
-            <w:lang w:val="en-US" w:eastAsia="zh-CN"/>
-          </w:rPr>
-          <w:t xml:space="preserve">与</w:t>
-        </w:r>
-      </w:ins>
-      <w:r>
-        <w:rPr>
-          <w:rFonts w:hint="eastAsia" w:eastAsia="宋体" w:cs="宋体"/>
-          <w:color w:val="FF0000"/>
-          <w:lang w:val="en-US" w:eastAsia="zh-CN"/>
-        </w:rPr>
-        <w:t xml:space="preserve">关系，为构建知识图谱提供支持</w:t>
-      </w:r>
-      <w:ins w:id="555" w:author="Kiro润色" w:date="2026-06-17T00:00:00Z">
-        <w:r>
-          <w:rPr>
-            <w:rFonts w:hint="eastAsia" w:eastAsia="宋体" w:cs="宋体"/>
-            <w:color w:val="FF0000"/>
-            <w:lang w:val="en-US" w:eastAsia="zh-CN"/>
-          </w:rPr>
-          <w:t xml:space="preserve">[33]</w:t>
-        </w:r>
-      </w:ins>
-      <w:r>
-        <w:rPr>
-          <w:rFonts w:hint="eastAsia" w:eastAsia="宋体" w:cs="宋体"/>
-          <w:color w:val="FF0000"/>
-          <w:lang w:val="en-US" w:eastAsia="zh-CN"/>
-        </w:rPr>
-        <w:t xml:space="preserve">。</w:t>
-      </w:r>
+          <w:delText xml:space="preserve">研究表明[32]，TEmbed-DDI利用LLM嵌入和双向神经网络进行跨领域药物相互作用注释，展示LLM在发现潜在药物相互作用方面的能力。Xu等[33]提出的字符级卷积循环交互网络（CCRIN）可从中医临床文本中联合抽取实体和关系，为构建知识图谱提供支持。</w:delText>
+        </w:r>
+      </w:del>
     </w:p>
     <w:p>
       <w:pPr>
@@ -10119,7 +9827,7 @@
           <w:color w:val="FF0000"/>
         </w:rPr>
       </w:pPr>
-      <w:del w:id="556" w:author="Kiro润色" w:date="2026-06-17T00:00:00Z">
+      <w:del w:id="538" w:author="Kiro润色" w:date="2026-06-17T00:00:00Z">
         <w:r>
           <w:rPr>
             <w:rFonts w:hint="eastAsia" w:ascii="宋体" w:hAnsi="宋体" w:eastAsia="宋体" w:cs="宋体"/>
@@ -10128,7 +9836,7 @@
           <w:delText xml:space="preserve">LLM</w:delText>
         </w:r>
       </w:del>
-      <w:ins w:id="557" w:author="Kiro润色" w:date="2026-06-17T00:00:00Z">
+      <w:ins w:id="539" w:author="Kiro润色" w:date="2026-06-17T00:00:00Z">
         <w:r>
           <w:rPr>
             <w:rFonts w:hint="eastAsia" w:ascii="宋体" w:hAnsi="宋体" w:eastAsia="宋体" w:cs="宋体"/>
@@ -10144,7 +9852,7 @@
         </w:rPr>
         <w:t xml:space="preserve">能够通过执业医师考试</w:t>
       </w:r>
-      <w:del w:id="558" w:author="Kiro润色" w:date="2026-06-17T00:00:00Z">
+      <w:del w:id="540" w:author="Kiro润色" w:date="2026-06-17T00:00:00Z">
         <w:r>
           <w:rPr>
             <w:rFonts w:hint="eastAsia" w:ascii="宋体" w:hAnsi="宋体" w:eastAsia="宋体" w:cs="宋体"/>
@@ -10153,7 +9861,7 @@
           <w:delText xml:space="preserve">并</w:delText>
         </w:r>
       </w:del>
-      <w:ins w:id="559" w:author="Kiro润色" w:date="2026-06-17T00:00:00Z">
+      <w:ins w:id="541" w:author="Kiro润色" w:date="2026-06-17T00:00:00Z">
         <w:r>
           <w:rPr>
             <w:rFonts w:hint="eastAsia" w:ascii="宋体" w:hAnsi="宋体" w:eastAsia="宋体" w:cs="宋体"/>
@@ -10169,7 +9877,7 @@
         </w:rPr>
         <w:t xml:space="preserve">在选择题上达</w:t>
       </w:r>
-      <w:ins w:id="560" w:author="Kiro润色" w:date="2026-06-17T00:00:00Z">
+      <w:ins w:id="542" w:author="Kiro润色" w:date="2026-06-17T00:00:00Z">
         <w:r>
           <w:rPr>
             <w:rFonts w:hint="eastAsia" w:ascii="宋体" w:hAnsi="宋体" w:eastAsia="宋体" w:cs="宋体"/>
@@ -10185,7 +9893,7 @@
         </w:rPr>
         <w:t xml:space="preserve">90%以上的准确率，</w:t>
       </w:r>
-      <w:del w:id="561" w:author="Kiro润色" w:date="2026-06-17T00:00:00Z">
+      <w:del w:id="543" w:author="Kiro润色" w:date="2026-06-17T00:00:00Z">
         <w:r>
           <w:rPr>
             <w:rFonts w:hint="eastAsia" w:ascii="宋体" w:hAnsi="宋体" w:eastAsia="宋体" w:cs="宋体"/>
@@ -10194,7 +9902,7 @@
           <w:delText xml:space="preserve">这本质上</w:delText>
         </w:r>
       </w:del>
-      <w:ins w:id="562" w:author="Kiro润色" w:date="2026-06-17T00:00:00Z">
+      <w:ins w:id="544" w:author="Kiro润色" w:date="2026-06-17T00:00:00Z">
         <w:r>
           <w:rPr>
             <w:rFonts w:hint="eastAsia" w:ascii="宋体" w:hAnsi="宋体" w:eastAsia="宋体" w:cs="宋体"/>
@@ -10210,21 +9918,274 @@
         </w:rPr>
         <w:t xml:space="preserve">度量的</w:t>
       </w:r>
+      <w:ins w:id="545" w:author="Kiro润色" w:date="2026-06-17T00:00:00Z">
+        <w:r>
+          <w:rPr>
+            <w:rFonts w:hint="eastAsia" w:ascii="宋体" w:hAnsi="宋体" w:eastAsia="宋体" w:cs="宋体"/>
+            <w:color w:val="FF0000"/>
+          </w:rPr>
+          <w:t xml:space="preserve">主要</w:t>
+        </w:r>
+      </w:ins>
+      <w:r>
+        <w:rPr>
+          <w:rFonts w:hint="eastAsia" w:ascii="宋体" w:hAnsi="宋体" w:eastAsia="宋体" w:cs="宋体"/>
+          <w:color w:val="FF0000"/>
+        </w:rPr>
+        <w:t xml:space="preserve">是文本到文本的符号映射能力，与真实中医诊疗所需的跨模态感知综合判断能力</w:t>
+      </w:r>
+      <w:del w:id="546" w:author="Kiro润色" w:date="2026-06-17T00:00:00Z">
+        <w:r>
+          <w:rPr>
+            <w:rFonts w:hint="eastAsia" w:ascii="宋体" w:hAnsi="宋体" w:eastAsia="宋体" w:cs="宋体"/>
+            <w:color w:val="FF0000"/>
+          </w:rPr>
+          <w:delText xml:space="preserve">之间</w:delText>
+        </w:r>
+      </w:del>
+      <w:r>
+        <w:rPr>
+          <w:rFonts w:hint="eastAsia" w:ascii="宋体" w:hAnsi="宋体" w:eastAsia="宋体" w:cs="宋体"/>
+          <w:color w:val="FF0000"/>
+        </w:rPr>
+        <w:t xml:space="preserve">存在</w:t>
+      </w:r>
+      <w:del w:id="547" w:author="Kiro润色" w:date="2026-06-17T00:00:00Z">
+        <w:r>
+          <w:rPr>
+            <w:rFonts w:hint="eastAsia" w:ascii="宋体" w:hAnsi="宋体" w:eastAsia="宋体" w:cs="宋体"/>
+            <w:color w:val="FF0000"/>
+          </w:rPr>
+          <w:delText xml:space="preserve">本质</w:delText>
+        </w:r>
+      </w:del>
+      <w:ins w:id="548" w:author="Kiro润色" w:date="2026-06-17T00:00:00Z">
+        <w:r>
+          <w:rPr>
+            <w:rFonts w:hint="eastAsia" w:ascii="宋体" w:hAnsi="宋体" w:eastAsia="宋体" w:cs="宋体"/>
+            <w:color w:val="FF0000"/>
+          </w:rPr>
+          <w:t xml:space="preserve">明显</w:t>
+        </w:r>
+      </w:ins>
+      <w:r>
+        <w:rPr>
+          <w:rFonts w:hint="eastAsia" w:ascii="宋体" w:hAnsi="宋体" w:eastAsia="宋体" w:cs="宋体"/>
+          <w:color w:val="FF0000"/>
+        </w:rPr>
+        <w:t xml:space="preserve">区别。文本</w:t>
+      </w:r>
+      <w:del w:id="549" w:author="Kiro润色" w:date="2026-06-17T00:00:00Z">
+        <w:r>
+          <w:rPr>
+            <w:rFonts w:hint="eastAsia" w:ascii="宋体" w:hAnsi="宋体" w:eastAsia="宋体" w:cs="宋体"/>
+            <w:color w:val="FF0000"/>
+          </w:rPr>
+          <w:delText xml:space="preserve">映射</w:delText>
+        </w:r>
+      </w:del>
+      <w:r>
+        <w:rPr>
+          <w:rFonts w:hint="eastAsia" w:ascii="宋体" w:hAnsi="宋体" w:eastAsia="宋体" w:cs="宋体"/>
+          <w:color w:val="FF0000"/>
+        </w:rPr>
+        <w:t xml:space="preserve">任务上的良好表现，可能</w:t>
+      </w:r>
+      <w:del w:id="550" w:author="Kiro润色" w:date="2026-06-17T00:00:00Z">
+        <w:r>
+          <w:rPr>
+            <w:rFonts w:hint="eastAsia" w:ascii="宋体" w:hAnsi="宋体" w:eastAsia="宋体" w:cs="宋体"/>
+            <w:color w:val="FF0000"/>
+          </w:rPr>
+          <w:delText xml:space="preserve">严重</w:delText>
+        </w:r>
+      </w:del>
+      <w:r>
+        <w:rPr>
+          <w:rFonts w:hint="eastAsia" w:ascii="宋体" w:hAnsi="宋体" w:eastAsia="宋体" w:cs="宋体"/>
+          <w:color w:val="FF0000"/>
+        </w:rPr>
+        <w:t xml:space="preserve">掩盖</w:t>
+      </w:r>
+      <w:del w:id="551" w:author="Kiro润色" w:date="2026-06-17T00:00:00Z">
+        <w:r>
+          <w:rPr>
+            <w:rFonts w:hint="eastAsia" w:ascii="宋体" w:hAnsi="宋体" w:eastAsia="宋体" w:cs="宋体"/>
+            <w:color w:val="FF0000"/>
+          </w:rPr>
+          <w:delText xml:space="preserve">中医临床所需的</w:delText>
+        </w:r>
+      </w:del>
+      <w:ins w:id="552" w:author="Kiro润色" w:date="2026-06-17T00:00:00Z">
+        <w:r>
+          <w:rPr>
+            <w:rFonts w:hint="eastAsia" w:ascii="宋体" w:hAnsi="宋体" w:eastAsia="宋体" w:cs="宋体"/>
+            <w:color w:val="FF0000"/>
+          </w:rPr>
+          <w:t xml:space="preserve">了对</w:t>
+        </w:r>
+      </w:ins>
+      <w:r>
+        <w:rPr>
+          <w:rFonts w:hint="eastAsia" w:ascii="宋体" w:hAnsi="宋体" w:eastAsia="宋体" w:cs="宋体"/>
+          <w:color w:val="FF0000"/>
+        </w:rPr>
+        <w:t xml:space="preserve">多感官、具身、情境依赖</w:t>
+      </w:r>
+      <w:ins w:id="553" w:author="Kiro润色" w:date="2026-06-17T00:00:00Z">
+        <w:r>
+          <w:rPr>
+            <w:rFonts w:hint="eastAsia" w:ascii="宋体" w:hAnsi="宋体" w:eastAsia="宋体" w:cs="宋体"/>
+            <w:color w:val="FF0000"/>
+          </w:rPr>
+          <w:t xml:space="preserve">这一类</w:t>
+        </w:r>
+      </w:ins>
+      <w:r>
+        <w:rPr>
+          <w:rFonts w:hint="eastAsia" w:ascii="宋体" w:hAnsi="宋体" w:eastAsia="宋体" w:cs="宋体"/>
+          <w:color w:val="FF0000"/>
+        </w:rPr>
+        <w:t xml:space="preserve">认知过程的评估缺失，从而</w:t>
+      </w:r>
+      <w:del w:id="554" w:author="Kiro润色" w:date="2026-06-17T00:00:00Z">
+        <w:r>
+          <w:rPr>
+            <w:rFonts w:hint="eastAsia" w:ascii="宋体" w:hAnsi="宋体" w:eastAsia="宋体" w:cs="宋体"/>
+            <w:color w:val="FF0000"/>
+          </w:rPr>
+          <w:delText xml:space="preserve">导致对</w:delText>
+        </w:r>
+      </w:del>
+      <w:ins w:id="555" w:author="Kiro润色" w:date="2026-06-17T00:00:00Z">
+        <w:r>
+          <w:rPr>
+            <w:rFonts w:hint="eastAsia" w:ascii="宋体" w:hAnsi="宋体" w:eastAsia="宋体" w:cs="宋体"/>
+            <w:color w:val="FF0000"/>
+          </w:rPr>
+          <w:t xml:space="preserve">高估</w:t>
+        </w:r>
+      </w:ins>
+      <w:r>
+        <w:rPr>
+          <w:rFonts w:hint="eastAsia" w:ascii="宋体" w:hAnsi="宋体" w:eastAsia="宋体" w:cs="宋体"/>
+          <w:color w:val="FF0000"/>
+        </w:rPr>
+        <w:t xml:space="preserve">模型</w:t>
+      </w:r>
+      <w:ins w:id="556" w:author="Kiro润色" w:date="2026-06-17T00:00:00Z">
+        <w:r>
+          <w:rPr>
+            <w:rFonts w:hint="eastAsia" w:ascii="宋体" w:hAnsi="宋体" w:eastAsia="宋体" w:cs="宋体"/>
+            <w:color w:val="FF0000"/>
+          </w:rPr>
+          <w:t xml:space="preserve">的</w:t>
+        </w:r>
+      </w:ins>
+      <w:r>
+        <w:rPr>
+          <w:rFonts w:hint="eastAsia" w:ascii="宋体" w:hAnsi="宋体" w:eastAsia="宋体" w:cs="宋体"/>
+          <w:color w:val="FF0000"/>
+        </w:rPr>
+        <w:t xml:space="preserve">实际临床能力</w:t>
+      </w:r>
+      <w:del w:id="557" w:author="Kiro润色" w:date="2026-06-17T00:00:00Z">
+        <w:r>
+          <w:rPr>
+            <w:rFonts w:hint="eastAsia" w:ascii="宋体" w:hAnsi="宋体" w:eastAsia="宋体" w:cs="宋体"/>
+            <w:color w:val="FF0000"/>
+          </w:rPr>
+          <w:delText xml:space="preserve">的高估</w:delText>
+        </w:r>
+      </w:del>
+      <w:r>
+        <w:rPr>
+          <w:rFonts w:hint="eastAsia" w:ascii="宋体" w:hAnsi="宋体" w:eastAsia="宋体" w:cs="宋体"/>
+          <w:color w:val="FF0000"/>
+        </w:rPr>
+        <w:t xml:space="preserve">。</w:t>
+      </w:r>
+      <w:ins w:id="558" w:author="Kiro润色" w:date="2026-06-17T00:00:00Z">
+        <w:r>
+          <w:rPr>
+            <w:rFonts w:hint="eastAsia" w:ascii="宋体" w:hAnsi="宋体" w:eastAsia="宋体" w:cs="宋体"/>
+            <w:color w:val="FF0000"/>
+          </w:rPr>
+          <w:t xml:space="preserve">一个</w:t>
+        </w:r>
+      </w:ins>
+      <w:r>
+        <w:rPr>
+          <w:rFonts w:hint="eastAsia" w:ascii="宋体" w:hAnsi="宋体" w:eastAsia="宋体" w:cs="宋体"/>
+          <w:color w:val="FF0000"/>
+        </w:rPr>
+        <w:t xml:space="preserve">“知道”舌红苔黄腻主湿热的模型，未必能在真实舌象图像中</w:t>
+      </w:r>
+      <w:del w:id="559" w:author="Kiro润色" w:date="2026-06-17T00:00:00Z">
+        <w:r>
+          <w:rPr>
+            <w:rFonts w:hint="eastAsia" w:ascii="宋体" w:hAnsi="宋体" w:eastAsia="宋体" w:cs="宋体"/>
+            <w:color w:val="FF0000"/>
+          </w:rPr>
+          <w:delText xml:space="preserve">准确</w:delText>
+        </w:r>
+      </w:del>
+      <w:r>
+        <w:rPr>
+          <w:rFonts w:hint="eastAsia" w:ascii="宋体" w:hAnsi="宋体" w:eastAsia="宋体" w:cs="宋体"/>
+          <w:color w:val="FF0000"/>
+        </w:rPr>
+        <w:t xml:space="preserve">识别该特征，</w:t>
+      </w:r>
+      <w:del w:id="560" w:author="Kiro润色" w:date="2026-06-17T00:00:00Z">
+        <w:r>
+          <w:rPr>
+            <w:rFonts w:hint="eastAsia" w:ascii="宋体" w:hAnsi="宋体" w:eastAsia="宋体" w:cs="宋体"/>
+            <w:color w:val="FF0000"/>
+          </w:rPr>
+          <w:delText xml:space="preserve">更</w:delText>
+        </w:r>
+      </w:del>
+      <w:ins w:id="561" w:author="Kiro润色" w:date="2026-06-17T00:00:00Z">
+        <w:r>
+          <w:rPr>
+            <w:rFonts w:hint="eastAsia" w:ascii="宋体" w:hAnsi="宋体" w:eastAsia="宋体" w:cs="宋体"/>
+            <w:color w:val="FF0000"/>
+          </w:rPr>
+          <w:t xml:space="preserve">也</w:t>
+        </w:r>
+      </w:ins>
+      <w:r>
+        <w:rPr>
+          <w:rFonts w:hint="eastAsia" w:ascii="宋体" w:hAnsi="宋体" w:eastAsia="宋体" w:cs="宋体"/>
+          <w:color w:val="FF0000"/>
+        </w:rPr>
+        <w:t xml:space="preserve">难以结合脉象、面色</w:t>
+      </w:r>
+      <w:del w:id="562" w:author="Kiro润色" w:date="2026-06-17T00:00:00Z">
+        <w:r>
+          <w:rPr>
+            <w:rFonts w:hint="eastAsia" w:ascii="宋体" w:hAnsi="宋体" w:eastAsia="宋体" w:cs="宋体"/>
+            <w:color w:val="FF0000"/>
+          </w:rPr>
+          <w:delText xml:space="preserve">和</w:delText>
+        </w:r>
+      </w:del>
       <w:ins w:id="563" w:author="Kiro润色" w:date="2026-06-17T00:00:00Z">
         <w:r>
           <w:rPr>
             <w:rFonts w:hint="eastAsia" w:ascii="宋体" w:hAnsi="宋体" w:eastAsia="宋体" w:cs="宋体"/>
             <w:color w:val="FF0000"/>
           </w:rPr>
-          <w:t xml:space="preserve">主要</w:t>
-        </w:r>
-      </w:ins>
-      <w:r>
-        <w:rPr>
-          <w:rFonts w:hint="eastAsia" w:ascii="宋体" w:hAnsi="宋体" w:eastAsia="宋体" w:cs="宋体"/>
-          <w:color w:val="FF0000"/>
-        </w:rPr>
-        <w:t xml:space="preserve">是文本到文本的符号映射能力，与真实中医诊疗所需的跨模态感知综合判断能力</w:t>
+          <w:t xml:space="preserve">与</w:t>
+        </w:r>
+      </w:ins>
+      <w:r>
+        <w:rPr>
+          <w:rFonts w:hint="eastAsia" w:ascii="宋体" w:hAnsi="宋体" w:eastAsia="宋体" w:cs="宋体"/>
+          <w:color w:val="FF0000"/>
+        </w:rPr>
+        <w:t xml:space="preserve">问诊信息完成综合辨证。</w:t>
       </w:r>
       <w:del w:id="564" w:author="Kiro润色" w:date="2026-06-17T00:00:00Z">
         <w:r>
@@ -10232,15 +10193,15 @@
             <w:rFonts w:hint="eastAsia" w:ascii="宋体" w:hAnsi="宋体" w:eastAsia="宋体" w:cs="宋体"/>
             <w:color w:val="FF0000"/>
           </w:rPr>
-          <w:delText xml:space="preserve">之间</w:delText>
-        </w:r>
-      </w:del>
-      <w:r>
-        <w:rPr>
-          <w:rFonts w:hint="eastAsia" w:ascii="宋体" w:hAnsi="宋体" w:eastAsia="宋体" w:cs="宋体"/>
-          <w:color w:val="FF0000"/>
-        </w:rPr>
-        <w:t xml:space="preserve">存在</w:t>
+          <w:delText xml:space="preserve">中</w:delText>
+        </w:r>
+      </w:del>
+      <w:r>
+        <w:rPr>
+          <w:rFonts w:hint="eastAsia" w:ascii="宋体" w:hAnsi="宋体" w:eastAsia="宋体" w:cs="宋体"/>
+          <w:color w:val="FF0000"/>
+        </w:rPr>
+        <w:t xml:space="preserve">医</w:t>
       </w:r>
       <w:del w:id="565" w:author="Kiro润色" w:date="2026-06-17T00:00:00Z">
         <w:r>
@@ -10248,259 +10209,6 @@
             <w:rFonts w:hint="eastAsia" w:ascii="宋体" w:hAnsi="宋体" w:eastAsia="宋体" w:cs="宋体"/>
             <w:color w:val="FF0000"/>
           </w:rPr>
-          <w:delText xml:space="preserve">本质</w:delText>
-        </w:r>
-      </w:del>
-      <w:ins w:id="566" w:author="Kiro润色" w:date="2026-06-17T00:00:00Z">
-        <w:r>
-          <w:rPr>
-            <w:rFonts w:hint="eastAsia" w:ascii="宋体" w:hAnsi="宋体" w:eastAsia="宋体" w:cs="宋体"/>
-            <w:color w:val="FF0000"/>
-          </w:rPr>
-          <w:t xml:space="preserve">明显</w:t>
-        </w:r>
-      </w:ins>
-      <w:r>
-        <w:rPr>
-          <w:rFonts w:hint="eastAsia" w:ascii="宋体" w:hAnsi="宋体" w:eastAsia="宋体" w:cs="宋体"/>
-          <w:color w:val="FF0000"/>
-        </w:rPr>
-        <w:t xml:space="preserve">区别。文本</w:t>
-      </w:r>
-      <w:del w:id="567" w:author="Kiro润色" w:date="2026-06-17T00:00:00Z">
-        <w:r>
-          <w:rPr>
-            <w:rFonts w:hint="eastAsia" w:ascii="宋体" w:hAnsi="宋体" w:eastAsia="宋体" w:cs="宋体"/>
-            <w:color w:val="FF0000"/>
-          </w:rPr>
-          <w:delText xml:space="preserve">映射</w:delText>
-        </w:r>
-      </w:del>
-      <w:r>
-        <w:rPr>
-          <w:rFonts w:hint="eastAsia" w:ascii="宋体" w:hAnsi="宋体" w:eastAsia="宋体" w:cs="宋体"/>
-          <w:color w:val="FF0000"/>
-        </w:rPr>
-        <w:t xml:space="preserve">任务上的良好表现，可能</w:t>
-      </w:r>
-      <w:del w:id="568" w:author="Kiro润色" w:date="2026-06-17T00:00:00Z">
-        <w:r>
-          <w:rPr>
-            <w:rFonts w:hint="eastAsia" w:ascii="宋体" w:hAnsi="宋体" w:eastAsia="宋体" w:cs="宋体"/>
-            <w:color w:val="FF0000"/>
-          </w:rPr>
-          <w:delText xml:space="preserve">严重</w:delText>
-        </w:r>
-      </w:del>
-      <w:r>
-        <w:rPr>
-          <w:rFonts w:hint="eastAsia" w:ascii="宋体" w:hAnsi="宋体" w:eastAsia="宋体" w:cs="宋体"/>
-          <w:color w:val="FF0000"/>
-        </w:rPr>
-        <w:t xml:space="preserve">掩盖</w:t>
-      </w:r>
-      <w:del w:id="569" w:author="Kiro润色" w:date="2026-06-17T00:00:00Z">
-        <w:r>
-          <w:rPr>
-            <w:rFonts w:hint="eastAsia" w:ascii="宋体" w:hAnsi="宋体" w:eastAsia="宋体" w:cs="宋体"/>
-            <w:color w:val="FF0000"/>
-          </w:rPr>
-          <w:delText xml:space="preserve">中医临床所需的</w:delText>
-        </w:r>
-      </w:del>
-      <w:ins w:id="570" w:author="Kiro润色" w:date="2026-06-17T00:00:00Z">
-        <w:r>
-          <w:rPr>
-            <w:rFonts w:hint="eastAsia" w:ascii="宋体" w:hAnsi="宋体" w:eastAsia="宋体" w:cs="宋体"/>
-            <w:color w:val="FF0000"/>
-          </w:rPr>
-          <w:t xml:space="preserve">了对</w:t>
-        </w:r>
-      </w:ins>
-      <w:r>
-        <w:rPr>
-          <w:rFonts w:hint="eastAsia" w:ascii="宋体" w:hAnsi="宋体" w:eastAsia="宋体" w:cs="宋体"/>
-          <w:color w:val="FF0000"/>
-        </w:rPr>
-        <w:t xml:space="preserve">多感官、具身、情境依赖</w:t>
-      </w:r>
-      <w:ins w:id="571" w:author="Kiro润色" w:date="2026-06-17T00:00:00Z">
-        <w:r>
-          <w:rPr>
-            <w:rFonts w:hint="eastAsia" w:ascii="宋体" w:hAnsi="宋体" w:eastAsia="宋体" w:cs="宋体"/>
-            <w:color w:val="FF0000"/>
-          </w:rPr>
-          <w:t xml:space="preserve">这一类</w:t>
-        </w:r>
-      </w:ins>
-      <w:r>
-        <w:rPr>
-          <w:rFonts w:hint="eastAsia" w:ascii="宋体" w:hAnsi="宋体" w:eastAsia="宋体" w:cs="宋体"/>
-          <w:color w:val="FF0000"/>
-        </w:rPr>
-        <w:t xml:space="preserve">认知过程的评估缺失，从而</w:t>
-      </w:r>
-      <w:del w:id="572" w:author="Kiro润色" w:date="2026-06-17T00:00:00Z">
-        <w:r>
-          <w:rPr>
-            <w:rFonts w:hint="eastAsia" w:ascii="宋体" w:hAnsi="宋体" w:eastAsia="宋体" w:cs="宋体"/>
-            <w:color w:val="FF0000"/>
-          </w:rPr>
-          <w:delText xml:space="preserve">导致对</w:delText>
-        </w:r>
-      </w:del>
-      <w:ins w:id="573" w:author="Kiro润色" w:date="2026-06-17T00:00:00Z">
-        <w:r>
-          <w:rPr>
-            <w:rFonts w:hint="eastAsia" w:ascii="宋体" w:hAnsi="宋体" w:eastAsia="宋体" w:cs="宋体"/>
-            <w:color w:val="FF0000"/>
-          </w:rPr>
-          <w:t xml:space="preserve">高估</w:t>
-        </w:r>
-      </w:ins>
-      <w:r>
-        <w:rPr>
-          <w:rFonts w:hint="eastAsia" w:ascii="宋体" w:hAnsi="宋体" w:eastAsia="宋体" w:cs="宋体"/>
-          <w:color w:val="FF0000"/>
-        </w:rPr>
-        <w:t xml:space="preserve">模型</w:t>
-      </w:r>
-      <w:ins w:id="574" w:author="Kiro润色" w:date="2026-06-17T00:00:00Z">
-        <w:r>
-          <w:rPr>
-            <w:rFonts w:hint="eastAsia" w:ascii="宋体" w:hAnsi="宋体" w:eastAsia="宋体" w:cs="宋体"/>
-            <w:color w:val="FF0000"/>
-          </w:rPr>
-          <w:t xml:space="preserve">的</w:t>
-        </w:r>
-      </w:ins>
-      <w:r>
-        <w:rPr>
-          <w:rFonts w:hint="eastAsia" w:ascii="宋体" w:hAnsi="宋体" w:eastAsia="宋体" w:cs="宋体"/>
-          <w:color w:val="FF0000"/>
-        </w:rPr>
-        <w:t xml:space="preserve">实际临床能力</w:t>
-      </w:r>
-      <w:del w:id="575" w:author="Kiro润色" w:date="2026-06-17T00:00:00Z">
-        <w:r>
-          <w:rPr>
-            <w:rFonts w:hint="eastAsia" w:ascii="宋体" w:hAnsi="宋体" w:eastAsia="宋体" w:cs="宋体"/>
-            <w:color w:val="FF0000"/>
-          </w:rPr>
-          <w:delText xml:space="preserve">的高估</w:delText>
-        </w:r>
-      </w:del>
-      <w:r>
-        <w:rPr>
-          <w:rFonts w:hint="eastAsia" w:ascii="宋体" w:hAnsi="宋体" w:eastAsia="宋体" w:cs="宋体"/>
-          <w:color w:val="FF0000"/>
-        </w:rPr>
-        <w:t xml:space="preserve">。</w:t>
-      </w:r>
-      <w:ins w:id="576" w:author="Kiro润色" w:date="2026-06-17T00:00:00Z">
-        <w:r>
-          <w:rPr>
-            <w:rFonts w:hint="eastAsia" w:ascii="宋体" w:hAnsi="宋体" w:eastAsia="宋体" w:cs="宋体"/>
-            <w:color w:val="FF0000"/>
-          </w:rPr>
-          <w:t xml:space="preserve">一个</w:t>
-        </w:r>
-      </w:ins>
-      <w:r>
-        <w:rPr>
-          <w:rFonts w:hint="eastAsia" w:ascii="宋体" w:hAnsi="宋体" w:eastAsia="宋体" w:cs="宋体"/>
-          <w:color w:val="FF0000"/>
-        </w:rPr>
-        <w:t xml:space="preserve">“知道”舌红苔黄腻主湿热的模型，未必能在真实舌象图像中</w:t>
-      </w:r>
-      <w:del w:id="577" w:author="Kiro润色" w:date="2026-06-17T00:00:00Z">
-        <w:r>
-          <w:rPr>
-            <w:rFonts w:hint="eastAsia" w:ascii="宋体" w:hAnsi="宋体" w:eastAsia="宋体" w:cs="宋体"/>
-            <w:color w:val="FF0000"/>
-          </w:rPr>
-          <w:delText xml:space="preserve">准确</w:delText>
-        </w:r>
-      </w:del>
-      <w:r>
-        <w:rPr>
-          <w:rFonts w:hint="eastAsia" w:ascii="宋体" w:hAnsi="宋体" w:eastAsia="宋体" w:cs="宋体"/>
-          <w:color w:val="FF0000"/>
-        </w:rPr>
-        <w:t xml:space="preserve">识别该特征，</w:t>
-      </w:r>
-      <w:del w:id="578" w:author="Kiro润色" w:date="2026-06-17T00:00:00Z">
-        <w:r>
-          <w:rPr>
-            <w:rFonts w:hint="eastAsia" w:ascii="宋体" w:hAnsi="宋体" w:eastAsia="宋体" w:cs="宋体"/>
-            <w:color w:val="FF0000"/>
-          </w:rPr>
-          <w:delText xml:space="preserve">更</w:delText>
-        </w:r>
-      </w:del>
-      <w:ins w:id="579" w:author="Kiro润色" w:date="2026-06-17T00:00:00Z">
-        <w:r>
-          <w:rPr>
-            <w:rFonts w:hint="eastAsia" w:ascii="宋体" w:hAnsi="宋体" w:eastAsia="宋体" w:cs="宋体"/>
-            <w:color w:val="FF0000"/>
-          </w:rPr>
-          <w:t xml:space="preserve">也</w:t>
-        </w:r>
-      </w:ins>
-      <w:r>
-        <w:rPr>
-          <w:rFonts w:hint="eastAsia" w:ascii="宋体" w:hAnsi="宋体" w:eastAsia="宋体" w:cs="宋体"/>
-          <w:color w:val="FF0000"/>
-        </w:rPr>
-        <w:t xml:space="preserve">难以结合脉象、面色</w:t>
-      </w:r>
-      <w:del w:id="580" w:author="Kiro润色" w:date="2026-06-17T00:00:00Z">
-        <w:r>
-          <w:rPr>
-            <w:rFonts w:hint="eastAsia" w:ascii="宋体" w:hAnsi="宋体" w:eastAsia="宋体" w:cs="宋体"/>
-            <w:color w:val="FF0000"/>
-          </w:rPr>
-          <w:delText xml:space="preserve">和</w:delText>
-        </w:r>
-      </w:del>
-      <w:ins w:id="581" w:author="Kiro润色" w:date="2026-06-17T00:00:00Z">
-        <w:r>
-          <w:rPr>
-            <w:rFonts w:hint="eastAsia" w:ascii="宋体" w:hAnsi="宋体" w:eastAsia="宋体" w:cs="宋体"/>
-            <w:color w:val="FF0000"/>
-          </w:rPr>
-          <w:t xml:space="preserve">与</w:t>
-        </w:r>
-      </w:ins>
-      <w:r>
-        <w:rPr>
-          <w:rFonts w:hint="eastAsia" w:ascii="宋体" w:hAnsi="宋体" w:eastAsia="宋体" w:cs="宋体"/>
-          <w:color w:val="FF0000"/>
-        </w:rPr>
-        <w:t xml:space="preserve">问诊信息完成综合辨证。</w:t>
-      </w:r>
-      <w:del w:id="582" w:author="Kiro润色" w:date="2026-06-17T00:00:00Z">
-        <w:r>
-          <w:rPr>
-            <w:rFonts w:hint="eastAsia" w:ascii="宋体" w:hAnsi="宋体" w:eastAsia="宋体" w:cs="宋体"/>
-            <w:color w:val="FF0000"/>
-          </w:rPr>
-          <w:delText xml:space="preserve">中</w:delText>
-        </w:r>
-      </w:del>
-      <w:r>
-        <w:rPr>
-          <w:rFonts w:hint="eastAsia" w:ascii="宋体" w:hAnsi="宋体" w:eastAsia="宋体" w:cs="宋体"/>
-          <w:color w:val="FF0000"/>
-        </w:rPr>
-        <w:t xml:space="preserve">医</w:t>
-      </w:r>
-      <w:del w:id="583" w:author="Kiro润色" w:date="2026-06-17T00:00:00Z">
-        <w:r>
-          <w:rPr>
-            <w:rFonts w:hint="eastAsia" w:ascii="宋体" w:hAnsi="宋体" w:eastAsia="宋体" w:cs="宋体"/>
-            <w:color w:val="FF0000"/>
-          </w:rPr>
           <w:delText xml:space="preserve">药</w:delText>
         </w:r>
       </w:del>
@@ -10509,7 +10217,32 @@
           <w:rFonts w:hint="eastAsia" w:ascii="宋体" w:hAnsi="宋体" w:eastAsia="宋体" w:cs="宋体"/>
           <w:color w:val="FF0000"/>
         </w:rPr>
-        <w:t xml:space="preserve">学AI要实现真正的临床价值，必须系统构建多模态感知能力[34]。</w:t>
+        <w:t xml:space="preserve">学AI要实现真正的临床价值，必须系统构建多模态感知能力[3</w:t>
+      </w:r>
+      <w:del w:id="566" w:author="Kiro润色" w:date="2026-06-17T00:00:00Z">
+        <w:r>
+          <w:rPr>
+            <w:rFonts w:hint="eastAsia" w:ascii="宋体" w:hAnsi="宋体" w:eastAsia="宋体" w:cs="宋体"/>
+            <w:color w:val="FF0000"/>
+          </w:rPr>
+          <w:delText xml:space="preserve">4</w:delText>
+        </w:r>
+      </w:del>
+      <w:ins w:id="567" w:author="Kiro润色" w:date="2026-06-17T00:00:00Z">
+        <w:r>
+          <w:rPr>
+            <w:rFonts w:hint="eastAsia" w:ascii="宋体" w:hAnsi="宋体" w:eastAsia="宋体" w:cs="宋体"/>
+            <w:color w:val="FF0000"/>
+          </w:rPr>
+          <w:t xml:space="preserve">2</w:t>
+        </w:r>
+      </w:ins>
+      <w:r>
+        <w:rPr>
+          <w:rFonts w:hint="eastAsia" w:ascii="宋体" w:hAnsi="宋体" w:eastAsia="宋体" w:cs="宋体"/>
+          <w:color w:val="FF0000"/>
+        </w:rPr>
+        <w:t xml:space="preserve">]。</w:t>
       </w:r>
     </w:p>
     <w:p>
@@ -10536,6 +10269,230 @@
           <w:rFonts w:hint="eastAsia" w:ascii="宋体" w:hAnsi="宋体" w:eastAsia="宋体" w:cs="宋体"/>
         </w:rPr>
       </w:pPr>
+      <w:del w:id="568" w:author="Kiro润色" w:date="2026-06-17T00:00:00Z">
+        <w:r>
+          <w:rPr>
+            <w:rFonts w:hint="default" w:ascii="Times New Roman" w:hAnsi="Times New Roman" w:eastAsia="宋体" w:cs="Times New Roman"/>
+            <w:color w:val="FF0000"/>
+            <w:lang w:val="en-US" w:eastAsia="zh-CN"/>
+          </w:rPr>
+          <w:delText xml:space="preserve">研究</w:delText>
+        </w:r>
+      </w:del>
+      <w:ins w:id="569" w:author="Kiro润色" w:date="2026-06-17T00:00:00Z">
+        <w:r>
+          <w:rPr>
+            <w:rFonts w:hint="default" w:ascii="Times New Roman" w:hAnsi="Times New Roman" w:eastAsia="宋体" w:cs="Times New Roman"/>
+            <w:color w:val="FF0000"/>
+            <w:lang w:val="en-US" w:eastAsia="zh-CN"/>
+          </w:rPr>
+          <w:t xml:space="preserve">已</w:t>
+        </w:r>
+      </w:ins>
+      <w:r>
+        <w:rPr>
+          <w:rFonts w:hint="default" w:ascii="Times New Roman" w:hAnsi="Times New Roman" w:eastAsia="宋体" w:cs="Times New Roman"/>
+          <w:color w:val="FF0000"/>
+          <w:lang w:val="en-US" w:eastAsia="zh-CN"/>
+        </w:rPr>
+        <w:t xml:space="preserve">发现</w:t>
+      </w:r>
+      <w:del w:id="570" w:author="Kiro润色" w:date="2026-06-17T00:00:00Z">
+        <w:r>
+          <w:rPr>
+            <w:rFonts w:hint="default" w:ascii="Times New Roman" w:hAnsi="Times New Roman" w:eastAsia="宋体" w:cs="Times New Roman"/>
+            <w:color w:val="FF0000"/>
+            <w:lang w:val="en-US" w:eastAsia="zh-CN"/>
+          </w:rPr>
+          <w:delText xml:space="preserve">，</w:delText>
+        </w:r>
+      </w:del>
+      <w:ins w:id="571" w:author="Kiro润色" w:date="2026-06-17T00:00:00Z">
+        <w:r>
+          <w:rPr>
+            <w:rFonts w:hint="default" w:ascii="Times New Roman" w:hAnsi="Times New Roman" w:eastAsia="宋体" w:cs="Times New Roman"/>
+            <w:color w:val="FF0000"/>
+            <w:lang w:val="en-US" w:eastAsia="zh-CN"/>
+          </w:rPr>
+          <w:t xml:space="preserve">的</w:t>
+        </w:r>
+      </w:ins>
+      <w:r>
+        <w:rPr>
+          <w:rFonts w:hint="default" w:ascii="Times New Roman" w:hAnsi="Times New Roman" w:eastAsia="宋体" w:cs="Times New Roman"/>
+          <w:color w:val="FF0000"/>
+          <w:lang w:val="en-US" w:eastAsia="zh-CN"/>
+        </w:rPr>
+        <w:t xml:space="preserve">“正负向能力鸿沟”</w:t>
+      </w:r>
+      <w:del w:id="572" w:author="Kiro润色" w:date="2026-06-17T00:00:00Z">
+        <w:r>
+          <w:rPr>
+            <w:rFonts w:hint="default" w:ascii="Times New Roman" w:hAnsi="Times New Roman" w:eastAsia="宋体" w:cs="Times New Roman"/>
+            <w:color w:val="FF0000"/>
+            <w:lang w:val="en-US" w:eastAsia="zh-CN"/>
+          </w:rPr>
+          <w:delText xml:space="preserve">仅</w:delText>
+        </w:r>
+      </w:del>
+      <w:ins w:id="573" w:author="Kiro润色" w:date="2026-06-17T00:00:00Z">
+        <w:r>
+          <w:rPr>
+            <w:rFonts w:hint="default" w:ascii="Times New Roman" w:hAnsi="Times New Roman" w:eastAsia="宋体" w:cs="Times New Roman"/>
+            <w:color w:val="FF0000"/>
+            <w:lang w:val="en-US" w:eastAsia="zh-CN"/>
+          </w:rPr>
+          <w:t xml:space="preserve">只</w:t>
+        </w:r>
+      </w:ins>
+      <w:r>
+        <w:rPr>
+          <w:rFonts w:hint="default" w:ascii="Times New Roman" w:hAnsi="Times New Roman" w:eastAsia="宋体" w:cs="Times New Roman"/>
+          <w:color w:val="FF0000"/>
+          <w:lang w:val="en-US" w:eastAsia="zh-CN"/>
+        </w:rPr>
+        <w:t xml:space="preserve">是文本层面安全问题的一部分[11]</w:t>
+      </w:r>
+      <w:del w:id="574" w:author="Kiro润色" w:date="2026-06-17T00:00:00Z">
+        <w:r>
+          <w:rPr>
+            <w:rFonts w:hint="default" w:ascii="Times New Roman" w:hAnsi="Times New Roman" w:eastAsia="宋体" w:cs="Times New Roman"/>
+            <w:color w:val="FF0000"/>
+            <w:lang w:val="en-US" w:eastAsia="zh-CN"/>
+          </w:rPr>
+          <w:delText xml:space="preserve">，</w:delText>
+        </w:r>
+      </w:del>
+      <w:ins w:id="575" w:author="Kiro润色" w:date="2026-06-17T00:00:00Z">
+        <w:r>
+          <w:rPr>
+            <w:rFonts w:hint="default" w:ascii="Times New Roman" w:hAnsi="Times New Roman" w:eastAsia="宋体" w:cs="Times New Roman"/>
+            <w:color w:val="FF0000"/>
+            <w:lang w:val="en-US" w:eastAsia="zh-CN"/>
+          </w:rPr>
+          <w:t xml:space="preserve">：</w:t>
+        </w:r>
+      </w:ins>
+      <w:r>
+        <w:rPr>
+          <w:rFonts w:hint="default" w:ascii="Times New Roman" w:hAnsi="Times New Roman" w:eastAsia="宋体" w:cs="Times New Roman"/>
+          <w:color w:val="FF0000"/>
+          <w:lang w:val="en-US" w:eastAsia="zh-CN"/>
+        </w:rPr>
+        <w:t xml:space="preserve">现有评测大多</w:t>
+      </w:r>
+      <w:del w:id="576" w:author="Kiro润色" w:date="2026-06-17T00:00:00Z">
+        <w:r>
+          <w:rPr>
+            <w:rFonts w:hint="default" w:ascii="Times New Roman" w:hAnsi="Times New Roman" w:eastAsia="宋体" w:cs="Times New Roman"/>
+            <w:color w:val="FF0000"/>
+            <w:lang w:val="en-US" w:eastAsia="zh-CN"/>
+          </w:rPr>
+          <w:delText xml:space="preserve">仅</w:delText>
+        </w:r>
+      </w:del>
+      <w:ins w:id="577" w:author="Kiro润色" w:date="2026-06-17T00:00:00Z">
+        <w:r>
+          <w:rPr>
+            <w:rFonts w:hint="default" w:ascii="Times New Roman" w:hAnsi="Times New Roman" w:eastAsia="宋体" w:cs="Times New Roman"/>
+            <w:color w:val="FF0000"/>
+            <w:lang w:val="en-US" w:eastAsia="zh-CN"/>
+          </w:rPr>
+          <w:t xml:space="preserve">只</w:t>
+        </w:r>
+      </w:ins>
+      <w:r>
+        <w:rPr>
+          <w:rFonts w:hint="default" w:ascii="Times New Roman" w:hAnsi="Times New Roman" w:eastAsia="宋体" w:cs="Times New Roman"/>
+          <w:color w:val="FF0000"/>
+          <w:lang w:val="en-US" w:eastAsia="zh-CN"/>
+        </w:rPr>
+        <w:t xml:space="preserve">关注文本准确率，对幻觉（</w:t>
+      </w:r>
+      <w:del w:id="578" w:author="Kiro润色" w:date="2026-06-17T00:00:00Z">
+        <w:r>
+          <w:rPr>
+            <w:rFonts w:hint="default" w:ascii="Times New Roman" w:hAnsi="Times New Roman" w:eastAsia="宋体" w:cs="Times New Roman"/>
+            <w:color w:val="FF0000"/>
+            <w:lang w:val="en-US" w:eastAsia="zh-CN"/>
+          </w:rPr>
+          <w:delText xml:space="preserve">H</w:delText>
+        </w:r>
+      </w:del>
+      <w:ins w:id="579" w:author="Kiro润色" w:date="2026-06-17T00:00:00Z">
+        <w:r>
+          <w:rPr>
+            <w:rFonts w:hint="default" w:ascii="Times New Roman" w:hAnsi="Times New Roman" w:eastAsia="宋体" w:cs="Times New Roman"/>
+            <w:color w:val="FF0000"/>
+            <w:lang w:val="en-US" w:eastAsia="zh-CN"/>
+          </w:rPr>
+          <w:t xml:space="preserve">h</w:t>
+        </w:r>
+      </w:ins>
+      <w:r>
+        <w:rPr>
+          <w:rFonts w:hint="default" w:ascii="Times New Roman" w:hAnsi="Times New Roman" w:eastAsia="宋体" w:cs="Times New Roman"/>
+          <w:color w:val="FF0000"/>
+          <w:lang w:val="en-US" w:eastAsia="zh-CN"/>
+        </w:rPr>
+        <w:t xml:space="preserve">allucination）、错误信息识别</w:t>
+      </w:r>
+      <w:del w:id="580" w:author="Kiro润色" w:date="2026-06-17T00:00:00Z">
+        <w:r>
+          <w:rPr>
+            <w:rFonts w:hint="default" w:ascii="Times New Roman" w:hAnsi="Times New Roman" w:eastAsia="宋体" w:cs="Times New Roman"/>
+            <w:color w:val="FF0000"/>
+            <w:lang w:val="en-US" w:eastAsia="zh-CN"/>
+          </w:rPr>
+          <w:delText xml:space="preserve">和</w:delText>
+        </w:r>
+      </w:del>
+      <w:ins w:id="581" w:author="Kiro润色" w:date="2026-06-17T00:00:00Z">
+        <w:r>
+          <w:rPr>
+            <w:rFonts w:hint="default" w:ascii="Times New Roman" w:hAnsi="Times New Roman" w:eastAsia="宋体" w:cs="Times New Roman"/>
+            <w:color w:val="FF0000"/>
+            <w:lang w:val="en-US" w:eastAsia="zh-CN"/>
+          </w:rPr>
+          <w:t xml:space="preserve">与</w:t>
+        </w:r>
+      </w:ins>
+      <w:r>
+        <w:rPr>
+          <w:rFonts w:hint="default" w:ascii="Times New Roman" w:hAnsi="Times New Roman" w:eastAsia="宋体" w:cs="Times New Roman"/>
+          <w:color w:val="FF0000"/>
+          <w:lang w:val="en-US" w:eastAsia="zh-CN"/>
+        </w:rPr>
+        <w:t xml:space="preserve">不确定性校准（</w:t>
+      </w:r>
+      <w:del w:id="582" w:author="Kiro润色" w:date="2026-06-17T00:00:00Z">
+        <w:r>
+          <w:rPr>
+            <w:rFonts w:hint="default" w:ascii="Times New Roman" w:hAnsi="Times New Roman" w:eastAsia="宋体" w:cs="Times New Roman"/>
+            <w:color w:val="FF0000"/>
+            <w:lang w:val="en-US" w:eastAsia="zh-CN"/>
+          </w:rPr>
+          <w:delText xml:space="preserve">U</w:delText>
+        </w:r>
+      </w:del>
+      <w:ins w:id="583" w:author="Kiro润色" w:date="2026-06-17T00:00:00Z">
+        <w:r>
+          <w:rPr>
+            <w:rFonts w:hint="default" w:ascii="Times New Roman" w:hAnsi="Times New Roman" w:eastAsia="宋体" w:cs="Times New Roman"/>
+            <w:color w:val="FF0000"/>
+            <w:lang w:val="en-US" w:eastAsia="zh-CN"/>
+          </w:rPr>
+          <w:t xml:space="preserve">u</w:t>
+        </w:r>
+      </w:ins>
+      <w:r>
+        <w:rPr>
+          <w:rFonts w:hint="default" w:ascii="Times New Roman" w:hAnsi="Times New Roman" w:eastAsia="宋体" w:cs="Times New Roman"/>
+          <w:color w:val="FF0000"/>
+          <w:lang w:val="en-US" w:eastAsia="zh-CN"/>
+        </w:rPr>
+        <w:t xml:space="preserve">ncertainty </w:t>
+      </w:r>
       <w:del w:id="584" w:author="Kiro润色" w:date="2026-06-17T00:00:00Z">
         <w:r>
           <w:rPr>
@@ -10543,7 +10500,7 @@
             <w:color w:val="FF0000"/>
             <w:lang w:val="en-US" w:eastAsia="zh-CN"/>
           </w:rPr>
-          <w:delText xml:space="preserve">研究</w:delText>
+          <w:delText xml:space="preserve">C</w:delText>
         </w:r>
       </w:del>
       <w:ins w:id="585" w:author="Kiro润色" w:date="2026-06-17T00:00:00Z">
@@ -10553,7 +10510,7 @@
             <w:color w:val="FF0000"/>
             <w:lang w:val="en-US" w:eastAsia="zh-CN"/>
           </w:rPr>
-          <w:t xml:space="preserve">已</w:t>
+          <w:t xml:space="preserve">c</w:t>
         </w:r>
       </w:ins>
       <w:r>
@@ -10562,7 +10519,7 @@
           <w:color w:val="FF0000"/>
           <w:lang w:val="en-US" w:eastAsia="zh-CN"/>
         </w:rPr>
-        <w:t xml:space="preserve">发现</w:t>
+        <w:t xml:space="preserve">alibration）</w:t>
       </w:r>
       <w:del w:id="586" w:author="Kiro润色" w:date="2026-06-17T00:00:00Z">
         <w:r>
@@ -10571,16 +10528,116 @@
             <w:color w:val="FF0000"/>
             <w:lang w:val="en-US" w:eastAsia="zh-CN"/>
           </w:rPr>
+          <w:delText xml:space="preserve"> </w:delText>
+        </w:r>
+      </w:del>
+      <w:r>
+        <w:rPr>
+          <w:rFonts w:hint="default" w:ascii="Times New Roman" w:hAnsi="Times New Roman" w:eastAsia="宋体" w:cs="Times New Roman"/>
+          <w:color w:val="FF0000"/>
+          <w:lang w:val="en-US" w:eastAsia="zh-CN"/>
+        </w:rPr>
+        <w:t xml:space="preserve">等核心安全属性关注不足。在多模态临床场景中，还存在图像质量欺骗</w:t>
+      </w:r>
+      <w:del w:id="587" w:author="Kiro润色" w:date="2026-06-17T00:00:00Z">
+        <w:r>
+          <w:rPr>
+            <w:rFonts w:hint="default" w:ascii="Times New Roman" w:hAnsi="Times New Roman" w:eastAsia="宋体" w:cs="Times New Roman"/>
+            <w:color w:val="FF0000"/>
+            <w:lang w:val="en-US" w:eastAsia="zh-CN"/>
+          </w:rPr>
           <w:delText xml:space="preserve">，</w:delText>
         </w:r>
       </w:del>
-      <w:ins w:id="587" w:author="Kiro润色" w:date="2026-06-17T00:00:00Z">
+      <w:ins w:id="588" w:author="Kiro润色" w:date="2026-06-17T00:00:00Z">
         <w:r>
           <w:rPr>
             <w:rFonts w:hint="default" w:ascii="Times New Roman" w:hAnsi="Times New Roman" w:eastAsia="宋体" w:cs="Times New Roman"/>
             <w:color w:val="FF0000"/>
             <w:lang w:val="en-US" w:eastAsia="zh-CN"/>
           </w:rPr>
+          <w:t xml:space="preserve">（</w:t>
+        </w:r>
+      </w:ins>
+      <w:r>
+        <w:rPr>
+          <w:rFonts w:hint="default" w:ascii="Times New Roman" w:hAnsi="Times New Roman" w:eastAsia="宋体" w:cs="Times New Roman"/>
+          <w:color w:val="FF0000"/>
+          <w:lang w:val="en-US" w:eastAsia="zh-CN"/>
+        </w:rPr>
+        <w:t xml:space="preserve">如色彩被篡改的舌诊图</w:t>
+      </w:r>
+      <w:ins w:id="589" w:author="Kiro润色" w:date="2026-06-17T00:00:00Z">
+        <w:r>
+          <w:rPr>
+            <w:rFonts w:hint="default" w:ascii="Times New Roman" w:hAnsi="Times New Roman" w:eastAsia="宋体" w:cs="Times New Roman"/>
+            <w:color w:val="FF0000"/>
+            <w:lang w:val="en-US" w:eastAsia="zh-CN"/>
+          </w:rPr>
+          <w:t xml:space="preserve">）</w:t>
+        </w:r>
+      </w:ins>
+      <w:r>
+        <w:rPr>
+          <w:rFonts w:hint="default" w:ascii="Times New Roman" w:hAnsi="Times New Roman" w:eastAsia="宋体" w:cs="Times New Roman"/>
+          <w:color w:val="FF0000"/>
+          <w:lang w:val="en-US" w:eastAsia="zh-CN"/>
+        </w:rPr>
+        <w:t xml:space="preserve">、跨模态信息矛盾</w:t>
+      </w:r>
+      <w:del w:id="590" w:author="Kiro润色" w:date="2026-06-17T00:00:00Z">
+        <w:r>
+          <w:rPr>
+            <w:rFonts w:hint="default" w:ascii="Times New Roman" w:hAnsi="Times New Roman" w:eastAsia="宋体" w:cs="Times New Roman"/>
+            <w:color w:val="FF0000"/>
+            <w:lang w:val="en-US" w:eastAsia="zh-CN"/>
+          </w:rPr>
+          <w:delText xml:space="preserve">，</w:delText>
+        </w:r>
+      </w:del>
+      <w:ins w:id="591" w:author="Kiro润色" w:date="2026-06-17T00:00:00Z">
+        <w:r>
+          <w:rPr>
+            <w:rFonts w:hint="default" w:ascii="Times New Roman" w:hAnsi="Times New Roman" w:eastAsia="宋体" w:cs="Times New Roman"/>
+            <w:color w:val="FF0000"/>
+            <w:lang w:val="en-US" w:eastAsia="zh-CN"/>
+          </w:rPr>
+          <w:t xml:space="preserve">（</w:t>
+        </w:r>
+      </w:ins>
+      <w:r>
+        <w:rPr>
+          <w:rFonts w:hint="default" w:ascii="Times New Roman" w:hAnsi="Times New Roman" w:eastAsia="宋体" w:cs="Times New Roman"/>
+          <w:color w:val="FF0000"/>
+          <w:lang w:val="en-US" w:eastAsia="zh-CN"/>
+        </w:rPr>
+        <w:t xml:space="preserve">如舌脉不一致时如何取舍</w:t>
+      </w:r>
+      <w:ins w:id="592" w:author="Kiro润色" w:date="2026-06-17T00:00:00Z">
+        <w:r>
+          <w:rPr>
+            <w:rFonts w:hint="default" w:ascii="Times New Roman" w:hAnsi="Times New Roman" w:eastAsia="宋体" w:cs="Times New Roman"/>
+            <w:color w:val="FF0000"/>
+            <w:lang w:val="en-US" w:eastAsia="zh-CN"/>
+          </w:rPr>
+          <w:t xml:space="preserve">）</w:t>
+        </w:r>
+      </w:ins>
+      <w:r>
+        <w:rPr>
+          <w:rFonts w:hint="default" w:ascii="Times New Roman" w:hAnsi="Times New Roman" w:eastAsia="宋体" w:cs="Times New Roman"/>
+          <w:color w:val="FF0000"/>
+          <w:lang w:val="en-US" w:eastAsia="zh-CN"/>
+        </w:rPr>
+        <w:t xml:space="preserve">以及模态缺失时</w:t>
+      </w:r>
+      <w:ins w:id="593" w:author="Kiro润色" w:date="2026-06-17T00:00:00Z">
+        <w:r>
+          <w:rPr>
+            <w:rFonts w:hint="default" w:ascii="Times New Roman" w:hAnsi="Times New Roman" w:eastAsia="宋体" w:cs="Times New Roman"/>
+            <w:color w:val="FF0000"/>
+            <w:lang w:val="en-US" w:eastAsia="zh-CN"/>
+          </w:rPr>
           <w:t xml:space="preserve">的</w:t>
         </w:r>
       </w:ins>
@@ -10590,26 +10647,26 @@
           <w:color w:val="FF0000"/>
           <w:lang w:val="en-US" w:eastAsia="zh-CN"/>
         </w:rPr>
-        <w:t xml:space="preserve">“正负向能力鸿沟”</w:t>
-      </w:r>
-      <w:del w:id="588" w:author="Kiro润色" w:date="2026-06-17T00:00:00Z">
+        <w:t xml:space="preserve">过度自信推断等风险，而这些在现有评测体系中几乎未被</w:t>
+      </w:r>
+      <w:del w:id="594" w:author="Kiro润色" w:date="2026-06-17T00:00:00Z">
         <w:r>
           <w:rPr>
             <w:rFonts w:hint="default" w:ascii="Times New Roman" w:hAnsi="Times New Roman" w:eastAsia="宋体" w:cs="Times New Roman"/>
             <w:color w:val="FF0000"/>
             <w:lang w:val="en-US" w:eastAsia="zh-CN"/>
           </w:rPr>
-          <w:delText xml:space="preserve">仅</w:delText>
-        </w:r>
-      </w:del>
-      <w:ins w:id="589" w:author="Kiro润色" w:date="2026-06-17T00:00:00Z">
+          <w:delText xml:space="preserve">涉</w:delText>
+        </w:r>
+      </w:del>
+      <w:ins w:id="595" w:author="Kiro润色" w:date="2026-06-17T00:00:00Z">
         <w:r>
           <w:rPr>
             <w:rFonts w:hint="default" w:ascii="Times New Roman" w:hAnsi="Times New Roman" w:eastAsia="宋体" w:cs="Times New Roman"/>
             <w:color w:val="FF0000"/>
             <w:lang w:val="en-US" w:eastAsia="zh-CN"/>
           </w:rPr>
-          <w:t xml:space="preserve">只</w:t>
+          <w:t xml:space="preserve">触</w:t>
         </w:r>
       </w:ins>
       <w:r>
@@ -10618,26 +10675,26 @@
           <w:color w:val="FF0000"/>
           <w:lang w:val="en-US" w:eastAsia="zh-CN"/>
         </w:rPr>
-        <w:t xml:space="preserve">是文本层面安全问题的一部分[11]</w:t>
-      </w:r>
-      <w:del w:id="590" w:author="Kiro润色" w:date="2026-06-17T00:00:00Z">
+        <w:t xml:space="preserve">及。</w:t>
+      </w:r>
+      <w:del w:id="596" w:author="Kiro润色" w:date="2026-06-17T00:00:00Z">
         <w:r>
           <w:rPr>
             <w:rFonts w:hint="default" w:ascii="Times New Roman" w:hAnsi="Times New Roman" w:eastAsia="宋体" w:cs="Times New Roman"/>
             <w:color w:val="FF0000"/>
             <w:lang w:val="en-US" w:eastAsia="zh-CN"/>
           </w:rPr>
-          <w:delText xml:space="preserve">，</w:delText>
-        </w:r>
-      </w:del>
-      <w:ins w:id="591" w:author="Kiro润色" w:date="2026-06-17T00:00:00Z">
+          <w:delText xml:space="preserve">Singhal等[35]在Med-PaLM</w:delText>
+        </w:r>
+      </w:del>
+      <w:ins w:id="597" w:author="Kiro润色" w:date="2026-06-17T00:00:00Z">
         <w:r>
           <w:rPr>
             <w:rFonts w:hint="default" w:ascii="Times New Roman" w:hAnsi="Times New Roman" w:eastAsia="宋体" w:cs="Times New Roman"/>
             <w:color w:val="FF0000"/>
             <w:lang w:val="en-US" w:eastAsia="zh-CN"/>
           </w:rPr>
-          <w:t xml:space="preserve">：</w:t>
+          <w:t xml:space="preserve">已有</w:t>
         </w:r>
       </w:ins>
       <w:r>
@@ -10646,26 +10703,34 @@
           <w:color w:val="FF0000"/>
           <w:lang w:val="en-US" w:eastAsia="zh-CN"/>
         </w:rPr>
-        <w:t xml:space="preserve">现有评测大多</w:t>
-      </w:r>
-      <w:del w:id="592" w:author="Kiro润色" w:date="2026-06-17T00:00:00Z">
+        <w:t xml:space="preserve">研究</w:t>
+      </w:r>
+      <w:del w:id="598" w:author="Kiro润色" w:date="2026-06-17T00:00:00Z">
         <w:r>
           <w:rPr>
             <w:rFonts w:hint="default" w:ascii="Times New Roman" w:hAnsi="Times New Roman" w:eastAsia="宋体" w:cs="Times New Roman"/>
             <w:color w:val="FF0000"/>
             <w:lang w:val="en-US" w:eastAsia="zh-CN"/>
           </w:rPr>
-          <w:delText xml:space="preserve">仅</w:delText>
-        </w:r>
-      </w:del>
-      <w:ins w:id="593" w:author="Kiro润色" w:date="2026-06-17T00:00:00Z">
+          <w:delText xml:space="preserve">中</w:delText>
+        </w:r>
+      </w:del>
+      <w:r>
+        <w:rPr>
+          <w:rFonts w:hint="default" w:ascii="Times New Roman" w:hAnsi="Times New Roman" w:eastAsia="宋体" w:cs="Times New Roman"/>
+          <w:color w:val="FF0000"/>
+          <w:lang w:val="en-US" w:eastAsia="zh-CN"/>
+        </w:rPr>
+        <w:t xml:space="preserve">强调</w:t>
+      </w:r>
+      <w:ins w:id="599" w:author="Kiro润色" w:date="2026-06-17T00:00:00Z">
         <w:r>
           <w:rPr>
             <w:rFonts w:hint="default" w:ascii="Times New Roman" w:hAnsi="Times New Roman" w:eastAsia="宋体" w:cs="Times New Roman"/>
             <w:color w:val="FF0000"/>
             <w:lang w:val="en-US" w:eastAsia="zh-CN"/>
           </w:rPr>
-          <w:t xml:space="preserve">只</w:t>
+          <w:t xml:space="preserve">，</w:t>
         </w:r>
       </w:ins>
       <w:r>
@@ -10674,26 +10739,26 @@
           <w:color w:val="FF0000"/>
           <w:lang w:val="en-US" w:eastAsia="zh-CN"/>
         </w:rPr>
-        <w:t xml:space="preserve">关注文本准确率，对幻觉（</w:t>
-      </w:r>
-      <w:del w:id="594" w:author="Kiro润色" w:date="2026-06-17T00:00:00Z">
+        <w:t xml:space="preserve">医学</w:t>
+      </w:r>
+      <w:del w:id="600" w:author="Kiro润色" w:date="2026-06-17T00:00:00Z">
         <w:r>
           <w:rPr>
             <w:rFonts w:hint="default" w:ascii="Times New Roman" w:hAnsi="Times New Roman" w:eastAsia="宋体" w:cs="Times New Roman"/>
             <w:color w:val="FF0000"/>
             <w:lang w:val="en-US" w:eastAsia="zh-CN"/>
           </w:rPr>
-          <w:delText xml:space="preserve">H</w:delText>
-        </w:r>
-      </w:del>
-      <w:ins w:id="595" w:author="Kiro润色" w:date="2026-06-17T00:00:00Z">
+          <w:delText xml:space="preserve">LLM</w:delText>
+        </w:r>
+      </w:del>
+      <w:ins w:id="601" w:author="Kiro润色" w:date="2026-06-17T00:00:00Z">
         <w:r>
           <w:rPr>
             <w:rFonts w:hint="default" w:ascii="Times New Roman" w:hAnsi="Times New Roman" w:eastAsia="宋体" w:cs="Times New Roman"/>
             <w:color w:val="FF0000"/>
             <w:lang w:val="en-US" w:eastAsia="zh-CN"/>
           </w:rPr>
-          <w:t xml:space="preserve">h</w:t>
+          <w:t xml:space="preserve">大语言模型</w:t>
         </w:r>
       </w:ins>
       <w:r>
@@ -10702,26 +10767,26 @@
           <w:color w:val="FF0000"/>
           <w:lang w:val="en-US" w:eastAsia="zh-CN"/>
         </w:rPr>
-        <w:t xml:space="preserve">allucination）、错误信息识别</w:t>
-      </w:r>
-      <w:del w:id="596" w:author="Kiro润色" w:date="2026-06-17T00:00:00Z">
+        <w:t xml:space="preserve">的安全评测应超越准确率，</w:t>
+      </w:r>
+      <w:del w:id="602" w:author="Kiro润色" w:date="2026-06-17T00:00:00Z">
         <w:r>
           <w:rPr>
             <w:rFonts w:hint="default" w:ascii="Times New Roman" w:hAnsi="Times New Roman" w:eastAsia="宋体" w:cs="Times New Roman"/>
             <w:color w:val="FF0000"/>
             <w:lang w:val="en-US" w:eastAsia="zh-CN"/>
           </w:rPr>
-          <w:delText xml:space="preserve">和</w:delText>
-        </w:r>
-      </w:del>
-      <w:ins w:id="597" w:author="Kiro润色" w:date="2026-06-17T00:00:00Z">
+          <w:delText xml:space="preserve">将</w:delText>
+        </w:r>
+      </w:del>
+      <w:ins w:id="603" w:author="Kiro润色" w:date="2026-06-17T00:00:00Z">
         <w:r>
           <w:rPr>
             <w:rFonts w:hint="default" w:ascii="Times New Roman" w:hAnsi="Times New Roman" w:eastAsia="宋体" w:cs="Times New Roman"/>
             <w:color w:val="FF0000"/>
             <w:lang w:val="en-US" w:eastAsia="zh-CN"/>
           </w:rPr>
-          <w:t xml:space="preserve">与</w:t>
+          <w:t xml:space="preserve">把</w:t>
         </w:r>
       </w:ins>
       <w:r>
@@ -10730,54 +10795,62 @@
           <w:color w:val="FF0000"/>
           <w:lang w:val="en-US" w:eastAsia="zh-CN"/>
         </w:rPr>
-        <w:t xml:space="preserve">不确定性校准（</w:t>
-      </w:r>
-      <w:del w:id="598" w:author="Kiro润色" w:date="2026-06-17T00:00:00Z">
+        <w:t xml:space="preserve">“模型是否自知其知识边界”的不确定性校准纳入核心指标</w:t>
+      </w:r>
+      <w:ins w:id="604" w:author="Kiro润色" w:date="2026-06-17T00:00:00Z">
         <w:r>
           <w:rPr>
             <w:rFonts w:hint="default" w:ascii="Times New Roman" w:hAnsi="Times New Roman" w:eastAsia="宋体" w:cs="Times New Roman"/>
             <w:color w:val="FF0000"/>
             <w:lang w:val="en-US" w:eastAsia="zh-CN"/>
           </w:rPr>
-          <w:delText xml:space="preserve">U</w:delText>
-        </w:r>
-      </w:del>
-      <w:ins w:id="599" w:author="Kiro润色" w:date="2026-06-17T00:00:00Z">
+          <w:t xml:space="preserve">[33]</w:t>
+        </w:r>
+      </w:ins>
+      <w:r>
+        <w:rPr>
+          <w:rFonts w:hint="default" w:ascii="Times New Roman" w:hAnsi="Times New Roman" w:eastAsia="宋体" w:cs="Times New Roman"/>
+          <w:color w:val="FF0000"/>
+          <w:lang w:val="en-US" w:eastAsia="zh-CN"/>
+        </w:rPr>
+        <w:t xml:space="preserve">。</w:t>
+      </w:r>
+      <w:del w:id="605" w:author="Kiro润色" w:date="2026-06-17T00:00:00Z">
         <w:r>
           <w:rPr>
             <w:rFonts w:hint="default" w:ascii="Times New Roman" w:hAnsi="Times New Roman" w:eastAsia="宋体" w:cs="Times New Roman"/>
             <w:color w:val="FF0000"/>
             <w:lang w:val="en-US" w:eastAsia="zh-CN"/>
           </w:rPr>
-          <w:t xml:space="preserve">u</w:t>
-        </w:r>
-      </w:ins>
+          <w:delText xml:space="preserve">Wang等[11]</w:delText>
+        </w:r>
+      </w:del>
       <w:r>
         <w:rPr>
           <w:rFonts w:hint="default" w:ascii="Times New Roman" w:hAnsi="Times New Roman" w:eastAsia="宋体" w:cs="Times New Roman"/>
           <w:color w:val="FF0000"/>
           <w:lang w:val="en-US" w:eastAsia="zh-CN"/>
         </w:rPr>
-        <w:t xml:space="preserve">ncertainty </w:t>
-      </w:r>
-      <w:del w:id="600" w:author="Kiro润色" w:date="2026-06-17T00:00:00Z">
+        <w:t xml:space="preserve">处方审核基准在用药安全维度上</w:t>
+      </w:r>
+      <w:del w:id="606" w:author="Kiro润色" w:date="2026-06-17T00:00:00Z">
         <w:r>
           <w:rPr>
             <w:rFonts w:hint="default" w:ascii="Times New Roman" w:hAnsi="Times New Roman" w:eastAsia="宋体" w:cs="Times New Roman"/>
             <w:color w:val="FF0000"/>
             <w:lang w:val="en-US" w:eastAsia="zh-CN"/>
           </w:rPr>
-          <w:delText xml:space="preserve">C</w:delText>
-        </w:r>
-      </w:del>
-      <w:ins w:id="601" w:author="Kiro润色" w:date="2026-06-17T00:00:00Z">
+          <w:delText xml:space="preserve">已取得初</w:delText>
+        </w:r>
+      </w:del>
+      <w:ins w:id="607" w:author="Kiro润色" w:date="2026-06-17T00:00:00Z">
         <w:r>
           <w:rPr>
             <w:rFonts w:hint="default" w:ascii="Times New Roman" w:hAnsi="Times New Roman" w:eastAsia="宋体" w:cs="Times New Roman"/>
             <w:color w:val="FF0000"/>
             <w:lang w:val="en-US" w:eastAsia="zh-CN"/>
           </w:rPr>
-          <w:t xml:space="preserve">c</w:t>
+          <w:t xml:space="preserve">前进了一</w:t>
         </w:r>
       </w:ins>
       <w:r>
@@ -10786,359 +10859,19 @@
           <w:color w:val="FF0000"/>
           <w:lang w:val="en-US" w:eastAsia="zh-CN"/>
         </w:rPr>
-        <w:t xml:space="preserve">alibration）</w:t>
-      </w:r>
-      <w:del w:id="602" w:author="Kiro润色" w:date="2026-06-17T00:00:00Z">
+        <w:t xml:space="preserve">步</w:t>
+      </w:r>
+      <w:del w:id="608" w:author="Kiro润色" w:date="2026-06-17T00:00:00Z">
         <w:r>
           <w:rPr>
             <w:rFonts w:hint="default" w:ascii="Times New Roman" w:hAnsi="Times New Roman" w:eastAsia="宋体" w:cs="Times New Roman"/>
             <w:color w:val="FF0000"/>
             <w:lang w:val="en-US" w:eastAsia="zh-CN"/>
           </w:rPr>
-          <w:delText xml:space="preserve"> </w:delText>
-        </w:r>
-      </w:del>
-      <w:r>
-        <w:rPr>
-          <w:rFonts w:hint="default" w:ascii="Times New Roman" w:hAnsi="Times New Roman" w:eastAsia="宋体" w:cs="Times New Roman"/>
-          <w:color w:val="FF0000"/>
-          <w:lang w:val="en-US" w:eastAsia="zh-CN"/>
-        </w:rPr>
-        <w:t xml:space="preserve">等核心安全属性关注不足。在多模态临床场景中，还存在图像质量欺骗</w:t>
-      </w:r>
-      <w:del w:id="603" w:author="Kiro润色" w:date="2026-06-17T00:00:00Z">
-        <w:r>
-          <w:rPr>
-            <w:rFonts w:hint="default" w:ascii="Times New Roman" w:hAnsi="Times New Roman" w:eastAsia="宋体" w:cs="Times New Roman"/>
-            <w:color w:val="FF0000"/>
-            <w:lang w:val="en-US" w:eastAsia="zh-CN"/>
-          </w:rPr>
-          <w:delText xml:space="preserve">，</w:delText>
-        </w:r>
-      </w:del>
-      <w:ins w:id="604" w:author="Kiro润色" w:date="2026-06-17T00:00:00Z">
-        <w:r>
-          <w:rPr>
-            <w:rFonts w:hint="default" w:ascii="Times New Roman" w:hAnsi="Times New Roman" w:eastAsia="宋体" w:cs="Times New Roman"/>
-            <w:color w:val="FF0000"/>
-            <w:lang w:val="en-US" w:eastAsia="zh-CN"/>
-          </w:rPr>
-          <w:t xml:space="preserve">（</w:t>
-        </w:r>
-      </w:ins>
-      <w:r>
-        <w:rPr>
-          <w:rFonts w:hint="default" w:ascii="Times New Roman" w:hAnsi="Times New Roman" w:eastAsia="宋体" w:cs="Times New Roman"/>
-          <w:color w:val="FF0000"/>
-          <w:lang w:val="en-US" w:eastAsia="zh-CN"/>
-        </w:rPr>
-        <w:t xml:space="preserve">如色彩被篡改的舌诊图</w:t>
-      </w:r>
-      <w:ins w:id="605" w:author="Kiro润色" w:date="2026-06-17T00:00:00Z">
-        <w:r>
-          <w:rPr>
-            <w:rFonts w:hint="default" w:ascii="Times New Roman" w:hAnsi="Times New Roman" w:eastAsia="宋体" w:cs="Times New Roman"/>
-            <w:color w:val="FF0000"/>
-            <w:lang w:val="en-US" w:eastAsia="zh-CN"/>
-          </w:rPr>
-          <w:t xml:space="preserve">）</w:t>
-        </w:r>
-      </w:ins>
-      <w:r>
-        <w:rPr>
-          <w:rFonts w:hint="default" w:ascii="Times New Roman" w:hAnsi="Times New Roman" w:eastAsia="宋体" w:cs="Times New Roman"/>
-          <w:color w:val="FF0000"/>
-          <w:lang w:val="en-US" w:eastAsia="zh-CN"/>
-        </w:rPr>
-        <w:t xml:space="preserve">、跨模态信息矛盾</w:t>
-      </w:r>
-      <w:del w:id="606" w:author="Kiro润色" w:date="2026-06-17T00:00:00Z">
-        <w:r>
-          <w:rPr>
-            <w:rFonts w:hint="default" w:ascii="Times New Roman" w:hAnsi="Times New Roman" w:eastAsia="宋体" w:cs="Times New Roman"/>
-            <w:color w:val="FF0000"/>
-            <w:lang w:val="en-US" w:eastAsia="zh-CN"/>
-          </w:rPr>
-          <w:delText xml:space="preserve">，</w:delText>
-        </w:r>
-      </w:del>
-      <w:ins w:id="607" w:author="Kiro润色" w:date="2026-06-17T00:00:00Z">
-        <w:r>
-          <w:rPr>
-            <w:rFonts w:hint="default" w:ascii="Times New Roman" w:hAnsi="Times New Roman" w:eastAsia="宋体" w:cs="Times New Roman"/>
-            <w:color w:val="FF0000"/>
-            <w:lang w:val="en-US" w:eastAsia="zh-CN"/>
-          </w:rPr>
-          <w:t xml:space="preserve">（</w:t>
-        </w:r>
-      </w:ins>
-      <w:r>
-        <w:rPr>
-          <w:rFonts w:hint="default" w:ascii="Times New Roman" w:hAnsi="Times New Roman" w:eastAsia="宋体" w:cs="Times New Roman"/>
-          <w:color w:val="FF0000"/>
-          <w:lang w:val="en-US" w:eastAsia="zh-CN"/>
-        </w:rPr>
-        <w:t xml:space="preserve">如舌脉不一致时如何取舍</w:t>
-      </w:r>
-      <w:ins w:id="608" w:author="Kiro润色" w:date="2026-06-17T00:00:00Z">
-        <w:r>
-          <w:rPr>
-            <w:rFonts w:hint="default" w:ascii="Times New Roman" w:hAnsi="Times New Roman" w:eastAsia="宋体" w:cs="Times New Roman"/>
-            <w:color w:val="FF0000"/>
-            <w:lang w:val="en-US" w:eastAsia="zh-CN"/>
-          </w:rPr>
-          <w:t xml:space="preserve">）</w:t>
-        </w:r>
-      </w:ins>
-      <w:r>
-        <w:rPr>
-          <w:rFonts w:hint="default" w:ascii="Times New Roman" w:hAnsi="Times New Roman" w:eastAsia="宋体" w:cs="Times New Roman"/>
-          <w:color w:val="FF0000"/>
-          <w:lang w:val="en-US" w:eastAsia="zh-CN"/>
-        </w:rPr>
-        <w:t xml:space="preserve">以及模态缺失时</w:t>
-      </w:r>
+          <w:delText xml:space="preserve">进展</w:delText>
+        </w:r>
+      </w:del>
       <w:ins w:id="609" w:author="Kiro润色" w:date="2026-06-17T00:00:00Z">
-        <w:r>
-          <w:rPr>
-            <w:rFonts w:hint="default" w:ascii="Times New Roman" w:hAnsi="Times New Roman" w:eastAsia="宋体" w:cs="Times New Roman"/>
-            <w:color w:val="FF0000"/>
-            <w:lang w:val="en-US" w:eastAsia="zh-CN"/>
-          </w:rPr>
-          <w:t xml:space="preserve">的</w:t>
-        </w:r>
-      </w:ins>
-      <w:r>
-        <w:rPr>
-          <w:rFonts w:hint="default" w:ascii="Times New Roman" w:hAnsi="Times New Roman" w:eastAsia="宋体" w:cs="Times New Roman"/>
-          <w:color w:val="FF0000"/>
-          <w:lang w:val="en-US" w:eastAsia="zh-CN"/>
-        </w:rPr>
-        <w:t xml:space="preserve">过度自信推断等风险，而这些在现有评测体系中几乎未被</w:t>
-      </w:r>
-      <w:del w:id="610" w:author="Kiro润色" w:date="2026-06-17T00:00:00Z">
-        <w:r>
-          <w:rPr>
-            <w:rFonts w:hint="default" w:ascii="Times New Roman" w:hAnsi="Times New Roman" w:eastAsia="宋体" w:cs="Times New Roman"/>
-            <w:color w:val="FF0000"/>
-            <w:lang w:val="en-US" w:eastAsia="zh-CN"/>
-          </w:rPr>
-          <w:delText xml:space="preserve">涉</w:delText>
-        </w:r>
-      </w:del>
-      <w:ins w:id="611" w:author="Kiro润色" w:date="2026-06-17T00:00:00Z">
-        <w:r>
-          <w:rPr>
-            <w:rFonts w:hint="default" w:ascii="Times New Roman" w:hAnsi="Times New Roman" w:eastAsia="宋体" w:cs="Times New Roman"/>
-            <w:color w:val="FF0000"/>
-            <w:lang w:val="en-US" w:eastAsia="zh-CN"/>
-          </w:rPr>
-          <w:t xml:space="preserve">触</w:t>
-        </w:r>
-      </w:ins>
-      <w:r>
-        <w:rPr>
-          <w:rFonts w:hint="default" w:ascii="Times New Roman" w:hAnsi="Times New Roman" w:eastAsia="宋体" w:cs="Times New Roman"/>
-          <w:color w:val="FF0000"/>
-          <w:lang w:val="en-US" w:eastAsia="zh-CN"/>
-        </w:rPr>
-        <w:t xml:space="preserve">及。</w:t>
-      </w:r>
-      <w:del w:id="612" w:author="Kiro润色" w:date="2026-06-17T00:00:00Z">
-        <w:r>
-          <w:rPr>
-            <w:rFonts w:hint="default" w:ascii="Times New Roman" w:hAnsi="Times New Roman" w:eastAsia="宋体" w:cs="Times New Roman"/>
-            <w:color w:val="FF0000"/>
-            <w:lang w:val="en-US" w:eastAsia="zh-CN"/>
-          </w:rPr>
-          <w:delText xml:space="preserve">Singhal等[35]在Med-PaLM</w:delText>
-        </w:r>
-      </w:del>
-      <w:ins w:id="613" w:author="Kiro润色" w:date="2026-06-17T00:00:00Z">
-        <w:r>
-          <w:rPr>
-            <w:rFonts w:hint="default" w:ascii="Times New Roman" w:hAnsi="Times New Roman" w:eastAsia="宋体" w:cs="Times New Roman"/>
-            <w:color w:val="FF0000"/>
-            <w:lang w:val="en-US" w:eastAsia="zh-CN"/>
-          </w:rPr>
-          <w:t xml:space="preserve">已有</w:t>
-        </w:r>
-      </w:ins>
-      <w:r>
-        <w:rPr>
-          <w:rFonts w:hint="default" w:ascii="Times New Roman" w:hAnsi="Times New Roman" w:eastAsia="宋体" w:cs="Times New Roman"/>
-          <w:color w:val="FF0000"/>
-          <w:lang w:val="en-US" w:eastAsia="zh-CN"/>
-        </w:rPr>
-        <w:t xml:space="preserve">研究</w:t>
-      </w:r>
-      <w:del w:id="614" w:author="Kiro润色" w:date="2026-06-17T00:00:00Z">
-        <w:r>
-          <w:rPr>
-            <w:rFonts w:hint="default" w:ascii="Times New Roman" w:hAnsi="Times New Roman" w:eastAsia="宋体" w:cs="Times New Roman"/>
-            <w:color w:val="FF0000"/>
-            <w:lang w:val="en-US" w:eastAsia="zh-CN"/>
-          </w:rPr>
-          <w:delText xml:space="preserve">中</w:delText>
-        </w:r>
-      </w:del>
-      <w:r>
-        <w:rPr>
-          <w:rFonts w:hint="default" w:ascii="Times New Roman" w:hAnsi="Times New Roman" w:eastAsia="宋体" w:cs="Times New Roman"/>
-          <w:color w:val="FF0000"/>
-          <w:lang w:val="en-US" w:eastAsia="zh-CN"/>
-        </w:rPr>
-        <w:t xml:space="preserve">强调</w:t>
-      </w:r>
-      <w:ins w:id="615" w:author="Kiro润色" w:date="2026-06-17T00:00:00Z">
-        <w:r>
-          <w:rPr>
-            <w:rFonts w:hint="default" w:ascii="Times New Roman" w:hAnsi="Times New Roman" w:eastAsia="宋体" w:cs="Times New Roman"/>
-            <w:color w:val="FF0000"/>
-            <w:lang w:val="en-US" w:eastAsia="zh-CN"/>
-          </w:rPr>
-          <w:t xml:space="preserve">，</w:t>
-        </w:r>
-      </w:ins>
-      <w:r>
-        <w:rPr>
-          <w:rFonts w:hint="default" w:ascii="Times New Roman" w:hAnsi="Times New Roman" w:eastAsia="宋体" w:cs="Times New Roman"/>
-          <w:color w:val="FF0000"/>
-          <w:lang w:val="en-US" w:eastAsia="zh-CN"/>
-        </w:rPr>
-        <w:t xml:space="preserve">医学</w:t>
-      </w:r>
-      <w:del w:id="616" w:author="Kiro润色" w:date="2026-06-17T00:00:00Z">
-        <w:r>
-          <w:rPr>
-            <w:rFonts w:hint="default" w:ascii="Times New Roman" w:hAnsi="Times New Roman" w:eastAsia="宋体" w:cs="Times New Roman"/>
-            <w:color w:val="FF0000"/>
-            <w:lang w:val="en-US" w:eastAsia="zh-CN"/>
-          </w:rPr>
-          <w:delText xml:space="preserve">LLM</w:delText>
-        </w:r>
-      </w:del>
-      <w:ins w:id="617" w:author="Kiro润色" w:date="2026-06-17T00:00:00Z">
-        <w:r>
-          <w:rPr>
-            <w:rFonts w:hint="default" w:ascii="Times New Roman" w:hAnsi="Times New Roman" w:eastAsia="宋体" w:cs="Times New Roman"/>
-            <w:color w:val="FF0000"/>
-            <w:lang w:val="en-US" w:eastAsia="zh-CN"/>
-          </w:rPr>
-          <w:t xml:space="preserve">大语言模型</w:t>
-        </w:r>
-      </w:ins>
-      <w:r>
-        <w:rPr>
-          <w:rFonts w:hint="default" w:ascii="Times New Roman" w:hAnsi="Times New Roman" w:eastAsia="宋体" w:cs="Times New Roman"/>
-          <w:color w:val="FF0000"/>
-          <w:lang w:val="en-US" w:eastAsia="zh-CN"/>
-        </w:rPr>
-        <w:t xml:space="preserve">的安全评测应超越准确率，</w:t>
-      </w:r>
-      <w:del w:id="618" w:author="Kiro润色" w:date="2026-06-17T00:00:00Z">
-        <w:r>
-          <w:rPr>
-            <w:rFonts w:hint="default" w:ascii="Times New Roman" w:hAnsi="Times New Roman" w:eastAsia="宋体" w:cs="Times New Roman"/>
-            <w:color w:val="FF0000"/>
-            <w:lang w:val="en-US" w:eastAsia="zh-CN"/>
-          </w:rPr>
-          <w:delText xml:space="preserve">将</w:delText>
-        </w:r>
-      </w:del>
-      <w:ins w:id="619" w:author="Kiro润色" w:date="2026-06-17T00:00:00Z">
-        <w:r>
-          <w:rPr>
-            <w:rFonts w:hint="default" w:ascii="Times New Roman" w:hAnsi="Times New Roman" w:eastAsia="宋体" w:cs="Times New Roman"/>
-            <w:color w:val="FF0000"/>
-            <w:lang w:val="en-US" w:eastAsia="zh-CN"/>
-          </w:rPr>
-          <w:t xml:space="preserve">把</w:t>
-        </w:r>
-      </w:ins>
-      <w:r>
-        <w:rPr>
-          <w:rFonts w:hint="default" w:ascii="Times New Roman" w:hAnsi="Times New Roman" w:eastAsia="宋体" w:cs="Times New Roman"/>
-          <w:color w:val="FF0000"/>
-          <w:lang w:val="en-US" w:eastAsia="zh-CN"/>
-        </w:rPr>
-        <w:t xml:space="preserve">“模型是否自知其知识边界”的不确定性校准纳入核心指标</w:t>
-      </w:r>
-      <w:ins w:id="620" w:author="Kiro润色" w:date="2026-06-17T00:00:00Z">
-        <w:r>
-          <w:rPr>
-            <w:rFonts w:hint="default" w:ascii="Times New Roman" w:hAnsi="Times New Roman" w:eastAsia="宋体" w:cs="Times New Roman"/>
-            <w:color w:val="FF0000"/>
-            <w:lang w:val="en-US" w:eastAsia="zh-CN"/>
-          </w:rPr>
-          <w:t xml:space="preserve">[35]</w:t>
-        </w:r>
-      </w:ins>
-      <w:r>
-        <w:rPr>
-          <w:rFonts w:hint="default" w:ascii="Times New Roman" w:hAnsi="Times New Roman" w:eastAsia="宋体" w:cs="Times New Roman"/>
-          <w:color w:val="FF0000"/>
-          <w:lang w:val="en-US" w:eastAsia="zh-CN"/>
-        </w:rPr>
-        <w:t xml:space="preserve">。</w:t>
-      </w:r>
-      <w:del w:id="621" w:author="Kiro润色" w:date="2026-06-17T00:00:00Z">
-        <w:r>
-          <w:rPr>
-            <w:rFonts w:hint="default" w:ascii="Times New Roman" w:hAnsi="Times New Roman" w:eastAsia="宋体" w:cs="Times New Roman"/>
-            <w:color w:val="FF0000"/>
-            <w:lang w:val="en-US" w:eastAsia="zh-CN"/>
-          </w:rPr>
-          <w:delText xml:space="preserve">Wang等[11]</w:delText>
-        </w:r>
-      </w:del>
-      <w:r>
-        <w:rPr>
-          <w:rFonts w:hint="default" w:ascii="Times New Roman" w:hAnsi="Times New Roman" w:eastAsia="宋体" w:cs="Times New Roman"/>
-          <w:color w:val="FF0000"/>
-          <w:lang w:val="en-US" w:eastAsia="zh-CN"/>
-        </w:rPr>
-        <w:t xml:space="preserve">处方审核基准在用药安全维度上</w:t>
-      </w:r>
-      <w:del w:id="622" w:author="Kiro润色" w:date="2026-06-17T00:00:00Z">
-        <w:r>
-          <w:rPr>
-            <w:rFonts w:hint="default" w:ascii="Times New Roman" w:hAnsi="Times New Roman" w:eastAsia="宋体" w:cs="Times New Roman"/>
-            <w:color w:val="FF0000"/>
-            <w:lang w:val="en-US" w:eastAsia="zh-CN"/>
-          </w:rPr>
-          <w:delText xml:space="preserve">已取得初</w:delText>
-        </w:r>
-      </w:del>
-      <w:ins w:id="623" w:author="Kiro润色" w:date="2026-06-17T00:00:00Z">
-        <w:r>
-          <w:rPr>
-            <w:rFonts w:hint="default" w:ascii="Times New Roman" w:hAnsi="Times New Roman" w:eastAsia="宋体" w:cs="Times New Roman"/>
-            <w:color w:val="FF0000"/>
-            <w:lang w:val="en-US" w:eastAsia="zh-CN"/>
-          </w:rPr>
-          <w:t xml:space="preserve">前进了一</w:t>
-        </w:r>
-      </w:ins>
-      <w:r>
-        <w:rPr>
-          <w:rFonts w:hint="default" w:ascii="Times New Roman" w:hAnsi="Times New Roman" w:eastAsia="宋体" w:cs="Times New Roman"/>
-          <w:color w:val="FF0000"/>
-          <w:lang w:val="en-US" w:eastAsia="zh-CN"/>
-        </w:rPr>
-        <w:t xml:space="preserve">步</w:t>
-      </w:r>
-      <w:del w:id="624" w:author="Kiro润色" w:date="2026-06-17T00:00:00Z">
-        <w:r>
-          <w:rPr>
-            <w:rFonts w:hint="default" w:ascii="Times New Roman" w:hAnsi="Times New Roman" w:eastAsia="宋体" w:cs="Times New Roman"/>
-            <w:color w:val="FF0000"/>
-            <w:lang w:val="en-US" w:eastAsia="zh-CN"/>
-          </w:rPr>
-          <w:delText xml:space="preserve">进展</w:delText>
-        </w:r>
-      </w:del>
-      <w:ins w:id="625" w:author="Kiro润色" w:date="2026-06-17T00:00:00Z">
         <w:r>
           <w:rPr>
             <w:rFonts w:hint="default" w:ascii="Times New Roman" w:hAnsi="Times New Roman" w:eastAsia="宋体" w:cs="Times New Roman"/>
@@ -11187,158 +10920,57 @@
           <w:rFonts w:hint="eastAsia" w:ascii="宋体" w:hAnsi="宋体" w:eastAsia="宋体" w:cs="宋体"/>
           <w:color w:val="FF0000"/>
         </w:rPr>
-        <w:t>现有研究较少考察LLM作为辅助工具在真实临床环境中对诊疗质量的实际影响。多数评测为静态离线测试，脱离真实临床的动态诊疗过程，缺少以患者结局为终点的闭环验证，难以据此预测模型的真实临床价值。近期虽有改进尝试：Liu等</w:t>
-      </w:r>
-      <w:r>
-        <w:rPr>
-          <w:rFonts w:hint="default" w:ascii="Times New Roman" w:hAnsi="Times New Roman" w:eastAsia="宋体" w:cs="Times New Roman"/>
-          <w:color w:val="FF0000"/>
-          <w:vertAlign w:val="superscript"/>
-          <w:lang w:val="en-US" w:eastAsia="zh-CN"/>
-        </w:rPr>
-        <w:t>[</w:t>
-      </w:r>
-      <w:r>
-        <w:rPr>
-          <w:rFonts w:hint="eastAsia" w:ascii="Times New Roman" w:hAnsi="Times New Roman" w:eastAsia="宋体" w:cs="Times New Roman"/>
-          <w:color w:val="FF0000"/>
-          <w:vertAlign w:val="superscript"/>
-          <w:lang w:val="en-US" w:eastAsia="zh-CN"/>
-        </w:rPr>
-        <w:t>36</w:t>
-      </w:r>
-      <w:r>
-        <w:rPr>
-          <w:rFonts w:hint="default" w:ascii="Times New Roman" w:hAnsi="Times New Roman" w:eastAsia="宋体" w:cs="Times New Roman"/>
-          <w:color w:val="FF0000"/>
-          <w:vertAlign w:val="superscript"/>
-          <w:lang w:val="en-US" w:eastAsia="zh-CN"/>
-        </w:rPr>
-        <w:t>]</w:t>
-      </w:r>
-      <w:r>
-        <w:rPr>
-          <w:rFonts w:hint="eastAsia" w:ascii="宋体" w:hAnsi="宋体" w:eastAsia="宋体" w:cs="宋体"/>
-          <w:color w:val="FF0000"/>
-        </w:rPr>
-        <w:t>以真实针灸病案为基础，由中、韩、美三国28名专家进行多语言盲评；ATCMD-Bench</w:t>
-      </w:r>
-      <w:r>
-        <w:rPr>
-          <w:rFonts w:hint="default" w:ascii="Times New Roman" w:hAnsi="Times New Roman" w:eastAsia="宋体" w:cs="Times New Roman"/>
-          <w:color w:val="FF0000"/>
-          <w:vertAlign w:val="superscript"/>
-          <w:lang w:val="en-US" w:eastAsia="zh-CN"/>
-        </w:rPr>
-        <w:t>[</w:t>
-      </w:r>
-      <w:r>
-        <w:rPr>
-          <w:rFonts w:hint="eastAsia" w:ascii="Times New Roman" w:hAnsi="Times New Roman" w:eastAsia="宋体" w:cs="Times New Roman"/>
-          <w:color w:val="FF0000"/>
-          <w:vertAlign w:val="superscript"/>
-          <w:lang w:val="en-US" w:eastAsia="zh-CN"/>
-        </w:rPr>
-        <w:t>9</w:t>
-      </w:r>
-      <w:r>
-        <w:rPr>
-          <w:rFonts w:hint="default" w:ascii="Times New Roman" w:hAnsi="Times New Roman" w:eastAsia="宋体" w:cs="Times New Roman"/>
-          <w:color w:val="FF0000"/>
-          <w:vertAlign w:val="superscript"/>
-          <w:lang w:val="en-US" w:eastAsia="zh-CN"/>
-        </w:rPr>
-        <w:t>]</w:t>
-      </w:r>
-      <w:r>
-        <w:rPr>
-          <w:rFonts w:hint="eastAsia" w:ascii="宋体" w:hAnsi="宋体" w:eastAsia="宋体" w:cs="宋体"/>
-          <w:color w:val="FF0000"/>
-        </w:rPr>
-        <w:t>与DCB</w:t>
-      </w:r>
-      <w:r>
-        <w:rPr>
-          <w:rFonts w:hint="default" w:ascii="Times New Roman" w:hAnsi="Times New Roman" w:eastAsia="宋体" w:cs="Times New Roman"/>
-          <w:color w:val="FF0000"/>
-          <w:vertAlign w:val="superscript"/>
-          <w:lang w:val="en-US" w:eastAsia="zh-CN"/>
-        </w:rPr>
-        <w:t>[1</w:t>
-      </w:r>
-      <w:r>
-        <w:rPr>
-          <w:rFonts w:hint="eastAsia" w:ascii="Times New Roman" w:hAnsi="Times New Roman" w:eastAsia="宋体" w:cs="Times New Roman"/>
-          <w:color w:val="FF0000"/>
-          <w:vertAlign w:val="superscript"/>
-          <w:lang w:val="en-US" w:eastAsia="zh-CN"/>
-        </w:rPr>
-        <w:t>0</w:t>
-      </w:r>
-      <w:r>
-        <w:rPr>
-          <w:rFonts w:hint="default" w:ascii="Times New Roman" w:hAnsi="Times New Roman" w:eastAsia="宋体" w:cs="Times New Roman"/>
-          <w:color w:val="FF0000"/>
-          <w:vertAlign w:val="superscript"/>
-          <w:lang w:val="en-US" w:eastAsia="zh-CN"/>
-        </w:rPr>
-        <w:t>]</w:t>
-      </w:r>
-      <w:r>
-        <w:rPr>
-          <w:rFonts w:hint="eastAsia" w:ascii="宋体" w:hAnsi="宋体" w:eastAsia="宋体" w:cs="宋体"/>
-          <w:color w:val="FF0000"/>
-        </w:rPr>
-        <w:t>分别采用多智能体模拟和全流程动态环境以逼近真实接诊场景。但这些工作仍以专家评分或模拟环境为主，与以患者结局为终点的前瞻性验证尚有差距。Topol</w:t>
-      </w:r>
-      <w:r>
-        <w:rPr>
-          <w:rFonts w:hint="default" w:ascii="Times New Roman" w:hAnsi="Times New Roman" w:eastAsia="宋体" w:cs="Times New Roman"/>
-          <w:color w:val="FF0000"/>
-          <w:vertAlign w:val="superscript"/>
-          <w:lang w:val="en-US" w:eastAsia="zh-CN"/>
-        </w:rPr>
-        <w:t>[</w:t>
-      </w:r>
-      <w:r>
-        <w:rPr>
-          <w:rFonts w:hint="eastAsia" w:ascii="Times New Roman" w:hAnsi="Times New Roman" w:eastAsia="宋体" w:cs="Times New Roman"/>
-          <w:color w:val="FF0000"/>
-          <w:vertAlign w:val="superscript"/>
-          <w:lang w:val="en-US" w:eastAsia="zh-CN"/>
-        </w:rPr>
-        <w:t>37</w:t>
-      </w:r>
-      <w:r>
-        <w:rPr>
-          <w:rFonts w:hint="default" w:ascii="Times New Roman" w:hAnsi="Times New Roman" w:eastAsia="宋体" w:cs="Times New Roman"/>
-          <w:color w:val="FF0000"/>
-          <w:vertAlign w:val="superscript"/>
-          <w:lang w:val="en-US" w:eastAsia="zh-CN"/>
-        </w:rPr>
-        <w:t>]</w:t>
-      </w:r>
-      <w:r>
-        <w:rPr>
-          <w:rFonts w:hint="eastAsia" w:ascii="宋体" w:hAnsi="宋体" w:eastAsia="宋体" w:cs="宋体"/>
-          <w:color w:val="FF0000"/>
-        </w:rPr>
-        <w:t>指出，医疗AI与临床实践之间的差距主要不在于技术精度，而在于缺乏以患者结局为终点的验证范式。中医诊疗是医患共建的动态过程，而非一次性的问答任务，脱离临床情境的离线基准带有系统性偏差。在真实临床</w:t>
-      </w:r>
-      <w:r>
-        <w:rPr>
-          <w:rFonts w:hint="eastAsia" w:eastAsia="宋体" w:cs="宋体"/>
-          <w:color w:val="FF0000"/>
-          <w:lang w:val="en-US" w:eastAsia="zh-CN"/>
-        </w:rPr>
-        <w:t>实践</w:t>
-      </w:r>
-      <w:r>
-        <w:rPr>
-          <w:rFonts w:hint="eastAsia" w:ascii="宋体" w:hAnsi="宋体" w:eastAsia="宋体" w:cs="宋体"/>
-          <w:color w:val="FF0000"/>
-        </w:rPr>
-        <w:t>中，医师需根据患者反馈不断调整辨证和治疗方案；而现有基准中，模型给出一次回答即视为评测完成。这一评测设计上的局限，是当前中医药LLM评测研究共同面临的问题。</w:t>
+        <w:t xml:space="preserve">现有研究较少考察LLM作为辅助工具在真实临床环境中对诊疗质量的实际影响。多数评测为静态离线测试，脱离真实临床的动态诊疗过程，缺少以患者结局为终点的闭环验证，难以据此预测模型的真实临床价值。近期虽有改进尝试：Liu等[3</w:t>
+      </w:r>
+      <w:del w:id="610" w:author="Kiro润色" w:date="2026-06-17T00:00:00Z">
+        <w:r>
+          <w:rPr>
+            <w:rFonts w:hint="eastAsia" w:ascii="宋体" w:hAnsi="宋体" w:eastAsia="宋体" w:cs="宋体"/>
+            <w:color w:val="FF0000"/>
+          </w:rPr>
+          <w:delText xml:space="preserve">6</w:delText>
+        </w:r>
+      </w:del>
+      <w:ins w:id="611" w:author="Kiro润色" w:date="2026-06-17T00:00:00Z">
+        <w:r>
+          <w:rPr>
+            <w:rFonts w:hint="eastAsia" w:ascii="宋体" w:hAnsi="宋体" w:eastAsia="宋体" w:cs="宋体"/>
+            <w:color w:val="FF0000"/>
+          </w:rPr>
+          <w:t xml:space="preserve">4</w:t>
+        </w:r>
+      </w:ins>
+      <w:r>
+        <w:rPr>
+          <w:rFonts w:hint="eastAsia" w:ascii="宋体" w:hAnsi="宋体" w:eastAsia="宋体" w:cs="宋体"/>
+          <w:color w:val="FF0000"/>
+        </w:rPr>
+        <w:t xml:space="preserve">]以真实针灸病案为基础，由中、韩、美三国28名专家进行多语言盲评；ATCMD-Bench[9]与DCB[10]分别采用多智能体模拟和全流程动态环境以逼近真实接诊场景。但这些工作仍以专家评分或模拟环境为主，与以患者结局为终点的前瞻性验证尚有差距。Topol[3</w:t>
+      </w:r>
+      <w:del w:id="612" w:author="Kiro润色" w:date="2026-06-17T00:00:00Z">
+        <w:r>
+          <w:rPr>
+            <w:rFonts w:hint="eastAsia" w:ascii="宋体" w:hAnsi="宋体" w:eastAsia="宋体" w:cs="宋体"/>
+            <w:color w:val="FF0000"/>
+          </w:rPr>
+          <w:delText xml:space="preserve">7</w:delText>
+        </w:r>
+      </w:del>
+      <w:ins w:id="613" w:author="Kiro润色" w:date="2026-06-17T00:00:00Z">
+        <w:r>
+          <w:rPr>
+            <w:rFonts w:hint="eastAsia" w:ascii="宋体" w:hAnsi="宋体" w:eastAsia="宋体" w:cs="宋体"/>
+            <w:color w:val="FF0000"/>
+          </w:rPr>
+          <w:t xml:space="preserve">5</w:t>
+        </w:r>
+      </w:ins>
+      <w:r>
+        <w:rPr>
+          <w:rFonts w:hint="eastAsia" w:ascii="宋体" w:hAnsi="宋体" w:eastAsia="宋体" w:cs="宋体"/>
+          <w:color w:val="FF0000"/>
+        </w:rPr>
+        <w:t xml:space="preserve">]指出，医疗AI与临床实践之间的差距主要不在于技术精度，而在于缺乏以患者结局为终点的验证范式。中医诊疗是医患共建的动态过程，而非一次性的问答任务，脱离临床情境的离线基准带有系统性偏差。在真实临床实践中，医师需根据患者反馈不断调整辨证和治疗方案；而现有基准中，模型给出一次回答即视为评测完成。这一评测设计上的局限，是当前中医药LLM评测研究共同面临的问题。</w:t>
       </w:r>
     </w:p>
     <w:p>
@@ -11630,7 +11262,7 @@
         </w:rPr>
         <w:t xml:space="preserve">各层逐层递进，采用条件化评分（</w:t>
       </w:r>
-      <w:del w:id="626" w:author="Kiro润色" w:date="2026-06-17T00:00:00Z">
+      <w:del w:id="614" w:author="Kiro润色" w:date="2026-06-17T00:00:00Z">
         <w:r>
           <w:rPr>
             <w:rFonts w:hint="eastAsia" w:ascii="宋体" w:hAnsi="宋体" w:eastAsia="宋体" w:cs="宋体"/>
@@ -11639,7 +11271,7 @@
           <w:delText xml:space="preserve">C</w:delText>
         </w:r>
       </w:del>
-      <w:ins w:id="627" w:author="Kiro润色" w:date="2026-06-17T00:00:00Z">
+      <w:ins w:id="615" w:author="Kiro润色" w:date="2026-06-17T00:00:00Z">
         <w:r>
           <w:rPr>
             <w:rFonts w:hint="eastAsia" w:ascii="宋体" w:hAnsi="宋体" w:eastAsia="宋体" w:cs="宋体"/>
@@ -11655,7 +11287,7 @@
         </w:rPr>
         <w:t xml:space="preserve">onditional </w:t>
       </w:r>
-      <w:del w:id="628" w:author="Kiro润色" w:date="2026-06-17T00:00:00Z">
+      <w:del w:id="616" w:author="Kiro润色" w:date="2026-06-17T00:00:00Z">
         <w:r>
           <w:rPr>
             <w:rFonts w:hint="eastAsia" w:ascii="宋体" w:hAnsi="宋体" w:eastAsia="宋体" w:cs="宋体"/>
@@ -11664,7 +11296,7 @@
           <w:delText xml:space="preserve">S</w:delText>
         </w:r>
       </w:del>
-      <w:ins w:id="629" w:author="Kiro润色" w:date="2026-06-17T00:00:00Z">
+      <w:ins w:id="617" w:author="Kiro润色" w:date="2026-06-17T00:00:00Z">
         <w:r>
           <w:rPr>
             <w:rFonts w:hint="eastAsia" w:ascii="宋体" w:hAnsi="宋体" w:eastAsia="宋体" w:cs="宋体"/>
@@ -11680,7 +11312,7 @@
         </w:rPr>
         <w:t xml:space="preserve">coring）</w:t>
       </w:r>
-      <w:del w:id="630" w:author="Kiro润色" w:date="2026-06-17T00:00:00Z">
+      <w:del w:id="618" w:author="Kiro润色" w:date="2026-06-17T00:00:00Z">
         <w:r>
           <w:rPr>
             <w:rFonts w:hint="eastAsia" w:ascii="宋体" w:hAnsi="宋体" w:eastAsia="宋体" w:cs="宋体"/>
@@ -11696,13 +11328,13 @@
         </w:rPr>
         <w:t xml:space="preserve">机制：上一层推理错误则终止后续评测，并报告误差沿链条的传导与放大效应。同时为各层设定准入阈值，未通过知识层与辨证层阈值者，其方药层、疗效层的高分不予采信。疗效层有赖于真实世界随访与前瞻性数据，目前仍属亟待建设的目标层次。各层与评测内容、代表指标及对应基准类别的对应关系见图3。</w:t>
       </w:r>
-      <w:ins w:id="631" w:author="Kiro润色" w:date="2026-06-17T00:00:00Z">
-        <w:r>
-          <w:rPr>
-            <w:rFonts w:hint="eastAsia" w:ascii="宋体" w:hAnsi="宋体" w:eastAsia="宋体" w:cs="宋体"/>
-            <w:color w:val="FF0000"/>
-          </w:rPr>
-          <w:t xml:space="preserve">这一分层思路在标准化层面亦有呼应，如GB/T 45288.2—2025确立了通用大模型的评测指标与方法[38]，可为中医药知识驱动评测体系提供制度参照。</w:t>
+      <w:ins w:id="619" w:author="Kiro润色" w:date="2026-06-17T00:00:00Z">
+        <w:r>
+          <w:rPr>
+            <w:rFonts w:hint="eastAsia" w:ascii="宋体" w:hAnsi="宋体" w:eastAsia="宋体" w:cs="宋体"/>
+            <w:color w:val="FF0000"/>
+          </w:rPr>
+          <w:t xml:space="preserve">这一分层思路在标准化层面亦有呼应，如GB/T 45288.2—2025确立了通用大模型的评测指标与方法[36]，可为中医药知识驱动评测体系提供制度参照。</w:t>
         </w:r>
       </w:ins>
     </w:p>
@@ -12035,46 +11667,35 @@
           <w:color w:val="FF0000"/>
           <w:lang w:eastAsia="zh-CN"/>
         </w:rPr>
-        <w:t>（</w:t>
-      </w:r>
+        <w:t xml:space="preserve">（3）第三层为临床效用验证层，通过前瞻性临床研究评价诊断辅助增效率、医师采纳与合理修改率以及纵向治疗结局预测准确度，以患者结局数据作为最终验证标准[3</w:t>
+      </w:r>
+      <w:del w:id="620" w:author="Kiro润色" w:date="2026-06-17T00:00:00Z">
+        <w:r>
+          <w:rPr>
+            <w:rFonts w:hint="eastAsia" w:eastAsia="宋体" w:cs="宋体"/>
+            <w:color w:val="FF0000"/>
+            <w:lang w:eastAsia="zh-CN"/>
+          </w:rPr>
+          <w:delText xml:space="preserve">7</w:delText>
+        </w:r>
+      </w:del>
+      <w:ins w:id="621" w:author="Kiro润色" w:date="2026-06-17T00:00:00Z">
+        <w:r>
+          <w:rPr>
+            <w:rFonts w:hint="eastAsia" w:eastAsia="宋体" w:cs="宋体"/>
+            <w:color w:val="FF0000"/>
+            <w:lang w:eastAsia="zh-CN"/>
+          </w:rPr>
+          <w:t xml:space="preserve">5</w:t>
+        </w:r>
+      </w:ins>
       <w:r>
         <w:rPr>
           <w:rFonts w:hint="eastAsia" w:eastAsia="宋体" w:cs="宋体"/>
           <w:color w:val="FF0000"/>
-          <w:lang w:val="en-US" w:eastAsia="zh-CN"/>
-        </w:rPr>
-        <w:t>3</w:t>
-      </w:r>
-      <w:r>
-        <w:rPr>
-          <w:rFonts w:hint="eastAsia" w:eastAsia="宋体" w:cs="宋体"/>
-          <w:color w:val="FF0000"/>
           <w:lang w:eastAsia="zh-CN"/>
         </w:rPr>
-        <w:t>）</w:t>
-      </w:r>
-      <w:r>
-        <w:rPr>
-          <w:rFonts w:hint="eastAsia" w:ascii="宋体" w:hAnsi="宋体" w:eastAsia="宋体" w:cs="宋体"/>
-          <w:color w:val="FF0000"/>
-        </w:rPr>
-        <w:t>第三层为临床效用验证层，通过前瞻性临床研究评价诊断辅助增效率、医师采纳与合理修改率以及纵向治疗结局预测准确度，以患者结局数据作为最终验证标准</w:t>
-      </w:r>
-      <w:r>
-        <w:rPr>
-          <w:rFonts w:hint="eastAsia" w:eastAsia="宋体" w:cs="宋体"/>
-          <w:color w:val="FF0000"/>
-          <w:vertAlign w:val="superscript"/>
-          <w:lang w:val="en-US" w:eastAsia="zh-CN"/>
-        </w:rPr>
-        <w:t>[37]</w:t>
-      </w:r>
-      <w:r>
-        <w:rPr>
-          <w:rFonts w:hint="eastAsia" w:ascii="宋体" w:hAnsi="宋体" w:eastAsia="宋体" w:cs="宋体"/>
-          <w:color w:val="FF0000"/>
-        </w:rPr>
-        <w:t>。</w:t>
+        <w:t xml:space="preserve">]。</w:t>
       </w:r>
     </w:p>
     <w:p>
@@ -12375,7 +11996,7 @@
         </w:rPr>
         <w:t xml:space="preserve">现有评测体系过度聚焦于模型的“文本输出正确性”，而未能有效度量其“临床认知充分性”与“决策过程可靠性”。要使中医药大语言模型从“可用”走向“可信、可靠”，</w:t>
       </w:r>
-      <w:del w:id="632" w:author="Kiro润色" w:date="2026-06-17T00:00:00Z">
+      <w:del w:id="622" w:author="Kiro润色" w:date="2026-06-17T00:00:00Z">
         <w:r>
           <w:rPr>
             <w:rFonts w:hint="eastAsia" w:ascii="宋体" w:hAnsi="宋体" w:eastAsia="宋体" w:cs="宋体"/>
@@ -12384,7 +12005,7 @@
           <w:delText xml:space="preserve">其核心路径</w:delText>
         </w:r>
       </w:del>
-      <w:ins w:id="633" w:author="Kiro润色" w:date="2026-06-17T00:00:00Z">
+      <w:ins w:id="623" w:author="Kiro润色" w:date="2026-06-17T00:00:00Z">
         <w:r>
           <w:rPr>
             <w:rFonts w:hint="eastAsia" w:ascii="宋体" w:hAnsi="宋体" w:eastAsia="宋体" w:cs="宋体"/>
@@ -12400,7 +12021,7 @@
         </w:rPr>
         <w:t xml:space="preserve">在于重构评测范式</w:t>
       </w:r>
-      <w:del w:id="634" w:author="Kiro润色" w:date="2026-06-17T00:00:00Z">
+      <w:del w:id="624" w:author="Kiro润色" w:date="2026-06-17T00:00:00Z">
         <w:r>
           <w:rPr>
             <w:rFonts w:hint="eastAsia" w:ascii="宋体" w:hAnsi="宋体" w:eastAsia="宋体" w:cs="宋体"/>
@@ -12409,7 +12030,7 @@
           <w:delText xml:space="preserve">，将</w:delText>
         </w:r>
       </w:del>
-      <w:ins w:id="635" w:author="Kiro润色" w:date="2026-06-17T00:00:00Z">
+      <w:ins w:id="625" w:author="Kiro润色" w:date="2026-06-17T00:00:00Z">
         <w:r>
           <w:rPr>
             <w:rFonts w:hint="eastAsia" w:ascii="宋体" w:hAnsi="宋体" w:eastAsia="宋体" w:cs="宋体"/>
@@ -12425,37 +12046,176 @@
         </w:rPr>
         <w:t xml:space="preserve">评价重心从文本问答的准确率转向临床多模态综合判断能力，</w:t>
       </w:r>
+      <w:del w:id="626" w:author="Kiro润色" w:date="2026-06-17T00:00:00Z">
+        <w:r>
+          <w:rPr>
+            <w:rFonts w:hint="eastAsia" w:ascii="宋体" w:hAnsi="宋体" w:eastAsia="宋体" w:cs="宋体"/>
+            <w:color w:val="FF0000"/>
+          </w:rPr>
+          <w:delText xml:space="preserve">并</w:delText>
+        </w:r>
+      </w:del>
+      <w:r>
+        <w:rPr>
+          <w:rFonts w:hint="eastAsia" w:ascii="宋体" w:hAnsi="宋体" w:eastAsia="宋体" w:cs="宋体"/>
+          <w:color w:val="FF0000"/>
+        </w:rPr>
+        <w:t xml:space="preserve">以真实世界的前瞻性结局数据作为最终验证尺度，构建“能力评估—安全审查—效用验证”三位一体的评测闭环。这既是人工智能与中医药交叉领域</w:t>
+      </w:r>
+      <w:ins w:id="627" w:author="Kiro润色" w:date="2026-06-17T00:00:00Z">
+        <w:r>
+          <w:rPr>
+            <w:rFonts w:hint="eastAsia" w:ascii="宋体" w:hAnsi="宋体" w:eastAsia="宋体" w:cs="宋体"/>
+            <w:color w:val="FF0000"/>
+          </w:rPr>
+          <w:t xml:space="preserve">的</w:t>
+        </w:r>
+      </w:ins>
+      <w:r>
+        <w:rPr>
+          <w:rFonts w:hint="eastAsia" w:ascii="宋体" w:hAnsi="宋体" w:eastAsia="宋体" w:cs="宋体"/>
+          <w:color w:val="FF0000"/>
+        </w:rPr>
+        <w:t xml:space="preserve">方法学</w:t>
+      </w:r>
+      <w:del w:id="628" w:author="Kiro润色" w:date="2026-06-17T00:00:00Z">
+        <w:r>
+          <w:rPr>
+            <w:rFonts w:hint="eastAsia" w:ascii="宋体" w:hAnsi="宋体" w:eastAsia="宋体" w:cs="宋体"/>
+            <w:color w:val="FF0000"/>
+          </w:rPr>
+          <w:delText xml:space="preserve">创新的前沿</w:delText>
+        </w:r>
+      </w:del>
+      <w:r>
+        <w:rPr>
+          <w:rFonts w:hint="eastAsia" w:ascii="宋体" w:hAnsi="宋体" w:eastAsia="宋体" w:cs="宋体"/>
+          <w:color w:val="FF0000"/>
+        </w:rPr>
+        <w:t xml:space="preserve">挑战，也是推动中医药</w:t>
+      </w:r>
+      <w:del w:id="629" w:author="Kiro润色" w:date="2026-06-17T00:00:00Z">
+        <w:r>
+          <w:rPr>
+            <w:rFonts w:hint="eastAsia" w:ascii="宋体" w:hAnsi="宋体" w:eastAsia="宋体" w:cs="宋体"/>
+            <w:color w:val="FF0000"/>
+          </w:rPr>
+          <w:delText xml:space="preserve">信息化、</w:delText>
+        </w:r>
+      </w:del>
+      <w:r>
+        <w:rPr>
+          <w:rFonts w:hint="eastAsia" w:ascii="宋体" w:hAnsi="宋体" w:eastAsia="宋体" w:cs="宋体"/>
+          <w:color w:val="FF0000"/>
+        </w:rPr>
+        <w:t xml:space="preserve">智能化</w:t>
+      </w:r>
+      <w:del w:id="630" w:author="Kiro润色" w:date="2026-06-17T00:00:00Z">
+        <w:r>
+          <w:rPr>
+            <w:rFonts w:hint="eastAsia" w:ascii="宋体" w:hAnsi="宋体" w:eastAsia="宋体" w:cs="宋体"/>
+            <w:color w:val="FF0000"/>
+          </w:rPr>
+          <w:delText xml:space="preserve">深度融合与</w:delText>
+        </w:r>
+      </w:del>
+      <w:r>
+        <w:rPr>
+          <w:rFonts w:hint="eastAsia" w:ascii="宋体" w:hAnsi="宋体" w:eastAsia="宋体" w:cs="宋体"/>
+          <w:color w:val="FF0000"/>
+        </w:rPr>
+        <w:t xml:space="preserve">规范发展的基础性工</w:t>
+      </w:r>
+      <w:del w:id="631" w:author="Kiro润色" w:date="2026-06-17T00:00:00Z">
+        <w:r>
+          <w:rPr>
+            <w:rFonts w:hint="eastAsia" w:ascii="宋体" w:hAnsi="宋体" w:eastAsia="宋体" w:cs="宋体"/>
+            <w:color w:val="FF0000"/>
+          </w:rPr>
+          <w:delText xml:space="preserve">程</w:delText>
+        </w:r>
+      </w:del>
+      <w:ins w:id="632" w:author="Kiro润色" w:date="2026-06-17T00:00:00Z">
+        <w:r>
+          <w:rPr>
+            <w:rFonts w:hint="eastAsia" w:ascii="宋体" w:hAnsi="宋体" w:eastAsia="宋体" w:cs="宋体"/>
+            <w:color w:val="FF0000"/>
+          </w:rPr>
+          <w:t xml:space="preserve">作</w:t>
+        </w:r>
+      </w:ins>
+      <w:r>
+        <w:rPr>
+          <w:rFonts w:hint="eastAsia" w:ascii="宋体" w:hAnsi="宋体" w:eastAsia="宋体" w:cs="宋体"/>
+          <w:color w:val="FF0000"/>
+        </w:rPr>
+        <w:t xml:space="preserve">，</w:t>
+      </w:r>
+      <w:del w:id="633" w:author="Kiro润色" w:date="2026-06-17T00:00:00Z">
+        <w:r>
+          <w:rPr>
+            <w:rFonts w:hint="eastAsia" w:ascii="宋体" w:hAnsi="宋体" w:eastAsia="宋体" w:cs="宋体"/>
+            <w:color w:val="FF0000"/>
+          </w:rPr>
+          <w:delText xml:space="preserve">亟</w:delText>
+        </w:r>
+      </w:del>
+      <w:ins w:id="634" w:author="Kiro润色" w:date="2026-06-17T00:00:00Z">
+        <w:r>
+          <w:rPr>
+            <w:rFonts w:hint="eastAsia" w:ascii="宋体" w:hAnsi="宋体" w:eastAsia="宋体" w:cs="宋体"/>
+            <w:color w:val="FF0000"/>
+          </w:rPr>
+          <w:t xml:space="preserve">仍</w:t>
+        </w:r>
+      </w:ins>
+      <w:r>
+        <w:rPr>
+          <w:rFonts w:hint="eastAsia" w:ascii="宋体" w:hAnsi="宋体" w:eastAsia="宋体" w:cs="宋体"/>
+          <w:color w:val="FF0000"/>
+        </w:rPr>
+        <w:t xml:space="preserve">需在高质量多模态数据</w:t>
+      </w:r>
+      <w:del w:id="635" w:author="Kiro润色" w:date="2026-06-17T00:00:00Z">
+        <w:r>
+          <w:rPr>
+            <w:rFonts w:hint="eastAsia" w:ascii="宋体" w:hAnsi="宋体" w:eastAsia="宋体" w:cs="宋体"/>
+            <w:color w:val="FF0000"/>
+          </w:rPr>
+          <w:delText xml:space="preserve">基础</w:delText>
+        </w:r>
+      </w:del>
+      <w:r>
+        <w:rPr>
+          <w:rFonts w:hint="eastAsia" w:ascii="宋体" w:hAnsi="宋体" w:eastAsia="宋体" w:cs="宋体"/>
+          <w:color w:val="FF0000"/>
+        </w:rPr>
+        <w:t xml:space="preserve">建设、动态交互式评测协议</w:t>
+      </w:r>
       <w:del w:id="636" w:author="Kiro润色" w:date="2026-06-17T00:00:00Z">
         <w:r>
           <w:rPr>
             <w:rFonts w:hint="eastAsia" w:ascii="宋体" w:hAnsi="宋体" w:eastAsia="宋体" w:cs="宋体"/>
             <w:color w:val="FF0000"/>
           </w:rPr>
-          <w:delText xml:space="preserve">并</w:delText>
-        </w:r>
-      </w:del>
-      <w:r>
-        <w:rPr>
-          <w:rFonts w:hint="eastAsia" w:ascii="宋体" w:hAnsi="宋体" w:eastAsia="宋体" w:cs="宋体"/>
-          <w:color w:val="FF0000"/>
-        </w:rPr>
-        <w:t xml:space="preserve">以真实世界的前瞻性结局数据作为最终验证尺度，构建“能力评估—安全审查—效用验证”三位一体的评测闭环。这既是人工智能与中医药交叉领域</w:t>
-      </w:r>
+          <w:delText xml:space="preserve">开发及</w:delText>
+        </w:r>
+      </w:del>
       <w:ins w:id="637" w:author="Kiro润色" w:date="2026-06-17T00:00:00Z">
         <w:r>
           <w:rPr>
             <w:rFonts w:hint="eastAsia" w:ascii="宋体" w:hAnsi="宋体" w:eastAsia="宋体" w:cs="宋体"/>
             <w:color w:val="FF0000"/>
           </w:rPr>
-          <w:t xml:space="preserve">的</w:t>
-        </w:r>
-      </w:ins>
-      <w:r>
-        <w:rPr>
-          <w:rFonts w:hint="eastAsia" w:ascii="宋体" w:hAnsi="宋体" w:eastAsia="宋体" w:cs="宋体"/>
-          <w:color w:val="FF0000"/>
-        </w:rPr>
-        <w:t xml:space="preserve">方法学</w:t>
+          <w:t xml:space="preserve">与</w:t>
+        </w:r>
+      </w:ins>
+      <w:r>
+        <w:rPr>
+          <w:rFonts w:hint="eastAsia" w:ascii="宋体" w:hAnsi="宋体" w:eastAsia="宋体" w:cs="宋体"/>
+          <w:color w:val="FF0000"/>
+        </w:rPr>
+        <w:t xml:space="preserve">人机协同临床验证等方面</w:t>
       </w:r>
       <w:del w:id="638" w:author="Kiro润色" w:date="2026-06-17T00:00:00Z">
         <w:r>
@@ -12463,165 +12223,26 @@
             <w:rFonts w:hint="eastAsia" w:ascii="宋体" w:hAnsi="宋体" w:eastAsia="宋体" w:cs="宋体"/>
             <w:color w:val="FF0000"/>
           </w:rPr>
-          <w:delText xml:space="preserve">创新的前沿</w:delText>
-        </w:r>
-      </w:del>
-      <w:r>
-        <w:rPr>
-          <w:rFonts w:hint="eastAsia" w:ascii="宋体" w:hAnsi="宋体" w:eastAsia="宋体" w:cs="宋体"/>
-          <w:color w:val="FF0000"/>
-        </w:rPr>
-        <w:t xml:space="preserve">挑战，也是推动中医药</w:t>
-      </w:r>
-      <w:del w:id="639" w:author="Kiro润色" w:date="2026-06-17T00:00:00Z">
-        <w:r>
-          <w:rPr>
-            <w:rFonts w:hint="eastAsia" w:ascii="宋体" w:hAnsi="宋体" w:eastAsia="宋体" w:cs="宋体"/>
-            <w:color w:val="FF0000"/>
-          </w:rPr>
-          <w:delText xml:space="preserve">信息化、</w:delText>
-        </w:r>
-      </w:del>
-      <w:r>
-        <w:rPr>
-          <w:rFonts w:hint="eastAsia" w:ascii="宋体" w:hAnsi="宋体" w:eastAsia="宋体" w:cs="宋体"/>
-          <w:color w:val="FF0000"/>
-        </w:rPr>
-        <w:t xml:space="preserve">智能化</w:t>
+          <w:delText xml:space="preserve">形成系统性</w:delText>
+        </w:r>
+      </w:del>
+      <w:ins w:id="639" w:author="Kiro润色" w:date="2026-06-17T00:00:00Z">
+        <w:r>
+          <w:rPr>
+            <w:rFonts w:hint="eastAsia" w:ascii="宋体" w:hAnsi="宋体" w:eastAsia="宋体" w:cs="宋体"/>
+            <w:color w:val="FF0000"/>
+          </w:rPr>
+          <w:t xml:space="preserve">取得实质</w:t>
+        </w:r>
+      </w:ins>
+      <w:r>
+        <w:rPr>
+          <w:rFonts w:hint="eastAsia" w:ascii="宋体" w:hAnsi="宋体" w:eastAsia="宋体" w:cs="宋体"/>
+          <w:color w:val="FF0000"/>
+        </w:rPr>
+        <w:t xml:space="preserve">突破</w:t>
       </w:r>
       <w:del w:id="640" w:author="Kiro润色" w:date="2026-06-17T00:00:00Z">
-        <w:r>
-          <w:rPr>
-            <w:rFonts w:hint="eastAsia" w:ascii="宋体" w:hAnsi="宋体" w:eastAsia="宋体" w:cs="宋体"/>
-            <w:color w:val="FF0000"/>
-          </w:rPr>
-          <w:delText xml:space="preserve">深度融合与</w:delText>
-        </w:r>
-      </w:del>
-      <w:r>
-        <w:rPr>
-          <w:rFonts w:hint="eastAsia" w:ascii="宋体" w:hAnsi="宋体" w:eastAsia="宋体" w:cs="宋体"/>
-          <w:color w:val="FF0000"/>
-        </w:rPr>
-        <w:t xml:space="preserve">规范发展的基础性工</w:t>
-      </w:r>
-      <w:del w:id="641" w:author="Kiro润色" w:date="2026-06-17T00:00:00Z">
-        <w:r>
-          <w:rPr>
-            <w:rFonts w:hint="eastAsia" w:ascii="宋体" w:hAnsi="宋体" w:eastAsia="宋体" w:cs="宋体"/>
-            <w:color w:val="FF0000"/>
-          </w:rPr>
-          <w:delText xml:space="preserve">程</w:delText>
-        </w:r>
-      </w:del>
-      <w:ins w:id="642" w:author="Kiro润色" w:date="2026-06-17T00:00:00Z">
-        <w:r>
-          <w:rPr>
-            <w:rFonts w:hint="eastAsia" w:ascii="宋体" w:hAnsi="宋体" w:eastAsia="宋体" w:cs="宋体"/>
-            <w:color w:val="FF0000"/>
-          </w:rPr>
-          <w:t xml:space="preserve">作</w:t>
-        </w:r>
-      </w:ins>
-      <w:r>
-        <w:rPr>
-          <w:rFonts w:hint="eastAsia" w:ascii="宋体" w:hAnsi="宋体" w:eastAsia="宋体" w:cs="宋体"/>
-          <w:color w:val="FF0000"/>
-        </w:rPr>
-        <w:t xml:space="preserve">，</w:t>
-      </w:r>
-      <w:del w:id="643" w:author="Kiro润色" w:date="2026-06-17T00:00:00Z">
-        <w:r>
-          <w:rPr>
-            <w:rFonts w:hint="eastAsia" w:ascii="宋体" w:hAnsi="宋体" w:eastAsia="宋体" w:cs="宋体"/>
-            <w:color w:val="FF0000"/>
-          </w:rPr>
-          <w:delText xml:space="preserve">亟</w:delText>
-        </w:r>
-      </w:del>
-      <w:ins w:id="644" w:author="Kiro润色" w:date="2026-06-17T00:00:00Z">
-        <w:r>
-          <w:rPr>
-            <w:rFonts w:hint="eastAsia" w:ascii="宋体" w:hAnsi="宋体" w:eastAsia="宋体" w:cs="宋体"/>
-            <w:color w:val="FF0000"/>
-          </w:rPr>
-          <w:t xml:space="preserve">仍</w:t>
-        </w:r>
-      </w:ins>
-      <w:r>
-        <w:rPr>
-          <w:rFonts w:hint="eastAsia" w:ascii="宋体" w:hAnsi="宋体" w:eastAsia="宋体" w:cs="宋体"/>
-          <w:color w:val="FF0000"/>
-        </w:rPr>
-        <w:t xml:space="preserve">需在高质量多模态数据</w:t>
-      </w:r>
-      <w:del w:id="645" w:author="Kiro润色" w:date="2026-06-17T00:00:00Z">
-        <w:r>
-          <w:rPr>
-            <w:rFonts w:hint="eastAsia" w:ascii="宋体" w:hAnsi="宋体" w:eastAsia="宋体" w:cs="宋体"/>
-            <w:color w:val="FF0000"/>
-          </w:rPr>
-          <w:delText xml:space="preserve">基础</w:delText>
-        </w:r>
-      </w:del>
-      <w:r>
-        <w:rPr>
-          <w:rFonts w:hint="eastAsia" w:ascii="宋体" w:hAnsi="宋体" w:eastAsia="宋体" w:cs="宋体"/>
-          <w:color w:val="FF0000"/>
-        </w:rPr>
-        <w:t xml:space="preserve">建设、动态交互式评测协议</w:t>
-      </w:r>
-      <w:del w:id="646" w:author="Kiro润色" w:date="2026-06-17T00:00:00Z">
-        <w:r>
-          <w:rPr>
-            <w:rFonts w:hint="eastAsia" w:ascii="宋体" w:hAnsi="宋体" w:eastAsia="宋体" w:cs="宋体"/>
-            <w:color w:val="FF0000"/>
-          </w:rPr>
-          <w:delText xml:space="preserve">开发及</w:delText>
-        </w:r>
-      </w:del>
-      <w:ins w:id="647" w:author="Kiro润色" w:date="2026-06-17T00:00:00Z">
-        <w:r>
-          <w:rPr>
-            <w:rFonts w:hint="eastAsia" w:ascii="宋体" w:hAnsi="宋体" w:eastAsia="宋体" w:cs="宋体"/>
-            <w:color w:val="FF0000"/>
-          </w:rPr>
-          <w:t xml:space="preserve">与</w:t>
-        </w:r>
-      </w:ins>
-      <w:r>
-        <w:rPr>
-          <w:rFonts w:hint="eastAsia" w:ascii="宋体" w:hAnsi="宋体" w:eastAsia="宋体" w:cs="宋体"/>
-          <w:color w:val="FF0000"/>
-        </w:rPr>
-        <w:t xml:space="preserve">人机协同临床验证等方面</w:t>
-      </w:r>
-      <w:del w:id="648" w:author="Kiro润色" w:date="2026-06-17T00:00:00Z">
-        <w:r>
-          <w:rPr>
-            <w:rFonts w:hint="eastAsia" w:ascii="宋体" w:hAnsi="宋体" w:eastAsia="宋体" w:cs="宋体"/>
-            <w:color w:val="FF0000"/>
-          </w:rPr>
-          <w:delText xml:space="preserve">形成系统性</w:delText>
-        </w:r>
-      </w:del>
-      <w:ins w:id="649" w:author="Kiro润色" w:date="2026-06-17T00:00:00Z">
-        <w:r>
-          <w:rPr>
-            <w:rFonts w:hint="eastAsia" w:ascii="宋体" w:hAnsi="宋体" w:eastAsia="宋体" w:cs="宋体"/>
-            <w:color w:val="FF0000"/>
-          </w:rPr>
-          <w:t xml:space="preserve">取得实质</w:t>
-        </w:r>
-      </w:ins>
-      <w:r>
-        <w:rPr>
-          <w:rFonts w:hint="eastAsia" w:ascii="宋体" w:hAnsi="宋体" w:eastAsia="宋体" w:cs="宋体"/>
-          <w:color w:val="FF0000"/>
-        </w:rPr>
-        <w:t xml:space="preserve">突破</w:t>
-      </w:r>
-      <w:del w:id="650" w:author="Kiro润色" w:date="2026-06-17T00:00:00Z">
         <w:r>
           <w:rPr>
             <w:rFonts w:hint="eastAsia" w:ascii="宋体" w:hAnsi="宋体" w:eastAsia="宋体" w:cs="宋体"/>
@@ -12959,7 +12580,7 @@
         </w:rPr>
         <w:t xml:space="preserve">[18] 张童, 王一凡, 王若佳, 等. 面向中医药领域专业能力的生成式大语言模型对比研究[J]. 中华中医药学刊, 2025, 43(10): 19-27</w:t>
       </w:r>
-      <w:ins w:id="651" w:author="Kiro润色" w:date="2026-06-17T00:00:00Z">
+      <w:ins w:id="641" w:author="Kiro润色" w:date="2026-06-17T00:00:00Z">
         <w:r>
           <w:rPr>
             <w:rFonts w:hint="eastAsia" w:ascii="宋体" w:hAnsi="宋体" w:eastAsia="宋体" w:cs="宋体"/>
@@ -13108,7 +12729,7 @@
         </w:rPr>
         <w:t xml:space="preserve">[27] YANG Q R, HAN J X, WANG H Z, et al. Knowledge graph enhanced large language models for traditional Chinese medicine question-answering[C]// 2026 IEEE International Conference on Big Data and Smart Computing (BigComp). Piscataway: IEEE, 202</w:t>
       </w:r>
-      <w:del w:id="652" w:author="Kiro润色" w:date="2026-06-17T00:00:00Z">
+      <w:del w:id="642" w:author="Kiro润色" w:date="2026-06-17T00:00:00Z">
         <w:r>
           <w:rPr>
             <w:rFonts w:hint="eastAsia" w:ascii="宋体" w:hAnsi="宋体" w:eastAsia="宋体" w:cs="宋体"/>
@@ -13116,7 +12737,7 @@
           <w:delText xml:space="preserve">5</w:delText>
         </w:r>
       </w:del>
-      <w:ins w:id="653" w:author="Kiro润色" w:date="2026-06-17T00:00:00Z">
+      <w:ins w:id="643" w:author="Kiro润色" w:date="2026-06-17T00:00:00Z">
         <w:r>
           <w:rPr>
             <w:rFonts w:hint="eastAsia" w:ascii="宋体" w:hAnsi="宋体" w:eastAsia="宋体" w:cs="宋体"/>
@@ -13145,7 +12766,7 @@
         </w:rPr>
         <w:t xml:space="preserve">[28] DUAN Y C, ZHOU Q Q, LI Y, et al. Research on a traditional Chinese medicine case-based question-answering system integrating large language models and knowledge graphs[J]. Frontiers in Medicine, 202</w:t>
       </w:r>
-      <w:del w:id="654" w:author="Kiro润色" w:date="2026-06-17T00:00:00Z">
+      <w:del w:id="644" w:author="Kiro润色" w:date="2026-06-17T00:00:00Z">
         <w:r>
           <w:rPr>
             <w:rFonts w:hint="eastAsia" w:ascii="宋体" w:hAnsi="宋体" w:eastAsia="宋体" w:cs="宋体"/>
@@ -13153,7 +12774,7 @@
           <w:delText xml:space="preserve">5</w:delText>
         </w:r>
       </w:del>
-      <w:ins w:id="655" w:author="Kiro润色" w:date="2026-06-17T00:00:00Z">
+      <w:ins w:id="645" w:author="Kiro润色" w:date="2026-06-17T00:00:00Z">
         <w:r>
           <w:rPr>
             <w:rFonts w:hint="eastAsia" w:ascii="宋体" w:hAnsi="宋体" w:eastAsia="宋体" w:cs="宋体"/>
@@ -13221,12 +12842,14 @@
           <w:rFonts w:hint="eastAsia" w:ascii="宋体" w:hAnsi="宋体" w:eastAsia="宋体" w:cs="宋体"/>
         </w:rPr>
       </w:pPr>
-      <w:r>
-        <w:rPr>
-          <w:rFonts w:hint="eastAsia" w:ascii="宋体" w:hAnsi="宋体" w:eastAsia="宋体" w:cs="宋体"/>
-        </w:rPr>
-        <w:t>[32] ZHANG R X, XIE W D, LIN Q Z, et al. When East meets West: cross-domain drug interaction annotations with large language models and bidirectional neural networks[J]. IEEE Journal of Biomedical and Health Informatics, 2025, 29(10): 7694-7703.</w:t>
-      </w:r>
+      <w:del w:id="646" w:author="Kiro润色" w:date="2026-06-17T00:00:00Z">
+        <w:r>
+          <w:rPr>
+            <w:rFonts w:hint="eastAsia" w:ascii="宋体" w:hAnsi="宋体" w:eastAsia="宋体" w:cs="宋体"/>
+          </w:rPr>
+          <w:delText xml:space="preserve">[32] ZHANG R X, XIE W D, LIN Q Z, et al. When East meets West: cross-domain drug interaction annotations with large language models and bidirectional neural networks[J]. IEEE Journal of Biomedical and Health Informatics, 2025, 29(10): 7694-7703.</w:delText>
+        </w:r>
+      </w:del>
     </w:p>
     <w:p>
       <w:pPr>
@@ -13236,12 +12859,14 @@
           <w:rFonts w:hint="eastAsia" w:ascii="宋体" w:hAnsi="宋体" w:eastAsia="宋体" w:cs="宋体"/>
         </w:rPr>
       </w:pPr>
-      <w:r>
-        <w:rPr>
-          <w:rFonts w:hint="eastAsia" w:ascii="宋体" w:hAnsi="宋体" w:eastAsia="宋体" w:cs="宋体"/>
-        </w:rPr>
-        <w:t>[33] XU Q, ZHAO Z H, LIU W W, et al. A character-level convolutional recurrent interaction network for joint traditional Chinese medicine clinical named entity recognition and relation extraction[J]. Artificial Intelligence in Medicine, 2026, 175: 103372.</w:t>
-      </w:r>
+      <w:del w:id="647" w:author="Kiro润色" w:date="2026-06-17T00:00:00Z">
+        <w:r>
+          <w:rPr>
+            <w:rFonts w:hint="eastAsia" w:ascii="宋体" w:hAnsi="宋体" w:eastAsia="宋体" w:cs="宋体"/>
+          </w:rPr>
+          <w:delText xml:space="preserve">[33] XU Q, ZHAO Z H, LIU W W, et al. A character-level convolutional recurrent interaction network for joint traditional Chinese medicine clinical named entity recognition and relation extraction[J]. Artificial Intelligence in Medicine, 2026, 175: 103372.</w:delText>
+        </w:r>
+      </w:del>
     </w:p>
     <w:p>
       <w:pPr>
@@ -13255,7 +12880,29 @@
         <w:rPr>
           <w:rFonts w:hint="eastAsia" w:ascii="宋体" w:hAnsi="宋体" w:eastAsia="宋体" w:cs="宋体"/>
         </w:rPr>
-        <w:t>[34] MOOR M, BANERJEE O, ABAD Z S H, et al. Foundation models for generalist medical artificial intelligence[J]. Nature, 2023, 616(7956): 259-265.</w:t>
+        <w:t xml:space="preserve">[3</w:t>
+      </w:r>
+      <w:del w:id="648" w:author="Kiro润色" w:date="2026-06-17T00:00:00Z">
+        <w:r>
+          <w:rPr>
+            <w:rFonts w:hint="eastAsia" w:ascii="宋体" w:hAnsi="宋体" w:eastAsia="宋体" w:cs="宋体"/>
+          </w:rPr>
+          <w:delText xml:space="preserve">4</w:delText>
+        </w:r>
+      </w:del>
+      <w:ins w:id="649" w:author="Kiro润色" w:date="2026-06-17T00:00:00Z">
+        <w:r>
+          <w:rPr>
+            <w:rFonts w:hint="eastAsia" w:ascii="宋体" w:hAnsi="宋体" w:eastAsia="宋体" w:cs="宋体"/>
+          </w:rPr>
+          <w:t xml:space="preserve">2</w:t>
+        </w:r>
+      </w:ins>
+      <w:r>
+        <w:rPr>
+          <w:rFonts w:hint="eastAsia" w:ascii="宋体" w:hAnsi="宋体" w:eastAsia="宋体" w:cs="宋体"/>
+        </w:rPr>
+        <w:t xml:space="preserve">] MOOR M, BANERJEE O, ABAD Z S H, et al. Foundation models for generalist medical artificial intelligence[J]. Nature, 2023, 616(7956): 259-265.</w:t>
       </w:r>
     </w:p>
     <w:p>
@@ -13270,7 +12917,29 @@
         <w:rPr>
           <w:rFonts w:hint="eastAsia" w:ascii="宋体" w:hAnsi="宋体" w:eastAsia="宋体" w:cs="宋体"/>
         </w:rPr>
-        <w:t>[35] SINGHAL K, AZIZI S, TU T, et al. Large language models encode clinical knowledge[J]. Nature, 2023, 620(7972): 172-180.</w:t>
+        <w:t xml:space="preserve">[3</w:t>
+      </w:r>
+      <w:del w:id="650" w:author="Kiro润色" w:date="2026-06-17T00:00:00Z">
+        <w:r>
+          <w:rPr>
+            <w:rFonts w:hint="eastAsia" w:ascii="宋体" w:hAnsi="宋体" w:eastAsia="宋体" w:cs="宋体"/>
+          </w:rPr>
+          <w:delText xml:space="preserve">5</w:delText>
+        </w:r>
+      </w:del>
+      <w:ins w:id="651" w:author="Kiro润色" w:date="2026-06-17T00:00:00Z">
+        <w:r>
+          <w:rPr>
+            <w:rFonts w:hint="eastAsia" w:ascii="宋体" w:hAnsi="宋体" w:eastAsia="宋体" w:cs="宋体"/>
+          </w:rPr>
+          <w:t xml:space="preserve">3</w:t>
+        </w:r>
+      </w:ins>
+      <w:r>
+        <w:rPr>
+          <w:rFonts w:hint="eastAsia" w:ascii="宋体" w:hAnsi="宋体" w:eastAsia="宋体" w:cs="宋体"/>
+        </w:rPr>
+        <w:t xml:space="preserve">] SINGHAL K, AZIZI S, TU T, et al. Large language models encode clinical knowledge[J]. Nature, 2023, 620(7972): 172-180.</w:t>
       </w:r>
     </w:p>
     <w:p>
@@ -13285,7 +12954,29 @@
         <w:rPr>
           <w:rFonts w:hint="eastAsia" w:ascii="宋体" w:hAnsi="宋体" w:eastAsia="宋体" w:cs="宋体"/>
         </w:rPr>
-        <w:t>[36] LIU Y, YUAN Y S, YAN K M, et al. Evaluating the role of large language models in traditional Chinese medicine diagnosis and treatment recommendations[J]. npj Digital Medicine, 2025, 8(1): 466.</w:t>
+        <w:t xml:space="preserve">[3</w:t>
+      </w:r>
+      <w:del w:id="652" w:author="Kiro润色" w:date="2026-06-17T00:00:00Z">
+        <w:r>
+          <w:rPr>
+            <w:rFonts w:hint="eastAsia" w:ascii="宋体" w:hAnsi="宋体" w:eastAsia="宋体" w:cs="宋体"/>
+          </w:rPr>
+          <w:delText xml:space="preserve">6</w:delText>
+        </w:r>
+      </w:del>
+      <w:ins w:id="653" w:author="Kiro润色" w:date="2026-06-17T00:00:00Z">
+        <w:r>
+          <w:rPr>
+            <w:rFonts w:hint="eastAsia" w:ascii="宋体" w:hAnsi="宋体" w:eastAsia="宋体" w:cs="宋体"/>
+          </w:rPr>
+          <w:t xml:space="preserve">4</w:t>
+        </w:r>
+      </w:ins>
+      <w:r>
+        <w:rPr>
+          <w:rFonts w:hint="eastAsia" w:ascii="宋体" w:hAnsi="宋体" w:eastAsia="宋体" w:cs="宋体"/>
+        </w:rPr>
+        <w:t xml:space="preserve">] LIU Y, YUAN Y S, YAN K M, et al. Evaluating the role of large language models in traditional Chinese medicine diagnosis and treatment recommendations[J]. npj Digital Medicine, 2025, 8(1): 466.</w:t>
       </w:r>
     </w:p>
     <w:p>
@@ -13300,7 +12991,29 @@
         <w:rPr>
           <w:rFonts w:hint="eastAsia" w:ascii="宋体" w:hAnsi="宋体" w:eastAsia="宋体" w:cs="宋体"/>
         </w:rPr>
-        <w:t>[37] TOPOL E J. High-performance medicine: the convergence of human and artificial intelligence[J]. Nature Medicine, 2019, 25(1): 44-56.</w:t>
+        <w:t xml:space="preserve">[3</w:t>
+      </w:r>
+      <w:del w:id="654" w:author="Kiro润色" w:date="2026-06-17T00:00:00Z">
+        <w:r>
+          <w:rPr>
+            <w:rFonts w:hint="eastAsia" w:ascii="宋体" w:hAnsi="宋体" w:eastAsia="宋体" w:cs="宋体"/>
+          </w:rPr>
+          <w:delText xml:space="preserve">7</w:delText>
+        </w:r>
+      </w:del>
+      <w:ins w:id="655" w:author="Kiro润色" w:date="2026-06-17T00:00:00Z">
+        <w:r>
+          <w:rPr>
+            <w:rFonts w:hint="eastAsia" w:ascii="宋体" w:hAnsi="宋体" w:eastAsia="宋体" w:cs="宋体"/>
+          </w:rPr>
+          <w:t xml:space="preserve">5</w:t>
+        </w:r>
+      </w:ins>
+      <w:r>
+        <w:rPr>
+          <w:rFonts w:hint="eastAsia" w:ascii="宋体" w:hAnsi="宋体" w:eastAsia="宋体" w:cs="宋体"/>
+        </w:rPr>
+        <w:t xml:space="preserve">] TOPOL E J. High-performance medicine: the convergence of human and artificial intelligence[J]. Nature Medicine, 2019, 25(1): 44-56.</w:t>
       </w:r>
     </w:p>
     <w:p>
@@ -13315,7 +13028,29 @@
         <w:rPr>
           <w:rFonts w:hint="eastAsia" w:ascii="宋体" w:hAnsi="宋体" w:eastAsia="宋体" w:cs="宋体"/>
         </w:rPr>
-        <w:t>[38] 全国信息技术标准化技术委员会. 人工智能 大模型 第2部分: 评测指标与方法: GB/T 45288.2—2025[S]. 北京: 中国标准出版社, 2025.</w:t>
+        <w:t xml:space="preserve">[3</w:t>
+      </w:r>
+      <w:del w:id="656" w:author="Kiro润色" w:date="2026-06-17T00:00:00Z">
+        <w:r>
+          <w:rPr>
+            <w:rFonts w:hint="eastAsia" w:ascii="宋体" w:hAnsi="宋体" w:eastAsia="宋体" w:cs="宋体"/>
+          </w:rPr>
+          <w:delText xml:space="preserve">8</w:delText>
+        </w:r>
+      </w:del>
+      <w:ins w:id="657" w:author="Kiro润色" w:date="2026-06-17T00:00:00Z">
+        <w:r>
+          <w:rPr>
+            <w:rFonts w:hint="eastAsia" w:ascii="宋体" w:hAnsi="宋体" w:eastAsia="宋体" w:cs="宋体"/>
+          </w:rPr>
+          <w:t xml:space="preserve">6</w:t>
+        </w:r>
+      </w:ins>
+      <w:r>
+        <w:rPr>
+          <w:rFonts w:hint="eastAsia" w:ascii="宋体" w:hAnsi="宋体" w:eastAsia="宋体" w:cs="宋体"/>
+        </w:rPr>
+        <w:t xml:space="preserve">] 全国信息技术标准化技术委员会. 人工智能 大模型 第2部分: 评测指标与方法: GB/T 45288.2—2025[S]. 北京: 中国标准出版社, 2025.</w:t>
       </w:r>
     </w:p>
     <w:p>

</xml_diff>

<commit_message>
Polish 5.1 for flow: smoother lead-in + cohesive scoring-mechanism paragraph; refresh track-changes
</commit_message>
<xml_diff>
--- a/大语言模型在中医药领域评测研究0617_修订模式.docx
+++ b/大语言模型在中医药领域评测研究0617_修订模式.docx
@@ -11032,7 +11032,171 @@
           <w:rFonts w:hint="eastAsia" w:ascii="宋体" w:hAnsi="宋体" w:eastAsia="宋体" w:cs="宋体"/>
           <w:color w:val="FF0000"/>
         </w:rPr>
-        <w:t>中医临床遵循由四诊信息到证候、由证候到治法、由治法到方药、再由疗效检验的递进链条，评测体系亦应循此分层展开，本文提出构建“知识驱动的五层评测框架”：</w:t>
+        <w:t xml:space="preserve">中医临床</w:t>
+      </w:r>
+      <w:ins w:id="614" w:author="Kiro润色" w:date="2026-06-17T00:00:00Z">
+        <w:r>
+          <w:rPr>
+            <w:rFonts w:hint="eastAsia" w:ascii="宋体" w:hAnsi="宋体" w:eastAsia="宋体" w:cs="宋体"/>
+            <w:color w:val="FF0000"/>
+          </w:rPr>
+          <w:t xml:space="preserve">本身</w:t>
+        </w:r>
+      </w:ins>
+      <w:r>
+        <w:rPr>
+          <w:rFonts w:hint="eastAsia" w:ascii="宋体" w:hAnsi="宋体" w:eastAsia="宋体" w:cs="宋体"/>
+          <w:color w:val="FF0000"/>
+        </w:rPr>
+        <w:t xml:space="preserve">遵循由四诊信息到证候、由证候到治法、由治法到方药、再</w:t>
+      </w:r>
+      <w:del w:id="615" w:author="Kiro润色" w:date="2026-06-17T00:00:00Z">
+        <w:r>
+          <w:rPr>
+            <w:rFonts w:hint="eastAsia" w:ascii="宋体" w:hAnsi="宋体" w:eastAsia="宋体" w:cs="宋体"/>
+            <w:color w:val="FF0000"/>
+          </w:rPr>
+          <w:delText xml:space="preserve">由</w:delText>
+        </w:r>
+      </w:del>
+      <w:ins w:id="616" w:author="Kiro润色" w:date="2026-06-17T00:00:00Z">
+        <w:r>
+          <w:rPr>
+            <w:rFonts w:hint="eastAsia" w:ascii="宋体" w:hAnsi="宋体" w:eastAsia="宋体" w:cs="宋体"/>
+            <w:color w:val="FF0000"/>
+          </w:rPr>
+          <w:t xml:space="preserve">以</w:t>
+        </w:r>
+      </w:ins>
+      <w:r>
+        <w:rPr>
+          <w:rFonts w:hint="eastAsia" w:ascii="宋体" w:hAnsi="宋体" w:eastAsia="宋体" w:cs="宋体"/>
+          <w:color w:val="FF0000"/>
+        </w:rPr>
+        <w:t xml:space="preserve">疗效检验的递进链条</w:t>
+      </w:r>
+      <w:del w:id="617" w:author="Kiro润色" w:date="2026-06-17T00:00:00Z">
+        <w:r>
+          <w:rPr>
+            <w:rFonts w:hint="eastAsia" w:ascii="宋体" w:hAnsi="宋体" w:eastAsia="宋体" w:cs="宋体"/>
+            <w:color w:val="FF0000"/>
+          </w:rPr>
+          <w:delText xml:space="preserve">，</w:delText>
+        </w:r>
+      </w:del>
+      <w:ins w:id="618" w:author="Kiro润色" w:date="2026-06-17T00:00:00Z">
+        <w:r>
+          <w:rPr>
+            <w:rFonts w:hint="eastAsia" w:ascii="宋体" w:hAnsi="宋体" w:eastAsia="宋体" w:cs="宋体"/>
+            <w:color w:val="FF0000"/>
+          </w:rPr>
+          <w:t xml:space="preserve">；</w:t>
+        </w:r>
+      </w:ins>
+      <w:r>
+        <w:rPr>
+          <w:rFonts w:hint="eastAsia" w:ascii="宋体" w:hAnsi="宋体" w:eastAsia="宋体" w:cs="宋体"/>
+          <w:color w:val="FF0000"/>
+        </w:rPr>
+        <w:t xml:space="preserve">评测体系</w:t>
+      </w:r>
+      <w:del w:id="619" w:author="Kiro润色" w:date="2026-06-17T00:00:00Z">
+        <w:r>
+          <w:rPr>
+            <w:rFonts w:hint="eastAsia" w:ascii="宋体" w:hAnsi="宋体" w:eastAsia="宋体" w:cs="宋体"/>
+            <w:color w:val="FF0000"/>
+          </w:rPr>
+          <w:delText xml:space="preserve">亦</w:delText>
+        </w:r>
+      </w:del>
+      <w:ins w:id="620" w:author="Kiro润色" w:date="2026-06-17T00:00:00Z">
+        <w:r>
+          <w:rPr>
+            <w:rFonts w:hint="eastAsia" w:ascii="宋体" w:hAnsi="宋体" w:eastAsia="宋体" w:cs="宋体"/>
+            <w:color w:val="FF0000"/>
+          </w:rPr>
+          <w:t xml:space="preserve">若要贴合这一临床逻辑，也</w:t>
+        </w:r>
+      </w:ins>
+      <w:r>
+        <w:rPr>
+          <w:rFonts w:hint="eastAsia" w:ascii="宋体" w:hAnsi="宋体" w:eastAsia="宋体" w:cs="宋体"/>
+          <w:color w:val="FF0000"/>
+        </w:rPr>
+        <w:t xml:space="preserve">应循此</w:t>
+      </w:r>
+      <w:del w:id="621" w:author="Kiro润色" w:date="2026-06-17T00:00:00Z">
+        <w:r>
+          <w:rPr>
+            <w:rFonts w:hint="eastAsia" w:ascii="宋体" w:hAnsi="宋体" w:eastAsia="宋体" w:cs="宋体"/>
+            <w:color w:val="FF0000"/>
+          </w:rPr>
+          <w:delText xml:space="preserve">分</w:delText>
+        </w:r>
+      </w:del>
+      <w:ins w:id="622" w:author="Kiro润色" w:date="2026-06-17T00:00:00Z">
+        <w:r>
+          <w:rPr>
+            <w:rFonts w:hint="eastAsia" w:ascii="宋体" w:hAnsi="宋体" w:eastAsia="宋体" w:cs="宋体"/>
+            <w:color w:val="FF0000"/>
+          </w:rPr>
+          <w:t xml:space="preserve">层</w:t>
+        </w:r>
+      </w:ins>
+      <w:r>
+        <w:rPr>
+          <w:rFonts w:hint="eastAsia" w:ascii="宋体" w:hAnsi="宋体" w:eastAsia="宋体" w:cs="宋体"/>
+          <w:color w:val="FF0000"/>
+        </w:rPr>
+        <w:t xml:space="preserve">层展开</w:t>
+      </w:r>
+      <w:ins w:id="623" w:author="Kiro润色" w:date="2026-06-17T00:00:00Z">
+        <w:r>
+          <w:rPr>
+            <w:rFonts w:hint="eastAsia" w:ascii="宋体" w:hAnsi="宋体" w:eastAsia="宋体" w:cs="宋体"/>
+            <w:color w:val="FF0000"/>
+          </w:rPr>
+          <w:t xml:space="preserve">。为此</w:t>
+        </w:r>
+      </w:ins>
+      <w:r>
+        <w:rPr>
+          <w:rFonts w:hint="eastAsia" w:ascii="宋体" w:hAnsi="宋体" w:eastAsia="宋体" w:cs="宋体"/>
+          <w:color w:val="FF0000"/>
+        </w:rPr>
+        <w:t xml:space="preserve">，本文提出</w:t>
+      </w:r>
+      <w:del w:id="624" w:author="Kiro润色" w:date="2026-06-17T00:00:00Z">
+        <w:r>
+          <w:rPr>
+            <w:rFonts w:hint="eastAsia" w:ascii="宋体" w:hAnsi="宋体" w:eastAsia="宋体" w:cs="宋体"/>
+            <w:color w:val="FF0000"/>
+          </w:rPr>
+          <w:delText xml:space="preserve">构建</w:delText>
+        </w:r>
+      </w:del>
+      <w:r>
+        <w:rPr>
+          <w:rFonts w:hint="eastAsia" w:ascii="宋体" w:hAnsi="宋体" w:eastAsia="宋体" w:cs="宋体"/>
+          <w:color w:val="FF0000"/>
+        </w:rPr>
+        <w:t xml:space="preserve">“知识驱动的五层评测框架”</w:t>
+      </w:r>
+      <w:ins w:id="625" w:author="Kiro润色" w:date="2026-06-17T00:00:00Z">
+        <w:r>
+          <w:rPr>
+            <w:rFonts w:hint="eastAsia" w:ascii="宋体" w:hAnsi="宋体" w:eastAsia="宋体" w:cs="宋体"/>
+            <w:color w:val="FF0000"/>
+          </w:rPr>
+          <w:t xml:space="preserve">，将模型能力分解为相互衔接的五个层级</w:t>
+        </w:r>
+      </w:ins>
+      <w:r>
+        <w:rPr>
+          <w:rFonts w:hint="eastAsia" w:ascii="宋体" w:hAnsi="宋体" w:eastAsia="宋体" w:cs="宋体"/>
+          <w:color w:val="FF0000"/>
+        </w:rPr>
+        <w:t xml:space="preserve">：</w:t>
       </w:r>
     </w:p>
     <w:p>
@@ -11255,14 +11419,80 @@
           <w:color w:val="FF0000"/>
         </w:rPr>
       </w:pPr>
-      <w:r>
-        <w:rPr>
-          <w:rFonts w:hint="eastAsia" w:ascii="宋体" w:hAnsi="宋体" w:eastAsia="宋体" w:cs="宋体"/>
-          <w:color w:val="FF0000"/>
-        </w:rPr>
-        <w:t xml:space="preserve">各层逐层递进，采用条件化评分（</w:t>
-      </w:r>
-      <w:del w:id="614" w:author="Kiro润色" w:date="2026-06-17T00:00:00Z">
+      <w:del w:id="626" w:author="Kiro润色" w:date="2026-06-17T00:00:00Z">
+        <w:r>
+          <w:rPr>
+            <w:rFonts w:hint="eastAsia" w:ascii="宋体" w:hAnsi="宋体" w:eastAsia="宋体" w:cs="宋体"/>
+            <w:color w:val="FF0000"/>
+          </w:rPr>
+          <w:delText xml:space="preserve">各</w:delText>
+        </w:r>
+      </w:del>
+      <w:ins w:id="627" w:author="Kiro润色" w:date="2026-06-17T00:00:00Z">
+        <w:r>
+          <w:rPr>
+            <w:rFonts w:hint="eastAsia" w:ascii="宋体" w:hAnsi="宋体" w:eastAsia="宋体" w:cs="宋体"/>
+            <w:color w:val="FF0000"/>
+          </w:rPr>
+          <w:t xml:space="preserve">这五</w:t>
+        </w:r>
+      </w:ins>
+      <w:r>
+        <w:rPr>
+          <w:rFonts w:hint="eastAsia" w:ascii="宋体" w:hAnsi="宋体" w:eastAsia="宋体" w:cs="宋体"/>
+          <w:color w:val="FF0000"/>
+        </w:rPr>
+        <w:t xml:space="preserve">层</w:t>
+      </w:r>
+      <w:ins w:id="628" w:author="Kiro润色" w:date="2026-06-17T00:00:00Z">
+        <w:r>
+          <w:rPr>
+            <w:rFonts w:hint="eastAsia" w:ascii="宋体" w:hAnsi="宋体" w:eastAsia="宋体" w:cs="宋体"/>
+            <w:color w:val="FF0000"/>
+          </w:rPr>
+          <w:t xml:space="preserve">并非彼此独立，而是</w:t>
+        </w:r>
+      </w:ins>
+      <w:r>
+        <w:rPr>
+          <w:rFonts w:hint="eastAsia" w:ascii="宋体" w:hAnsi="宋体" w:eastAsia="宋体" w:cs="宋体"/>
+          <w:color w:val="FF0000"/>
+        </w:rPr>
+        <w:t xml:space="preserve">逐层递进</w:t>
+      </w:r>
+      <w:ins w:id="629" w:author="Kiro润色" w:date="2026-06-17T00:00:00Z">
+        <w:r>
+          <w:rPr>
+            <w:rFonts w:hint="eastAsia" w:ascii="宋体" w:hAnsi="宋体" w:eastAsia="宋体" w:cs="宋体"/>
+            <w:color w:val="FF0000"/>
+          </w:rPr>
+          <w:t xml:space="preserve">、下层以上层为前提：辨证一旦出错</w:t>
+        </w:r>
+      </w:ins>
+      <w:r>
+        <w:rPr>
+          <w:rFonts w:hint="eastAsia" w:ascii="宋体" w:hAnsi="宋体" w:eastAsia="宋体" w:cs="宋体"/>
+          <w:color w:val="FF0000"/>
+        </w:rPr>
+        <w:t xml:space="preserve">，</w:t>
+      </w:r>
+      <w:ins w:id="630" w:author="Kiro润色" w:date="2026-06-17T00:00:00Z">
+        <w:r>
+          <w:rPr>
+            <w:rFonts w:hint="eastAsia" w:ascii="宋体" w:hAnsi="宋体" w:eastAsia="宋体" w:cs="宋体"/>
+            <w:color w:val="FF0000"/>
+          </w:rPr>
+          <w:t xml:space="preserve">其后的治则与方药评测便失去意义。因此，框架</w:t>
+        </w:r>
+      </w:ins>
+      <w:r>
+        <w:rPr>
+          <w:rFonts w:hint="eastAsia" w:ascii="宋体" w:hAnsi="宋体" w:eastAsia="宋体" w:cs="宋体"/>
+          <w:color w:val="FF0000"/>
+        </w:rPr>
+        <w:t xml:space="preserve">采用条件化评分（</w:t>
+      </w:r>
+      <w:del w:id="631" w:author="Kiro润色" w:date="2026-06-17T00:00:00Z">
         <w:r>
           <w:rPr>
             <w:rFonts w:hint="eastAsia" w:ascii="宋体" w:hAnsi="宋体" w:eastAsia="宋体" w:cs="宋体"/>
@@ -11271,7 +11501,7 @@
           <w:delText xml:space="preserve">C</w:delText>
         </w:r>
       </w:del>
-      <w:ins w:id="615" w:author="Kiro润色" w:date="2026-06-17T00:00:00Z">
+      <w:ins w:id="632" w:author="Kiro润色" w:date="2026-06-17T00:00:00Z">
         <w:r>
           <w:rPr>
             <w:rFonts w:hint="eastAsia" w:ascii="宋体" w:hAnsi="宋体" w:eastAsia="宋体" w:cs="宋体"/>
@@ -11287,7 +11517,7 @@
         </w:rPr>
         <w:t xml:space="preserve">onditional </w:t>
       </w:r>
-      <w:del w:id="616" w:author="Kiro润色" w:date="2026-06-17T00:00:00Z">
+      <w:del w:id="633" w:author="Kiro润色" w:date="2026-06-17T00:00:00Z">
         <w:r>
           <w:rPr>
             <w:rFonts w:hint="eastAsia" w:ascii="宋体" w:hAnsi="宋体" w:eastAsia="宋体" w:cs="宋体"/>
@@ -11296,7 +11526,7 @@
           <w:delText xml:space="preserve">S</w:delText>
         </w:r>
       </w:del>
-      <w:ins w:id="617" w:author="Kiro润色" w:date="2026-06-17T00:00:00Z">
+      <w:ins w:id="634" w:author="Kiro润色" w:date="2026-06-17T00:00:00Z">
         <w:r>
           <w:rPr>
             <w:rFonts w:hint="eastAsia" w:ascii="宋体" w:hAnsi="宋体" w:eastAsia="宋体" w:cs="宋体"/>
@@ -11312,7 +11542,7 @@
         </w:rPr>
         <w:t xml:space="preserve">coring）</w:t>
       </w:r>
-      <w:del w:id="618" w:author="Kiro润色" w:date="2026-06-17T00:00:00Z">
+      <w:del w:id="635" w:author="Kiro润色" w:date="2026-06-17T00:00:00Z">
         <w:r>
           <w:rPr>
             <w:rFonts w:hint="eastAsia" w:ascii="宋体" w:hAnsi="宋体" w:eastAsia="宋体" w:cs="宋体"/>
@@ -11326,17 +11556,363 @@
           <w:rFonts w:hint="eastAsia" w:ascii="宋体" w:hAnsi="宋体" w:eastAsia="宋体" w:cs="宋体"/>
           <w:color w:val="FF0000"/>
         </w:rPr>
-        <w:t xml:space="preserve">机制：上一层推理错误则终止后续评测，并报告误差沿链条的传导与放大效应。同时为各层设定准入阈值，未通过知识层与辨证层阈值者，其方药层、疗效层的高分不予采信。疗效层有赖于真实世界随访与前瞻性数据，目前仍属亟待建设的目标层次。各层与评测内容、代表指标及对应基准类别的对应关系见图3。</w:t>
-      </w:r>
-      <w:ins w:id="619" w:author="Kiro润色" w:date="2026-06-17T00:00:00Z">
-        <w:r>
-          <w:rPr>
-            <w:rFonts w:hint="eastAsia" w:ascii="宋体" w:hAnsi="宋体" w:eastAsia="宋体" w:cs="宋体"/>
-            <w:color w:val="FF0000"/>
-          </w:rPr>
-          <w:t xml:space="preserve">这一分层思路在标准化层面亦有呼应，如GB/T 45288.2—2025确立了通用大模型的评测指标与方法[36]，可为中医药知识驱动评测体系提供制度参照。</w:t>
-        </w:r>
-      </w:ins>
+        <w:t xml:space="preserve">机制</w:t>
+      </w:r>
+      <w:del w:id="636" w:author="Kiro润色" w:date="2026-06-17T00:00:00Z">
+        <w:r>
+          <w:rPr>
+            <w:rFonts w:hint="eastAsia" w:ascii="宋体" w:hAnsi="宋体" w:eastAsia="宋体" w:cs="宋体"/>
+            <w:color w:val="FF0000"/>
+          </w:rPr>
+          <w:delText xml:space="preserve">：</w:delText>
+        </w:r>
+      </w:del>
+      <w:ins w:id="637" w:author="Kiro润色" w:date="2026-06-17T00:00:00Z">
+        <w:r>
+          <w:rPr>
+            <w:rFonts w:hint="eastAsia" w:ascii="宋体" w:hAnsi="宋体" w:eastAsia="宋体" w:cs="宋体"/>
+            <w:color w:val="FF0000"/>
+          </w:rPr>
+          <w:t xml:space="preserve">，仅在</w:t>
+        </w:r>
+      </w:ins>
+      <w:r>
+        <w:rPr>
+          <w:rFonts w:hint="eastAsia" w:ascii="宋体" w:hAnsi="宋体" w:eastAsia="宋体" w:cs="宋体"/>
+          <w:color w:val="FF0000"/>
+        </w:rPr>
+        <w:t xml:space="preserve">上一层</w:t>
+      </w:r>
+      <w:del w:id="638" w:author="Kiro润色" w:date="2026-06-17T00:00:00Z">
+        <w:r>
+          <w:rPr>
+            <w:rFonts w:hint="eastAsia" w:ascii="宋体" w:hAnsi="宋体" w:eastAsia="宋体" w:cs="宋体"/>
+            <w:color w:val="FF0000"/>
+          </w:rPr>
+          <w:delText xml:space="preserve">推理错误则终止后续</w:delText>
+        </w:r>
+      </w:del>
+      <w:ins w:id="639" w:author="Kiro润色" w:date="2026-06-17T00:00:00Z">
+        <w:r>
+          <w:rPr>
+            <w:rFonts w:hint="eastAsia" w:ascii="宋体" w:hAnsi="宋体" w:eastAsia="宋体" w:cs="宋体"/>
+            <w:color w:val="FF0000"/>
+          </w:rPr>
+          <w:t xml:space="preserve">结论正确的前提下</w:t>
+        </w:r>
+      </w:ins>
+      <w:r>
+        <w:rPr>
+          <w:rFonts w:hint="eastAsia" w:ascii="宋体" w:hAnsi="宋体" w:eastAsia="宋体" w:cs="宋体"/>
+          <w:color w:val="FF0000"/>
+        </w:rPr>
+        <w:t xml:space="preserve">评</w:t>
+      </w:r>
+      <w:del w:id="640" w:author="Kiro润色" w:date="2026-06-17T00:00:00Z">
+        <w:r>
+          <w:rPr>
+            <w:rFonts w:hint="eastAsia" w:ascii="宋体" w:hAnsi="宋体" w:eastAsia="宋体" w:cs="宋体"/>
+            <w:color w:val="FF0000"/>
+          </w:rPr>
+          <w:delText xml:space="preserve">测</w:delText>
+        </w:r>
+      </w:del>
+      <w:ins w:id="641" w:author="Kiro润色" w:date="2026-06-17T00:00:00Z">
+        <w:r>
+          <w:rPr>
+            <w:rFonts w:hint="eastAsia" w:ascii="宋体" w:hAnsi="宋体" w:eastAsia="宋体" w:cs="宋体"/>
+            <w:color w:val="FF0000"/>
+          </w:rPr>
+          <w:t xml:space="preserve">估下一层</w:t>
+        </w:r>
+      </w:ins>
+      <w:r>
+        <w:rPr>
+          <w:rFonts w:hint="eastAsia" w:ascii="宋体" w:hAnsi="宋体" w:eastAsia="宋体" w:cs="宋体"/>
+          <w:color w:val="FF0000"/>
+        </w:rPr>
+        <w:t xml:space="preserve">，并报告误差沿</w:t>
+      </w:r>
+      <w:ins w:id="642" w:author="Kiro润色" w:date="2026-06-17T00:00:00Z">
+        <w:r>
+          <w:rPr>
+            <w:rFonts w:hint="eastAsia" w:ascii="宋体" w:hAnsi="宋体" w:eastAsia="宋体" w:cs="宋体"/>
+            <w:color w:val="FF0000"/>
+          </w:rPr>
+          <w:t xml:space="preserve">“知识—辨证—治则—方药”</w:t>
+        </w:r>
+      </w:ins>
+      <w:r>
+        <w:rPr>
+          <w:rFonts w:hint="eastAsia" w:ascii="宋体" w:hAnsi="宋体" w:eastAsia="宋体" w:cs="宋体"/>
+          <w:color w:val="FF0000"/>
+        </w:rPr>
+        <w:t xml:space="preserve">链条的传导与放大</w:t>
+      </w:r>
+      <w:del w:id="643" w:author="Kiro润色" w:date="2026-06-17T00:00:00Z">
+        <w:r>
+          <w:rPr>
+            <w:rFonts w:hint="eastAsia" w:ascii="宋体" w:hAnsi="宋体" w:eastAsia="宋体" w:cs="宋体"/>
+            <w:color w:val="FF0000"/>
+          </w:rPr>
+          <w:delText xml:space="preserve">效应。</w:delText>
+        </w:r>
+      </w:del>
+      <w:ins w:id="644" w:author="Kiro润色" w:date="2026-06-17T00:00:00Z">
+        <w:r>
+          <w:rPr>
+            <w:rFonts w:hint="eastAsia" w:ascii="宋体" w:hAnsi="宋体" w:eastAsia="宋体" w:cs="宋体"/>
+            <w:color w:val="FF0000"/>
+          </w:rPr>
+          <w:t xml:space="preserve">；</w:t>
+        </w:r>
+      </w:ins>
+      <w:r>
+        <w:rPr>
+          <w:rFonts w:hint="eastAsia" w:ascii="宋体" w:hAnsi="宋体" w:eastAsia="宋体" w:cs="宋体"/>
+          <w:color w:val="FF0000"/>
+        </w:rPr>
+        <w:t xml:space="preserve">同时为各层设定准入阈值，未通过知识层与辨证层</w:t>
+      </w:r>
+      <w:del w:id="645" w:author="Kiro润色" w:date="2026-06-17T00:00:00Z">
+        <w:r>
+          <w:rPr>
+            <w:rFonts w:hint="eastAsia" w:ascii="宋体" w:hAnsi="宋体" w:eastAsia="宋体" w:cs="宋体"/>
+            <w:color w:val="FF0000"/>
+          </w:rPr>
+          <w:delText xml:space="preserve">阈值</w:delText>
+        </w:r>
+      </w:del>
+      <w:r>
+        <w:rPr>
+          <w:rFonts w:hint="eastAsia" w:ascii="宋体" w:hAnsi="宋体" w:eastAsia="宋体" w:cs="宋体"/>
+          <w:color w:val="FF0000"/>
+        </w:rPr>
+        <w:t xml:space="preserve">者，</w:t>
+      </w:r>
+      <w:del w:id="646" w:author="Kiro润色" w:date="2026-06-17T00:00:00Z">
+        <w:r>
+          <w:rPr>
+            <w:rFonts w:hint="eastAsia" w:ascii="宋体" w:hAnsi="宋体" w:eastAsia="宋体" w:cs="宋体"/>
+            <w:color w:val="FF0000"/>
+          </w:rPr>
+          <w:delText xml:space="preserve">其</w:delText>
+        </w:r>
+      </w:del>
+      <w:ins w:id="647" w:author="Kiro润色" w:date="2026-06-17T00:00:00Z">
+        <w:r>
+          <w:rPr>
+            <w:rFonts w:hint="eastAsia" w:ascii="宋体" w:hAnsi="宋体" w:eastAsia="宋体" w:cs="宋体"/>
+            <w:color w:val="FF0000"/>
+          </w:rPr>
+          <w:t xml:space="preserve">即便在</w:t>
+        </w:r>
+      </w:ins>
+      <w:r>
+        <w:rPr>
+          <w:rFonts w:hint="eastAsia" w:ascii="宋体" w:hAnsi="宋体" w:eastAsia="宋体" w:cs="宋体"/>
+          <w:color w:val="FF0000"/>
+        </w:rPr>
+        <w:t xml:space="preserve">方药层、疗效层</w:t>
+      </w:r>
+      <w:del w:id="648" w:author="Kiro润色" w:date="2026-06-17T00:00:00Z">
+        <w:r>
+          <w:rPr>
+            <w:rFonts w:hint="eastAsia" w:ascii="宋体" w:hAnsi="宋体" w:eastAsia="宋体" w:cs="宋体"/>
+            <w:color w:val="FF0000"/>
+          </w:rPr>
+          <w:delText xml:space="preserve">的</w:delText>
+        </w:r>
+      </w:del>
+      <w:ins w:id="649" w:author="Kiro润色" w:date="2026-06-17T00:00:00Z">
+        <w:r>
+          <w:rPr>
+            <w:rFonts w:hint="eastAsia" w:ascii="宋体" w:hAnsi="宋体" w:eastAsia="宋体" w:cs="宋体"/>
+            <w:color w:val="FF0000"/>
+          </w:rPr>
+          <w:t xml:space="preserve">得分较</w:t>
+        </w:r>
+      </w:ins>
+      <w:r>
+        <w:rPr>
+          <w:rFonts w:hint="eastAsia" w:ascii="宋体" w:hAnsi="宋体" w:eastAsia="宋体" w:cs="宋体"/>
+          <w:color w:val="FF0000"/>
+        </w:rPr>
+        <w:t xml:space="preserve">高</w:t>
+      </w:r>
+      <w:del w:id="650" w:author="Kiro润色" w:date="2026-06-17T00:00:00Z">
+        <w:r>
+          <w:rPr>
+            <w:rFonts w:hint="eastAsia" w:ascii="宋体" w:hAnsi="宋体" w:eastAsia="宋体" w:cs="宋体"/>
+            <w:color w:val="FF0000"/>
+          </w:rPr>
+          <w:delText xml:space="preserve">分</w:delText>
+        </w:r>
+      </w:del>
+      <w:ins w:id="651" w:author="Kiro润色" w:date="2026-06-17T00:00:00Z">
+        <w:r>
+          <w:rPr>
+            <w:rFonts w:hint="eastAsia" w:ascii="宋体" w:hAnsi="宋体" w:eastAsia="宋体" w:cs="宋体"/>
+            <w:color w:val="FF0000"/>
+          </w:rPr>
+          <w:t xml:space="preserve">也</w:t>
+        </w:r>
+      </w:ins>
+      <w:r>
+        <w:rPr>
+          <w:rFonts w:hint="eastAsia" w:ascii="宋体" w:hAnsi="宋体" w:eastAsia="宋体" w:cs="宋体"/>
+          <w:color w:val="FF0000"/>
+        </w:rPr>
+        <w:t xml:space="preserve">不予采信</w:t>
+      </w:r>
+      <w:ins w:id="652" w:author="Kiro润色" w:date="2026-06-17T00:00:00Z">
+        <w:r>
+          <w:rPr>
+            <w:rFonts w:hint="eastAsia" w:ascii="宋体" w:hAnsi="宋体" w:eastAsia="宋体" w:cs="宋体"/>
+            <w:color w:val="FF0000"/>
+          </w:rPr>
+          <w:t xml:space="preserve">，以免模型因末端表现而被整体高估</w:t>
+        </w:r>
+      </w:ins>
+      <w:r>
+        <w:rPr>
+          <w:rFonts w:hint="eastAsia" w:ascii="宋体" w:hAnsi="宋体" w:eastAsia="宋体" w:cs="宋体"/>
+          <w:color w:val="FF0000"/>
+        </w:rPr>
+        <w:t xml:space="preserve">。</w:t>
+      </w:r>
+      <w:ins w:id="653" w:author="Kiro润色" w:date="2026-06-17T00:00:00Z">
+        <w:r>
+          <w:rPr>
+            <w:rFonts w:hint="eastAsia" w:ascii="宋体" w:hAnsi="宋体" w:eastAsia="宋体" w:cs="宋体"/>
+            <w:color w:val="FF0000"/>
+          </w:rPr>
+          <w:t xml:space="preserve">需要说明的是，</w:t>
+        </w:r>
+      </w:ins>
+      <w:r>
+        <w:rPr>
+          <w:rFonts w:hint="eastAsia" w:ascii="宋体" w:hAnsi="宋体" w:eastAsia="宋体" w:cs="宋体"/>
+          <w:color w:val="FF0000"/>
+        </w:rPr>
+        <w:t xml:space="preserve">疗效层</w:t>
+      </w:r>
+      <w:del w:id="654" w:author="Kiro润色" w:date="2026-06-17T00:00:00Z">
+        <w:r>
+          <w:rPr>
+            <w:rFonts w:hint="eastAsia" w:ascii="宋体" w:hAnsi="宋体" w:eastAsia="宋体" w:cs="宋体"/>
+            <w:color w:val="FF0000"/>
+          </w:rPr>
+          <w:delText xml:space="preserve">有</w:delText>
+        </w:r>
+      </w:del>
+      <w:ins w:id="655" w:author="Kiro润色" w:date="2026-06-17T00:00:00Z">
+        <w:r>
+          <w:rPr>
+            <w:rFonts w:hint="eastAsia" w:ascii="宋体" w:hAnsi="宋体" w:eastAsia="宋体" w:cs="宋体"/>
+            <w:color w:val="FF0000"/>
+          </w:rPr>
+          <w:t xml:space="preserve">依</w:t>
+        </w:r>
+      </w:ins>
+      <w:r>
+        <w:rPr>
+          <w:rFonts w:hint="eastAsia" w:ascii="宋体" w:hAnsi="宋体" w:eastAsia="宋体" w:cs="宋体"/>
+          <w:color w:val="FF0000"/>
+        </w:rPr>
+        <w:t xml:space="preserve">赖</w:t>
+      </w:r>
+      <w:del w:id="656" w:author="Kiro润色" w:date="2026-06-17T00:00:00Z">
+        <w:r>
+          <w:rPr>
+            <w:rFonts w:hint="eastAsia" w:ascii="宋体" w:hAnsi="宋体" w:eastAsia="宋体" w:cs="宋体"/>
+            <w:color w:val="FF0000"/>
+          </w:rPr>
+          <w:delText xml:space="preserve">于</w:delText>
+        </w:r>
+      </w:del>
+      <w:r>
+        <w:rPr>
+          <w:rFonts w:hint="eastAsia" w:ascii="宋体" w:hAnsi="宋体" w:eastAsia="宋体" w:cs="宋体"/>
+          <w:color w:val="FF0000"/>
+        </w:rPr>
+        <w:t xml:space="preserve">真实世界随访与前瞻性数据，目前仍</w:t>
+      </w:r>
+      <w:del w:id="657" w:author="Kiro润色" w:date="2026-06-17T00:00:00Z">
+        <w:r>
+          <w:rPr>
+            <w:rFonts w:hint="eastAsia" w:ascii="宋体" w:hAnsi="宋体" w:eastAsia="宋体" w:cs="宋体"/>
+            <w:color w:val="FF0000"/>
+          </w:rPr>
+          <w:delText xml:space="preserve">属</w:delText>
+        </w:r>
+      </w:del>
+      <w:ins w:id="658" w:author="Kiro润色" w:date="2026-06-17T00:00:00Z">
+        <w:r>
+          <w:rPr>
+            <w:rFonts w:hint="eastAsia" w:ascii="宋体" w:hAnsi="宋体" w:eastAsia="宋体" w:cs="宋体"/>
+            <w:color w:val="FF0000"/>
+          </w:rPr>
+          <w:t xml:space="preserve">是</w:t>
+        </w:r>
+      </w:ins>
+      <w:r>
+        <w:rPr>
+          <w:rFonts w:hint="eastAsia" w:ascii="宋体" w:hAnsi="宋体" w:eastAsia="宋体" w:cs="宋体"/>
+          <w:color w:val="FF0000"/>
+        </w:rPr>
+        <w:t xml:space="preserve">亟待建设的目标层</w:t>
+      </w:r>
+      <w:del w:id="659" w:author="Kiro润色" w:date="2026-06-17T00:00:00Z">
+        <w:r>
+          <w:rPr>
+            <w:rFonts w:hint="eastAsia" w:ascii="宋体" w:hAnsi="宋体" w:eastAsia="宋体" w:cs="宋体"/>
+            <w:color w:val="FF0000"/>
+          </w:rPr>
+          <w:delText xml:space="preserve">次</w:delText>
+        </w:r>
+      </w:del>
+      <w:ins w:id="660" w:author="Kiro润色" w:date="2026-06-17T00:00:00Z">
+        <w:r>
+          <w:rPr>
+            <w:rFonts w:hint="eastAsia" w:ascii="宋体" w:hAnsi="宋体" w:eastAsia="宋体" w:cs="宋体"/>
+            <w:color w:val="FF0000"/>
+          </w:rPr>
+          <w:t xml:space="preserve">级，短期内难以全面落地</w:t>
+        </w:r>
+      </w:ins>
+      <w:r>
+        <w:rPr>
+          <w:rFonts w:hint="eastAsia" w:ascii="宋体" w:hAnsi="宋体" w:eastAsia="宋体" w:cs="宋体"/>
+          <w:color w:val="FF0000"/>
+        </w:rPr>
+        <w:t xml:space="preserve">。</w:t>
+      </w:r>
+      <w:del w:id="661" w:author="Kiro润色" w:date="2026-06-17T00:00:00Z">
+        <w:r>
+          <w:rPr>
+            <w:rFonts w:hint="eastAsia" w:ascii="宋体" w:hAnsi="宋体" w:eastAsia="宋体" w:cs="宋体"/>
+            <w:color w:val="FF0000"/>
+          </w:rPr>
+          <w:delText xml:space="preserve">各</w:delText>
+        </w:r>
+      </w:del>
+      <w:ins w:id="662" w:author="Kiro润色" w:date="2026-06-17T00:00:00Z">
+        <w:r>
+          <w:rPr>
+            <w:rFonts w:hint="eastAsia" w:ascii="宋体" w:hAnsi="宋体" w:eastAsia="宋体" w:cs="宋体"/>
+            <w:color w:val="FF0000"/>
+          </w:rPr>
+          <w:t xml:space="preserve">这一分层递进的思路与标准化工作相互呼应：GB/T 45288.2—2025已确立通用大模型的评测指标与方法[36]，可为中医药知识驱动的评测体系提供制度参照；五</w:t>
+        </w:r>
+      </w:ins>
+      <w:r>
+        <w:rPr>
+          <w:rFonts w:hint="eastAsia" w:ascii="宋体" w:hAnsi="宋体" w:eastAsia="宋体" w:cs="宋体"/>
+          <w:color w:val="FF0000"/>
+        </w:rPr>
+        <w:t xml:space="preserve">层与评测内容、代表指标及对应基准类别的对应关系见图3。</w:t>
+      </w:r>
     </w:p>
     <w:p>
       <w:pPr>
@@ -11669,7 +12245,7 @@
         </w:rPr>
         <w:t xml:space="preserve">（3）第三层为临床效用验证层，通过前瞻性临床研究评价诊断辅助增效率、医师采纳与合理修改率以及纵向治疗结局预测准确度，以患者结局数据作为最终验证标准[3</w:t>
       </w:r>
-      <w:del w:id="620" w:author="Kiro润色" w:date="2026-06-17T00:00:00Z">
+      <w:del w:id="663" w:author="Kiro润色" w:date="2026-06-17T00:00:00Z">
         <w:r>
           <w:rPr>
             <w:rFonts w:hint="eastAsia" w:eastAsia="宋体" w:cs="宋体"/>
@@ -11679,7 +12255,7 @@
           <w:delText xml:space="preserve">7</w:delText>
         </w:r>
       </w:del>
-      <w:ins w:id="621" w:author="Kiro润色" w:date="2026-06-17T00:00:00Z">
+      <w:ins w:id="664" w:author="Kiro润色" w:date="2026-06-17T00:00:00Z">
         <w:r>
           <w:rPr>
             <w:rFonts w:hint="eastAsia" w:eastAsia="宋体" w:cs="宋体"/>
@@ -11996,7 +12572,7 @@
         </w:rPr>
         <w:t xml:space="preserve">现有评测体系过度聚焦于模型的“文本输出正确性”，而未能有效度量其“临床认知充分性”与“决策过程可靠性”。要使中医药大语言模型从“可用”走向“可信、可靠”，</w:t>
       </w:r>
-      <w:del w:id="622" w:author="Kiro润色" w:date="2026-06-17T00:00:00Z">
+      <w:del w:id="665" w:author="Kiro润色" w:date="2026-06-17T00:00:00Z">
         <w:r>
           <w:rPr>
             <w:rFonts w:hint="eastAsia" w:ascii="宋体" w:hAnsi="宋体" w:eastAsia="宋体" w:cs="宋体"/>
@@ -12005,7 +12581,7 @@
           <w:delText xml:space="preserve">其核心路径</w:delText>
         </w:r>
       </w:del>
-      <w:ins w:id="623" w:author="Kiro润色" w:date="2026-06-17T00:00:00Z">
+      <w:ins w:id="666" w:author="Kiro润色" w:date="2026-06-17T00:00:00Z">
         <w:r>
           <w:rPr>
             <w:rFonts w:hint="eastAsia" w:ascii="宋体" w:hAnsi="宋体" w:eastAsia="宋体" w:cs="宋体"/>
@@ -12021,7 +12597,7 @@
         </w:rPr>
         <w:t xml:space="preserve">在于重构评测范式</w:t>
       </w:r>
-      <w:del w:id="624" w:author="Kiro润色" w:date="2026-06-17T00:00:00Z">
+      <w:del w:id="667" w:author="Kiro润色" w:date="2026-06-17T00:00:00Z">
         <w:r>
           <w:rPr>
             <w:rFonts w:hint="eastAsia" w:ascii="宋体" w:hAnsi="宋体" w:eastAsia="宋体" w:cs="宋体"/>
@@ -12030,7 +12606,7 @@
           <w:delText xml:space="preserve">，将</w:delText>
         </w:r>
       </w:del>
-      <w:ins w:id="625" w:author="Kiro润色" w:date="2026-06-17T00:00:00Z">
+      <w:ins w:id="668" w:author="Kiro润色" w:date="2026-06-17T00:00:00Z">
         <w:r>
           <w:rPr>
             <w:rFonts w:hint="eastAsia" w:ascii="宋体" w:hAnsi="宋体" w:eastAsia="宋体" w:cs="宋体"/>
@@ -12046,7 +12622,7 @@
         </w:rPr>
         <w:t xml:space="preserve">评价重心从文本问答的准确率转向临床多模态综合判断能力，</w:t>
       </w:r>
-      <w:del w:id="626" w:author="Kiro润色" w:date="2026-06-17T00:00:00Z">
+      <w:del w:id="669" w:author="Kiro润色" w:date="2026-06-17T00:00:00Z">
         <w:r>
           <w:rPr>
             <w:rFonts w:hint="eastAsia" w:ascii="宋体" w:hAnsi="宋体" w:eastAsia="宋体" w:cs="宋体"/>
@@ -12062,7 +12638,7 @@
         </w:rPr>
         <w:t xml:space="preserve">以真实世界的前瞻性结局数据作为最终验证尺度，构建“能力评估—安全审查—效用验证”三位一体的评测闭环。这既是人工智能与中医药交叉领域</w:t>
       </w:r>
-      <w:ins w:id="627" w:author="Kiro润色" w:date="2026-06-17T00:00:00Z">
+      <w:ins w:id="670" w:author="Kiro润色" w:date="2026-06-17T00:00:00Z">
         <w:r>
           <w:rPr>
             <w:rFonts w:hint="eastAsia" w:ascii="宋体" w:hAnsi="宋体" w:eastAsia="宋体" w:cs="宋体"/>
@@ -12078,7 +12654,7 @@
         </w:rPr>
         <w:t xml:space="preserve">方法学</w:t>
       </w:r>
-      <w:del w:id="628" w:author="Kiro润色" w:date="2026-06-17T00:00:00Z">
+      <w:del w:id="671" w:author="Kiro润色" w:date="2026-06-17T00:00:00Z">
         <w:r>
           <w:rPr>
             <w:rFonts w:hint="eastAsia" w:ascii="宋体" w:hAnsi="宋体" w:eastAsia="宋体" w:cs="宋体"/>
@@ -12094,7 +12670,7 @@
         </w:rPr>
         <w:t xml:space="preserve">挑战，也是推动中医药</w:t>
       </w:r>
-      <w:del w:id="629" w:author="Kiro润色" w:date="2026-06-17T00:00:00Z">
+      <w:del w:id="672" w:author="Kiro润色" w:date="2026-06-17T00:00:00Z">
         <w:r>
           <w:rPr>
             <w:rFonts w:hint="eastAsia" w:ascii="宋体" w:hAnsi="宋体" w:eastAsia="宋体" w:cs="宋体"/>
@@ -12110,7 +12686,7 @@
         </w:rPr>
         <w:t xml:space="preserve">智能化</w:t>
       </w:r>
-      <w:del w:id="630" w:author="Kiro润色" w:date="2026-06-17T00:00:00Z">
+      <w:del w:id="673" w:author="Kiro润色" w:date="2026-06-17T00:00:00Z">
         <w:r>
           <w:rPr>
             <w:rFonts w:hint="eastAsia" w:ascii="宋体" w:hAnsi="宋体" w:eastAsia="宋体" w:cs="宋体"/>
@@ -12126,7 +12702,7 @@
         </w:rPr>
         <w:t xml:space="preserve">规范发展的基础性工</w:t>
       </w:r>
-      <w:del w:id="631" w:author="Kiro润色" w:date="2026-06-17T00:00:00Z">
+      <w:del w:id="674" w:author="Kiro润色" w:date="2026-06-17T00:00:00Z">
         <w:r>
           <w:rPr>
             <w:rFonts w:hint="eastAsia" w:ascii="宋体" w:hAnsi="宋体" w:eastAsia="宋体" w:cs="宋体"/>
@@ -12135,7 +12711,7 @@
           <w:delText xml:space="preserve">程</w:delText>
         </w:r>
       </w:del>
-      <w:ins w:id="632" w:author="Kiro润色" w:date="2026-06-17T00:00:00Z">
+      <w:ins w:id="675" w:author="Kiro润色" w:date="2026-06-17T00:00:00Z">
         <w:r>
           <w:rPr>
             <w:rFonts w:hint="eastAsia" w:ascii="宋体" w:hAnsi="宋体" w:eastAsia="宋体" w:cs="宋体"/>
@@ -12151,7 +12727,7 @@
         </w:rPr>
         <w:t xml:space="preserve">，</w:t>
       </w:r>
-      <w:del w:id="633" w:author="Kiro润色" w:date="2026-06-17T00:00:00Z">
+      <w:del w:id="676" w:author="Kiro润色" w:date="2026-06-17T00:00:00Z">
         <w:r>
           <w:rPr>
             <w:rFonts w:hint="eastAsia" w:ascii="宋体" w:hAnsi="宋体" w:eastAsia="宋体" w:cs="宋体"/>
@@ -12160,7 +12736,7 @@
           <w:delText xml:space="preserve">亟</w:delText>
         </w:r>
       </w:del>
-      <w:ins w:id="634" w:author="Kiro润色" w:date="2026-06-17T00:00:00Z">
+      <w:ins w:id="677" w:author="Kiro润色" w:date="2026-06-17T00:00:00Z">
         <w:r>
           <w:rPr>
             <w:rFonts w:hint="eastAsia" w:ascii="宋体" w:hAnsi="宋体" w:eastAsia="宋体" w:cs="宋体"/>
@@ -12176,7 +12752,7 @@
         </w:rPr>
         <w:t xml:space="preserve">需在高质量多模态数据</w:t>
       </w:r>
-      <w:del w:id="635" w:author="Kiro润色" w:date="2026-06-17T00:00:00Z">
+      <w:del w:id="678" w:author="Kiro润色" w:date="2026-06-17T00:00:00Z">
         <w:r>
           <w:rPr>
             <w:rFonts w:hint="eastAsia" w:ascii="宋体" w:hAnsi="宋体" w:eastAsia="宋体" w:cs="宋体"/>
@@ -12192,7 +12768,7 @@
         </w:rPr>
         <w:t xml:space="preserve">建设、动态交互式评测协议</w:t>
       </w:r>
-      <w:del w:id="636" w:author="Kiro润色" w:date="2026-06-17T00:00:00Z">
+      <w:del w:id="679" w:author="Kiro润色" w:date="2026-06-17T00:00:00Z">
         <w:r>
           <w:rPr>
             <w:rFonts w:hint="eastAsia" w:ascii="宋体" w:hAnsi="宋体" w:eastAsia="宋体" w:cs="宋体"/>
@@ -12201,7 +12777,7 @@
           <w:delText xml:space="preserve">开发及</w:delText>
         </w:r>
       </w:del>
-      <w:ins w:id="637" w:author="Kiro润色" w:date="2026-06-17T00:00:00Z">
+      <w:ins w:id="680" w:author="Kiro润色" w:date="2026-06-17T00:00:00Z">
         <w:r>
           <w:rPr>
             <w:rFonts w:hint="eastAsia" w:ascii="宋体" w:hAnsi="宋体" w:eastAsia="宋体" w:cs="宋体"/>
@@ -12217,7 +12793,7 @@
         </w:rPr>
         <w:t xml:space="preserve">人机协同临床验证等方面</w:t>
       </w:r>
-      <w:del w:id="638" w:author="Kiro润色" w:date="2026-06-17T00:00:00Z">
+      <w:del w:id="681" w:author="Kiro润色" w:date="2026-06-17T00:00:00Z">
         <w:r>
           <w:rPr>
             <w:rFonts w:hint="eastAsia" w:ascii="宋体" w:hAnsi="宋体" w:eastAsia="宋体" w:cs="宋体"/>
@@ -12226,7 +12802,7 @@
           <w:delText xml:space="preserve">形成系统性</w:delText>
         </w:r>
       </w:del>
-      <w:ins w:id="639" w:author="Kiro润色" w:date="2026-06-17T00:00:00Z">
+      <w:ins w:id="682" w:author="Kiro润色" w:date="2026-06-17T00:00:00Z">
         <w:r>
           <w:rPr>
             <w:rFonts w:hint="eastAsia" w:ascii="宋体" w:hAnsi="宋体" w:eastAsia="宋体" w:cs="宋体"/>
@@ -12242,7 +12818,7 @@
         </w:rPr>
         <w:t xml:space="preserve">突破</w:t>
       </w:r>
-      <w:del w:id="640" w:author="Kiro润色" w:date="2026-06-17T00:00:00Z">
+      <w:del w:id="683" w:author="Kiro润色" w:date="2026-06-17T00:00:00Z">
         <w:r>
           <w:rPr>
             <w:rFonts w:hint="eastAsia" w:ascii="宋体" w:hAnsi="宋体" w:eastAsia="宋体" w:cs="宋体"/>
@@ -12580,7 +13156,7 @@
         </w:rPr>
         <w:t xml:space="preserve">[18] 张童, 王一凡, 王若佳, 等. 面向中医药领域专业能力的生成式大语言模型对比研究[J]. 中华中医药学刊, 2025, 43(10): 19-27</w:t>
       </w:r>
-      <w:ins w:id="641" w:author="Kiro润色" w:date="2026-06-17T00:00:00Z">
+      <w:ins w:id="684" w:author="Kiro润色" w:date="2026-06-17T00:00:00Z">
         <w:r>
           <w:rPr>
             <w:rFonts w:hint="eastAsia" w:ascii="宋体" w:hAnsi="宋体" w:eastAsia="宋体" w:cs="宋体"/>
@@ -12729,7 +13305,7 @@
         </w:rPr>
         <w:t xml:space="preserve">[27] YANG Q R, HAN J X, WANG H Z, et al. Knowledge graph enhanced large language models for traditional Chinese medicine question-answering[C]// 2026 IEEE International Conference on Big Data and Smart Computing (BigComp). Piscataway: IEEE, 202</w:t>
       </w:r>
-      <w:del w:id="642" w:author="Kiro润色" w:date="2026-06-17T00:00:00Z">
+      <w:del w:id="685" w:author="Kiro润色" w:date="2026-06-17T00:00:00Z">
         <w:r>
           <w:rPr>
             <w:rFonts w:hint="eastAsia" w:ascii="宋体" w:hAnsi="宋体" w:eastAsia="宋体" w:cs="宋体"/>
@@ -12737,7 +13313,7 @@
           <w:delText xml:space="preserve">5</w:delText>
         </w:r>
       </w:del>
-      <w:ins w:id="643" w:author="Kiro润色" w:date="2026-06-17T00:00:00Z">
+      <w:ins w:id="686" w:author="Kiro润色" w:date="2026-06-17T00:00:00Z">
         <w:r>
           <w:rPr>
             <w:rFonts w:hint="eastAsia" w:ascii="宋体" w:hAnsi="宋体" w:eastAsia="宋体" w:cs="宋体"/>
@@ -12766,7 +13342,7 @@
         </w:rPr>
         <w:t xml:space="preserve">[28] DUAN Y C, ZHOU Q Q, LI Y, et al. Research on a traditional Chinese medicine case-based question-answering system integrating large language models and knowledge graphs[J]. Frontiers in Medicine, 202</w:t>
       </w:r>
-      <w:del w:id="644" w:author="Kiro润色" w:date="2026-06-17T00:00:00Z">
+      <w:del w:id="687" w:author="Kiro润色" w:date="2026-06-17T00:00:00Z">
         <w:r>
           <w:rPr>
             <w:rFonts w:hint="eastAsia" w:ascii="宋体" w:hAnsi="宋体" w:eastAsia="宋体" w:cs="宋体"/>
@@ -12774,7 +13350,7 @@
           <w:delText xml:space="preserve">5</w:delText>
         </w:r>
       </w:del>
-      <w:ins w:id="645" w:author="Kiro润色" w:date="2026-06-17T00:00:00Z">
+      <w:ins w:id="688" w:author="Kiro润色" w:date="2026-06-17T00:00:00Z">
         <w:r>
           <w:rPr>
             <w:rFonts w:hint="eastAsia" w:ascii="宋体" w:hAnsi="宋体" w:eastAsia="宋体" w:cs="宋体"/>
@@ -12842,7 +13418,7 @@
           <w:rFonts w:hint="eastAsia" w:ascii="宋体" w:hAnsi="宋体" w:eastAsia="宋体" w:cs="宋体"/>
         </w:rPr>
       </w:pPr>
-      <w:del w:id="646" w:author="Kiro润色" w:date="2026-06-17T00:00:00Z">
+      <w:del w:id="689" w:author="Kiro润色" w:date="2026-06-17T00:00:00Z">
         <w:r>
           <w:rPr>
             <w:rFonts w:hint="eastAsia" w:ascii="宋体" w:hAnsi="宋体" w:eastAsia="宋体" w:cs="宋体"/>
@@ -12859,7 +13435,7 @@
           <w:rFonts w:hint="eastAsia" w:ascii="宋体" w:hAnsi="宋体" w:eastAsia="宋体" w:cs="宋体"/>
         </w:rPr>
       </w:pPr>
-      <w:del w:id="647" w:author="Kiro润色" w:date="2026-06-17T00:00:00Z">
+      <w:del w:id="690" w:author="Kiro润色" w:date="2026-06-17T00:00:00Z">
         <w:r>
           <w:rPr>
             <w:rFonts w:hint="eastAsia" w:ascii="宋体" w:hAnsi="宋体" w:eastAsia="宋体" w:cs="宋体"/>
@@ -12882,7 +13458,7 @@
         </w:rPr>
         <w:t xml:space="preserve">[3</w:t>
       </w:r>
-      <w:del w:id="648" w:author="Kiro润色" w:date="2026-06-17T00:00:00Z">
+      <w:del w:id="691" w:author="Kiro润色" w:date="2026-06-17T00:00:00Z">
         <w:r>
           <w:rPr>
             <w:rFonts w:hint="eastAsia" w:ascii="宋体" w:hAnsi="宋体" w:eastAsia="宋体" w:cs="宋体"/>
@@ -12890,7 +13466,7 @@
           <w:delText xml:space="preserve">4</w:delText>
         </w:r>
       </w:del>
-      <w:ins w:id="649" w:author="Kiro润色" w:date="2026-06-17T00:00:00Z">
+      <w:ins w:id="692" w:author="Kiro润色" w:date="2026-06-17T00:00:00Z">
         <w:r>
           <w:rPr>
             <w:rFonts w:hint="eastAsia" w:ascii="宋体" w:hAnsi="宋体" w:eastAsia="宋体" w:cs="宋体"/>
@@ -12919,7 +13495,7 @@
         </w:rPr>
         <w:t xml:space="preserve">[3</w:t>
       </w:r>
-      <w:del w:id="650" w:author="Kiro润色" w:date="2026-06-17T00:00:00Z">
+      <w:del w:id="693" w:author="Kiro润色" w:date="2026-06-17T00:00:00Z">
         <w:r>
           <w:rPr>
             <w:rFonts w:hint="eastAsia" w:ascii="宋体" w:hAnsi="宋体" w:eastAsia="宋体" w:cs="宋体"/>
@@ -12927,7 +13503,7 @@
           <w:delText xml:space="preserve">5</w:delText>
         </w:r>
       </w:del>
-      <w:ins w:id="651" w:author="Kiro润色" w:date="2026-06-17T00:00:00Z">
+      <w:ins w:id="694" w:author="Kiro润色" w:date="2026-06-17T00:00:00Z">
         <w:r>
           <w:rPr>
             <w:rFonts w:hint="eastAsia" w:ascii="宋体" w:hAnsi="宋体" w:eastAsia="宋体" w:cs="宋体"/>
@@ -12956,7 +13532,7 @@
         </w:rPr>
         <w:t xml:space="preserve">[3</w:t>
       </w:r>
-      <w:del w:id="652" w:author="Kiro润色" w:date="2026-06-17T00:00:00Z">
+      <w:del w:id="695" w:author="Kiro润色" w:date="2026-06-17T00:00:00Z">
         <w:r>
           <w:rPr>
             <w:rFonts w:hint="eastAsia" w:ascii="宋体" w:hAnsi="宋体" w:eastAsia="宋体" w:cs="宋体"/>
@@ -12964,7 +13540,7 @@
           <w:delText xml:space="preserve">6</w:delText>
         </w:r>
       </w:del>
-      <w:ins w:id="653" w:author="Kiro润色" w:date="2026-06-17T00:00:00Z">
+      <w:ins w:id="696" w:author="Kiro润色" w:date="2026-06-17T00:00:00Z">
         <w:r>
           <w:rPr>
             <w:rFonts w:hint="eastAsia" w:ascii="宋体" w:hAnsi="宋体" w:eastAsia="宋体" w:cs="宋体"/>
@@ -12993,7 +13569,7 @@
         </w:rPr>
         <w:t xml:space="preserve">[3</w:t>
       </w:r>
-      <w:del w:id="654" w:author="Kiro润色" w:date="2026-06-17T00:00:00Z">
+      <w:del w:id="697" w:author="Kiro润色" w:date="2026-06-17T00:00:00Z">
         <w:r>
           <w:rPr>
             <w:rFonts w:hint="eastAsia" w:ascii="宋体" w:hAnsi="宋体" w:eastAsia="宋体" w:cs="宋体"/>
@@ -13001,7 +13577,7 @@
           <w:delText xml:space="preserve">7</w:delText>
         </w:r>
       </w:del>
-      <w:ins w:id="655" w:author="Kiro润色" w:date="2026-06-17T00:00:00Z">
+      <w:ins w:id="698" w:author="Kiro润色" w:date="2026-06-17T00:00:00Z">
         <w:r>
           <w:rPr>
             <w:rFonts w:hint="eastAsia" w:ascii="宋体" w:hAnsi="宋体" w:eastAsia="宋体" w:cs="宋体"/>
@@ -13030,7 +13606,7 @@
         </w:rPr>
         <w:t xml:space="preserve">[3</w:t>
       </w:r>
-      <w:del w:id="656" w:author="Kiro润色" w:date="2026-06-17T00:00:00Z">
+      <w:del w:id="699" w:author="Kiro润色" w:date="2026-06-17T00:00:00Z">
         <w:r>
           <w:rPr>
             <w:rFonts w:hint="eastAsia" w:ascii="宋体" w:hAnsi="宋体" w:eastAsia="宋体" w:cs="宋体"/>
@@ -13038,7 +13614,7 @@
           <w:delText xml:space="preserve">8</w:delText>
         </w:r>
       </w:del>
-      <w:ins w:id="657" w:author="Kiro润色" w:date="2026-06-17T00:00:00Z">
+      <w:ins w:id="700" w:author="Kiro润色" w:date="2026-06-17T00:00:00Z">
         <w:r>
           <w:rPr>
             <w:rFonts w:hint="eastAsia" w:ascii="宋体" w:hAnsi="宋体" w:eastAsia="宋体" w:cs="宋体"/>

</xml_diff>